<commit_message>
feat: enforce release companion handbook gate
</commit_message>
<xml_diff>
--- a/docs/user-guide/企业全生命周期助手用户使用手册.docx
+++ b/docs/user-guide/企业全生命周期助手用户使用手册.docx
@@ -44,8 +44,9 @@
     </w:p>
     <w:p>
       <w:pPr>
-        <w:pStyle w:val="3"/>
-        <w:bidi w:val="0"/>
+        <w:keepNext/>
+        <w:bidi w:val="0"/>
+        <w:spacing w:before="200" w:after="200"/>
         <w:jc w:val="center"/>
         <w:rPr>
           <w:rFonts w:hint="default" w:asciiTheme="majorEastAsia" w:hAnsiTheme="majorEastAsia" w:eastAsiaTheme="majorEastAsia" w:cstheme="majorEastAsia"/>
@@ -55,15 +56,10 @@
       <w:r>
         <w:rPr>
           <w:rFonts w:hint="eastAsia" w:asciiTheme="majorEastAsia" w:hAnsiTheme="majorEastAsia" w:eastAsiaTheme="majorEastAsia" w:cstheme="majorEastAsia"/>
-        </w:rPr>
-        <w:t>适用版本：V1.</w:t>
-      </w:r>
-      <w:r>
-        <w:rPr>
-          <w:rFonts w:hint="default" w:asciiTheme="majorEastAsia" w:hAnsiTheme="majorEastAsia" w:eastAsiaTheme="majorEastAsia" w:cstheme="majorEastAsia"/>
-          <w:lang w:val="en-US"/>
-        </w:rPr>
-        <w:t>3.1</w:t>
+          <w:b/>
+          <w:sz w:val="32"/>
+        </w:rPr>
+        <w:t>适用版本：V1.3.1</w:t>
       </w:r>
     </w:p>
     <w:p>
@@ -91,7 +87,7 @@
         <w:rPr>
           <w:rFonts w:hint="eastAsia" w:asciiTheme="majorEastAsia" w:hAnsiTheme="majorEastAsia" w:eastAsiaTheme="majorEastAsia" w:cstheme="majorEastAsia"/>
         </w:rPr>
-        <w:t>本手册面向共创团队成员。企业全生命周期助手由48个平台无关Skills、团队云端知识库、RESTAPI和MCP组成的工作能力包，可放入支持Skills的Agent使用。</w:t>
+        <w:t>本手册面向共创团队成员。企业全生命周期助手由49个平台无关Skills、团队云端知识库、REST API和MCP组成，可导入支持Skills的Agent使用。</w:t>
       </w:r>
     </w:p>
     <w:p>
@@ -543,7 +539,7 @@
         <w:rPr>
           <w:rFonts w:hint="eastAsia" w:asciiTheme="majorEastAsia" w:hAnsiTheme="majorEastAsia" w:eastAsiaTheme="majorEastAsia" w:cstheme="majorEastAsia"/>
         </w:rPr>
-        <w:t>登录网站，进入“Skills下载”。</w:t>
+        <w:t>登录网站，进入“Skills中心”，点击“选择安装平台”。</w:t>
       </w:r>
     </w:p>
     <w:p>
@@ -575,20 +571,7 @@
         <w:rPr>
           <w:rFonts w:hint="eastAsia" w:asciiTheme="majorEastAsia" w:hAnsiTheme="majorEastAsia" w:eastAsiaTheme="majorEastAsia" w:cstheme="majorEastAsia"/>
         </w:rPr>
-        <w:t>下载</w:t>
-      </w:r>
-      <w:r>
-        <w:rPr>
-          <w:rFonts w:hint="default" w:asciiTheme="majorEastAsia" w:hAnsiTheme="majorEastAsia" w:eastAsiaTheme="majorEastAsia" w:cstheme="majorEastAsia"/>
-          <w:lang w:val="en-US"/>
-        </w:rPr>
-        <w:t>V1.3.1</w:t>
-      </w:r>
-      <w:r>
-        <w:rPr>
-          <w:rFonts w:hint="eastAsia" w:asciiTheme="majorEastAsia" w:hAnsiTheme="majorEastAsia" w:eastAsiaTheme="majorEastAsia" w:cstheme="majorEastAsia"/>
-        </w:rPr>
-        <w:t>ZIP并解压。</w:t>
+        <w:t>按宿主下载V1.3.1通用Skills ZIP或V1.3.1 WorkBuddy插件ZIP。</w:t>
       </w:r>
     </w:p>
     <w:p>
@@ -620,33 +603,7 @@
         <w:rPr>
           <w:rFonts w:hint="eastAsia" w:asciiTheme="majorEastAsia" w:hAnsiTheme="majorEastAsia" w:eastAsiaTheme="majorEastAsia" w:cstheme="majorEastAsia"/>
         </w:rPr>
-        <w:t>网站同时提供</w:t>
-      </w:r>
-      <w:r>
-        <w:rPr>
-          <w:rFonts w:hint="default" w:asciiTheme="majorEastAsia" w:hAnsiTheme="majorEastAsia" w:eastAsiaTheme="majorEastAsia" w:cstheme="majorEastAsia"/>
-          <w:lang w:val="en-US"/>
-        </w:rPr>
-        <w:t>V1.3.1</w:t>
-      </w:r>
-      <w:r>
-        <w:rPr>
-          <w:rFonts w:hint="eastAsia" w:asciiTheme="majorEastAsia" w:hAnsiTheme="majorEastAsia" w:eastAsiaTheme="majorEastAsia" w:cstheme="majorEastAsia"/>
-        </w:rPr>
-        <w:t>通用Skills包和</w:t>
-      </w:r>
-      <w:r>
-        <w:rPr>
-          <w:rFonts w:hint="default" w:asciiTheme="majorEastAsia" w:hAnsiTheme="majorEastAsia" w:eastAsiaTheme="majorEastAsia" w:cstheme="majorEastAsia"/>
-          <w:lang w:val="en-US"/>
-        </w:rPr>
-        <w:t>V1.3.1</w:t>
-      </w:r>
-      <w:r>
-        <w:rPr>
-          <w:rFonts w:hint="eastAsia" w:asciiTheme="majorEastAsia" w:hAnsiTheme="majorEastAsia" w:eastAsiaTheme="majorEastAsia" w:cstheme="majorEastAsia"/>
-        </w:rPr>
-        <w:t xml:space="preserve"> WorkBuddy插件包。两种版本业务能力相同，不要重复安装；支持SKILL.md的Agent使用通用包，WorkBuddy用户优先使用插件包。</w:t>
+        <w:t>两种安装包的业务能力相同，不要重复安装。支持SKILL.md的Agent使用通用包；WorkBuddy用户使用插件包及随包一键安装器，并在安装前核对来源、SHA-256和撤销说明。</w:t>
       </w:r>
     </w:p>
     <w:p>
@@ -932,7 +889,7 @@
         <w:rPr>
           <w:rFonts w:hint="eastAsia" w:asciiTheme="majorEastAsia" w:hAnsiTheme="majorEastAsia" w:eastAsiaTheme="majorEastAsia" w:cstheme="majorEastAsia"/>
         </w:rPr>
-        <w:t>登录网站，进入“API与MCP”。</w:t>
+        <w:t>登录网站，进入“连接我的Agent”。</w:t>
       </w:r>
     </w:p>
     <w:p>
@@ -964,33 +921,7 @@
         <w:rPr>
           <w:rFonts w:hint="eastAsia" w:asciiTheme="majorEastAsia" w:hAnsiTheme="majorEastAsia" w:eastAsiaTheme="majorEastAsia" w:cstheme="majorEastAsia"/>
         </w:rPr>
-        <w:t>显示并复制REST</w:t>
-      </w:r>
-      <w:r>
-        <w:rPr>
-          <w:rFonts w:hint="eastAsia" w:asciiTheme="majorEastAsia" w:hAnsiTheme="majorEastAsia" w:eastAsiaTheme="majorEastAsia" w:cstheme="majorEastAsia"/>
-          <w:lang w:val="en-US" w:eastAsia="zh-CN"/>
-        </w:rPr>
-        <w:t xml:space="preserve"> </w:t>
-      </w:r>
-      <w:r>
-        <w:rPr>
-          <w:rFonts w:hint="eastAsia" w:asciiTheme="majorEastAsia" w:hAnsiTheme="majorEastAsia" w:eastAsiaTheme="majorEastAsia" w:cstheme="majorEastAsia"/>
-        </w:rPr>
-        <w:t>BaseURL、MCP</w:t>
-      </w:r>
-      <w:r>
-        <w:rPr>
-          <w:rFonts w:hint="eastAsia" w:asciiTheme="majorEastAsia" w:hAnsiTheme="majorEastAsia" w:eastAsiaTheme="majorEastAsia" w:cstheme="majorEastAsia"/>
-          <w:lang w:val="en-US" w:eastAsia="zh-CN"/>
-        </w:rPr>
-        <w:t xml:space="preserve"> </w:t>
-      </w:r>
-      <w:r>
-        <w:rPr>
-          <w:rFonts w:hint="eastAsia" w:asciiTheme="majorEastAsia" w:hAnsiTheme="majorEastAsia" w:eastAsiaTheme="majorEastAsia" w:cstheme="majorEastAsia"/>
-        </w:rPr>
-        <w:t>URL和个人访问凭据。</w:t>
+        <w:t>点击“复制给Agent”，将网站生成的完整接入内容复制到当前本地Agent。</w:t>
       </w:r>
     </w:p>
     <w:p>
@@ -1022,7 +953,7 @@
         <w:rPr>
           <w:rFonts w:hint="eastAsia" w:asciiTheme="majorEastAsia" w:hAnsiTheme="majorEastAsia" w:eastAsiaTheme="majorEastAsia" w:cstheme="majorEastAsia"/>
         </w:rPr>
-        <w:t>每位用户只有一个有效个人凭据，可反复显示和复制，不需要重复创建。</w:t>
+        <w:t>普通成员无需查看、保存或转发个人API Key、设备私钥和MCP请求头；接入内容只交给本人的本地Agent处理。</w:t>
       </w:r>
     </w:p>
     <w:p>
@@ -1054,7 +985,7 @@
         <w:rPr>
           <w:rFonts w:hint="eastAsia" w:asciiTheme="majorEastAsia" w:hAnsiTheme="majorEastAsia" w:eastAsiaTheme="majorEastAsia" w:cstheme="majorEastAsia"/>
         </w:rPr>
-        <w:t>将网站提供的完整接入内容交给自己的Agent，并要求运行`firstrunconfiguration`。</w:t>
+        <w:t>将完整接入内容粘贴到Agent对话框，并要求运行`first-run-configuration`首次配置向导。</w:t>
       </w:r>
     </w:p>
     <w:p>
@@ -1086,7 +1017,7 @@
         <w:rPr>
           <w:rFonts w:hint="eastAsia" w:asciiTheme="majorEastAsia" w:hAnsiTheme="majorEastAsia" w:eastAsiaTheme="majorEastAsia" w:cstheme="majorEastAsia"/>
         </w:rPr>
-        <w:t>Agent应先验证身份，再进行一次非敏感关键词检索。</w:t>
+        <w:t>Agent应自动完成设备登记、身份验证、REST连接、MCP工具列表和非敏感关键词检索。</w:t>
       </w:r>
     </w:p>
     <w:p>
@@ -1114,7 +1045,7 @@
         <w:rPr>
           <w:rFonts w:hint="eastAsia" w:asciiTheme="majorEastAsia" w:hAnsiTheme="majorEastAsia" w:eastAsiaTheme="majorEastAsia" w:cstheme="majorEastAsia"/>
         </w:rPr>
-        <w:t>个人凭据不是模型APIKey。它只用于访问团队知识库、查看本人用量和下载最新版Skills。凭据返回401时，先确认复制完整；仍无效则在本人页面吊销后重新生成。</w:t>
+        <w:t>个人知识库凭据不是模型API Key。普通成员同一账号同时绑定一台设备；换机时先在门户执行“更换绑定设备”，再把新的配置交给新设备Agent。凭据返回401时重新复制完整接入内容并执行五步验收。</w:t>
       </w:r>
     </w:p>
     <w:p>
@@ -1431,14 +1362,7 @@
         <w:rPr>
           <w:rFonts w:hint="eastAsia" w:asciiTheme="majorEastAsia" w:hAnsiTheme="majorEastAsia" w:eastAsiaTheme="majorEastAsia" w:cstheme="majorEastAsia"/>
         </w:rPr>
-        <w:t>企查查：增强工商、股权、风险和知识产权画像，可通过网站保留的企查查入口注册并按供应商说明配置API或MCP。</w:t>
-      </w:r>
-      <w:r>
-        <w:rPr>
-          <w:rFonts w:hint="eastAsia" w:asciiTheme="majorEastAsia" w:hAnsiTheme="majorEastAsia" w:eastAsiaTheme="majorEastAsia" w:cstheme="majorEastAsia"/>
-          <w:lang w:val="en-US" w:eastAsia="zh-CN"/>
-        </w:rPr>
-        <w:t>通过网站邀请链接注册登录后首页获取MCP通用配置，复制到个人agent中使用。</w:t>
+        <w:t>企查查：增强工商、股权、风险和知识产权画像。通过网站保留的供应商入口注册，并按供应商说明配置API或MCP。</w:t>
       </w:r>
     </w:p>
     <w:p>
@@ -1470,14 +1394,7 @@
         <w:rPr>
           <w:rFonts w:hint="eastAsia" w:asciiTheme="majorEastAsia" w:hAnsiTheme="majorEastAsia" w:eastAsiaTheme="majorEastAsia" w:cstheme="majorEastAsia"/>
         </w:rPr>
-        <w:t>BigQueryPatents：增强全球专利批量检索、同族和引证分析。</w:t>
-      </w:r>
-      <w:r>
-        <w:rPr>
-          <w:rFonts w:hint="eastAsia" w:asciiTheme="majorEastAsia" w:hAnsiTheme="majorEastAsia" w:eastAsiaTheme="majorEastAsia" w:cstheme="majorEastAsia"/>
-          <w:lang w:val="en-US" w:eastAsia="zh-CN"/>
-        </w:rPr>
-        <w:t>专利部自行翻墙注册Google账号后使用</w:t>
+        <w:t>BigQuery Patents：增强全球专利批量检索、同族和引证分析，按Google Cloud官方说明完成账号、项目和MCP配置。</w:t>
       </w:r>
     </w:p>
     <w:p>
@@ -1575,7 +1492,7 @@
         <w:rPr>
           <w:rFonts w:hint="eastAsia" w:asciiTheme="majorEastAsia" w:hAnsiTheme="majorEastAsia" w:eastAsiaTheme="majorEastAsia" w:cstheme="majorEastAsia"/>
         </w:rPr>
-        <w:t>覆盖政府项目检索、匹配、体检、材料编写、企业分析、专利、法律法规、制造业财税风险和交付归档，但不承诺一定符合或一定获批。</w:t>
+        <w:t>覆盖政府项目检索、匹配、体检、材料编写、高企申请书、企业分析、专利、法律法规、制造业财税风险和交付归档，但不承诺一定符合或一定获批。</w:t>
       </w:r>
     </w:p>
     <w:p>
@@ -2130,20 +2047,16 @@
         <w:keepLines w:val="0"/>
         <w:pageBreakBefore w:val="0"/>
         <w:widowControl w:val="0"/>
-        <w:numPr>
-          <w:ilvl w:val="0"/>
-          <w:numId w:val="5"/>
-        </w:numPr>
-        <w:kinsoku/>
-        <w:wordWrap/>
-        <w:overflowPunct/>
-        <w:topLinePunct w:val="0"/>
-        <w:autoSpaceDE/>
-        <w:autoSpaceDN/>
-        <w:bidi w:val="0"/>
-        <w:adjustRightInd/>
-        <w:snapToGrid/>
-        <w:ind w:left="425" w:leftChars="0" w:hanging="425" w:firstLineChars="0"/>
+        <w:kinsoku/>
+        <w:wordWrap/>
+        <w:overflowPunct/>
+        <w:topLinePunct w:val="0"/>
+        <w:autoSpaceDE/>
+        <w:autoSpaceDN/>
+        <w:bidi w:val="0"/>
+        <w:adjustRightInd/>
+        <w:snapToGrid/>
+        <w:ind w:firstLine="420" w:firstLineChars="200"/>
         <w:textAlignment w:val="auto"/>
         <w:rPr>
           <w:rFonts w:hint="eastAsia" w:asciiTheme="majorEastAsia" w:hAnsiTheme="majorEastAsia" w:eastAsiaTheme="majorEastAsia" w:cstheme="majorEastAsia"/>
@@ -2162,30 +2075,34 @@
         <w:keepLines w:val="0"/>
         <w:pageBreakBefore w:val="0"/>
         <w:widowControl w:val="0"/>
-        <w:numPr>
-          <w:ilvl w:val="0"/>
-          <w:numId w:val="5"/>
-        </w:numPr>
-        <w:kinsoku/>
-        <w:wordWrap/>
-        <w:overflowPunct/>
-        <w:topLinePunct w:val="0"/>
-        <w:autoSpaceDE/>
-        <w:autoSpaceDN/>
-        <w:bidi w:val="0"/>
-        <w:adjustRightInd/>
-        <w:snapToGrid/>
-        <w:ind w:left="425" w:leftChars="0" w:hanging="425" w:firstLineChars="0"/>
-        <w:textAlignment w:val="auto"/>
-        <w:rPr>
-          <w:rFonts w:hint="eastAsia" w:asciiTheme="majorEastAsia" w:hAnsiTheme="majorEastAsia" w:eastAsiaTheme="majorEastAsia" w:cstheme="majorEastAsia"/>
-        </w:rPr>
-      </w:pPr>
-      <w:r>
-        <w:rPr>
-          <w:rFonts w:hint="eastAsia" w:asciiTheme="majorEastAsia" w:hAnsiTheme="majorEastAsia" w:eastAsiaTheme="majorEastAsia" w:cstheme="majorEastAsia"/>
-        </w:rPr>
-        <w:t>“请先生成专精特新或小巨人申报前评分用的三年财务底表，待我回传并确认项目版本后再评分。”</w:t>
+        <w:kinsoku/>
+        <w:wordWrap/>
+        <w:overflowPunct/>
+        <w:topLinePunct w:val="0"/>
+        <w:autoSpaceDE/>
+        <w:autoSpaceDN/>
+        <w:bidi w:val="0"/>
+        <w:adjustRightInd/>
+        <w:snapToGrid/>
+        <w:ind w:firstLine="420" w:firstLineChars="200"/>
+        <w:textAlignment w:val="auto"/>
+        <w:rPr>
+          <w:rFonts w:hint="eastAsia" w:asciiTheme="majorEastAsia" w:hAnsiTheme="majorEastAsia" w:eastAsiaTheme="majorEastAsia" w:cstheme="majorEastAsia"/>
+        </w:rPr>
+      </w:pPr>
+      <w:r>
+        <w:rPr>
+          <w:rFonts w:hint="eastAsia" w:asciiTheme="majorEastAsia" w:hAnsiTheme="majorEastAsia" w:eastAsiaTheme="majorEastAsia" w:cstheme="majorEastAsia"/>
+        </w:rPr>
+        <w:t>“请先生成专</w:t>
+      </w:r>
+      <w:bookmarkStart w:id="0" w:name="_GoBack"/>
+      <w:bookmarkEnd w:id="0"/>
+      <w:r>
+        <w:rPr>
+          <w:rFonts w:hint="eastAsia" w:asciiTheme="majorEastAsia" w:hAnsiTheme="majorEastAsia" w:eastAsiaTheme="majorEastAsia" w:cstheme="majorEastAsia"/>
+        </w:rPr>
+        <w:t>精特新或小巨人申报前评分用的三年财务底表，待我回传并确认项目版本后再评分。”</w:t>
       </w:r>
     </w:p>
     <w:p>
@@ -2221,7 +2138,7 @@
           <w:b/>
           <w:bCs/>
         </w:rPr>
-        <w:t>专精特新和小巨人</w:t>
+        <w:t>高新技术企业认定</w:t>
       </w:r>
     </w:p>
     <w:p>
@@ -2248,8 +2165,9 @@
       <w:r>
         <w:rPr>
           <w:rFonts w:hint="eastAsia" w:asciiTheme="majorEastAsia" w:hAnsiTheme="majorEastAsia" w:eastAsiaTheme="majorEastAsia" w:cstheme="majorEastAsia"/>
-        </w:rPr>
-        <w:t>“请先识别并让我确认申请书项目类型和版本，再体检这份材料。”</w:t>
+          <w:b w:val="0"/>
+        </w:rPr>
+        <w:t>“请按V1.3.1空白母版，使用我提供的企业、RD、知识产权、成果转化和PS资料撰写并回填高企申请书；缺失数据保留待核定，不得补造。”</w:t>
       </w:r>
     </w:p>
     <w:p>
@@ -2276,36 +2194,9 @@
       <w:r>
         <w:rPr>
           <w:rFonts w:hint="eastAsia" w:asciiTheme="majorEastAsia" w:hAnsiTheme="majorEastAsia" w:eastAsiaTheme="majorEastAsia" w:cstheme="majorEastAsia"/>
-        </w:rPr>
-        <w:t>“按现行优质中小企业梯度培育管理办法，分析企业差距，并对主导产品、补短板、填空白、国产替代分别给出保留、替换或补证后保留结论。”</w:t>
-      </w:r>
-    </w:p>
-    <w:p>
-      <w:pPr>
-        <w:keepNext w:val="0"/>
-        <w:keepLines w:val="0"/>
-        <w:pageBreakBefore w:val="0"/>
-        <w:widowControl w:val="0"/>
-        <w:kinsoku/>
-        <w:wordWrap/>
-        <w:overflowPunct/>
-        <w:topLinePunct w:val="0"/>
-        <w:autoSpaceDE/>
-        <w:autoSpaceDN/>
-        <w:bidi w:val="0"/>
-        <w:adjustRightInd/>
-        <w:snapToGrid/>
-        <w:ind w:firstLine="420" w:firstLineChars="200"/>
-        <w:textAlignment w:val="auto"/>
-        <w:rPr>
-          <w:rFonts w:hint="eastAsia" w:asciiTheme="majorEastAsia" w:hAnsiTheme="majorEastAsia" w:eastAsiaTheme="majorEastAsia" w:cstheme="majorEastAsia"/>
-        </w:rPr>
-      </w:pPr>
-      <w:r>
-        <w:rPr>
-          <w:rFonts w:hint="eastAsia" w:asciiTheme="majorEastAsia" w:hAnsiTheme="majorEastAsia" w:eastAsiaTheme="majorEastAsia" w:cstheme="majorEastAsia"/>
-        </w:rPr>
-        <w:t>“严格按照包内产业链架构和工业六基目录匹配主导产品；没有直接分类时，给一个相似分类和一个分析判断分类。”</w:t>
+          <w:b w:val="0"/>
+        </w:rPr>
+        <w:t>“请核稿这份高企申请书，检查RD、PS、技术领域、知识产权、成果转化、格式、占位符和逐页版式，并列出待企业确认事项。”</w:t>
       </w:r>
     </w:p>
     <w:p>
@@ -2341,7 +2232,7 @@
           <w:b/>
           <w:bCs/>
         </w:rPr>
-        <w:t>专利</w:t>
+        <w:t>专精特新和小巨人</w:t>
       </w:r>
     </w:p>
     <w:p>
@@ -2369,7 +2260,7 @@
         <w:rPr>
           <w:rFonts w:hint="eastAsia" w:asciiTheme="majorEastAsia" w:hAnsiTheme="majorEastAsia" w:eastAsiaTheme="majorEastAsia" w:cstheme="majorEastAsia"/>
         </w:rPr>
-        <w:t>“根据现有资料和项目要求，为这家企业规划10个专利方向，并说明每个方向与产品、技术问题和项目指标的关系。”</w:t>
+        <w:t>“请先识别并让我确认申请书项目类型和版本，再体检这份材料。”</w:t>
       </w:r>
     </w:p>
     <w:p>
@@ -2397,7 +2288,7 @@
         <w:rPr>
           <w:rFonts w:hint="eastAsia" w:asciiTheme="majorEastAsia" w:hAnsiTheme="majorEastAsia" w:eastAsiaTheme="majorEastAsia" w:cstheme="majorEastAsia"/>
         </w:rPr>
-        <w:t>“对这项产品做FTO初筛，区分公开文本、授权文本和法律状态，并列出仍需人工核验的权利要求。”</w:t>
+        <w:t>“按现行优质中小企业梯度培育管理办法，分析企业差距，并对主导产品、补短板、填空白、国产替代分别给出保留、替换或补证后保留结论。”</w:t>
       </w:r>
     </w:p>
     <w:p>
@@ -2425,7 +2316,7 @@
         <w:rPr>
           <w:rFonts w:hint="eastAsia" w:asciiTheme="majorEastAsia" w:hAnsiTheme="majorEastAsia" w:eastAsiaTheme="majorEastAsia" w:cstheme="majorEastAsia"/>
         </w:rPr>
-        <w:t>“审查这份专利交底书或申请文件，检查权利要求依附关系、保护范围、支持性和提交前风险。”</w:t>
+        <w:t>“严格按照包内产业链架构和工业六基目录匹配主导产品；没有直接分类时，给一个相似分类和一个分析判断分类。”</w:t>
       </w:r>
     </w:p>
     <w:p>
@@ -2461,7 +2352,7 @@
           <w:b/>
           <w:bCs/>
         </w:rPr>
-        <w:t>法律与财税</w:t>
+        <w:t>专利</w:t>
       </w:r>
     </w:p>
     <w:p>
@@ -2489,7 +2380,7 @@
         <w:rPr>
           <w:rFonts w:hint="eastAsia" w:asciiTheme="majorEastAsia" w:hAnsiTheme="majorEastAsia" w:eastAsiaTheme="majorEastAsia" w:cstheme="majorEastAsia"/>
         </w:rPr>
-        <w:t>“帮我排查这么做的法律风险，按事实、适用法规、风险等级、补证材料和整改动作输出。”</w:t>
+        <w:t>“根据现有资料和项目要求，为这家企业规划10个专利方向，并说明每个方向与产品、技术问题和项目指标的关系。”</w:t>
       </w:r>
     </w:p>
     <w:p>
@@ -2517,7 +2408,7 @@
         <w:rPr>
           <w:rFonts w:hint="eastAsia" w:asciiTheme="majorEastAsia" w:hAnsiTheme="majorEastAsia" w:eastAsiaTheme="majorEastAsia" w:cstheme="majorEastAsia"/>
         </w:rPr>
-        <w:t>“按新公司法为这家企业做合规自查，重点检查出资、章程、治理、关联交易、股权转让、减资和清算风险。”</w:t>
+        <w:t>“对这项产品做FTO初筛，区分公开文本、授权文本和法律状态，并列出仍需人工核验的权利要求。”</w:t>
       </w:r>
     </w:p>
     <w:p>
@@ -2545,7 +2436,7 @@
         <w:rPr>
           <w:rFonts w:hint="eastAsia" w:asciiTheme="majorEastAsia" w:hAnsiTheme="majorEastAsia" w:eastAsiaTheme="majorEastAsia" w:cstheme="majorEastAsia"/>
         </w:rPr>
-        <w:t>“帮我出具这家企业金税四期分析报告，复算近三年财务指标，区分已证实风险和待补证信号。”</w:t>
+        <w:t>“审查这份专利交底书或申请文件，检查权利要求依附关系、保护范围、支持性和提交前风险。”</w:t>
       </w:r>
     </w:p>
     <w:p>
@@ -2581,7 +2472,7 @@
           <w:b/>
           <w:bCs/>
         </w:rPr>
-        <w:t>政策版本与材料审查</w:t>
+        <w:t>法律与财税</w:t>
       </w:r>
     </w:p>
     <w:p>
@@ -2609,7 +2500,7 @@
         <w:rPr>
           <w:rFonts w:hint="eastAsia" w:asciiTheme="majorEastAsia" w:hAnsiTheme="majorEastAsia" w:eastAsiaTheme="majorEastAsia" w:cstheme="majorEastAsia"/>
         </w:rPr>
-        <w:t>“核验这个政策是否仍然有效；如已废止，给出废止或替代依据、新项目名称、现行条件和官方原文。”</w:t>
+        <w:t>“帮我排查这么做的法律风险，按事实、适用法规、风险等级、补证材料和整改动作输出。”</w:t>
       </w:r>
     </w:p>
     <w:p>
@@ -2637,7 +2528,7 @@
         <w:rPr>
           <w:rFonts w:hint="eastAsia" w:asciiTheme="majorEastAsia" w:hAnsiTheme="majorEastAsia" w:eastAsiaTheme="majorEastAsia" w:cstheme="majorEastAsia"/>
         </w:rPr>
-        <w:t>“帮我体检这份申报材料，检查数字、事实、主导产品、知识产权和章节之间的一致性。”</w:t>
+        <w:t>“按新公司法为这家企业做合规自查，重点检查出资、章程、治理、关联交易、股权转让、减资和清算风险。”</w:t>
       </w:r>
     </w:p>
     <w:p>
@@ -2665,18 +2556,18 @@
         <w:rPr>
           <w:rFonts w:hint="eastAsia" w:asciiTheme="majorEastAsia" w:hAnsiTheme="majorEastAsia" w:eastAsiaTheme="majorEastAsia" w:cstheme="majorEastAsia"/>
         </w:rPr>
-        <w:t>“对比这两个版本的申报材料，列出数据变化、表述升级、遗漏和新增风险。”</w:t>
-      </w:r>
-    </w:p>
-    <w:p>
-      <w:pPr>
-        <w:keepNext w:val="0"/>
-        <w:keepLines w:val="0"/>
-        <w:pageBreakBefore w:val="0"/>
-        <w:widowControl w:val="0"/>
-        <w:numPr>
-          <w:ilvl w:val="0"/>
-          <w:numId w:val="1"/>
+        <w:t>“帮我出具这家企业金税四期分析报告，复算近三年财务指标，区分已证实风险和待补证信号。”</w:t>
+      </w:r>
+    </w:p>
+    <w:p>
+      <w:pPr>
+        <w:keepNext w:val="0"/>
+        <w:keepLines w:val="0"/>
+        <w:pageBreakBefore w:val="0"/>
+        <w:widowControl w:val="0"/>
+        <w:numPr>
+          <w:ilvl w:val="0"/>
+          <w:numId w:val="9"/>
         </w:numPr>
         <w:kinsoku/>
         <w:wordWrap/>
@@ -2701,13 +2592,133 @@
           <w:b/>
           <w:bCs/>
         </w:rPr>
+        <w:t>政策版本与材料审查</w:t>
+      </w:r>
+    </w:p>
+    <w:p>
+      <w:pPr>
+        <w:keepNext w:val="0"/>
+        <w:keepLines w:val="0"/>
+        <w:pageBreakBefore w:val="0"/>
+        <w:widowControl w:val="0"/>
+        <w:kinsoku/>
+        <w:wordWrap/>
+        <w:overflowPunct/>
+        <w:topLinePunct w:val="0"/>
+        <w:autoSpaceDE/>
+        <w:autoSpaceDN/>
+        <w:bidi w:val="0"/>
+        <w:adjustRightInd/>
+        <w:snapToGrid/>
+        <w:ind w:firstLine="420" w:firstLineChars="200"/>
+        <w:textAlignment w:val="auto"/>
+        <w:rPr>
+          <w:rFonts w:hint="eastAsia" w:asciiTheme="majorEastAsia" w:hAnsiTheme="majorEastAsia" w:eastAsiaTheme="majorEastAsia" w:cstheme="majorEastAsia"/>
+        </w:rPr>
+      </w:pPr>
+      <w:r>
+        <w:rPr>
+          <w:rFonts w:hint="eastAsia" w:asciiTheme="majorEastAsia" w:hAnsiTheme="majorEastAsia" w:eastAsiaTheme="majorEastAsia" w:cstheme="majorEastAsia"/>
+        </w:rPr>
+        <w:t>“核验这个政策是否仍然有效；如已废止，给出废止或替代依据、新项目名称、现行条件和官方原文。”</w:t>
+      </w:r>
+    </w:p>
+    <w:p>
+      <w:pPr>
+        <w:keepNext w:val="0"/>
+        <w:keepLines w:val="0"/>
+        <w:pageBreakBefore w:val="0"/>
+        <w:widowControl w:val="0"/>
+        <w:kinsoku/>
+        <w:wordWrap/>
+        <w:overflowPunct/>
+        <w:topLinePunct w:val="0"/>
+        <w:autoSpaceDE/>
+        <w:autoSpaceDN/>
+        <w:bidi w:val="0"/>
+        <w:adjustRightInd/>
+        <w:snapToGrid/>
+        <w:ind w:firstLine="420" w:firstLineChars="200"/>
+        <w:textAlignment w:val="auto"/>
+        <w:rPr>
+          <w:rFonts w:hint="eastAsia" w:asciiTheme="majorEastAsia" w:hAnsiTheme="majorEastAsia" w:eastAsiaTheme="majorEastAsia" w:cstheme="majorEastAsia"/>
+        </w:rPr>
+      </w:pPr>
+      <w:r>
+        <w:rPr>
+          <w:rFonts w:hint="eastAsia" w:asciiTheme="majorEastAsia" w:hAnsiTheme="majorEastAsia" w:eastAsiaTheme="majorEastAsia" w:cstheme="majorEastAsia"/>
+        </w:rPr>
+        <w:t>“帮我体检这份申报材料，检查数字、事实、主导产品、知识产权和章节之间的一致性。”</w:t>
+      </w:r>
+    </w:p>
+    <w:p>
+      <w:pPr>
+        <w:keepNext w:val="0"/>
+        <w:keepLines w:val="0"/>
+        <w:pageBreakBefore w:val="0"/>
+        <w:widowControl w:val="0"/>
+        <w:kinsoku/>
+        <w:wordWrap/>
+        <w:overflowPunct/>
+        <w:topLinePunct w:val="0"/>
+        <w:autoSpaceDE/>
+        <w:autoSpaceDN/>
+        <w:bidi w:val="0"/>
+        <w:adjustRightInd/>
+        <w:snapToGrid/>
+        <w:ind w:firstLine="420" w:firstLineChars="200"/>
+        <w:textAlignment w:val="auto"/>
+        <w:rPr>
+          <w:rFonts w:hint="eastAsia" w:asciiTheme="majorEastAsia" w:hAnsiTheme="majorEastAsia" w:eastAsiaTheme="majorEastAsia" w:cstheme="majorEastAsia"/>
+        </w:rPr>
+      </w:pPr>
+      <w:r>
+        <w:rPr>
+          <w:rFonts w:hint="eastAsia" w:asciiTheme="majorEastAsia" w:hAnsiTheme="majorEastAsia" w:eastAsiaTheme="majorEastAsia" w:cstheme="majorEastAsia"/>
+        </w:rPr>
+        <w:t>“对比这两个版本的申报材料，列出数据变化、表述升级、遗漏和新增风险。”</w:t>
+      </w:r>
+    </w:p>
+    <w:p>
+      <w:pPr>
+        <w:keepNext/>
+        <w:keepLines w:val="0"/>
+        <w:pageBreakBefore w:val="0"/>
+        <w:widowControl w:val="0"/>
+        <w:numPr>
+          <w:ilvl w:val="0"/>
+          <w:numId w:val="1"/>
+        </w:numPr>
+        <w:kinsoku/>
+        <w:wordWrap/>
+        <w:overflowPunct/>
+        <w:topLinePunct w:val="0"/>
+        <w:autoSpaceDE/>
+        <w:autoSpaceDN/>
+        <w:bidi w:val="0"/>
+        <w:adjustRightInd/>
+        <w:snapToGrid/>
+        <w:ind w:left="425" w:leftChars="0" w:hanging="425" w:firstLineChars="0"/>
+        <w:textAlignment w:val="auto"/>
+        <w:rPr>
+          <w:rFonts w:hint="eastAsia" w:asciiTheme="majorEastAsia" w:hAnsiTheme="majorEastAsia" w:eastAsiaTheme="majorEastAsia" w:cstheme="majorEastAsia"/>
+          <w:b/>
+          <w:bCs/>
+        </w:rPr>
+      </w:pPr>
+      <w:r>
+        <w:rPr>
+          <w:rFonts w:hint="eastAsia" w:asciiTheme="majorEastAsia" w:hAnsiTheme="majorEastAsia" w:eastAsiaTheme="majorEastAsia" w:cstheme="majorEastAsia"/>
+          <w:b/>
+          <w:bCs/>
+        </w:rPr>
         <w:t>更新与问题处理</w:t>
       </w:r>
     </w:p>
     <w:p>
       <w:pPr>
         <w:keepNext w:val="0"/>
-        <w:keepLines w:val="0"/>
+        <w:keepLines/>
         <w:pageBreakBefore w:val="0"/>
         <w:widowControl w:val="0"/>
         <w:kinsoku/>
@@ -2728,8 +2739,9 @@
       <w:r>
         <w:rPr>
           <w:rFonts w:hint="eastAsia" w:asciiTheme="majorEastAsia" w:hAnsiTheme="majorEastAsia" w:eastAsiaTheme="majorEastAsia" w:cstheme="majorEastAsia"/>
-        </w:rPr>
-        <w:t>网站“Skills下载”显示最新版、发布时间和更新说明。</w:t>
+          <w:b/>
+        </w:rPr>
+        <w:t>V1.3.1包含49个Skills，新增高企申请书撰写、扩表、回填与核稿能力。</w:t>
       </w:r>
     </w:p>
     <w:p>
@@ -2757,15 +2769,7 @@
         <w:rPr>
           <w:rFonts w:hint="eastAsia" w:asciiTheme="majorEastAsia" w:hAnsiTheme="majorEastAsia" w:eastAsiaTheme="majorEastAsia" w:cstheme="majorEastAsia"/>
         </w:rPr>
-        <w:t>升级时用</w:t>
-      </w:r>
-      <w:bookmarkStart w:id="0" w:name="_GoBack"/>
-      <w:bookmarkEnd w:id="0"/>
-      <w:r>
-        <w:rPr>
-          <w:rFonts w:hint="eastAsia" w:asciiTheme="majorEastAsia" w:hAnsiTheme="majorEastAsia" w:eastAsiaTheme="majorEastAsia" w:cstheme="majorEastAsia"/>
-        </w:rPr>
-        <w:t>新的`skills`文件夹替换旧版标准Skills，保留个人项目资料和本地政策规则。</w:t>
+        <w:t>网站“Skills中心”显示最新版、发布时间、更新说明和安装平台。</w:t>
       </w:r>
     </w:p>
     <w:p>
@@ -2793,6 +2797,34 @@
         <w:rPr>
           <w:rFonts w:hint="eastAsia" w:asciiTheme="majorEastAsia" w:hAnsiTheme="majorEastAsia" w:eastAsiaTheme="majorEastAsia" w:cstheme="majorEastAsia"/>
         </w:rPr>
+        <w:t>升级时运行首次配置向导的继承工具。新版官方核心、个人覆盖层和云端偏好分别继承，旧文件进入可恢复备份，不直接覆盖个人项目资料。</w:t>
+      </w:r>
+    </w:p>
+    <w:p>
+      <w:pPr>
+        <w:keepNext w:val="0"/>
+        <w:keepLines w:val="0"/>
+        <w:pageBreakBefore w:val="0"/>
+        <w:widowControl w:val="0"/>
+        <w:kinsoku/>
+        <w:wordWrap/>
+        <w:overflowPunct/>
+        <w:topLinePunct w:val="0"/>
+        <w:autoSpaceDE/>
+        <w:autoSpaceDN/>
+        <w:bidi w:val="0"/>
+        <w:adjustRightInd/>
+        <w:snapToGrid/>
+        <w:ind w:firstLine="420" w:firstLineChars="200"/>
+        <w:textAlignment w:val="auto"/>
+        <w:rPr>
+          <w:rFonts w:hint="eastAsia" w:asciiTheme="majorEastAsia" w:hAnsiTheme="majorEastAsia" w:eastAsiaTheme="majorEastAsia" w:cstheme="majorEastAsia"/>
+        </w:rPr>
+      </w:pPr>
+      <w:r>
+        <w:rPr>
+          <w:rFonts w:hint="eastAsia" w:asciiTheme="majorEastAsia" w:hAnsiTheme="majorEastAsia" w:eastAsiaTheme="majorEastAsia" w:cstheme="majorEastAsia"/>
+        </w:rPr>
         <w:t>出现401：检查个人凭据是否完整、是否已被吊销，再重新生成并执行五步验收。</w:t>
       </w:r>
     </w:p>
@@ -2853,35 +2885,13 @@
       </w:r>
     </w:p>
     <w:sectPr>
-      <w:headerReference w:type="default" r:id="rId6"/>
-      <w:footerReference w:type="default" r:id="rId7"/>
       <w:pgSz w:w="11906" w:h="16838"/>
-      <w:pgMar w:top="1440" w:right="1800" w:bottom="1440" w:left="1800" w:header="851" w:footer="992" w:gutter="0"/>
+      <w:pgMar w:top="1080" w:right="1440" w:bottom="1080" w:left="1440" w:header="851" w:footer="992" w:gutter="0"/>
       <w:cols w:space="425" w:num="1"/>
       <w:docGrid w:type="lines" w:linePitch="312" w:charSpace="0"/>
     </w:sectPr>
   </w:body>
 </w:document>
-</file>
-
-<file path=word/footer1.xml><?xml version="1.0" encoding="utf-8"?>
-<w:ftr xmlns:m="http://schemas.openxmlformats.org/officeDocument/2006/math" xmlns:mc="http://schemas.openxmlformats.org/markup-compatibility/2006" xmlns:mo="http://schemas.microsoft.com/office/mac/office/2008/main" xmlns:mv="urn:schemas-microsoft-com:mac:vml" xmlns:o="urn:schemas-microsoft-com:office:office" xmlns:r="http://schemas.openxmlformats.org/officeDocument/2006/relationships" xmlns:v="urn:schemas-microsoft-com:vml" xmlns:w10="urn:schemas-microsoft-com:office:word" xmlns:w14="http://schemas.microsoft.com/office/word/2010/wordml" xmlns:w="http://schemas.openxmlformats.org/wordprocessingml/2006/main" xmlns:wne="http://schemas.microsoft.com/office/word/2006/wordml" xmlns:wp14="http://schemas.microsoft.com/office/word/2010/wordprocessingDrawing" xmlns:wp="http://schemas.openxmlformats.org/drawingml/2006/wordprocessingDrawing" xmlns:wpc="http://schemas.microsoft.com/office/word/2010/wordprocessingCanvas" xmlns:wpg="http://schemas.microsoft.com/office/word/2010/wordprocessingGroup" xmlns:wpi="http://schemas.microsoft.com/office/word/2010/wordprocessingInk" xmlns:wps="http://schemas.microsoft.com/office/word/2010/wordprocessingShape" mc:Ignorable="w14 wp14">
-  <w:p>
-    <w:pPr>
-      <w:pStyle w:val="Footer"/>
-    </w:pPr>
-  </w:p>
-</w:ftr>
-</file>
-
-<file path=word/header1.xml><?xml version="1.0" encoding="utf-8"?>
-<w:hdr xmlns:m="http://schemas.openxmlformats.org/officeDocument/2006/math" xmlns:mc="http://schemas.openxmlformats.org/markup-compatibility/2006" xmlns:mo="http://schemas.microsoft.com/office/mac/office/2008/main" xmlns:mv="urn:schemas-microsoft-com:mac:vml" xmlns:o="urn:schemas-microsoft-com:office:office" xmlns:r="http://schemas.openxmlformats.org/officeDocument/2006/relationships" xmlns:v="urn:schemas-microsoft-com:vml" xmlns:w10="urn:schemas-microsoft-com:office:word" xmlns:w14="http://schemas.microsoft.com/office/word/2010/wordml" xmlns:w="http://schemas.openxmlformats.org/wordprocessingml/2006/main" xmlns:wne="http://schemas.microsoft.com/office/word/2006/wordml" xmlns:wp14="http://schemas.microsoft.com/office/word/2010/wordprocessingDrawing" xmlns:wp="http://schemas.openxmlformats.org/drawingml/2006/wordprocessingDrawing" xmlns:wpc="http://schemas.microsoft.com/office/word/2010/wordprocessingCanvas" xmlns:wpg="http://schemas.microsoft.com/office/word/2010/wordprocessingGroup" xmlns:wpi="http://schemas.microsoft.com/office/word/2010/wordprocessingInk" xmlns:wps="http://schemas.microsoft.com/office/word/2010/wordprocessingShape" mc:Ignorable="w14 wp14">
-  <w:p>
-    <w:pPr>
-      <w:pStyle w:val="Header"/>
-    </w:pPr>
-  </w:p>
-</w:hdr>
 </file>
 
 <file path=word/numbering.xml><?xml version="1.0" encoding="utf-8"?>

</xml_diff>

<commit_message>
release: prepare Windows V1.3.1.2 hotfix
</commit_message>
<xml_diff>
--- a/docs/user-guide/企业全生命周期助手用户使用手册.docx
+++ b/docs/user-guide/企业全生命周期助手用户使用手册.docx
@@ -59,7 +59,7 @@
           <w:b/>
           <w:sz w:val="32"/>
         </w:rPr>
-        <w:t>适用版本：V1.3.1</w:t>
+        <w:t>适用版本：V1.3.1.2</w:t>
       </w:r>
     </w:p>
     <w:p>
@@ -88,6 +88,46 @@
           <w:rFonts w:hint="eastAsia" w:asciiTheme="majorEastAsia" w:hAnsiTheme="majorEastAsia" w:eastAsiaTheme="majorEastAsia" w:cstheme="majorEastAsia"/>
         </w:rPr>
         <w:t>本手册面向共创团队成员。企业全生命周期助手由49个平台无关Skills、团队云端知识库、REST API和MCP组成，可导入支持Skills的Agent使用。</w:t>
+      </w:r>
+    </w:p>
+    <w:p>
+      <w:r>
+        <w:t>本版本更新：修复 WorkBuddy Windows 安装卡住问题，并增加 bootstrap_url 一键复制。</w:t>
+      </w:r>
+    </w:p>
+    <w:p>
+      <w:r>
+        <w:t>能力变化：Windows 用户解压签名包后可直接双击 .cmd；安装器会在调用插件 CLI 前检查并等待 WorkBuddy 完全退出，避免本地端口冲突导致无输出卡住；API 与用户页、Skills 管理中心的手工配置确认按钮会生成并复制一次性 bootstrap_url；浏览器拒绝剪贴板权限时保留下方手工复制兜底；本次只发布 WorkBuddy Windows 包；macOS 继续使用 V1.3.1.1，通用 Skills 继续使用最近一次正式版本，49 项技能内容不变。</w:t>
+      </w:r>
+    </w:p>
+    <w:p>
+      <w:r>
+        <w:t>通用安装：支持 SKILL.md 的 Agent 使用通用 Skills 包，导入 skills 目录后启动首次配置向导。</w:t>
+      </w:r>
+    </w:p>
+    <w:p>
+      <w:r>
+        <w:t>WorkBuddy 安装：Windows 用户解压 V1.3.1.2 签名包并直接双击 install-jiaotang-workbuddy.cmd；macOS 用户继续使用 V1.3.1.1，无需更新。</w:t>
+      </w:r>
+    </w:p>
+    <w:p>
+      <w:r>
+        <w:t>手工接入：从 API 与用户页或 Skills 管理中心完成公开说明审查后，点击生成并复制 bootstrap_url，再粘贴到 WorkBuddy 插件敏感配置。</w:t>
+      </w:r>
+    </w:p>
+    <w:p>
+      <w:r>
+        <w:t>安装验收：安装后必须核对技能清单，并完成身份、检索、文档读取、用量和 MCP 工具调用验收。</w:t>
+      </w:r>
+    </w:p>
+    <w:p>
+      <w:r>
+        <w:t>兼容性：通用 Skills：已验证，适用于能够导入 SKILL.md 的 Agent；macOS WorkBuddy：保持 V1.3.1.1，本次未修改 macOS 包，不要求更新；原有安装、设备绑定、系统凭据和 MCP 接入继续有效；Windows WorkBuddy：热修复，已完成安装器契约、安全、完整性和端口冲突保护检查；真实 Windows 宿主安装仍需发布后按五步流程复验。</w:t>
+      </w:r>
+    </w:p>
+    <w:p>
+      <w:r>
+        <w:t>回滚：通用 Skills 回滚时恢复上一版本 skills 目录，并重新运行安装完整性检查；Windows WorkBuddy 回滚时执行安装计划展示的撤销命令，再安装 V1.3.1.1；macOS 无需回滚；回滚不得覆盖个人项目资料、本地政策规则、个人偏好或系统凭据。</w:t>
       </w:r>
     </w:p>
     <w:p>
@@ -571,7 +611,7 @@
         <w:rPr>
           <w:rFonts w:hint="eastAsia" w:asciiTheme="majorEastAsia" w:hAnsiTheme="majorEastAsia" w:eastAsiaTheme="majorEastAsia" w:cstheme="majorEastAsia"/>
         </w:rPr>
-        <w:t>按宿主下载V1.3.1通用Skills ZIP或V1.3.1 WorkBuddy插件ZIP。</w:t>
+        <w:t>按宿主下载V1.3.1.2通用Skills ZIP或V1.3.1.2 WorkBuddy插件ZIP。</w:t>
       </w:r>
     </w:p>
     <w:p>
@@ -2167,7 +2207,7 @@
           <w:rFonts w:hint="eastAsia" w:asciiTheme="majorEastAsia" w:hAnsiTheme="majorEastAsia" w:eastAsiaTheme="majorEastAsia" w:cstheme="majorEastAsia"/>
           <w:b w:val="0"/>
         </w:rPr>
-        <w:t>“请按V1.3.1空白母版，使用我提供的企业、RD、知识产权、成果转化和PS资料撰写并回填高企申请书；缺失数据保留待核定，不得补造。”</w:t>
+        <w:t>“请按V1.3.1.2空白母版，使用我提供的企业、RD、知识产权、成果转化和PS资料撰写并回填高企申请书；缺失数据保留待核定，不得补造。”</w:t>
       </w:r>
     </w:p>
     <w:p>
@@ -2741,7 +2781,7 @@
           <w:rFonts w:hint="eastAsia" w:asciiTheme="majorEastAsia" w:hAnsiTheme="majorEastAsia" w:eastAsiaTheme="majorEastAsia" w:cstheme="majorEastAsia"/>
           <w:b/>
         </w:rPr>
-        <w:t>V1.3.1包含49个Skills，新增高企申请书撰写、扩表、回填与核稿能力。</w:t>
+        <w:t>V1.3.1.2包含49个Skills，新增高企申请书撰写、扩表、回填与核稿能力。</w:t>
       </w:r>
     </w:p>
     <w:p>
@@ -2885,6 +2925,9 @@
       </w:r>
     </w:p>
     <w:sectPr>
+      <w:headerReference w:type="default" r:id="rId6"/>
+      <w:headerReference w:type="first" r:id="rId7"/>
+      <w:headerReference w:type="even" r:id="rId8"/>
       <w:pgSz w:w="11906" w:h="16838"/>
       <w:pgMar w:top="1080" w:right="1440" w:bottom="1080" w:left="1440" w:header="851" w:footer="992" w:gutter="0"/>
       <w:cols w:space="425" w:num="1"/>
@@ -2892,6 +2935,171 @@
     </w:sectPr>
   </w:body>
 </w:document>
+</file>
+
+<file path=word/header1.xml><?xml version="1.0" encoding="utf-8"?>
+<w:hdr xmlns:m="http://schemas.openxmlformats.org/officeDocument/2006/math" xmlns:mc="http://schemas.openxmlformats.org/markup-compatibility/2006" xmlns:mo="http://schemas.microsoft.com/office/mac/office/2008/main" xmlns:mv="urn:schemas-microsoft-com:mac:vml" xmlns:o="urn:schemas-microsoft-com:office:office" xmlns:r="http://schemas.openxmlformats.org/officeDocument/2006/relationships" xmlns:v="urn:schemas-microsoft-com:vml" xmlns:w10="urn:schemas-microsoft-com:office:word" xmlns:w14="http://schemas.microsoft.com/office/word/2010/wordml" xmlns:w="http://schemas.openxmlformats.org/wordprocessingml/2006/main" xmlns:wne="http://schemas.microsoft.com/office/word/2006/wordml" xmlns:wp14="http://schemas.microsoft.com/office/word/2010/wordprocessingDrawing" xmlns:wp="http://schemas.openxmlformats.org/drawingml/2006/wordprocessingDrawing" xmlns:wpc="http://schemas.microsoft.com/office/word/2010/wordprocessingCanvas" xmlns:wpg="http://schemas.microsoft.com/office/word/2010/wordprocessingGroup" xmlns:wpi="http://schemas.microsoft.com/office/word/2010/wordprocessingInk" xmlns:wps="http://schemas.microsoft.com/office/word/2010/wordprocessingShape" mc:Ignorable="w14 wp14">
+  <w:p>
+    <w:pPr>
+      <w:pStyle w:val="Header"/>
+    </w:pPr>
+  </w:p>
+  <w:p>
+    <w:r>
+      <w:drawing>
+        <wp:anchor distT="0" distB="0" distL="0" distR="0" simplePos="0" relativeHeight="251658240" behindDoc="0" locked="0" layoutInCell="1" allowOverlap="1">
+          <wp:simplePos x="0" y="0"/>
+          <wp:positionH relativeFrom="page">
+            <wp:align>center</wp:align>
+          </wp:positionH>
+          <wp:positionV relativeFrom="page">
+            <wp:align>center</wp:align>
+          </wp:positionV>
+          <wp:extent cx="4233773" cy="4233773"/>
+          <wp:effectExtent l="0" t="0" r="0" b="0"/>
+          <wp:wrapNone/>
+          <wp:docPr id="1" name="Jiaotang Centered Watermark v3" descr="Jiaotang Centered Watermark v3"/>
+          <wp:cNvGraphicFramePr>
+            <a:graphicFrameLocks xmlns:a="http://schemas.openxmlformats.org/drawingml/2006/main" noChangeAspect="1"/>
+          </wp:cNvGraphicFramePr>
+          <a:graphic xmlns:a="http://schemas.openxmlformats.org/drawingml/2006/main" xmlns:pic="http://schemas.openxmlformats.org/drawingml/2006/picture">
+            <a:graphicData uri="http://schemas.openxmlformats.org/drawingml/2006/picture">
+              <pic:pic>
+                <pic:nvPicPr>
+                  <pic:cNvPr id="0" name="brand-red-10.png"/>
+                  <pic:cNvPicPr/>
+                </pic:nvPicPr>
+                <pic:blipFill>
+                  <a:blip r:embed="rId1"/>
+                  <a:stretch>
+                    <a:fillRect/>
+                  </a:stretch>
+                </pic:blipFill>
+                <pic:spPr>
+                  <a:xfrm>
+                    <a:off x="0" y="0"/>
+                    <a:ext cx="4233773" cy="4233773"/>
+                  </a:xfrm>
+                  <a:prstGeom prst="rect"/>
+                </pic:spPr>
+              </pic:pic>
+            </a:graphicData>
+          </a:graphic>
+        </wp:anchor>
+      </w:drawing>
+    </w:r>
+  </w:p>
+</w:hdr>
+</file>
+
+<file path=word/header2.xml><?xml version="1.0" encoding="utf-8"?>
+<w:hdr xmlns:m="http://schemas.openxmlformats.org/officeDocument/2006/math" xmlns:mc="http://schemas.openxmlformats.org/markup-compatibility/2006" xmlns:mo="http://schemas.microsoft.com/office/mac/office/2008/main" xmlns:mv="urn:schemas-microsoft-com:mac:vml" xmlns:o="urn:schemas-microsoft-com:office:office" xmlns:r="http://schemas.openxmlformats.org/officeDocument/2006/relationships" xmlns:v="urn:schemas-microsoft-com:vml" xmlns:w10="urn:schemas-microsoft-com:office:word" xmlns:w14="http://schemas.microsoft.com/office/word/2010/wordml" xmlns:w="http://schemas.openxmlformats.org/wordprocessingml/2006/main" xmlns:wne="http://schemas.microsoft.com/office/word/2006/wordml" xmlns:wp14="http://schemas.microsoft.com/office/word/2010/wordprocessingDrawing" xmlns:wp="http://schemas.openxmlformats.org/drawingml/2006/wordprocessingDrawing" xmlns:wpc="http://schemas.microsoft.com/office/word/2010/wordprocessingCanvas" xmlns:wpg="http://schemas.microsoft.com/office/word/2010/wordprocessingGroup" xmlns:wpi="http://schemas.microsoft.com/office/word/2010/wordprocessingInk" xmlns:wps="http://schemas.microsoft.com/office/word/2010/wordprocessingShape" mc:Ignorable="w14 wp14">
+  <w:p>
+    <w:pPr>
+      <w:pStyle w:val="Header"/>
+    </w:pPr>
+  </w:p>
+  <w:p>
+    <w:r>
+      <w:drawing>
+        <wp:anchor distT="0" distB="0" distL="0" distR="0" simplePos="0" relativeHeight="251658240" behindDoc="0" locked="0" layoutInCell="1" allowOverlap="1">
+          <wp:simplePos x="0" y="0"/>
+          <wp:positionH relativeFrom="page">
+            <wp:align>center</wp:align>
+          </wp:positionH>
+          <wp:positionV relativeFrom="page">
+            <wp:align>center</wp:align>
+          </wp:positionV>
+          <wp:extent cx="4233773" cy="4233773"/>
+          <wp:effectExtent l="0" t="0" r="0" b="0"/>
+          <wp:wrapNone/>
+          <wp:docPr id="1" name="Jiaotang Centered Watermark v3" descr="Jiaotang Centered Watermark v3"/>
+          <wp:cNvGraphicFramePr>
+            <a:graphicFrameLocks xmlns:a="http://schemas.openxmlformats.org/drawingml/2006/main" noChangeAspect="1"/>
+          </wp:cNvGraphicFramePr>
+          <a:graphic xmlns:a="http://schemas.openxmlformats.org/drawingml/2006/main" xmlns:pic="http://schemas.openxmlformats.org/drawingml/2006/picture">
+            <a:graphicData uri="http://schemas.openxmlformats.org/drawingml/2006/picture">
+              <pic:pic>
+                <pic:nvPicPr>
+                  <pic:cNvPr id="0" name="brand-red-10.png"/>
+                  <pic:cNvPicPr/>
+                </pic:nvPicPr>
+                <pic:blipFill>
+                  <a:blip r:embed="rId1"/>
+                  <a:stretch>
+                    <a:fillRect/>
+                  </a:stretch>
+                </pic:blipFill>
+                <pic:spPr>
+                  <a:xfrm>
+                    <a:off x="0" y="0"/>
+                    <a:ext cx="4233773" cy="4233773"/>
+                  </a:xfrm>
+                  <a:prstGeom prst="rect"/>
+                </pic:spPr>
+              </pic:pic>
+            </a:graphicData>
+          </a:graphic>
+        </wp:anchor>
+      </w:drawing>
+    </w:r>
+  </w:p>
+</w:hdr>
+</file>
+
+<file path=word/header3.xml><?xml version="1.0" encoding="utf-8"?>
+<w:hdr xmlns:m="http://schemas.openxmlformats.org/officeDocument/2006/math" xmlns:mc="http://schemas.openxmlformats.org/markup-compatibility/2006" xmlns:mo="http://schemas.microsoft.com/office/mac/office/2008/main" xmlns:mv="urn:schemas-microsoft-com:mac:vml" xmlns:o="urn:schemas-microsoft-com:office:office" xmlns:r="http://schemas.openxmlformats.org/officeDocument/2006/relationships" xmlns:v="urn:schemas-microsoft-com:vml" xmlns:w10="urn:schemas-microsoft-com:office:word" xmlns:w14="http://schemas.microsoft.com/office/word/2010/wordml" xmlns:w="http://schemas.openxmlformats.org/wordprocessingml/2006/main" xmlns:wne="http://schemas.microsoft.com/office/word/2006/wordml" xmlns:wp14="http://schemas.microsoft.com/office/word/2010/wordprocessingDrawing" xmlns:wp="http://schemas.openxmlformats.org/drawingml/2006/wordprocessingDrawing" xmlns:wpc="http://schemas.microsoft.com/office/word/2010/wordprocessingCanvas" xmlns:wpg="http://schemas.microsoft.com/office/word/2010/wordprocessingGroup" xmlns:wpi="http://schemas.microsoft.com/office/word/2010/wordprocessingInk" xmlns:wps="http://schemas.microsoft.com/office/word/2010/wordprocessingShape" mc:Ignorable="w14 wp14">
+  <w:p>
+    <w:pPr>
+      <w:pStyle w:val="Header"/>
+    </w:pPr>
+  </w:p>
+  <w:p>
+    <w:r>
+      <w:drawing>
+        <wp:anchor distT="0" distB="0" distL="0" distR="0" simplePos="0" relativeHeight="251658240" behindDoc="0" locked="0" layoutInCell="1" allowOverlap="1">
+          <wp:simplePos x="0" y="0"/>
+          <wp:positionH relativeFrom="page">
+            <wp:align>center</wp:align>
+          </wp:positionH>
+          <wp:positionV relativeFrom="page">
+            <wp:align>center</wp:align>
+          </wp:positionV>
+          <wp:extent cx="4233773" cy="4233773"/>
+          <wp:effectExtent l="0" t="0" r="0" b="0"/>
+          <wp:wrapNone/>
+          <wp:docPr id="1" name="Jiaotang Centered Watermark v3" descr="Jiaotang Centered Watermark v3"/>
+          <wp:cNvGraphicFramePr>
+            <a:graphicFrameLocks xmlns:a="http://schemas.openxmlformats.org/drawingml/2006/main" noChangeAspect="1"/>
+          </wp:cNvGraphicFramePr>
+          <a:graphic xmlns:a="http://schemas.openxmlformats.org/drawingml/2006/main" xmlns:pic="http://schemas.openxmlformats.org/drawingml/2006/picture">
+            <a:graphicData uri="http://schemas.openxmlformats.org/drawingml/2006/picture">
+              <pic:pic>
+                <pic:nvPicPr>
+                  <pic:cNvPr id="0" name="brand-red-10.png"/>
+                  <pic:cNvPicPr/>
+                </pic:nvPicPr>
+                <pic:blipFill>
+                  <a:blip r:embed="rId1"/>
+                  <a:stretch>
+                    <a:fillRect/>
+                  </a:stretch>
+                </pic:blipFill>
+                <pic:spPr>
+                  <a:xfrm>
+                    <a:off x="0" y="0"/>
+                    <a:ext cx="4233773" cy="4233773"/>
+                  </a:xfrm>
+                  <a:prstGeom prst="rect"/>
+                </pic:spPr>
+              </pic:pic>
+            </a:graphicData>
+          </a:graphic>
+        </wp:anchor>
+      </w:drawing>
+    </w:r>
+  </w:p>
+</w:hdr>
 </file>
 
 <file path=word/numbering.xml><?xml version="1.0" encoding="utf-8"?>

</xml_diff>

<commit_message>
fix: 修复 Windows WorkBuddy MCP 首次连接
</commit_message>
<xml_diff>
--- a/docs/user-guide/企业全生命周期助手用户使用手册.docx
+++ b/docs/user-guide/企业全生命周期助手用户使用手册.docx
@@ -132,7 +132,7 @@
                 <w:color w:val="17212B"/>
                 <w:sz w:val="20"/>
               </w:rPr>
-              <w:t>管理器版本与 Skills 内容版本相互独立。当前管理器为 0.2.0，正式 Skills 仍为 V1.3.1.2，共 49 项。桌面客户端采用未签名本机授权分发；应用身份与 Skills 内容验真是两条独立信任链。系统或企业策略不允许未签名应用时，继续使用 HTTPS PWA，不关闭系统防护。</w:t>
+              <w:t>管理器版本与 Skills 内容版本相互独立。当前管理器为 0.2.0，正式 Skills 为 V1.3.1.3，共 49 项。桌面客户端采用未签名本机授权分发；应用身份与 Skills 内容验真是两条独立信任链。系统或企业策略不允许未签名应用时，继续使用 HTTPS PWA，不关闭系统防护。</w:t>
             </w:r>
           </w:p>
         </w:tc>
@@ -3052,7 +3052,7 @@
           <w:color w:val="17212B"/>
           <w:sz w:val="21"/>
         </w:rPr>
-        <w:t>管理器“关于”或安全中心显示版本 0.2.0，Skills 清单显示 V1.3.1.2 与 49 项。</w:t>
+        <w:t>管理器“关于”或安全中心显示版本 0.2.0，Skills 清单显示 V1.3.1.3 与 49 项。</w:t>
       </w:r>
     </w:p>
     <w:p>

</xml_diff>

<commit_message>
fix: 修复 Windows WorkBuddy MCP 首次连接 (#63)
Co-authored-by: 项目申报助手 <project-application-assistant@users.noreply.github.com>
</commit_message>
<xml_diff>
--- a/docs/user-guide/企业全生命周期助手用户使用手册.docx
+++ b/docs/user-guide/企业全生命周期助手用户使用手册.docx
@@ -132,7 +132,7 @@
                 <w:color w:val="17212B"/>
                 <w:sz w:val="20"/>
               </w:rPr>
-              <w:t>管理器版本与 Skills 内容版本相互独立。当前管理器为 0.2.0，正式 Skills 仍为 V1.3.1.2，共 49 项。桌面客户端采用未签名本机授权分发；应用身份与 Skills 内容验真是两条独立信任链。系统或企业策略不允许未签名应用时，继续使用 HTTPS PWA，不关闭系统防护。</w:t>
+              <w:t>管理器版本与 Skills 内容版本相互独立。当前管理器为 0.2.0，正式 Skills 为 V1.3.1.3，共 49 项。桌面客户端采用未签名本机授权分发；应用身份与 Skills 内容验真是两条独立信任链。系统或企业策略不允许未签名应用时，继续使用 HTTPS PWA，不关闭系统防护。</w:t>
             </w:r>
           </w:p>
         </w:tc>
@@ -3052,7 +3052,7 @@
           <w:color w:val="17212B"/>
           <w:sz w:val="21"/>
         </w:rPr>
-        <w:t>管理器“关于”或安全中心显示版本 0.2.0，Skills 清单显示 V1.3.1.2 与 49 项。</w:t>
+        <w:t>管理器“关于”或安全中心显示版本 0.2.0，Skills 清单显示 V1.3.1.3 与 49 项。</w:t>
       </w:r>
     </w:p>
     <w:p>

</xml_diff>

<commit_message>
refactor: 发布矩阵收敛为通用版与 WorkBuddy (#66)
Co-authored-by: 夏蝉 <zsh@sccc.local>
</commit_message>
<xml_diff>
--- a/docs/user-guide/企业全生命周期助手用户使用手册.docx
+++ b/docs/user-guide/企业全生命周期助手用户使用手册.docx
@@ -907,7 +907,7 @@
                 <w:color w:val="17212B"/>
                 <w:sz w:val="20"/>
               </w:rPr>
-              <w:t>只有点击“扫描本机 Agent”后才开始。扫描范围限于系统应用目录、常见用户安装目录和已配置命令位置；不读取项目正文、客户资料、聊天记录或用户文档。多个平台命中同一托管目录时只写入一次并登记对应平台。</w:t>
+              <w:t>只有点击“扫描本机 Agent”后才开始。扫描范围限于系统应用目录、常见用户安装目录和已配置命令位置；不读取项目正文、客户资料、聊天记录或用户文档。正式平台扫描只识别 WorkBuddy。</w:t>
             </w:r>
           </w:p>
         </w:tc>
@@ -998,7 +998,7 @@
           <w:color w:val="17212B"/>
           <w:sz w:val="22"/>
         </w:rPr>
-        <w:t xml:space="preserve">选择平台。 </w:t>
+        <w:t xml:space="preserve">选择产物。 </w:t>
       </w:r>
       <w:r>
         <w:rPr>
@@ -1006,7 +1006,7 @@
           <w:color w:val="17212B"/>
           <w:sz w:val="22"/>
         </w:rPr>
-        <w:t>已安装平台显示对应导入按钮；未安装平台仍保留在主流平台清单中。</w:t>
+        <w:t>根据宿主能力选择通用版或 WorkBuddy 跨平台版。</w:t>
       </w:r>
     </w:p>
     <w:p>
@@ -1102,7 +1102,7 @@
           <w:color w:val="2E74B5"/>
           <w:sz w:val="26"/>
         </w:rPr>
-        <w:t>六个平台的当前动作</w:t>
+        <w:t>两个正式产物的当前动作</w:t>
       </w:r>
     </w:p>
     <w:tbl>
@@ -1389,7 +1389,7 @@
                 <w:color w:val="17212B"/>
                 <w:sz w:val="17"/>
               </w:rPr>
-              <w:t>TRAE</w:t>
+              <w:t>通用版</w:t>
             </w:r>
           </w:p>
         </w:tc>
@@ -1416,7 +1416,7 @@
                 <w:color w:val="17212B"/>
                 <w:sz w:val="17"/>
               </w:rPr>
-              <w:t>应用与用户目录</w:t>
+              <w:t>标准 Skills 入口</w:t>
             </w:r>
           </w:p>
         </w:tc>
@@ -1443,7 +1443,7 @@
                 <w:color w:val="17212B"/>
                 <w:sz w:val="17"/>
               </w:rPr>
-              <w:t>向稳定用户级 Skills 目录一键导入</w:t>
+              <w:t>下载并验签通用 Skills 包</w:t>
             </w:r>
           </w:p>
         </w:tc>
@@ -1470,459 +1470,7 @@
                 <w:color w:val="17212B"/>
                 <w:sz w:val="17"/>
               </w:rPr>
-              <w:t>新建会话并复验</w:t>
-            </w:r>
-          </w:p>
-        </w:tc>
-      </w:tr>
-      <w:tr>
-        <w:trPr>
-          <w:cantSplit w:val="1"/>
-        </w:trPr>
-        <w:tc>
-          <w:tcPr>
-            <w:tcW w:type="dxa" w:w="1450"/>
-            <w:vAlign w:val="center"/>
-            <w:tcMar>
-              <w:top w:w="90" w:type="dxa"/>
-              <w:bottom w:w="90" w:type="dxa"/>
-              <w:start w:w="120" w:type="dxa"/>
-              <w:end w:w="120" w:type="dxa"/>
-            </w:tcMar>
-          </w:tcPr>
-          <w:p>
-            <w:pPr>
-              <w:widowControl/>
-              <w:spacing w:before="0" w:after="0" w:line="269" w:lineRule="auto"/>
-              <w:jc w:val="center"/>
-            </w:pPr>
-            <w:r>
-              <w:rPr>
-                <w:rFonts w:ascii="Arial Unicode MS" w:hAnsi="Arial Unicode MS" w:eastAsia="Arial Unicode MS" w:cs="Arial Unicode MS"/>
-                <w:color w:val="17212B"/>
-                <w:sz w:val="17"/>
-              </w:rPr>
-              <w:t>Kimi Code</w:t>
-            </w:r>
-          </w:p>
-        </w:tc>
-        <w:tc>
-          <w:tcPr>
-            <w:tcW w:type="dxa" w:w="1800"/>
-            <w:vAlign w:val="center"/>
-            <w:tcMar>
-              <w:top w:w="90" w:type="dxa"/>
-              <w:bottom w:w="90" w:type="dxa"/>
-              <w:start w:w="120" w:type="dxa"/>
-              <w:end w:w="120" w:type="dxa"/>
-            </w:tcMar>
-          </w:tcPr>
-          <w:p>
-            <w:pPr>
-              <w:widowControl/>
-              <w:spacing w:before="0" w:after="0" w:line="269" w:lineRule="auto"/>
-              <w:jc w:val="left"/>
-            </w:pPr>
-            <w:r>
-              <w:rPr>
-                <w:rFonts w:ascii="Arial Unicode MS" w:hAnsi="Arial Unicode MS" w:eastAsia="Arial Unicode MS" w:cs="Arial Unicode MS"/>
-                <w:color w:val="17212B"/>
-                <w:sz w:val="17"/>
-              </w:rPr>
-              <w:t>命令位置</w:t>
-            </w:r>
-          </w:p>
-        </w:tc>
-        <w:tc>
-          <w:tcPr>
-            <w:tcW w:type="dxa" w:w="2800"/>
-            <w:vAlign w:val="center"/>
-            <w:tcMar>
-              <w:top w:w="90" w:type="dxa"/>
-              <w:bottom w:w="90" w:type="dxa"/>
-              <w:start w:w="120" w:type="dxa"/>
-              <w:end w:w="120" w:type="dxa"/>
-            </w:tcMar>
-          </w:tcPr>
-          <w:p>
-            <w:pPr>
-              <w:widowControl/>
-              <w:spacing w:before="0" w:after="0" w:line="269" w:lineRule="auto"/>
-              <w:jc w:val="left"/>
-            </w:pPr>
-            <w:r>
-              <w:rPr>
-                <w:rFonts w:ascii="Arial Unicode MS" w:hAnsi="Arial Unicode MS" w:eastAsia="Arial Unicode MS" w:cs="Arial Unicode MS"/>
-                <w:color w:val="17212B"/>
-                <w:sz w:val="17"/>
-              </w:rPr>
-              <w:t>向 ~/.agents/skills 一键导入</w:t>
-            </w:r>
-          </w:p>
-        </w:tc>
-        <w:tc>
-          <w:tcPr>
-            <w:tcW w:type="dxa" w:w="3310"/>
-            <w:vAlign w:val="center"/>
-            <w:tcMar>
-              <w:top w:w="90" w:type="dxa"/>
-              <w:bottom w:w="90" w:type="dxa"/>
-              <w:start w:w="120" w:type="dxa"/>
-              <w:end w:w="120" w:type="dxa"/>
-            </w:tcMar>
-          </w:tcPr>
-          <w:p>
-            <w:pPr>
-              <w:widowControl/>
-              <w:spacing w:before="0" w:after="0" w:line="269" w:lineRule="auto"/>
-              <w:jc w:val="left"/>
-            </w:pPr>
-            <w:r>
-              <w:rPr>
-                <w:rFonts w:ascii="Arial Unicode MS" w:hAnsi="Arial Unicode MS" w:eastAsia="Arial Unicode MS" w:cs="Arial Unicode MS"/>
-                <w:color w:val="17212B"/>
-                <w:sz w:val="17"/>
-              </w:rPr>
-              <w:t>新建会话并复验</w:t>
-            </w:r>
-          </w:p>
-        </w:tc>
-      </w:tr>
-      <w:tr>
-        <w:trPr>
-          <w:cantSplit w:val="1"/>
-        </w:trPr>
-        <w:tc>
-          <w:tcPr>
-            <w:tcW w:type="dxa" w:w="1450"/>
-            <w:vAlign w:val="center"/>
-            <w:tcMar>
-              <w:top w:w="90" w:type="dxa"/>
-              <w:bottom w:w="90" w:type="dxa"/>
-              <w:start w:w="120" w:type="dxa"/>
-              <w:end w:w="120" w:type="dxa"/>
-            </w:tcMar>
-          </w:tcPr>
-          <w:p>
-            <w:pPr>
-              <w:widowControl/>
-              <w:spacing w:before="0" w:after="0" w:line="269" w:lineRule="auto"/>
-              <w:jc w:val="center"/>
-            </w:pPr>
-            <w:r>
-              <w:rPr>
-                <w:rFonts w:ascii="Arial Unicode MS" w:hAnsi="Arial Unicode MS" w:eastAsia="Arial Unicode MS" w:cs="Arial Unicode MS"/>
-                <w:color w:val="17212B"/>
-                <w:sz w:val="17"/>
-              </w:rPr>
-              <w:t>通义灵码</w:t>
-            </w:r>
-          </w:p>
-        </w:tc>
-        <w:tc>
-          <w:tcPr>
-            <w:tcW w:type="dxa" w:w="1800"/>
-            <w:vAlign w:val="center"/>
-            <w:tcMar>
-              <w:top w:w="90" w:type="dxa"/>
-              <w:bottom w:w="90" w:type="dxa"/>
-              <w:start w:w="120" w:type="dxa"/>
-              <w:end w:w="120" w:type="dxa"/>
-            </w:tcMar>
-          </w:tcPr>
-          <w:p>
-            <w:pPr>
-              <w:widowControl/>
-              <w:spacing w:before="0" w:after="0" w:line="269" w:lineRule="auto"/>
-              <w:jc w:val="left"/>
-            </w:pPr>
-            <w:r>
-              <w:rPr>
-                <w:rFonts w:ascii="Arial Unicode MS" w:hAnsi="Arial Unicode MS" w:eastAsia="Arial Unicode MS" w:cs="Arial Unicode MS"/>
-                <w:color w:val="17212B"/>
-                <w:sz w:val="17"/>
-              </w:rPr>
-              <w:t>应用安装位置</w:t>
-            </w:r>
-          </w:p>
-        </w:tc>
-        <w:tc>
-          <w:tcPr>
-            <w:tcW w:type="dxa" w:w="2800"/>
-            <w:vAlign w:val="center"/>
-            <w:tcMar>
-              <w:top w:w="90" w:type="dxa"/>
-              <w:bottom w:w="90" w:type="dxa"/>
-              <w:start w:w="120" w:type="dxa"/>
-              <w:end w:w="120" w:type="dxa"/>
-            </w:tcMar>
-          </w:tcPr>
-          <w:p>
-            <w:pPr>
-              <w:widowControl/>
-              <w:spacing w:before="0" w:after="0" w:line="269" w:lineRule="auto"/>
-              <w:jc w:val="left"/>
-            </w:pPr>
-            <w:r>
-              <w:rPr>
-                <w:rFonts w:ascii="Arial Unicode MS" w:hAnsi="Arial Unicode MS" w:eastAsia="Arial Unicode MS" w:cs="Arial Unicode MS"/>
-                <w:color w:val="17212B"/>
-                <w:sz w:val="17"/>
-              </w:rPr>
-              <w:t>准备已验证通用包</w:t>
-            </w:r>
-          </w:p>
-        </w:tc>
-        <w:tc>
-          <w:tcPr>
-            <w:tcW w:type="dxa" w:w="3310"/>
-            <w:vAlign w:val="center"/>
-            <w:tcMar>
-              <w:top w:w="90" w:type="dxa"/>
-              <w:bottom w:w="90" w:type="dxa"/>
-              <w:start w:w="120" w:type="dxa"/>
-              <w:end w:w="120" w:type="dxa"/>
-            </w:tcMar>
-          </w:tcPr>
-          <w:p>
-            <w:pPr>
-              <w:widowControl/>
-              <w:spacing w:before="0" w:after="0" w:line="269" w:lineRule="auto"/>
-              <w:jc w:val="left"/>
-            </w:pPr>
-            <w:r>
-              <w:rPr>
-                <w:rFonts w:ascii="Arial Unicode MS" w:hAnsi="Arial Unicode MS" w:eastAsia="Arial Unicode MS" w:cs="Arial Unicode MS"/>
-                <w:color w:val="17212B"/>
-                <w:sz w:val="17"/>
-              </w:rPr>
-              <w:t>按平台官方界面导入</w:t>
-            </w:r>
-          </w:p>
-        </w:tc>
-      </w:tr>
-      <w:tr>
-        <w:trPr>
-          <w:cantSplit w:val="1"/>
-        </w:trPr>
-        <w:tc>
-          <w:tcPr>
-            <w:tcW w:type="dxa" w:w="1450"/>
-            <w:vAlign w:val="center"/>
-            <w:tcMar>
-              <w:top w:w="90" w:type="dxa"/>
-              <w:bottom w:w="90" w:type="dxa"/>
-              <w:start w:w="120" w:type="dxa"/>
-              <w:end w:w="120" w:type="dxa"/>
-            </w:tcMar>
-          </w:tcPr>
-          <w:p>
-            <w:pPr>
-              <w:widowControl/>
-              <w:spacing w:before="0" w:after="0" w:line="269" w:lineRule="auto"/>
-              <w:jc w:val="center"/>
-            </w:pPr>
-            <w:r>
-              <w:rPr>
-                <w:rFonts w:ascii="Arial Unicode MS" w:hAnsi="Arial Unicode MS" w:eastAsia="Arial Unicode MS" w:cs="Arial Unicode MS"/>
-                <w:color w:val="17212B"/>
-                <w:sz w:val="17"/>
-              </w:rPr>
-              <w:t>Qoder</w:t>
-            </w:r>
-          </w:p>
-        </w:tc>
-        <w:tc>
-          <w:tcPr>
-            <w:tcW w:type="dxa" w:w="1800"/>
-            <w:vAlign w:val="center"/>
-            <w:tcMar>
-              <w:top w:w="90" w:type="dxa"/>
-              <w:bottom w:w="90" w:type="dxa"/>
-              <w:start w:w="120" w:type="dxa"/>
-              <w:end w:w="120" w:type="dxa"/>
-            </w:tcMar>
-          </w:tcPr>
-          <w:p>
-            <w:pPr>
-              <w:widowControl/>
-              <w:spacing w:before="0" w:after="0" w:line="269" w:lineRule="auto"/>
-              <w:jc w:val="left"/>
-            </w:pPr>
-            <w:r>
-              <w:rPr>
-                <w:rFonts w:ascii="Arial Unicode MS" w:hAnsi="Arial Unicode MS" w:eastAsia="Arial Unicode MS" w:cs="Arial Unicode MS"/>
-                <w:color w:val="17212B"/>
-                <w:sz w:val="17"/>
-              </w:rPr>
-              <w:t>应用安装位置</w:t>
-            </w:r>
-          </w:p>
-        </w:tc>
-        <w:tc>
-          <w:tcPr>
-            <w:tcW w:type="dxa" w:w="2800"/>
-            <w:vAlign w:val="center"/>
-            <w:tcMar>
-              <w:top w:w="90" w:type="dxa"/>
-              <w:bottom w:w="90" w:type="dxa"/>
-              <w:start w:w="120" w:type="dxa"/>
-              <w:end w:w="120" w:type="dxa"/>
-            </w:tcMar>
-          </w:tcPr>
-          <w:p>
-            <w:pPr>
-              <w:widowControl/>
-              <w:spacing w:before="0" w:after="0" w:line="269" w:lineRule="auto"/>
-              <w:jc w:val="left"/>
-            </w:pPr>
-            <w:r>
-              <w:rPr>
-                <w:rFonts w:ascii="Arial Unicode MS" w:hAnsi="Arial Unicode MS" w:eastAsia="Arial Unicode MS" w:cs="Arial Unicode MS"/>
-                <w:color w:val="17212B"/>
-                <w:sz w:val="17"/>
-              </w:rPr>
-              <w:t>准备已验证导入包</w:t>
-            </w:r>
-          </w:p>
-        </w:tc>
-        <w:tc>
-          <w:tcPr>
-            <w:tcW w:type="dxa" w:w="3310"/>
-            <w:vAlign w:val="center"/>
-            <w:tcMar>
-              <w:top w:w="90" w:type="dxa"/>
-              <w:bottom w:w="90" w:type="dxa"/>
-              <w:start w:w="120" w:type="dxa"/>
-              <w:end w:w="120" w:type="dxa"/>
-            </w:tcMar>
-          </w:tcPr>
-          <w:p>
-            <w:pPr>
-              <w:widowControl/>
-              <w:spacing w:before="0" w:after="0" w:line="269" w:lineRule="auto"/>
-              <w:jc w:val="left"/>
-            </w:pPr>
-            <w:r>
-              <w:rPr>
-                <w:rFonts w:ascii="Arial Unicode MS" w:hAnsi="Arial Unicode MS" w:eastAsia="Arial Unicode MS" w:cs="Arial Unicode MS"/>
-                <w:color w:val="17212B"/>
-                <w:sz w:val="17"/>
-              </w:rPr>
-              <w:t>按插件或项目级入口导入</w:t>
-            </w:r>
-          </w:p>
-        </w:tc>
-      </w:tr>
-      <w:tr>
-        <w:trPr>
-          <w:cantSplit w:val="1"/>
-        </w:trPr>
-        <w:tc>
-          <w:tcPr>
-            <w:tcW w:type="dxa" w:w="1450"/>
-            <w:vAlign w:val="center"/>
-            <w:tcMar>
-              <w:top w:w="90" w:type="dxa"/>
-              <w:bottom w:w="90" w:type="dxa"/>
-              <w:start w:w="120" w:type="dxa"/>
-              <w:end w:w="120" w:type="dxa"/>
-            </w:tcMar>
-          </w:tcPr>
-          <w:p>
-            <w:pPr>
-              <w:widowControl/>
-              <w:spacing w:before="0" w:after="0" w:line="269" w:lineRule="auto"/>
-              <w:jc w:val="center"/>
-            </w:pPr>
-            <w:r>
-              <w:rPr>
-                <w:rFonts w:ascii="Arial Unicode MS" w:hAnsi="Arial Unicode MS" w:eastAsia="Arial Unicode MS" w:cs="Arial Unicode MS"/>
-                <w:color w:val="17212B"/>
-                <w:sz w:val="17"/>
-              </w:rPr>
-              <w:t>Cherry Studio</w:t>
-            </w:r>
-          </w:p>
-        </w:tc>
-        <w:tc>
-          <w:tcPr>
-            <w:tcW w:type="dxa" w:w="1800"/>
-            <w:vAlign w:val="center"/>
-            <w:tcMar>
-              <w:top w:w="90" w:type="dxa"/>
-              <w:bottom w:w="90" w:type="dxa"/>
-              <w:start w:w="120" w:type="dxa"/>
-              <w:end w:w="120" w:type="dxa"/>
-            </w:tcMar>
-          </w:tcPr>
-          <w:p>
-            <w:pPr>
-              <w:widowControl/>
-              <w:spacing w:before="0" w:after="0" w:line="269" w:lineRule="auto"/>
-              <w:jc w:val="left"/>
-            </w:pPr>
-            <w:r>
-              <w:rPr>
-                <w:rFonts w:ascii="Arial Unicode MS" w:hAnsi="Arial Unicode MS" w:eastAsia="Arial Unicode MS" w:cs="Arial Unicode MS"/>
-                <w:color w:val="17212B"/>
-                <w:sz w:val="17"/>
-              </w:rPr>
-              <w:t>应用安装位置</w:t>
-            </w:r>
-          </w:p>
-        </w:tc>
-        <w:tc>
-          <w:tcPr>
-            <w:tcW w:type="dxa" w:w="2800"/>
-            <w:vAlign w:val="center"/>
-            <w:tcMar>
-              <w:top w:w="90" w:type="dxa"/>
-              <w:bottom w:w="90" w:type="dxa"/>
-              <w:start w:w="120" w:type="dxa"/>
-              <w:end w:w="120" w:type="dxa"/>
-            </w:tcMar>
-          </w:tcPr>
-          <w:p>
-            <w:pPr>
-              <w:widowControl/>
-              <w:spacing w:before="0" w:after="0" w:line="269" w:lineRule="auto"/>
-              <w:jc w:val="left"/>
-            </w:pPr>
-            <w:r>
-              <w:rPr>
-                <w:rFonts w:ascii="Arial Unicode MS" w:hAnsi="Arial Unicode MS" w:eastAsia="Arial Unicode MS" w:cs="Arial Unicode MS"/>
-                <w:color w:val="17212B"/>
-                <w:sz w:val="17"/>
-              </w:rPr>
-              <w:t>准备已验证通用包</w:t>
-            </w:r>
-          </w:p>
-        </w:tc>
-        <w:tc>
-          <w:tcPr>
-            <w:tcW w:type="dxa" w:w="3310"/>
-            <w:vAlign w:val="center"/>
-            <w:tcMar>
-              <w:top w:w="90" w:type="dxa"/>
-              <w:bottom w:w="90" w:type="dxa"/>
-              <w:start w:w="120" w:type="dxa"/>
-              <w:end w:w="120" w:type="dxa"/>
-            </w:tcMar>
-          </w:tcPr>
-          <w:p>
-            <w:pPr>
-              <w:widowControl/>
-              <w:spacing w:before="0" w:after="0" w:line="269" w:lineRule="auto"/>
-              <w:jc w:val="left"/>
-            </w:pPr>
-            <w:r>
-              <w:rPr>
-                <w:rFonts w:ascii="Arial Unicode MS" w:hAnsi="Arial Unicode MS" w:eastAsia="Arial Unicode MS" w:cs="Arial Unicode MS"/>
-                <w:color w:val="17212B"/>
-                <w:sz w:val="17"/>
-              </w:rPr>
-              <w:t>在官方导入界面选择 ZIP 或文件夹</w:t>
+              <w:t>按宿主标准入口导入并新建会话复验</w:t>
             </w:r>
           </w:p>
         </w:tc>
@@ -3088,7 +2636,7 @@
           <w:color w:val="17212B"/>
           <w:sz w:val="21"/>
         </w:rPr>
-        <w:t>TRAE 或 Kimi Code 的导入计划没有未处理冲突；导入后新建会话能识别 Skills。</w:t>
+        <w:t>通用版下载、解压和导入计划没有未处理冲突；导入后新建会话能识别 Skills。</w:t>
       </w:r>
     </w:p>
     <w:p>

</xml_diff>

<commit_message>
release: 发布 V1.3.1.5 WorkBuddy 安装闭环 (#72)
修复受限下载地址、SHA-256 一致性与 jiaotang-kb 运行时连接验收顺序，并对齐 V1.3.1.5 发布资产。
</commit_message>
<xml_diff>
--- a/docs/user-guide/企业全生命周期助手用户使用手册.docx
+++ b/docs/user-guide/企业全生命周期助手用户使用手册.docx
@@ -132,7 +132,7 @@
                 <w:color w:val="17212B"/>
                 <w:sz w:val="20"/>
               </w:rPr>
-              <w:t>管理器版本与 Skills 内容版本相互独立。当前管理器为 0.2.0，正式 Skills 为 V1.3.1.4，共 49 项。桌面客户端采用未签名本机授权分发；应用身份与 Skills 内容验真是两条独立信任链。系统或企业策略不允许未签名应用时，继续使用 HTTPS PWA，不关闭系统防护。</w:t>
+              <w:t>管理器版本与 Skills 内容版本相互独立。当前管理器为 0.2.0，正式 Skills 为 V1.3.1.5，共 49 项。桌面客户端采用未签名本机授权分发；应用身份与 Skills 内容验真是两条独立信任链。系统或企业策略不允许未签名应用时，继续使用 HTTPS PWA，不关闭系统防护。</w:t>
             </w:r>
           </w:p>
         </w:tc>
@@ -2600,7 +2600,7 @@
           <w:color w:val="17212B"/>
           <w:sz w:val="21"/>
         </w:rPr>
-        <w:t>管理器“关于”或安全中心显示版本 0.2.0，Skills 清单显示 V1.3.1.4 与 49 项。</w:t>
+        <w:t>管理器“关于”或安全中心显示版本 0.2.0，Skills 清单显示 V1.3.1.5 与 49 项。</w:t>
       </w:r>
     </w:p>
     <w:p>

</xml_diff>

<commit_message>
fix: harden WorkBuddy plugin lifecycle for V1.3.1.6
</commit_message>
<xml_diff>
--- a/docs/user-guide/企业全生命周期助手用户使用手册.docx
+++ b/docs/user-guide/企业全生命周期助手用户使用手册.docx
@@ -132,7 +132,7 @@
                 <w:color w:val="17212B"/>
                 <w:sz w:val="20"/>
               </w:rPr>
-              <w:t>管理器版本与 Skills 内容版本相互独立。当前管理器为 0.2.0，正式 Skills 为 V1.3.1.5，共 49 项。桌面客户端采用未签名本机授权分发；应用身份与 Skills 内容验真是两条独立信任链。系统或企业策略不允许未签名应用时，继续使用 HTTPS PWA，不关闭系统防护。</w:t>
+              <w:t>管理器版本与 Skills 内容版本相互独立。当前管理器为 0.2.0，正式 Skills 为 V1.3.1.6，共 49 项。桌面客户端采用未签名本机授权分发；应用身份与 Skills 内容验真是两条独立信任链。系统或企业策略不允许未签名应用时，继续使用 HTTPS PWA，不关闭系统防护。</w:t>
             </w:r>
           </w:p>
         </w:tc>
@@ -1525,7 +1525,7 @@
           <w:color w:val="17212B"/>
           <w:sz w:val="22"/>
         </w:rPr>
-        <w:t>macOS 与 Windows 不再分别发布 WorkBuddy 安装包，也不再运行固定 .command、.cmd、PowerShell 或外部 CLI。管理器只下载、验签并定位同一个跨平台插件市场 ZIP。</w:t>
+        <w:t>macOS 与 Windows 不再分别发布 WorkBuddy 安装包，也不再运行固定 .command、.cmd、PowerShell 或外部 CLI。管理器只下载、验签并定位同一个跨平台插件市场 ZIP。V1.3.1.6 在签名 plugin.json 中内联声明 jiaotang-kb，不依赖插件根目录 .mcp.json，也不写用户级、项目级或全局 MCP 配置。</w:t>
       </w:r>
     </w:p>
     <w:p>
@@ -1579,7 +1579,34 @@
           <w:color w:val="17212B"/>
           <w:sz w:val="22"/>
         </w:rPr>
-        <w:t>打开 ZIP 位置，解压到可长期保留的本地目录。</w:t>
+        <w:t>打开 ZIP 位置，安全解压完整 jiaotang 市场。</w:t>
+      </w:r>
+    </w:p>
+    <w:p>
+      <w:pPr>
+        <w:numPr>
+          <w:ilvl w:val="0"/>
+          <w:numId w:val="12"/>
+        </w:numPr>
+        <w:spacing w:after="80" w:line="300" w:lineRule="auto"/>
+        <w:ind w:left="540" w:hanging="270"/>
+      </w:pPr>
+      <w:r>
+        <w:rPr>
+          <w:rFonts w:ascii="Arial Unicode MS" w:hAnsi="Arial Unicode MS" w:eastAsia="Arial Unicode MS" w:cs="Arial Unicode MS"/>
+          <w:b/>
+          <w:color w:val="17212B"/>
+          <w:sz w:val="22"/>
+        </w:rPr>
+        <w:t xml:space="preserve">持久保存。 </w:t>
+      </w:r>
+      <w:r>
+        <w:rPr>
+          <w:rFonts w:ascii="Arial Unicode MS" w:hAnsi="Arial Unicode MS" w:eastAsia="Arial Unicode MS" w:cs="Arial Unicode MS"/>
+          <w:color w:val="17212B"/>
+          <w:sz w:val="22"/>
+        </w:rPr>
+        <w:t>将完整市场保存到当前 WorkBuddy 实际用户目录的 plugins/marketplaces/jiaotang，不使用临时下载或临时解压目录。</w:t>
       </w:r>
     </w:p>
     <w:p>
@@ -1606,7 +1633,7 @@
           <w:color w:val="17212B"/>
           <w:sz w:val="22"/>
         </w:rPr>
-        <w:t>在 WorkBuddy 插件市场添加解压后的 jiaotang 目录。</w:t>
+        <w:t>在 WorkBuddy 插件市场添加上述持久 jiaotang 目录；安装后不得清理该目录。</w:t>
       </w:r>
     </w:p>
     <w:p>
@@ -1679,6 +1706,33 @@
           <w:color w:val="17212B"/>
           <w:sz w:val="22"/>
         </w:rPr>
+        <w:t xml:space="preserve">检查连接。 </w:t>
+      </w:r>
+      <w:r>
+        <w:rPr>
+          <w:rFonts w:ascii="Arial Unicode MS" w:hAnsi="Arial Unicode MS" w:eastAsia="Arial Unicode MS" w:cs="Arial Unicode MS"/>
+          <w:color w:val="17212B"/>
+          <w:sz w:val="22"/>
+        </w:rPr>
+        <w:t>让 Agent 检查知识库连接状态，确认 MCP 工具列表可见，并成功调用任一只读状态或检索工具。</w:t>
+      </w:r>
+    </w:p>
+    <w:p>
+      <w:pPr>
+        <w:numPr>
+          <w:ilvl w:val="0"/>
+          <w:numId w:val="12"/>
+        </w:numPr>
+        <w:spacing w:after="80" w:line="300" w:lineRule="auto"/>
+        <w:ind w:left="540" w:hanging="270"/>
+      </w:pPr>
+      <w:r>
+        <w:rPr>
+          <w:rFonts w:ascii="Arial Unicode MS" w:hAnsi="Arial Unicode MS" w:eastAsia="Arial Unicode MS" w:cs="Arial Unicode MS"/>
+          <w:b/>
+          <w:color w:val="17212B"/>
+          <w:sz w:val="22"/>
+        </w:rPr>
         <w:t xml:space="preserve">完成验收。 </w:t>
       </w:r>
       <w:r>
@@ -1687,7 +1741,7 @@
           <w:color w:val="17212B"/>
           <w:sz w:val="22"/>
         </w:rPr>
-        <w:t>确认插件启用、49 项可见，并完成 MCP 工具列表与一次知识检索。</w:t>
+        <w:t>连接成功后再安装 OCR、PDF、Word、PPT、Excel 和联网检索 Skills；确认插件启用且 49 项可见。</w:t>
       </w:r>
     </w:p>
     <w:p>
@@ -1702,7 +1756,7 @@
           <w:color w:val="17212B"/>
           <w:sz w:val="18"/>
         </w:rPr>
-        <w:t>/plugin marketplace add &lt;解压后的 jiaotang 目录&gt;    →    安装 jiaotang-workbuddy-skills@jiaotang</w:t>
+        <w:t>/plugin marketplace add &lt;持久保存的 jiaotang 目录&gt;    →    安装 jiaotang-workbuddy-skills@jiaotang</w:t>
       </w:r>
     </w:p>
     <w:p>
@@ -2600,7 +2654,7 @@
           <w:color w:val="17212B"/>
           <w:sz w:val="21"/>
         </w:rPr>
-        <w:t>管理器“关于”或安全中心显示版本 0.2.0，Skills 清单显示 V1.3.1.5 与 49 项。</w:t>
+        <w:t>管理器“关于”或安全中心显示版本 0.2.0，Skills 清单显示 V1.3.1.6 与 49 项。</w:t>
       </w:r>
     </w:p>
     <w:p>

</xml_diff>

<commit_message>
chore: prepare V1.4.0 release
</commit_message>
<xml_diff>
--- a/docs/user-guide/企业全生命周期助手用户使用手册.docx
+++ b/docs/user-guide/企业全生命周期助手用户使用手册.docx
@@ -109,7 +109,7 @@
           <w:p>
             <w:pPr>
               <w:widowControl/>
-              <w:spacing w:before="0" w:after="40" w:line="269" w:lineRule="auto"/>
+              <w:spacing w:before="0" w:after="0" w:line="252" w:lineRule="auto"/>
             </w:pPr>
             <w:r>
               <w:rPr>
@@ -124,7 +124,7 @@
           <w:p>
             <w:pPr>
               <w:widowControl/>
-              <w:spacing w:before="0" w:after="0" w:line="283" w:lineRule="auto"/>
+              <w:spacing w:before="0" w:after="0" w:line="252" w:lineRule="auto"/>
             </w:pPr>
             <w:r>
               <w:rPr>
@@ -132,7 +132,7 @@
                 <w:color w:val="17212B"/>
                 <w:sz w:val="20"/>
               </w:rPr>
-              <w:t>管理器版本与 Skills 内容版本相互独立。当前管理器为 0.2.0，正式 Skills 为 V1.3.1.6，共 49 项。桌面客户端采用未签名本机授权分发；应用身份与 Skills 内容验真是两条独立信任链。系统或企业策略不允许未签名应用时，继续使用 HTTPS PWA，不关闭系统防护。</w:t>
+              <w:t>管理器版本与 Skills 内容版本相互独立。当前管理器为 0.2.0，正式 Skills 为 V1.4.0，共 49 项。桌面客户端采用未签名本机授权分发；应用身份与 Skills 内容验真是两条独立信任链。系统或企业策略不允许未签名应用时，继续使用 HTTPS PWA，不关闭系统防护。</w:t>
             </w:r>
           </w:p>
         </w:tc>
@@ -165,7 +165,7 @@
           <w:color w:val="66717C"/>
           <w:sz w:val="19"/>
         </w:rPr>
-        <w:t>适用：macOS arm64 / x64，Windows x64  ·  更新日期：2026 年 7 月</w:t>
+        <w:t>适用：macOS arm64 / x64，Windows x64  ·  更新日期：2026 年 7 月 30 日</w:t>
       </w:r>
     </w:p>
     <w:p>
@@ -175,6 +175,7 @@
           <w:footerReference w:type="default" r:id="rId10"/>
           <w:headerReference w:type="first" r:id="rId11"/>
           <w:footerReference w:type="first" r:id="rId12"/>
+          <w:headerReference w:type="even" r:id="rId21"/>
           <w:pgSz w:w="12240" w:h="15840"/>
           <w:pgMar w:top="1440" w:right="1440" w:bottom="1440" w:left="1440" w:header="708" w:footer="708" w:gutter="0"/>
           <w:cols w:space="720"/>
@@ -237,7 +238,7 @@
           <w:p>
             <w:pPr>
               <w:widowControl/>
-              <w:spacing w:before="0" w:after="40" w:line="269" w:lineRule="auto"/>
+              <w:spacing w:before="0" w:after="0" w:line="252" w:lineRule="auto"/>
             </w:pPr>
             <w:r>
               <w:rPr>
@@ -252,7 +253,7 @@
           <w:p>
             <w:pPr>
               <w:widowControl/>
-              <w:spacing w:before="0" w:after="0" w:line="283" w:lineRule="auto"/>
+              <w:spacing w:before="0" w:after="0" w:line="252" w:lineRule="auto"/>
             </w:pPr>
             <w:r>
               <w:rPr>
@@ -418,7 +419,7 @@
           <w:p>
             <w:pPr>
               <w:widowControl/>
-              <w:spacing w:before="0" w:after="0" w:line="264" w:lineRule="auto"/>
+              <w:spacing w:before="0" w:after="0" w:line="252" w:lineRule="auto"/>
               <w:jc w:val="center"/>
             </w:pPr>
             <w:r>
@@ -447,7 +448,7 @@
           <w:p>
             <w:pPr>
               <w:widowControl/>
-              <w:spacing w:before="0" w:after="0" w:line="264" w:lineRule="auto"/>
+              <w:spacing w:before="0" w:after="0" w:line="252" w:lineRule="auto"/>
               <w:jc w:val="left"/>
             </w:pPr>
             <w:r>
@@ -476,7 +477,7 @@
           <w:p>
             <w:pPr>
               <w:widowControl/>
-              <w:spacing w:before="0" w:after="0" w:line="264" w:lineRule="auto"/>
+              <w:spacing w:before="0" w:after="0" w:line="252" w:lineRule="auto"/>
               <w:jc w:val="left"/>
             </w:pPr>
             <w:r>
@@ -509,7 +510,7 @@
           <w:p>
             <w:pPr>
               <w:widowControl/>
-              <w:spacing w:before="0" w:after="0" w:line="269" w:lineRule="auto"/>
+              <w:spacing w:before="0" w:after="0" w:line="252" w:lineRule="auto"/>
               <w:jc w:val="center"/>
             </w:pPr>
             <w:r>
@@ -536,7 +537,7 @@
           <w:p>
             <w:pPr>
               <w:widowControl/>
-              <w:spacing w:before="0" w:after="0" w:line="269" w:lineRule="auto"/>
+              <w:spacing w:before="0" w:after="0" w:line="252" w:lineRule="auto"/>
               <w:jc w:val="left"/>
             </w:pPr>
             <w:r>
@@ -563,7 +564,7 @@
           <w:p>
             <w:pPr>
               <w:widowControl/>
-              <w:spacing w:before="0" w:after="0" w:line="269" w:lineRule="auto"/>
+              <w:spacing w:before="0" w:after="0" w:line="252" w:lineRule="auto"/>
               <w:jc w:val="left"/>
             </w:pPr>
             <w:r>
@@ -595,7 +596,7 @@
           <w:p>
             <w:pPr>
               <w:widowControl/>
-              <w:spacing w:before="0" w:after="0" w:line="269" w:lineRule="auto"/>
+              <w:spacing w:before="0" w:after="0" w:line="252" w:lineRule="auto"/>
               <w:jc w:val="center"/>
             </w:pPr>
             <w:r>
@@ -622,7 +623,7 @@
           <w:p>
             <w:pPr>
               <w:widowControl/>
-              <w:spacing w:before="0" w:after="0" w:line="269" w:lineRule="auto"/>
+              <w:spacing w:before="0" w:after="0" w:line="252" w:lineRule="auto"/>
               <w:jc w:val="left"/>
             </w:pPr>
             <w:r>
@@ -649,7 +650,7 @@
           <w:p>
             <w:pPr>
               <w:widowControl/>
-              <w:spacing w:before="0" w:after="0" w:line="269" w:lineRule="auto"/>
+              <w:spacing w:before="0" w:after="0" w:line="252" w:lineRule="auto"/>
               <w:jc w:val="left"/>
             </w:pPr>
             <w:r>
@@ -681,7 +682,7 @@
           <w:p>
             <w:pPr>
               <w:widowControl/>
-              <w:spacing w:before="0" w:after="0" w:line="269" w:lineRule="auto"/>
+              <w:spacing w:before="0" w:after="0" w:line="252" w:lineRule="auto"/>
               <w:jc w:val="center"/>
             </w:pPr>
             <w:r>
@@ -708,7 +709,7 @@
           <w:p>
             <w:pPr>
               <w:widowControl/>
-              <w:spacing w:before="0" w:after="0" w:line="269" w:lineRule="auto"/>
+              <w:spacing w:before="0" w:after="0" w:line="252" w:lineRule="auto"/>
               <w:jc w:val="left"/>
             </w:pPr>
             <w:r>
@@ -735,7 +736,7 @@
           <w:p>
             <w:pPr>
               <w:widowControl/>
-              <w:spacing w:before="0" w:after="0" w:line="269" w:lineRule="auto"/>
+              <w:spacing w:before="0" w:after="0" w:line="252" w:lineRule="auto"/>
               <w:jc w:val="left"/>
             </w:pPr>
             <w:r>
@@ -789,7 +790,7 @@
           <w:p>
             <w:pPr>
               <w:widowControl/>
-              <w:spacing w:before="0" w:after="40" w:line="269" w:lineRule="auto"/>
+              <w:spacing w:before="0" w:after="0" w:line="252" w:lineRule="auto"/>
             </w:pPr>
             <w:r>
               <w:rPr>
@@ -804,7 +805,7 @@
           <w:p>
             <w:pPr>
               <w:widowControl/>
-              <w:spacing w:before="0" w:after="0" w:line="283" w:lineRule="auto"/>
+              <w:spacing w:before="0" w:after="0" w:line="252" w:lineRule="auto"/>
             </w:pPr>
             <w:r>
               <w:rPr>
@@ -884,7 +885,7 @@
           <w:p>
             <w:pPr>
               <w:widowControl/>
-              <w:spacing w:before="0" w:after="40" w:line="269" w:lineRule="auto"/>
+              <w:spacing w:before="0" w:after="0" w:line="252" w:lineRule="auto"/>
             </w:pPr>
             <w:r>
               <w:rPr>
@@ -899,7 +900,7 @@
           <w:p>
             <w:pPr>
               <w:widowControl/>
-              <w:spacing w:before="0" w:after="0" w:line="283" w:lineRule="auto"/>
+              <w:spacing w:before="0" w:after="0" w:line="252" w:lineRule="auto"/>
             </w:pPr>
             <w:r>
               <w:rPr>
@@ -1042,7 +1043,7 @@
           <w:ilvl w:val="0"/>
           <w:numId w:val="11"/>
         </w:numPr>
-        <w:spacing w:after="80" w:line="300" w:lineRule="auto"/>
+        <w:spacing w:after="120" w:line="300" w:lineRule="auto"/>
         <w:ind w:left="540" w:hanging="270"/>
       </w:pPr>
       <w:r>
@@ -1069,7 +1070,7 @@
           <w:ilvl w:val="0"/>
           <w:numId w:val="11"/>
         </w:numPr>
-        <w:spacing w:after="80" w:line="300" w:lineRule="auto"/>
+        <w:spacing w:after="120" w:line="300" w:lineRule="auto" w:before="240"/>
         <w:ind w:left="540" w:hanging="270"/>
       </w:pPr>
       <w:r>
@@ -1147,7 +1148,7 @@
           <w:p>
             <w:pPr>
               <w:widowControl/>
-              <w:spacing w:before="0" w:after="0" w:line="264" w:lineRule="auto"/>
+              <w:spacing w:before="0" w:after="0" w:line="252" w:lineRule="auto"/>
               <w:jc w:val="center"/>
             </w:pPr>
             <w:r>
@@ -1176,7 +1177,7 @@
           <w:p>
             <w:pPr>
               <w:widowControl/>
-              <w:spacing w:before="0" w:after="0" w:line="264" w:lineRule="auto"/>
+              <w:spacing w:before="0" w:after="0" w:line="252" w:lineRule="auto"/>
               <w:jc w:val="left"/>
             </w:pPr>
             <w:r>
@@ -1205,7 +1206,7 @@
           <w:p>
             <w:pPr>
               <w:widowControl/>
-              <w:spacing w:before="0" w:after="0" w:line="264" w:lineRule="auto"/>
+              <w:spacing w:before="0" w:after="0" w:line="252" w:lineRule="auto"/>
               <w:jc w:val="left"/>
             </w:pPr>
             <w:r>
@@ -1234,7 +1235,7 @@
           <w:p>
             <w:pPr>
               <w:widowControl/>
-              <w:spacing w:before="0" w:after="0" w:line="264" w:lineRule="auto"/>
+              <w:spacing w:before="0" w:after="0" w:line="252" w:lineRule="auto"/>
               <w:jc w:val="left"/>
             </w:pPr>
             <w:r>
@@ -1267,7 +1268,7 @@
           <w:p>
             <w:pPr>
               <w:widowControl/>
-              <w:spacing w:before="0" w:after="0" w:line="269" w:lineRule="auto"/>
+              <w:spacing w:before="0" w:after="0" w:line="252" w:lineRule="auto"/>
               <w:jc w:val="center"/>
             </w:pPr>
             <w:r>
@@ -1294,7 +1295,7 @@
           <w:p>
             <w:pPr>
               <w:widowControl/>
-              <w:spacing w:before="0" w:after="0" w:line="269" w:lineRule="auto"/>
+              <w:spacing w:before="0" w:after="0" w:line="252" w:lineRule="auto"/>
               <w:jc w:val="left"/>
             </w:pPr>
             <w:r>
@@ -1321,7 +1322,7 @@
           <w:p>
             <w:pPr>
               <w:widowControl/>
-              <w:spacing w:before="0" w:after="0" w:line="269" w:lineRule="auto"/>
+              <w:spacing w:before="0" w:after="0" w:line="252" w:lineRule="auto"/>
               <w:jc w:val="left"/>
             </w:pPr>
             <w:r>
@@ -1348,7 +1349,7 @@
           <w:p>
             <w:pPr>
               <w:widowControl/>
-              <w:spacing w:before="0" w:after="0" w:line="269" w:lineRule="auto"/>
+              <w:spacing w:before="0" w:after="0" w:line="252" w:lineRule="auto"/>
               <w:jc w:val="left"/>
             </w:pPr>
             <w:r>
@@ -1380,7 +1381,7 @@
           <w:p>
             <w:pPr>
               <w:widowControl/>
-              <w:spacing w:before="0" w:after="0" w:line="269" w:lineRule="auto"/>
+              <w:spacing w:before="0" w:after="0" w:line="252" w:lineRule="auto"/>
               <w:jc w:val="center"/>
             </w:pPr>
             <w:r>
@@ -1407,7 +1408,7 @@
           <w:p>
             <w:pPr>
               <w:widowControl/>
-              <w:spacing w:before="0" w:after="0" w:line="269" w:lineRule="auto"/>
+              <w:spacing w:before="0" w:after="0" w:line="252" w:lineRule="auto"/>
               <w:jc w:val="left"/>
             </w:pPr>
             <w:r>
@@ -1434,7 +1435,7 @@
           <w:p>
             <w:pPr>
               <w:widowControl/>
-              <w:spacing w:before="0" w:after="0" w:line="269" w:lineRule="auto"/>
+              <w:spacing w:before="0" w:after="0" w:line="252" w:lineRule="auto"/>
               <w:jc w:val="left"/>
             </w:pPr>
             <w:r>
@@ -1461,7 +1462,7 @@
           <w:p>
             <w:pPr>
               <w:widowControl/>
-              <w:spacing w:before="0" w:after="0" w:line="269" w:lineRule="auto"/>
+              <w:spacing w:before="0" w:after="0" w:line="252" w:lineRule="auto"/>
               <w:jc w:val="left"/>
             </w:pPr>
             <w:r>
@@ -1519,13 +1520,16 @@
       </w:r>
     </w:p>
     <w:p>
+      <w:pPr>
+        <w:spacing w:line="252" w:lineRule="auto" w:after="0"/>
+      </w:pPr>
       <w:r>
         <w:rPr>
           <w:rFonts w:ascii="Arial Unicode MS" w:hAnsi="Arial Unicode MS" w:eastAsia="Arial Unicode MS" w:cs="Arial Unicode MS"/>
           <w:color w:val="17212B"/>
           <w:sz w:val="22"/>
         </w:rPr>
-        <w:t>macOS 与 Windows 不再分别发布 WorkBuddy 安装包，也不再运行固定 .command、.cmd、PowerShell 或外部 CLI。管理器只下载、验签并定位同一个跨平台插件市场 ZIP。V1.3.1.6 在签名 plugin.json 中内联声明 jiaotang-kb，不依赖插件根目录 .mcp.json，也不写用户级、项目级或全局 MCP 配置。</w:t>
+        <w:t>macOS 与 Windows 不再分别发布 WorkBuddy 安装包，也不再运行固定 .command、.cmd、PowerShell 或外部 CLI。管理器只下载、验签并定位同一个跨平台插件市场 ZIP。V1.4.0 在签名 plugin.json 中内联声明 jiaotang-kb，不依赖插件根目录 .mcp.json，也不写用户级、项目级或全局 MCP 配置。</w:t>
       </w:r>
     </w:p>
     <w:p>
@@ -1534,7 +1538,7 @@
           <w:ilvl w:val="0"/>
           <w:numId w:val="12"/>
         </w:numPr>
-        <w:spacing w:after="80" w:line="300" w:lineRule="auto"/>
+        <w:spacing w:after="0" w:line="252" w:lineRule="auto"/>
         <w:ind w:left="540" w:hanging="270"/>
       </w:pPr>
       <w:r>
@@ -1561,7 +1565,7 @@
           <w:ilvl w:val="0"/>
           <w:numId w:val="12"/>
         </w:numPr>
-        <w:spacing w:after="80" w:line="300" w:lineRule="auto"/>
+        <w:spacing w:after="0" w:line="252" w:lineRule="auto"/>
         <w:ind w:left="540" w:hanging="270"/>
       </w:pPr>
       <w:r>
@@ -1588,7 +1592,7 @@
           <w:ilvl w:val="0"/>
           <w:numId w:val="12"/>
         </w:numPr>
-        <w:spacing w:after="80" w:line="300" w:lineRule="auto"/>
+        <w:spacing w:after="0" w:line="252" w:lineRule="auto"/>
         <w:ind w:left="540" w:hanging="270"/>
       </w:pPr>
       <w:r>
@@ -1615,7 +1619,7 @@
           <w:ilvl w:val="0"/>
           <w:numId w:val="12"/>
         </w:numPr>
-        <w:spacing w:after="80" w:line="300" w:lineRule="auto"/>
+        <w:spacing w:after="0" w:line="252" w:lineRule="auto"/>
         <w:ind w:left="540" w:hanging="270"/>
       </w:pPr>
       <w:r>
@@ -1642,7 +1646,7 @@
           <w:ilvl w:val="0"/>
           <w:numId w:val="12"/>
         </w:numPr>
-        <w:spacing w:after="80" w:line="300" w:lineRule="auto"/>
+        <w:spacing w:after="0" w:line="252" w:lineRule="auto"/>
         <w:ind w:left="540" w:hanging="270"/>
       </w:pPr>
       <w:r>
@@ -1669,7 +1673,7 @@
           <w:ilvl w:val="0"/>
           <w:numId w:val="12"/>
         </w:numPr>
-        <w:spacing w:after="80" w:line="300" w:lineRule="auto"/>
+        <w:spacing w:after="0" w:line="252" w:lineRule="auto"/>
         <w:ind w:left="540" w:hanging="270"/>
       </w:pPr>
       <w:r>
@@ -1696,7 +1700,7 @@
           <w:ilvl w:val="0"/>
           <w:numId w:val="12"/>
         </w:numPr>
-        <w:spacing w:after="80" w:line="300" w:lineRule="auto"/>
+        <w:spacing w:after="0" w:line="252" w:lineRule="auto"/>
         <w:ind w:left="540" w:hanging="270"/>
       </w:pPr>
       <w:r>
@@ -1723,7 +1727,7 @@
           <w:ilvl w:val="0"/>
           <w:numId w:val="12"/>
         </w:numPr>
-        <w:spacing w:after="80" w:line="300" w:lineRule="auto"/>
+        <w:spacing w:after="0" w:line="252" w:lineRule="auto"/>
         <w:ind w:left="540" w:hanging="270"/>
       </w:pPr>
       <w:r>
@@ -1746,7 +1750,7 @@
     </w:p>
     <w:p>
       <w:pPr>
-        <w:spacing w:before="40" w:after="120" w:line="264" w:lineRule="auto"/>
+        <w:spacing w:before="40" w:after="0" w:line="252" w:lineRule="auto"/>
         <w:ind w:left="317" w:right="317"/>
         <w:shd w:val="clear" w:fill="F4F6F9"/>
       </w:pPr>
@@ -1780,7 +1784,7 @@
           <w:ilvl w:val="0"/>
           <w:numId w:val="13"/>
         </w:numPr>
-        <w:spacing w:after="80" w:line="300" w:lineRule="auto"/>
+        <w:spacing w:after="0" w:line="252" w:lineRule="auto"/>
         <w:ind w:left="540" w:hanging="270"/>
       </w:pPr>
       <w:r>
@@ -1807,7 +1811,7 @@
           <w:ilvl w:val="0"/>
           <w:numId w:val="13"/>
         </w:numPr>
-        <w:spacing w:after="80" w:line="300" w:lineRule="auto"/>
+        <w:spacing w:after="0" w:line="252" w:lineRule="auto"/>
         <w:ind w:left="540" w:hanging="270"/>
       </w:pPr>
       <w:r>
@@ -1834,7 +1838,7 @@
           <w:ilvl w:val="0"/>
           <w:numId w:val="13"/>
         </w:numPr>
-        <w:spacing w:after="80" w:line="300" w:lineRule="auto"/>
+        <w:spacing w:after="0" w:line="252" w:lineRule="auto"/>
         <w:ind w:left="540" w:hanging="270"/>
       </w:pPr>
       <w:r>
@@ -1861,7 +1865,7 @@
           <w:ilvl w:val="0"/>
           <w:numId w:val="13"/>
         </w:numPr>
-        <w:spacing w:after="80" w:line="300" w:lineRule="auto"/>
+        <w:spacing w:after="0" w:line="252" w:lineRule="auto"/>
         <w:ind w:left="540" w:hanging="270"/>
       </w:pPr>
       <w:r>
@@ -1871,7 +1875,7 @@
           <w:color w:val="17212B"/>
           <w:sz w:val="22"/>
         </w:rPr>
-        <w:t xml:space="preserve">版本保护。 </w:t>
+        <w:t>版本保护。 新 revision 验证通过才缓存；失败时继续使用当前已验证版本或内置版本。只有新增可执行逻辑、私有 API 或扩大写入权限时，才升级管理器并重走双端发行门禁。</w:t>
       </w:r>
       <w:r>
         <w:rPr>
@@ -1879,79 +1883,11 @@
           <w:color w:val="17212B"/>
           <w:sz w:val="22"/>
         </w:rPr>
-        <w:t>新 revision 验证通过才缓存；失败时继续使用当前已验证版本或内置版本。</w:t>
       </w:r>
     </w:p>
-    <w:tbl>
-      <w:tblPr>
-        <w:tblW w:type="dxa" w:w="9360"/>
-        <w:jc w:val="left"/>
-        <w:tblLayout w:type="fixed"/>
-        <w:tblLook w:firstColumn="1" w:firstRow="1" w:lastColumn="0" w:lastRow="0" w:noHBand="0" w:noVBand="1" w:val="04A0"/>
-        <w:tblInd w:type="dxa" w:w="120"/>
-        <w:tblBorders>
-          <w:top w:val="single" w:sz="4" w:space="0" w:color="FFF8E8"/>
-          <w:left w:val="single" w:sz="4" w:space="0" w:color="FFF8E8"/>
-          <w:bottom w:val="single" w:sz="4" w:space="0" w:color="FFF8E8"/>
-          <w:right w:val="single" w:sz="4" w:space="0" w:color="FFF8E8"/>
-          <w:insideH w:val="single" w:sz="4" w:space="0" w:color="FFF8E8"/>
-          <w:insideV w:val="single" w:sz="4" w:space="0" w:color="FFF8E8"/>
-        </w:tblBorders>
-      </w:tblPr>
-      <w:tblGrid>
-        <w:gridCol w:w="9360"/>
-      </w:tblGrid>
-      <w:tr>
-        <w:trPr>
-          <w:cantSplit w:val="1"/>
-          <w:tblHeader w:val="true"/>
-        </w:trPr>
-        <w:tc>
-          <w:tcPr>
-            <w:tcW w:type="dxa" w:w="9360"/>
-            <w:vAlign w:val="center"/>
-            <w:tcMar>
-              <w:top w:w="90" w:type="dxa"/>
-              <w:bottom w:w="90" w:type="dxa"/>
-              <w:start w:w="120" w:type="dxa"/>
-              <w:end w:w="120" w:type="dxa"/>
-            </w:tcMar>
-            <w:shd w:val="clear" w:fill="FFF8E8"/>
-          </w:tcPr>
-          <w:p>
-            <w:pPr>
-              <w:widowControl/>
-              <w:spacing w:before="0" w:after="40" w:line="269" w:lineRule="auto"/>
-            </w:pPr>
-            <w:r>
-              <w:rPr>
-                <w:rFonts w:ascii="Arial Unicode MS" w:hAnsi="Arial Unicode MS" w:eastAsia="Arial Unicode MS" w:cs="Arial Unicode MS"/>
-                <w:b/>
-                <w:color w:val="B98532"/>
-                <w:sz w:val="21"/>
-              </w:rPr>
-              <w:t>什么时候必须升级客户端</w:t>
-            </w:r>
-          </w:p>
-          <w:p>
-            <w:pPr>
-              <w:widowControl/>
-              <w:spacing w:before="0" w:after="0" w:line="283" w:lineRule="auto"/>
-            </w:pPr>
-            <w:r>
-              <w:rPr>
-                <w:rFonts w:ascii="Arial Unicode MS" w:hAnsi="Arial Unicode MS" w:eastAsia="Arial Unicode MS" w:cs="Arial Unicode MS"/>
-                <w:color w:val="17212B"/>
-                <w:sz w:val="20"/>
-              </w:rPr>
-              <w:t>平台只更改应用位置或用户级 Skills 目录时发布签名适配器；涉及新可执行逻辑、私有 API 或扩大写入权限时，必须升级管理器并重走双端发行门禁。</w:t>
-            </w:r>
-          </w:p>
-        </w:tc>
-      </w:tr>
-    </w:tbl>
     <w:p>
       <w:pPr>
+        <w:spacing w:line="252" w:lineRule="auto" w:after="0"/>
         <w:sectPr>
           <w:headerReference w:type="default" r:id="rId17"/>
           <w:footerReference w:type="default" r:id="rId18"/>
@@ -2033,7 +1969,7 @@
           <w:p>
             <w:pPr>
               <w:widowControl/>
-              <w:spacing w:before="0" w:after="0" w:line="264" w:lineRule="auto"/>
+              <w:spacing w:before="0" w:after="0" w:line="252" w:lineRule="auto"/>
               <w:jc w:val="center"/>
             </w:pPr>
             <w:r>
@@ -2062,7 +1998,7 @@
           <w:p>
             <w:pPr>
               <w:widowControl/>
-              <w:spacing w:before="0" w:after="0" w:line="264" w:lineRule="auto"/>
+              <w:spacing w:before="0" w:after="0" w:line="252" w:lineRule="auto"/>
               <w:jc w:val="left"/>
             </w:pPr>
             <w:r>
@@ -2091,7 +2027,7 @@
           <w:p>
             <w:pPr>
               <w:widowControl/>
-              <w:spacing w:before="0" w:after="0" w:line="264" w:lineRule="auto"/>
+              <w:spacing w:before="0" w:after="0" w:line="252" w:lineRule="auto"/>
               <w:jc w:val="left"/>
             </w:pPr>
             <w:r>
@@ -2124,7 +2060,7 @@
           <w:p>
             <w:pPr>
               <w:widowControl/>
-              <w:spacing w:before="0" w:after="0" w:line="269" w:lineRule="auto"/>
+              <w:spacing w:before="0" w:after="0" w:line="252" w:lineRule="auto"/>
               <w:jc w:val="center"/>
             </w:pPr>
             <w:r>
@@ -2151,7 +2087,7 @@
           <w:p>
             <w:pPr>
               <w:widowControl/>
-              <w:spacing w:before="0" w:after="0" w:line="269" w:lineRule="auto"/>
+              <w:spacing w:before="0" w:after="0" w:line="252" w:lineRule="auto"/>
               <w:jc w:val="left"/>
             </w:pPr>
             <w:r>
@@ -2178,7 +2114,7 @@
           <w:p>
             <w:pPr>
               <w:widowControl/>
-              <w:spacing w:before="0" w:after="0" w:line="269" w:lineRule="auto"/>
+              <w:spacing w:before="0" w:after="0" w:line="252" w:lineRule="auto"/>
               <w:jc w:val="left"/>
             </w:pPr>
             <w:r>
@@ -2210,7 +2146,7 @@
           <w:p>
             <w:pPr>
               <w:widowControl/>
-              <w:spacing w:before="0" w:after="0" w:line="269" w:lineRule="auto"/>
+              <w:spacing w:before="0" w:after="0" w:line="252" w:lineRule="auto"/>
               <w:jc w:val="center"/>
             </w:pPr>
             <w:r>
@@ -2237,7 +2173,7 @@
           <w:p>
             <w:pPr>
               <w:widowControl/>
-              <w:spacing w:before="0" w:after="0" w:line="269" w:lineRule="auto"/>
+              <w:spacing w:before="0" w:after="0" w:line="252" w:lineRule="auto"/>
               <w:jc w:val="left"/>
             </w:pPr>
             <w:r>
@@ -2264,7 +2200,7 @@
           <w:p>
             <w:pPr>
               <w:widowControl/>
-              <w:spacing w:before="0" w:after="0" w:line="269" w:lineRule="auto"/>
+              <w:spacing w:before="0" w:after="0" w:line="252" w:lineRule="auto"/>
               <w:jc w:val="left"/>
             </w:pPr>
             <w:r>
@@ -2296,7 +2232,7 @@
           <w:p>
             <w:pPr>
               <w:widowControl/>
-              <w:spacing w:before="0" w:after="0" w:line="269" w:lineRule="auto"/>
+              <w:spacing w:before="0" w:after="0" w:line="252" w:lineRule="auto"/>
               <w:jc w:val="center"/>
             </w:pPr>
             <w:r>
@@ -2323,7 +2259,7 @@
           <w:p>
             <w:pPr>
               <w:widowControl/>
-              <w:spacing w:before="0" w:after="0" w:line="269" w:lineRule="auto"/>
+              <w:spacing w:before="0" w:after="0" w:line="252" w:lineRule="auto"/>
               <w:jc w:val="left"/>
             </w:pPr>
             <w:r>
@@ -2350,7 +2286,7 @@
           <w:p>
             <w:pPr>
               <w:widowControl/>
-              <w:spacing w:before="0" w:after="0" w:line="269" w:lineRule="auto"/>
+              <w:spacing w:before="0" w:after="0" w:line="252" w:lineRule="auto"/>
               <w:jc w:val="left"/>
             </w:pPr>
             <w:r>
@@ -2382,7 +2318,7 @@
           <w:p>
             <w:pPr>
               <w:widowControl/>
-              <w:spacing w:before="0" w:after="0" w:line="269" w:lineRule="auto"/>
+              <w:spacing w:before="0" w:after="0" w:line="252" w:lineRule="auto"/>
               <w:jc w:val="center"/>
             </w:pPr>
             <w:r>
@@ -2409,7 +2345,7 @@
           <w:p>
             <w:pPr>
               <w:widowControl/>
-              <w:spacing w:before="0" w:after="0" w:line="269" w:lineRule="auto"/>
+              <w:spacing w:before="0" w:after="0" w:line="252" w:lineRule="auto"/>
               <w:jc w:val="left"/>
             </w:pPr>
             <w:r>
@@ -2436,7 +2372,7 @@
           <w:p>
             <w:pPr>
               <w:widowControl/>
-              <w:spacing w:before="0" w:after="0" w:line="269" w:lineRule="auto"/>
+              <w:spacing w:before="0" w:after="0" w:line="252" w:lineRule="auto"/>
               <w:jc w:val="left"/>
             </w:pPr>
             <w:r>
@@ -2468,7 +2404,7 @@
           <w:p>
             <w:pPr>
               <w:widowControl/>
-              <w:spacing w:before="0" w:after="0" w:line="269" w:lineRule="auto"/>
+              <w:spacing w:before="0" w:after="0" w:line="252" w:lineRule="auto"/>
               <w:jc w:val="center"/>
             </w:pPr>
             <w:r>
@@ -2495,7 +2431,7 @@
           <w:p>
             <w:pPr>
               <w:widowControl/>
-              <w:spacing w:before="0" w:after="0" w:line="269" w:lineRule="auto"/>
+              <w:spacing w:before="0" w:after="0" w:line="252" w:lineRule="auto"/>
               <w:jc w:val="left"/>
             </w:pPr>
             <w:r>
@@ -2522,7 +2458,7 @@
           <w:p>
             <w:pPr>
               <w:widowControl/>
-              <w:spacing w:before="0" w:after="0" w:line="269" w:lineRule="auto"/>
+              <w:spacing w:before="0" w:after="0" w:line="252" w:lineRule="auto"/>
               <w:jc w:val="left"/>
             </w:pPr>
             <w:r>
@@ -2654,7 +2590,7 @@
           <w:color w:val="17212B"/>
           <w:sz w:val="21"/>
         </w:rPr>
-        <w:t>管理器“关于”或安全中心显示版本 0.2.0，Skills 清单显示 V1.3.1.6 与 49 项。</w:t>
+        <w:t>管理器“关于”或安全中心显示版本 0.2.0，Skills 清单显示 V1.4.0 与 49 项。</w:t>
       </w:r>
     </w:p>
     <w:p>
@@ -2786,7 +2722,7 @@
           <w:p>
             <w:pPr>
               <w:widowControl/>
-              <w:spacing w:before="0" w:after="40" w:line="269" w:lineRule="auto"/>
+              <w:spacing w:before="0" w:after="0" w:line="252" w:lineRule="auto"/>
             </w:pPr>
             <w:r>
               <w:rPr>
@@ -2801,7 +2737,7 @@
           <w:p>
             <w:pPr>
               <w:widowControl/>
-              <w:spacing w:before="0" w:after="0" w:line="283" w:lineRule="auto"/>
+              <w:spacing w:before="0" w:after="0" w:line="252" w:lineRule="auto"/>
             </w:pPr>
             <w:r>
               <w:rPr>
@@ -2815,9 +2751,197 @@
         </w:tc>
       </w:tr>
     </w:tbl>
+    <w:p>
+      <w:pPr>
+        <w:sectPr>
+          <w:headerReference w:type="default" r:id="rId19"/>
+          <w:footerReference w:type="default" r:id="rId20"/>
+          <w:type w:val="continuous"/>
+          <w:pgSz w:w="12240" w:h="15840"/>
+          <w:pgMar w:top="1440" w:right="1440" w:bottom="1440" w:left="1440" w:header="708" w:footer="708" w:gutter="0"/>
+          <w:cols w:space="720"/>
+          <w:docGrid w:linePitch="360"/>
+        </w:sectPr>
+      </w:pPr>
+    </w:p>
+    <w:p>
+      <w:pPr>
+        <w:pStyle w:val="Heading1"/>
+      </w:pPr>
+      <w:r>
+        <w:rPr>
+          <w:rFonts w:eastAsia="Arial Unicode MS"/>
+        </w:rPr>
+        <w:t>5  项目算法、交付契约与专利案卷</w:t>
+      </w:r>
+    </w:p>
+    <w:p>
+      <w:pPr>
+        <w:pStyle w:val="Heading2"/>
+      </w:pPr>
+      <w:r>
+        <w:rPr>
+          <w:rFonts w:eastAsia="Arial Unicode MS"/>
+        </w:rPr>
+        <w:t>系统如何评估一家企业</w:t>
+      </w:r>
+    </w:p>
+    <w:p>
+      <w:pPr>
+        <w:spacing w:line="276" w:lineRule="auto" w:after="40"/>
+      </w:pPr>
+      <w:r>
+        <w:rPr>
+          <w:rFonts w:eastAsia="Arial Unicode MS"/>
+        </w:rPr>
+        <w:t>1. 锚定企业主体和目标属地，识别标准项目名称、项目族和历史别名。</w:t>
+      </w:r>
+    </w:p>
+    <w:p>
+      <w:pPr>
+        <w:spacing w:line="276" w:lineRule="auto" w:after="40"/>
+      </w:pPr>
+      <w:r>
+        <w:rPr>
+          <w:rFonts w:eastAsia="Arial Unicode MS"/>
+        </w:rPr>
+        <w:t>2. 选择正式判断、当年申报前准备、历史回放、预测或回测等政策时间类型。</w:t>
+      </w:r>
+    </w:p>
+    <w:p>
+      <w:pPr>
+        <w:spacing w:line="276" w:lineRule="auto" w:after="40"/>
+      </w:pPr>
+      <w:r>
+        <w:rPr>
+          <w:rFonts w:eastAsia="Arial Unicode MS"/>
+        </w:rPr>
+        <w:t>3. 读取稳定管理办法、当年度通知、属地规则和适用的征求意见前瞻层。</w:t>
+      </w:r>
+    </w:p>
+    <w:p>
+      <w:pPr>
+        <w:spacing w:line="276" w:lineRule="auto" w:after="40"/>
+      </w:pPr>
+      <w:r>
+        <w:rPr>
+          <w:rFonts w:eastAsia="Arial Unicode MS"/>
+        </w:rPr>
+        <w:t>4. 将企业事实送入项目规则树，执行叶节点阈值和 all/any 组合判断。</w:t>
+      </w:r>
+    </w:p>
+    <w:p>
+      <w:pPr>
+        <w:spacing w:line="276" w:lineRule="auto" w:after="40"/>
+      </w:pPr>
+      <w:r>
+        <w:rPr>
+          <w:rFonts w:eastAsia="Arial Unicode MS"/>
+        </w:rPr>
+        <w:t>5. 输出符合、不符合、待补材料或当前无法判断，并列明政策来源与事实缺口。</w:t>
+      </w:r>
+    </w:p>
+    <w:p>
+      <w:pPr>
+        <w:spacing w:line="276" w:lineRule="auto" w:after="40"/>
+      </w:pPr>
+      <w:r>
+        <w:rPr>
+          <w:rFonts w:eastAsia="Arial Unicode MS"/>
+        </w:rPr>
+        <w:t>系统不会因为政策库暂时未命中就断言项目不存在，也不会用省级政策替代必须由市、区县规则决定的结论。已核验且明确替代旧政策的征求意见稿，在申报尚未开放时作为准备与预测主基线，但始终标注为尚未正式生效。</w:t>
+      </w:r>
+    </w:p>
+    <w:p>
+      <w:pPr>
+        <w:pStyle w:val="Heading2"/>
+      </w:pPr>
+      <w:r>
+        <w:rPr>
+          <w:rFonts w:eastAsia="Arial Unicode MS"/>
+        </w:rPr>
+        <w:t>企业项目身份数字孪生</w:t>
+      </w:r>
+    </w:p>
+    <w:p>
+      <w:pPr>
+        <w:spacing w:line="276" w:lineRule="auto" w:after="40"/>
+      </w:pPr>
+      <w:r>
+        <w:rPr>
+          <w:rFonts w:eastAsia="Arial Unicode MS"/>
+        </w:rPr>
+        <w:t>系统把名单身份和规则判断分开保存。认定年度、认定时名称和认定时地区以名单原文为准；当前企业名称、统一社会信用代码、现注册地址和登记机关来自当前工商核验。更名、迁址、复评、复核、失效和重新认定形成独立生命周期事件，可以回放企业某一年为何具有某项身份。</w:t>
+      </w:r>
+    </w:p>
+    <w:p>
+      <w:pPr>
+        <w:pStyle w:val="Heading2"/>
+        <w:pageBreakBefore/>
+      </w:pPr>
+      <w:r>
+        <w:rPr>
+          <w:rFonts w:eastAsia="Arial Unicode MS"/>
+        </w:rPr>
+        <w:t>交付契约负责什么</w:t>
+      </w:r>
+    </w:p>
+    <w:p>
+      <w:pPr>
+        <w:spacing w:line="276" w:lineRule="auto" w:after="40"/>
+      </w:pPr>
+      <w:r>
+        <w:rPr>
+          <w:rFonts w:eastAsia="Arial Unicode MS"/>
+        </w:rPr>
+        <w:t>算法负责项目规则、政策版本和企业事实判断；交付契约负责最终文件是否完整。不同报告类型分别约束必填章节、结论顺序、政策原文、企业事实、同行对比、证据台账、内置表格、数据口径、文件格式、焦糖品牌、Logo、水印、四问复盘和产物 SHA-256。</w:t>
+      </w:r>
+    </w:p>
+    <w:p>
+      <w:pPr>
+        <w:spacing w:line="276" w:lineRule="auto" w:after="40"/>
+      </w:pPr>
+      <w:r>
+        <w:rPr>
+          <w:rFonts w:eastAsia="Arial Unicode MS"/>
+        </w:rPr>
+        <w:t>门禁失败时，自动修复器只生成缺失章节、表格、证据或重新渲染的精确任务，不会用一段“已完成”说明代替实际文件验收。</w:t>
+      </w:r>
+    </w:p>
+    <w:p>
+      <w:pPr>
+        <w:pStyle w:val="Heading2"/>
+      </w:pPr>
+      <w:r>
+        <w:rPr>
+          <w:rFonts w:eastAsia="Arial Unicode MS"/>
+        </w:rPr>
+        <w:t>专利入口说明</w:t>
+      </w:r>
+    </w:p>
+    <w:p>
+      <w:pPr>
+        <w:spacing w:line="276" w:lineRule="auto" w:after="40"/>
+      </w:pPr>
+      <w:r>
+        <w:rPr>
+          <w:rFonts w:eastAsia="Arial Unicode MS"/>
+        </w:rPr>
+        <w:t>专利任务先进入 jiaotang-patent-router，判断是查新、布局、挖掘、交底、预审、FTO、审查意见还是项目申报证据任务。需要检查中国专利申请 Word 文件时，再进入 checking-patdocx-cn-single-agent。授权、审中、失效和转让取得必须分别标注；FTO 和侵权预警仅作初筛。</w:t>
+      </w:r>
+    </w:p>
+    <w:p>
+      <w:pPr>
+        <w:spacing w:line="276" w:lineRule="auto" w:after="40"/>
+      </w:pPr>
+      <w:r>
+        <w:rPr>
+          <w:rFonts w:eastAsia="Arial Unicode MS"/>
+        </w:rPr>
+        <w:t>完整申请文件先创建每案唯一的 patent-case-manifest，再从确认后的事实锁 JSON 通过同一个生成器形成申请 Word 和附图规范。交底、检索证据、权利要求现有技术矩阵、核稿验证、预审建议和提交清单均回写同一清单。提交前契约检查文件哈希、案件版本和依赖关系；阶段错版或缺失会生成具体重建任务。匿名测试夹具只用于升级回归，不能作为真实申请案卷。</w:t>
+      </w:r>
+    </w:p>
     <w:sectPr>
-      <w:headerReference w:type="default" r:id="rId19"/>
-      <w:footerReference w:type="default" r:id="rId20"/>
       <w:pgSz w:w="12240" w:h="15840"/>
       <w:pgMar w:top="1440" w:right="1440" w:bottom="1440" w:left="1440" w:header="708" w:footer="708" w:gutter="0"/>
       <w:cols w:space="720"/>
@@ -3062,6 +3186,51 @@
       <w:t>企业全生命周期助手  ·  Skills 管理器 0.2.0</w:t>
     </w:r>
   </w:p>
+  <w:p>
+    <w:r>
+      <w:drawing>
+        <wp:anchor distT="0" distB="0" distL="0" distR="0" simplePos="0" relativeHeight="251658240" behindDoc="0" locked="0" layoutInCell="1" allowOverlap="1">
+          <wp:simplePos x="0" y="0"/>
+          <wp:positionH relativeFrom="page">
+            <wp:align>center</wp:align>
+          </wp:positionH>
+          <wp:positionV relativeFrom="page">
+            <wp:align>center</wp:align>
+          </wp:positionV>
+          <wp:extent cx="4352544" cy="4352544"/>
+          <wp:effectExtent l="0" t="0" r="0" b="0"/>
+          <wp:wrapNone/>
+          <wp:docPr id="1" name="Jiaotang Centered Watermark v3" descr="Jiaotang Centered Watermark v3"/>
+          <wp:cNvGraphicFramePr>
+            <a:graphicFrameLocks xmlns:a="http://schemas.openxmlformats.org/drawingml/2006/main" noChangeAspect="1"/>
+          </wp:cNvGraphicFramePr>
+          <a:graphic xmlns:a="http://schemas.openxmlformats.org/drawingml/2006/main" xmlns:pic="http://schemas.openxmlformats.org/drawingml/2006/picture">
+            <a:graphicData uri="http://schemas.openxmlformats.org/drawingml/2006/picture">
+              <pic:pic>
+                <pic:nvPicPr>
+                  <pic:cNvPr id="0" name="brand-red-10.png"/>
+                  <pic:cNvPicPr/>
+                </pic:nvPicPr>
+                <pic:blipFill>
+                  <a:blip r:embed="rId1"/>
+                  <a:stretch>
+                    <a:fillRect/>
+                  </a:stretch>
+                </pic:blipFill>
+                <pic:spPr>
+                  <a:xfrm>
+                    <a:off x="0" y="0"/>
+                    <a:ext cx="4352544" cy="4352544"/>
+                  </a:xfrm>
+                  <a:prstGeom prst="rect"/>
+                </pic:spPr>
+              </pic:pic>
+            </a:graphicData>
+          </a:graphic>
+        </wp:anchor>
+      </w:drawing>
+    </w:r>
+  </w:p>
 </w:hdr>
 </file>
 
@@ -3072,6 +3241,51 @@
       <w:pStyle w:val="Header"/>
     </w:pPr>
     <w:r/>
+  </w:p>
+  <w:p>
+    <w:r>
+      <w:drawing>
+        <wp:anchor distT="0" distB="0" distL="0" distR="0" simplePos="0" relativeHeight="251658240" behindDoc="0" locked="0" layoutInCell="1" allowOverlap="1">
+          <wp:simplePos x="0" y="0"/>
+          <wp:positionH relativeFrom="page">
+            <wp:align>center</wp:align>
+          </wp:positionH>
+          <wp:positionV relativeFrom="page">
+            <wp:align>center</wp:align>
+          </wp:positionV>
+          <wp:extent cx="4352544" cy="4352544"/>
+          <wp:effectExtent l="0" t="0" r="0" b="0"/>
+          <wp:wrapNone/>
+          <wp:docPr id="1" name="Jiaotang Centered Watermark v3" descr="Jiaotang Centered Watermark v3"/>
+          <wp:cNvGraphicFramePr>
+            <a:graphicFrameLocks xmlns:a="http://schemas.openxmlformats.org/drawingml/2006/main" noChangeAspect="1"/>
+          </wp:cNvGraphicFramePr>
+          <a:graphic xmlns:a="http://schemas.openxmlformats.org/drawingml/2006/main" xmlns:pic="http://schemas.openxmlformats.org/drawingml/2006/picture">
+            <a:graphicData uri="http://schemas.openxmlformats.org/drawingml/2006/picture">
+              <pic:pic>
+                <pic:nvPicPr>
+                  <pic:cNvPr id="0" name="brand-red-10.png"/>
+                  <pic:cNvPicPr/>
+                </pic:nvPicPr>
+                <pic:blipFill>
+                  <a:blip r:embed="rId1"/>
+                  <a:stretch>
+                    <a:fillRect/>
+                  </a:stretch>
+                </pic:blipFill>
+                <pic:spPr>
+                  <a:xfrm>
+                    <a:off x="0" y="0"/>
+                    <a:ext cx="4352544" cy="4352544"/>
+                  </a:xfrm>
+                  <a:prstGeom prst="rect"/>
+                </pic:spPr>
+              </pic:pic>
+            </a:graphicData>
+          </a:graphic>
+        </wp:anchor>
+      </w:drawing>
+    </w:r>
   </w:p>
 </w:hdr>
 </file>
@@ -3093,6 +3307,51 @@
         <w:sz w:val="17"/>
       </w:rPr>
       <w:t>企业全生命周期助手  ·  Skills 管理器 0.2.0</w:t>
+    </w:r>
+  </w:p>
+  <w:p>
+    <w:r>
+      <w:drawing>
+        <wp:anchor distT="0" distB="0" distL="0" distR="0" simplePos="0" relativeHeight="251658240" behindDoc="0" locked="0" layoutInCell="1" allowOverlap="1">
+          <wp:simplePos x="0" y="0"/>
+          <wp:positionH relativeFrom="page">
+            <wp:align>center</wp:align>
+          </wp:positionH>
+          <wp:positionV relativeFrom="page">
+            <wp:align>center</wp:align>
+          </wp:positionV>
+          <wp:extent cx="4352544" cy="4352544"/>
+          <wp:effectExtent l="0" t="0" r="0" b="0"/>
+          <wp:wrapNone/>
+          <wp:docPr id="1" name="Jiaotang Centered Watermark v3" descr="Jiaotang Centered Watermark v3"/>
+          <wp:cNvGraphicFramePr>
+            <a:graphicFrameLocks xmlns:a="http://schemas.openxmlformats.org/drawingml/2006/main" noChangeAspect="1"/>
+          </wp:cNvGraphicFramePr>
+          <a:graphic xmlns:a="http://schemas.openxmlformats.org/drawingml/2006/main" xmlns:pic="http://schemas.openxmlformats.org/drawingml/2006/picture">
+            <a:graphicData uri="http://schemas.openxmlformats.org/drawingml/2006/picture">
+              <pic:pic>
+                <pic:nvPicPr>
+                  <pic:cNvPr id="0" name="brand-red-10.png"/>
+                  <pic:cNvPicPr/>
+                </pic:nvPicPr>
+                <pic:blipFill>
+                  <a:blip r:embed="rId1"/>
+                  <a:stretch>
+                    <a:fillRect/>
+                  </a:stretch>
+                </pic:blipFill>
+                <pic:spPr>
+                  <a:xfrm>
+                    <a:off x="0" y="0"/>
+                    <a:ext cx="4352544" cy="4352544"/>
+                  </a:xfrm>
+                  <a:prstGeom prst="rect"/>
+                </pic:spPr>
+              </pic:pic>
+            </a:graphicData>
+          </a:graphic>
+        </wp:anchor>
+      </w:drawing>
     </w:r>
   </w:p>
 </w:hdr>
@@ -3117,6 +3376,51 @@
       <w:t>企业全生命周期助手  ·  Skills 管理器 0.2.0</w:t>
     </w:r>
   </w:p>
+  <w:p>
+    <w:r>
+      <w:drawing>
+        <wp:anchor distT="0" distB="0" distL="0" distR="0" simplePos="0" relativeHeight="251658240" behindDoc="0" locked="0" layoutInCell="1" allowOverlap="1">
+          <wp:simplePos x="0" y="0"/>
+          <wp:positionH relativeFrom="page">
+            <wp:align>center</wp:align>
+          </wp:positionH>
+          <wp:positionV relativeFrom="page">
+            <wp:align>center</wp:align>
+          </wp:positionV>
+          <wp:extent cx="4352544" cy="4352544"/>
+          <wp:effectExtent l="0" t="0" r="0" b="0"/>
+          <wp:wrapNone/>
+          <wp:docPr id="1" name="Jiaotang Centered Watermark v3" descr="Jiaotang Centered Watermark v3"/>
+          <wp:cNvGraphicFramePr>
+            <a:graphicFrameLocks xmlns:a="http://schemas.openxmlformats.org/drawingml/2006/main" noChangeAspect="1"/>
+          </wp:cNvGraphicFramePr>
+          <a:graphic xmlns:a="http://schemas.openxmlformats.org/drawingml/2006/main" xmlns:pic="http://schemas.openxmlformats.org/drawingml/2006/picture">
+            <a:graphicData uri="http://schemas.openxmlformats.org/drawingml/2006/picture">
+              <pic:pic>
+                <pic:nvPicPr>
+                  <pic:cNvPr id="0" name="brand-red-10.png"/>
+                  <pic:cNvPicPr/>
+                </pic:nvPicPr>
+                <pic:blipFill>
+                  <a:blip r:embed="rId1"/>
+                  <a:stretch>
+                    <a:fillRect/>
+                  </a:stretch>
+                </pic:blipFill>
+                <pic:spPr>
+                  <a:xfrm>
+                    <a:off x="0" y="0"/>
+                    <a:ext cx="4352544" cy="4352544"/>
+                  </a:xfrm>
+                  <a:prstGeom prst="rect"/>
+                </pic:spPr>
+              </pic:pic>
+            </a:graphicData>
+          </a:graphic>
+        </wp:anchor>
+      </w:drawing>
+    </w:r>
+  </w:p>
 </w:hdr>
 </file>
 
@@ -3137,6 +3441,51 @@
         <w:sz w:val="17"/>
       </w:rPr>
       <w:t>企业全生命周期助手  ·  Skills 管理器 0.2.0</w:t>
+    </w:r>
+  </w:p>
+  <w:p>
+    <w:r>
+      <w:drawing>
+        <wp:anchor distT="0" distB="0" distL="0" distR="0" simplePos="0" relativeHeight="251658240" behindDoc="0" locked="0" layoutInCell="1" allowOverlap="1">
+          <wp:simplePos x="0" y="0"/>
+          <wp:positionH relativeFrom="page">
+            <wp:align>center</wp:align>
+          </wp:positionH>
+          <wp:positionV relativeFrom="page">
+            <wp:align>center</wp:align>
+          </wp:positionV>
+          <wp:extent cx="4352544" cy="4352544"/>
+          <wp:effectExtent l="0" t="0" r="0" b="0"/>
+          <wp:wrapNone/>
+          <wp:docPr id="1" name="Jiaotang Centered Watermark v3" descr="Jiaotang Centered Watermark v3"/>
+          <wp:cNvGraphicFramePr>
+            <a:graphicFrameLocks xmlns:a="http://schemas.openxmlformats.org/drawingml/2006/main" noChangeAspect="1"/>
+          </wp:cNvGraphicFramePr>
+          <a:graphic xmlns:a="http://schemas.openxmlformats.org/drawingml/2006/main" xmlns:pic="http://schemas.openxmlformats.org/drawingml/2006/picture">
+            <a:graphicData uri="http://schemas.openxmlformats.org/drawingml/2006/picture">
+              <pic:pic>
+                <pic:nvPicPr>
+                  <pic:cNvPr id="0" name="brand-red-10.png"/>
+                  <pic:cNvPicPr/>
+                </pic:nvPicPr>
+                <pic:blipFill>
+                  <a:blip r:embed="rId1"/>
+                  <a:stretch>
+                    <a:fillRect/>
+                  </a:stretch>
+                </pic:blipFill>
+                <pic:spPr>
+                  <a:xfrm>
+                    <a:off x="0" y="0"/>
+                    <a:ext cx="4352544" cy="4352544"/>
+                  </a:xfrm>
+                  <a:prstGeom prst="rect"/>
+                </pic:spPr>
+              </pic:pic>
+            </a:graphicData>
+          </a:graphic>
+        </wp:anchor>
+      </w:drawing>
     </w:r>
   </w:p>
 </w:hdr>
@@ -3159,6 +3508,106 @@
         <w:sz w:val="17"/>
       </w:rPr>
       <w:t>企业全生命周期助手  ·  Skills 管理器 0.2.0</w:t>
+    </w:r>
+  </w:p>
+  <w:p>
+    <w:r>
+      <w:drawing>
+        <wp:anchor distT="0" distB="0" distL="0" distR="0" simplePos="0" relativeHeight="251658240" behindDoc="0" locked="0" layoutInCell="1" allowOverlap="1">
+          <wp:simplePos x="0" y="0"/>
+          <wp:positionH relativeFrom="page">
+            <wp:align>center</wp:align>
+          </wp:positionH>
+          <wp:positionV relativeFrom="page">
+            <wp:align>center</wp:align>
+          </wp:positionV>
+          <wp:extent cx="4352544" cy="4352544"/>
+          <wp:effectExtent l="0" t="0" r="0" b="0"/>
+          <wp:wrapNone/>
+          <wp:docPr id="1" name="Jiaotang Centered Watermark v3" descr="Jiaotang Centered Watermark v3"/>
+          <wp:cNvGraphicFramePr>
+            <a:graphicFrameLocks xmlns:a="http://schemas.openxmlformats.org/drawingml/2006/main" noChangeAspect="1"/>
+          </wp:cNvGraphicFramePr>
+          <a:graphic xmlns:a="http://schemas.openxmlformats.org/drawingml/2006/main" xmlns:pic="http://schemas.openxmlformats.org/drawingml/2006/picture">
+            <a:graphicData uri="http://schemas.openxmlformats.org/drawingml/2006/picture">
+              <pic:pic>
+                <pic:nvPicPr>
+                  <pic:cNvPr id="0" name="brand-red-10.png"/>
+                  <pic:cNvPicPr/>
+                </pic:nvPicPr>
+                <pic:blipFill>
+                  <a:blip r:embed="rId1"/>
+                  <a:stretch>
+                    <a:fillRect/>
+                  </a:stretch>
+                </pic:blipFill>
+                <pic:spPr>
+                  <a:xfrm>
+                    <a:off x="0" y="0"/>
+                    <a:ext cx="4352544" cy="4352544"/>
+                  </a:xfrm>
+                  <a:prstGeom prst="rect"/>
+                </pic:spPr>
+              </pic:pic>
+            </a:graphicData>
+          </a:graphic>
+        </wp:anchor>
+      </w:drawing>
+    </w:r>
+  </w:p>
+</w:hdr>
+</file>
+
+<file path=word/header7.xml><?xml version="1.0" encoding="utf-8"?>
+<w:hdr xmlns:m="http://schemas.openxmlformats.org/officeDocument/2006/math" xmlns:mc="http://schemas.openxmlformats.org/markup-compatibility/2006" xmlns:mo="http://schemas.microsoft.com/office/mac/office/2008/main" xmlns:mv="urn:schemas-microsoft-com:mac:vml" xmlns:o="urn:schemas-microsoft-com:office:office" xmlns:r="http://schemas.openxmlformats.org/officeDocument/2006/relationships" xmlns:v="urn:schemas-microsoft-com:vml" xmlns:w10="urn:schemas-microsoft-com:office:word" xmlns:w14="http://schemas.microsoft.com/office/word/2010/wordml" xmlns:w="http://schemas.openxmlformats.org/wordprocessingml/2006/main" xmlns:wne="http://schemas.microsoft.com/office/word/2006/wordml" xmlns:wp14="http://schemas.microsoft.com/office/word/2010/wordprocessingDrawing" xmlns:wp="http://schemas.openxmlformats.org/drawingml/2006/wordprocessingDrawing" xmlns:wpc="http://schemas.microsoft.com/office/word/2010/wordprocessingCanvas" xmlns:wpg="http://schemas.microsoft.com/office/word/2010/wordprocessingGroup" xmlns:wpi="http://schemas.microsoft.com/office/word/2010/wordprocessingInk" xmlns:wps="http://schemas.microsoft.com/office/word/2010/wordprocessingShape" mc:Ignorable="w14 wp14">
+  <w:p>
+    <w:pPr>
+      <w:pStyle w:val="Header"/>
+    </w:pPr>
+  </w:p>
+  <w:p>
+    <w:r>
+      <w:drawing>
+        <wp:anchor distT="0" distB="0" distL="0" distR="0" simplePos="0" relativeHeight="251658240" behindDoc="0" locked="0" layoutInCell="1" allowOverlap="1">
+          <wp:simplePos x="0" y="0"/>
+          <wp:positionH relativeFrom="page">
+            <wp:align>center</wp:align>
+          </wp:positionH>
+          <wp:positionV relativeFrom="page">
+            <wp:align>center</wp:align>
+          </wp:positionV>
+          <wp:extent cx="4352544" cy="4352544"/>
+          <wp:effectExtent l="0" t="0" r="0" b="0"/>
+          <wp:wrapNone/>
+          <wp:docPr id="1" name="Jiaotang Centered Watermark v3" descr="Jiaotang Centered Watermark v3"/>
+          <wp:cNvGraphicFramePr>
+            <a:graphicFrameLocks xmlns:a="http://schemas.openxmlformats.org/drawingml/2006/main" noChangeAspect="1"/>
+          </wp:cNvGraphicFramePr>
+          <a:graphic xmlns:a="http://schemas.openxmlformats.org/drawingml/2006/main" xmlns:pic="http://schemas.openxmlformats.org/drawingml/2006/picture">
+            <a:graphicData uri="http://schemas.openxmlformats.org/drawingml/2006/picture">
+              <pic:pic>
+                <pic:nvPicPr>
+                  <pic:cNvPr id="0" name="brand-red-10.png"/>
+                  <pic:cNvPicPr/>
+                </pic:nvPicPr>
+                <pic:blipFill>
+                  <a:blip r:embed="rId1"/>
+                  <a:stretch>
+                    <a:fillRect/>
+                  </a:stretch>
+                </pic:blipFill>
+                <pic:spPr>
+                  <a:xfrm>
+                    <a:off x="0" y="0"/>
+                    <a:ext cx="4352544" cy="4352544"/>
+                  </a:xfrm>
+                  <a:prstGeom prst="rect"/>
+                </pic:spPr>
+              </pic:pic>
+            </a:graphicData>
+          </a:graphic>
+        </wp:anchor>
+      </w:drawing>
     </w:r>
   </w:p>
 </w:hdr>
@@ -3678,6 +4127,9 @@
       </w:tabs>
       <w:spacing w:after="0" w:line="240" w:lineRule="auto"/>
     </w:pPr>
+    <w:rPr>
+      <w:rFonts w:eastAsia="Arial Unicode MS"/>
+    </w:rPr>
   </w:style>
   <w:style w:type="character" w:customStyle="1" w:styleId="HeaderChar">
     <w:name w:val="Header Char"/>
@@ -3685,6 +4137,9 @@
     <w:link w:val="Header"/>
     <w:uiPriority w:val="99"/>
     <w:rsid w:val="00E618BF"/>
+    <w:rPr>
+      <w:rFonts w:eastAsia="Arial Unicode MS"/>
+    </w:rPr>
   </w:style>
   <w:style w:type="paragraph" w:styleId="Footer">
     <w:name w:val="footer"/>
@@ -3700,6 +4155,9 @@
       </w:tabs>
       <w:spacing w:after="0" w:line="240" w:lineRule="auto"/>
     </w:pPr>
+    <w:rPr>
+      <w:rFonts w:eastAsia="Arial Unicode MS"/>
+    </w:rPr>
   </w:style>
   <w:style w:type="character" w:customStyle="1" w:styleId="FooterChar">
     <w:name w:val="Footer Char"/>
@@ -3707,6 +4165,9 @@
     <w:link w:val="Footer"/>
     <w:uiPriority w:val="99"/>
     <w:rsid w:val="00E618BF"/>
+    <w:rPr>
+      <w:rFonts w:eastAsia="Arial Unicode MS"/>
+    </w:rPr>
   </w:style>
   <w:style w:type="paragraph" w:styleId="Heading1">
     <w:name w:val="heading 1"/>
@@ -3795,7 +4256,7 @@
       <w:outlineLvl w:val="3"/>
     </w:pPr>
     <w:rPr>
-      <w:rFonts w:asciiTheme="majorHAnsi" w:eastAsiaTheme="majorEastAsia" w:hAnsiTheme="majorHAnsi" w:cstheme="majorBidi"/>
+      <w:rFonts w:asciiTheme="majorHAnsi" w:eastAsiaTheme="majorEastAsia" w:hAnsiTheme="majorHAnsi" w:cstheme="majorBidi" w:eastAsia="Arial Unicode MS"/>
       <w:b/>
       <w:bCs/>
       <w:i/>
@@ -3820,7 +4281,7 @@
       <w:outlineLvl w:val="4"/>
     </w:pPr>
     <w:rPr>
-      <w:rFonts w:asciiTheme="majorHAnsi" w:eastAsiaTheme="majorEastAsia" w:hAnsiTheme="majorHAnsi" w:cstheme="majorBidi"/>
+      <w:rFonts w:asciiTheme="majorHAnsi" w:eastAsiaTheme="majorEastAsia" w:hAnsiTheme="majorHAnsi" w:cstheme="majorBidi" w:eastAsia="Arial Unicode MS"/>
       <w:color w:val="243F60" w:themeColor="accent1" w:themeShade="7F"/>
     </w:rPr>
   </w:style>
@@ -3841,7 +4302,7 @@
       <w:outlineLvl w:val="5"/>
     </w:pPr>
     <w:rPr>
-      <w:rFonts w:asciiTheme="majorHAnsi" w:eastAsiaTheme="majorEastAsia" w:hAnsiTheme="majorHAnsi" w:cstheme="majorBidi"/>
+      <w:rFonts w:asciiTheme="majorHAnsi" w:eastAsiaTheme="majorEastAsia" w:hAnsiTheme="majorHAnsi" w:cstheme="majorBidi" w:eastAsia="Arial Unicode MS"/>
       <w:i/>
       <w:iCs/>
       <w:color w:val="243F60" w:themeColor="accent1" w:themeShade="7F"/>
@@ -3864,7 +4325,7 @@
       <w:outlineLvl w:val="6"/>
     </w:pPr>
     <w:rPr>
-      <w:rFonts w:asciiTheme="majorHAnsi" w:eastAsiaTheme="majorEastAsia" w:hAnsiTheme="majorHAnsi" w:cstheme="majorBidi"/>
+      <w:rFonts w:asciiTheme="majorHAnsi" w:eastAsiaTheme="majorEastAsia" w:hAnsiTheme="majorHAnsi" w:cstheme="majorBidi" w:eastAsia="Arial Unicode MS"/>
       <w:i/>
       <w:iCs/>
       <w:color w:val="404040" w:themeColor="text1" w:themeTint="BF"/>
@@ -3887,7 +4348,7 @@
       <w:outlineLvl w:val="7"/>
     </w:pPr>
     <w:rPr>
-      <w:rFonts w:asciiTheme="majorHAnsi" w:eastAsiaTheme="majorEastAsia" w:hAnsiTheme="majorHAnsi" w:cstheme="majorBidi"/>
+      <w:rFonts w:asciiTheme="majorHAnsi" w:eastAsiaTheme="majorEastAsia" w:hAnsiTheme="majorHAnsi" w:cstheme="majorBidi" w:eastAsia="Arial Unicode MS"/>
       <w:color w:val="4F81BD" w:themeColor="accent1"/>
       <w:sz w:val="20"/>
       <w:szCs w:val="20"/>
@@ -3910,7 +4371,7 @@
       <w:outlineLvl w:val="8"/>
     </w:pPr>
     <w:rPr>
-      <w:rFonts w:asciiTheme="majorHAnsi" w:eastAsiaTheme="majorEastAsia" w:hAnsiTheme="majorHAnsi" w:cstheme="majorBidi"/>
+      <w:rFonts w:asciiTheme="majorHAnsi" w:eastAsiaTheme="majorEastAsia" w:hAnsiTheme="majorHAnsi" w:cstheme="majorBidi" w:eastAsia="Arial Unicode MS"/>
       <w:i/>
       <w:iCs/>
       <w:color w:val="404040" w:themeColor="text1" w:themeTint="BF"/>
@@ -3923,12 +4384,18 @@
     <w:uiPriority w:val="1"/>
     <w:semiHidden/>
     <w:unhideWhenUsed/>
+    <w:rPr>
+      <w:rFonts w:eastAsia="Arial Unicode MS"/>
+    </w:rPr>
   </w:style>
   <w:style w:type="table" w:default="1" w:styleId="TableNormal">
     <w:name w:val="Normal Table"/>
     <w:uiPriority w:val="99"/>
     <w:semiHidden/>
     <w:unhideWhenUsed/>
+    <w:rPr>
+      <w:rFonts w:eastAsia="Arial Unicode MS"/>
+    </w:rPr>
     <w:tblPr>
       <w:tblInd w:w="0" w:type="dxa"/>
       <w:tblCellMar>
@@ -3944,6 +4411,9 @@
     <w:uiPriority w:val="99"/>
     <w:semiHidden/>
     <w:unhideWhenUsed/>
+    <w:rPr>
+      <w:rFonts w:eastAsia="Arial Unicode MS"/>
+    </w:rPr>
   </w:style>
   <w:style w:type="paragraph" w:styleId="NoSpacing">
     <w:name w:val="No Spacing"/>
@@ -3953,6 +4423,9 @@
     <w:pPr>
       <w:spacing w:after="0" w:line="240" w:lineRule="auto"/>
     </w:pPr>
+    <w:rPr>
+      <w:rFonts w:eastAsia="Arial Unicode MS"/>
+    </w:rPr>
   </w:style>
   <w:style w:type="character" w:customStyle="1" w:styleId="Heading1Char">
     <w:name w:val="Heading 1 Char"/>
@@ -3961,7 +4434,7 @@
     <w:uiPriority w:val="9"/>
     <w:rsid w:val="00FC693F"/>
     <w:rPr>
-      <w:rFonts w:asciiTheme="majorHAnsi" w:eastAsiaTheme="majorEastAsia" w:hAnsiTheme="majorHAnsi" w:cstheme="majorBidi"/>
+      <w:rFonts w:asciiTheme="majorHAnsi" w:eastAsiaTheme="majorEastAsia" w:hAnsiTheme="majorHAnsi" w:cstheme="majorBidi" w:eastAsia="Arial Unicode MS"/>
       <w:b/>
       <w:bCs/>
       <w:color w:val="365F91" w:themeColor="accent1" w:themeShade="BF"/>
@@ -3976,7 +4449,7 @@
     <w:uiPriority w:val="9"/>
     <w:rsid w:val="00FC693F"/>
     <w:rPr>
-      <w:rFonts w:asciiTheme="majorHAnsi" w:eastAsiaTheme="majorEastAsia" w:hAnsiTheme="majorHAnsi" w:cstheme="majorBidi"/>
+      <w:rFonts w:asciiTheme="majorHAnsi" w:eastAsiaTheme="majorEastAsia" w:hAnsiTheme="majorHAnsi" w:cstheme="majorBidi" w:eastAsia="Arial Unicode MS"/>
       <w:b/>
       <w:bCs/>
       <w:color w:val="4F81BD" w:themeColor="accent1"/>
@@ -3991,7 +4464,7 @@
     <w:uiPriority w:val="9"/>
     <w:rsid w:val="00FC693F"/>
     <w:rPr>
-      <w:rFonts w:asciiTheme="majorHAnsi" w:eastAsiaTheme="majorEastAsia" w:hAnsiTheme="majorHAnsi" w:cstheme="majorBidi"/>
+      <w:rFonts w:asciiTheme="majorHAnsi" w:eastAsiaTheme="majorEastAsia" w:hAnsiTheme="majorHAnsi" w:cstheme="majorBidi" w:eastAsia="Arial Unicode MS"/>
       <w:b/>
       <w:bCs/>
       <w:color w:val="4F81BD" w:themeColor="accent1"/>
@@ -4013,7 +4486,7 @@
       <w:contextualSpacing/>
     </w:pPr>
     <w:rPr>
-      <w:rFonts w:asciiTheme="majorHAnsi" w:eastAsiaTheme="majorEastAsia" w:hAnsiTheme="majorHAnsi" w:cstheme="majorBidi"/>
+      <w:rFonts w:asciiTheme="majorHAnsi" w:eastAsiaTheme="majorEastAsia" w:hAnsiTheme="majorHAnsi" w:cstheme="majorBidi" w:eastAsia="Arial Unicode MS"/>
       <w:color w:val="17365D" w:themeColor="text2" w:themeShade="BF"/>
       <w:spacing w:val="5"/>
       <w:kern w:val="28"/>
@@ -4028,7 +4501,7 @@
     <w:uiPriority w:val="10"/>
     <w:rsid w:val="00FC693F"/>
     <w:rPr>
-      <w:rFonts w:asciiTheme="majorHAnsi" w:eastAsiaTheme="majorEastAsia" w:hAnsiTheme="majorHAnsi" w:cstheme="majorBidi"/>
+      <w:rFonts w:asciiTheme="majorHAnsi" w:eastAsiaTheme="majorEastAsia" w:hAnsiTheme="majorHAnsi" w:cstheme="majorBidi" w:eastAsia="Arial Unicode MS"/>
       <w:color w:val="17365D" w:themeColor="text2" w:themeShade="BF"/>
       <w:spacing w:val="5"/>
       <w:kern w:val="28"/>
@@ -4050,7 +4523,7 @@
       </w:numPr>
     </w:pPr>
     <w:rPr>
-      <w:rFonts w:asciiTheme="majorHAnsi" w:eastAsiaTheme="majorEastAsia" w:hAnsiTheme="majorHAnsi" w:cstheme="majorBidi"/>
+      <w:rFonts w:asciiTheme="majorHAnsi" w:eastAsiaTheme="majorEastAsia" w:hAnsiTheme="majorHAnsi" w:cstheme="majorBidi" w:eastAsia="Arial Unicode MS"/>
       <w:i/>
       <w:iCs/>
       <w:color w:val="4F81BD" w:themeColor="accent1"/>
@@ -4066,7 +4539,7 @@
     <w:uiPriority w:val="11"/>
     <w:rsid w:val="00FC693F"/>
     <w:rPr>
-      <w:rFonts w:asciiTheme="majorHAnsi" w:eastAsiaTheme="majorEastAsia" w:hAnsiTheme="majorHAnsi" w:cstheme="majorBidi"/>
+      <w:rFonts w:asciiTheme="majorHAnsi" w:eastAsiaTheme="majorEastAsia" w:hAnsiTheme="majorHAnsi" w:cstheme="majorBidi" w:eastAsia="Arial Unicode MS"/>
       <w:i/>
       <w:iCs/>
       <w:color w:val="4F81BD" w:themeColor="accent1"/>
@@ -4085,6 +4558,9 @@
       <w:ind w:left="720"/>
       <w:contextualSpacing/>
     </w:pPr>
+    <w:rPr>
+      <w:rFonts w:eastAsia="Arial Unicode MS"/>
+    </w:rPr>
   </w:style>
   <w:style w:type="paragraph" w:styleId="BodyText">
     <w:name w:val="Body Text"/>
@@ -4096,6 +4572,9 @@
     <w:pPr>
       <w:spacing w:after="120"/>
     </w:pPr>
+    <w:rPr>
+      <w:rFonts w:eastAsia="Arial Unicode MS"/>
+    </w:rPr>
   </w:style>
   <w:style w:type="character" w:customStyle="1" w:styleId="BodyTextChar">
     <w:name w:val="Body Text Char"/>
@@ -4103,6 +4582,9 @@
     <w:link w:val="BodyText"/>
     <w:uiPriority w:val="99"/>
     <w:rsid w:val="00AA1D8D"/>
+    <w:rPr>
+      <w:rFonts w:eastAsia="Arial Unicode MS"/>
+    </w:rPr>
   </w:style>
   <w:style w:type="paragraph" w:styleId="BodyText2">
     <w:name w:val="Body Text 2"/>
@@ -4114,6 +4596,9 @@
     <w:pPr>
       <w:spacing w:after="120" w:line="480" w:lineRule="auto"/>
     </w:pPr>
+    <w:rPr>
+      <w:rFonts w:eastAsia="Arial Unicode MS"/>
+    </w:rPr>
   </w:style>
   <w:style w:type="character" w:customStyle="1" w:styleId="BodyText2Char">
     <w:name w:val="Body Text 2 Char"/>
@@ -4121,6 +4606,9 @@
     <w:link w:val="BodyText2"/>
     <w:uiPriority w:val="99"/>
     <w:rsid w:val="00AA1D8D"/>
+    <w:rPr>
+      <w:rFonts w:eastAsia="Arial Unicode MS"/>
+    </w:rPr>
   </w:style>
   <w:style w:type="paragraph" w:styleId="BodyText3">
     <w:name w:val="Body Text 3"/>
@@ -4133,6 +4621,7 @@
       <w:spacing w:after="120"/>
     </w:pPr>
     <w:rPr>
+      <w:rFonts w:eastAsia="Arial Unicode MS"/>
       <w:sz w:val="16"/>
       <w:szCs w:val="16"/>
     </w:rPr>
@@ -4144,6 +4633,7 @@
     <w:uiPriority w:val="99"/>
     <w:rsid w:val="00AA1D8D"/>
     <w:rPr>
+      <w:rFonts w:eastAsia="Arial Unicode MS"/>
       <w:sz w:val="16"/>
       <w:szCs w:val="16"/>
     </w:rPr>
@@ -4158,6 +4648,9 @@
       <w:ind w:left="360" w:hanging="360"/>
       <w:contextualSpacing/>
     </w:pPr>
+    <w:rPr>
+      <w:rFonts w:eastAsia="Arial Unicode MS"/>
+    </w:rPr>
   </w:style>
   <w:style w:type="paragraph" w:styleId="List2">
     <w:name w:val="List 2"/>
@@ -4169,6 +4662,9 @@
       <w:ind w:left="720" w:hanging="360"/>
       <w:contextualSpacing/>
     </w:pPr>
+    <w:rPr>
+      <w:rFonts w:eastAsia="Arial Unicode MS"/>
+    </w:rPr>
   </w:style>
   <w:style w:type="paragraph" w:styleId="List3">
     <w:name w:val="List 3"/>
@@ -4180,6 +4676,9 @@
       <w:ind w:left="1080" w:hanging="360"/>
       <w:contextualSpacing/>
     </w:pPr>
+    <w:rPr>
+      <w:rFonts w:eastAsia="Arial Unicode MS"/>
+    </w:rPr>
   </w:style>
   <w:style w:type="paragraph" w:styleId="ListBullet">
     <w:name w:val="List Bullet"/>
@@ -4193,6 +4692,9 @@
       </w:numPr>
       <w:contextualSpacing/>
     </w:pPr>
+    <w:rPr>
+      <w:rFonts w:eastAsia="Arial Unicode MS"/>
+    </w:rPr>
   </w:style>
   <w:style w:type="paragraph" w:styleId="ListBullet2">
     <w:name w:val="List Bullet 2"/>
@@ -4206,6 +4708,9 @@
       </w:numPr>
       <w:contextualSpacing/>
     </w:pPr>
+    <w:rPr>
+      <w:rFonts w:eastAsia="Arial Unicode MS"/>
+    </w:rPr>
   </w:style>
   <w:style w:type="paragraph" w:styleId="ListBullet3">
     <w:name w:val="List Bullet 3"/>
@@ -4219,6 +4724,9 @@
       </w:numPr>
       <w:contextualSpacing/>
     </w:pPr>
+    <w:rPr>
+      <w:rFonts w:eastAsia="Arial Unicode MS"/>
+    </w:rPr>
   </w:style>
   <w:style w:type="paragraph" w:styleId="ListNumber">
     <w:name w:val="List Number"/>
@@ -4232,6 +4740,9 @@
       </w:numPr>
       <w:contextualSpacing/>
     </w:pPr>
+    <w:rPr>
+      <w:rFonts w:eastAsia="Arial Unicode MS"/>
+    </w:rPr>
   </w:style>
   <w:style w:type="paragraph" w:styleId="ListNumber2">
     <w:name w:val="List Number 2"/>
@@ -4245,6 +4756,9 @@
       </w:numPr>
       <w:contextualSpacing/>
     </w:pPr>
+    <w:rPr>
+      <w:rFonts w:eastAsia="Arial Unicode MS"/>
+    </w:rPr>
   </w:style>
   <w:style w:type="paragraph" w:styleId="ListNumber3">
     <w:name w:val="List Number 3"/>
@@ -4258,6 +4772,9 @@
       </w:numPr>
       <w:contextualSpacing/>
     </w:pPr>
+    <w:rPr>
+      <w:rFonts w:eastAsia="Arial Unicode MS"/>
+    </w:rPr>
   </w:style>
   <w:style w:type="paragraph" w:styleId="ListContinue">
     <w:name w:val="List Continue"/>
@@ -4270,6 +4787,9 @@
       <w:ind w:left="360"/>
       <w:contextualSpacing/>
     </w:pPr>
+    <w:rPr>
+      <w:rFonts w:eastAsia="Arial Unicode MS"/>
+    </w:rPr>
   </w:style>
   <w:style w:type="paragraph" w:styleId="ListContinue2">
     <w:name w:val="List Continue 2"/>
@@ -4282,6 +4802,9 @@
       <w:ind w:left="720"/>
       <w:contextualSpacing/>
     </w:pPr>
+    <w:rPr>
+      <w:rFonts w:eastAsia="Arial Unicode MS"/>
+    </w:rPr>
   </w:style>
   <w:style w:type="paragraph" w:styleId="ListContinue3">
     <w:name w:val="List Continue 3"/>
@@ -4294,6 +4817,9 @@
       <w:ind w:left="1080"/>
       <w:contextualSpacing/>
     </w:pPr>
+    <w:rPr>
+      <w:rFonts w:eastAsia="Arial Unicode MS"/>
+    </w:rPr>
   </w:style>
   <w:style w:type="paragraph" w:styleId="MacroText">
     <w:name w:val="macro"/>
@@ -4313,7 +4839,7 @@
       </w:tabs>
     </w:pPr>
     <w:rPr>
-      <w:rFonts w:ascii="Courier" w:hAnsi="Courier"/>
+      <w:rFonts w:ascii="Courier" w:hAnsi="Courier" w:eastAsia="Arial Unicode MS"/>
       <w:sz w:val="20"/>
       <w:szCs w:val="20"/>
     </w:rPr>
@@ -4325,7 +4851,7 @@
     <w:uiPriority w:val="99"/>
     <w:rsid w:val="0029639D"/>
     <w:rPr>
-      <w:rFonts w:ascii="Courier" w:hAnsi="Courier"/>
+      <w:rFonts w:ascii="Courier" w:hAnsi="Courier" w:eastAsia="Arial Unicode MS"/>
       <w:sz w:val="20"/>
       <w:szCs w:val="20"/>
     </w:rPr>
@@ -4339,6 +4865,7 @@
     <w:qFormat/>
     <w:rsid w:val="00FC693F"/>
     <w:rPr>
+      <w:rFonts w:eastAsia="Arial Unicode MS"/>
       <w:i/>
       <w:iCs/>
       <w:color w:val="000000" w:themeColor="text1"/>
@@ -4351,6 +4878,7 @@
     <w:uiPriority w:val="29"/>
     <w:rsid w:val="00FC693F"/>
     <w:rPr>
+      <w:rFonts w:eastAsia="Arial Unicode MS"/>
       <w:i/>
       <w:iCs/>
       <w:color w:val="000000" w:themeColor="text1"/>
@@ -4364,7 +4892,7 @@
     <w:semiHidden/>
     <w:rsid w:val="00FC693F"/>
     <w:rPr>
-      <w:rFonts w:asciiTheme="majorHAnsi" w:eastAsiaTheme="majorEastAsia" w:hAnsiTheme="majorHAnsi" w:cstheme="majorBidi"/>
+      <w:rFonts w:asciiTheme="majorHAnsi" w:eastAsiaTheme="majorEastAsia" w:hAnsiTheme="majorHAnsi" w:cstheme="majorBidi" w:eastAsia="Arial Unicode MS"/>
       <w:b/>
       <w:bCs/>
       <w:i/>
@@ -4380,7 +4908,7 @@
     <w:semiHidden/>
     <w:rsid w:val="00FC693F"/>
     <w:rPr>
-      <w:rFonts w:asciiTheme="majorHAnsi" w:eastAsiaTheme="majorEastAsia" w:hAnsiTheme="majorHAnsi" w:cstheme="majorBidi"/>
+      <w:rFonts w:asciiTheme="majorHAnsi" w:eastAsiaTheme="majorEastAsia" w:hAnsiTheme="majorHAnsi" w:cstheme="majorBidi" w:eastAsia="Arial Unicode MS"/>
       <w:color w:val="243F60" w:themeColor="accent1" w:themeShade="7F"/>
     </w:rPr>
   </w:style>
@@ -4392,7 +4920,7 @@
     <w:semiHidden/>
     <w:rsid w:val="00FC693F"/>
     <w:rPr>
-      <w:rFonts w:asciiTheme="majorHAnsi" w:eastAsiaTheme="majorEastAsia" w:hAnsiTheme="majorHAnsi" w:cstheme="majorBidi"/>
+      <w:rFonts w:asciiTheme="majorHAnsi" w:eastAsiaTheme="majorEastAsia" w:hAnsiTheme="majorHAnsi" w:cstheme="majorBidi" w:eastAsia="Arial Unicode MS"/>
       <w:i/>
       <w:iCs/>
       <w:color w:val="243F60" w:themeColor="accent1" w:themeShade="7F"/>
@@ -4406,7 +4934,7 @@
     <w:semiHidden/>
     <w:rsid w:val="00FC693F"/>
     <w:rPr>
-      <w:rFonts w:asciiTheme="majorHAnsi" w:eastAsiaTheme="majorEastAsia" w:hAnsiTheme="majorHAnsi" w:cstheme="majorBidi"/>
+      <w:rFonts w:asciiTheme="majorHAnsi" w:eastAsiaTheme="majorEastAsia" w:hAnsiTheme="majorHAnsi" w:cstheme="majorBidi" w:eastAsia="Arial Unicode MS"/>
       <w:i/>
       <w:iCs/>
       <w:color w:val="404040" w:themeColor="text1" w:themeTint="BF"/>
@@ -4420,7 +4948,7 @@
     <w:semiHidden/>
     <w:rsid w:val="00FC693F"/>
     <w:rPr>
-      <w:rFonts w:asciiTheme="majorHAnsi" w:eastAsiaTheme="majorEastAsia" w:hAnsiTheme="majorHAnsi" w:cstheme="majorBidi"/>
+      <w:rFonts w:asciiTheme="majorHAnsi" w:eastAsiaTheme="majorEastAsia" w:hAnsiTheme="majorHAnsi" w:cstheme="majorBidi" w:eastAsia="Arial Unicode MS"/>
       <w:color w:val="4F81BD" w:themeColor="accent1"/>
       <w:sz w:val="20"/>
       <w:szCs w:val="20"/>
@@ -4434,7 +4962,7 @@
     <w:semiHidden/>
     <w:rsid w:val="00FC693F"/>
     <w:rPr>
-      <w:rFonts w:asciiTheme="majorHAnsi" w:eastAsiaTheme="majorEastAsia" w:hAnsiTheme="majorHAnsi" w:cstheme="majorBidi"/>
+      <w:rFonts w:asciiTheme="majorHAnsi" w:eastAsiaTheme="majorEastAsia" w:hAnsiTheme="majorHAnsi" w:cstheme="majorBidi" w:eastAsia="Arial Unicode MS"/>
       <w:i/>
       <w:iCs/>
       <w:color w:val="404040" w:themeColor="text1" w:themeTint="BF"/>
@@ -4455,6 +4983,7 @@
       <w:spacing w:line="240" w:lineRule="auto"/>
     </w:pPr>
     <w:rPr>
+      <w:rFonts w:eastAsia="Arial Unicode MS"/>
       <w:b/>
       <w:bCs/>
       <w:color w:val="4F81BD" w:themeColor="accent1"/>
@@ -4469,6 +4998,7 @@
     <w:qFormat/>
     <w:rsid w:val="00FC693F"/>
     <w:rPr>
+      <w:rFonts w:eastAsia="Arial Unicode MS"/>
       <w:b/>
       <w:bCs/>
     </w:rPr>
@@ -4480,6 +5010,7 @@
     <w:qFormat/>
     <w:rsid w:val="00FC693F"/>
     <w:rPr>
+      <w:rFonts w:eastAsia="Arial Unicode MS"/>
       <w:i/>
       <w:iCs/>
     </w:rPr>
@@ -4500,6 +5031,7 @@
       <w:ind w:left="936" w:right="936"/>
     </w:pPr>
     <w:rPr>
+      <w:rFonts w:eastAsia="Arial Unicode MS"/>
       <w:b/>
       <w:bCs/>
       <w:i/>
@@ -4514,6 +5046,7 @@
     <w:uiPriority w:val="30"/>
     <w:rsid w:val="00FC693F"/>
     <w:rPr>
+      <w:rFonts w:eastAsia="Arial Unicode MS"/>
       <w:b/>
       <w:bCs/>
       <w:i/>
@@ -4528,6 +5061,7 @@
     <w:qFormat/>
     <w:rsid w:val="00FC693F"/>
     <w:rPr>
+      <w:rFonts w:eastAsia="Arial Unicode MS"/>
       <w:i/>
       <w:iCs/>
       <w:color w:val="808080" w:themeColor="text1" w:themeTint="7F"/>
@@ -4540,6 +5074,7 @@
     <w:qFormat/>
     <w:rsid w:val="00FC693F"/>
     <w:rPr>
+      <w:rFonts w:eastAsia="Arial Unicode MS"/>
       <w:b/>
       <w:bCs/>
       <w:i/>
@@ -4554,6 +5089,7 @@
     <w:qFormat/>
     <w:rsid w:val="00FC693F"/>
     <w:rPr>
+      <w:rFonts w:eastAsia="Arial Unicode MS"/>
       <w:smallCaps/>
       <w:color w:val="C0504D" w:themeColor="accent2"/>
       <w:u w:val="single"/>
@@ -4566,6 +5102,7 @@
     <w:qFormat/>
     <w:rsid w:val="00FC693F"/>
     <w:rPr>
+      <w:rFonts w:eastAsia="Arial Unicode MS"/>
       <w:b/>
       <w:bCs/>
       <w:smallCaps/>
@@ -4581,6 +5118,7 @@
     <w:qFormat/>
     <w:rsid w:val="00FC693F"/>
     <w:rPr>
+      <w:rFonts w:eastAsia="Arial Unicode MS"/>
       <w:b/>
       <w:bCs/>
       <w:smallCaps/>
@@ -4599,6 +5137,9 @@
     <w:pPr>
       <w:outlineLvl w:val="9"/>
     </w:pPr>
+    <w:rPr>
+      <w:rFonts w:eastAsia="Arial Unicode MS"/>
+    </w:rPr>
   </w:style>
   <w:style w:type="table" w:styleId="TableGrid">
     <w:name w:val="Table Grid"/>
@@ -4608,6 +5149,9 @@
     <w:pPr>
       <w:spacing w:after="0" w:line="240" w:lineRule="auto"/>
     </w:pPr>
+    <w:rPr>
+      <w:rFonts w:eastAsia="Arial Unicode MS"/>
+    </w:rPr>
     <w:tblPr>
       <w:tblInd w:w="0" w:type="dxa"/>
       <w:tblBorders>
@@ -4635,6 +5179,7 @@
       <w:spacing w:after="0" w:line="240" w:lineRule="auto"/>
     </w:pPr>
     <w:rPr>
+      <w:rFonts w:eastAsia="Arial Unicode MS"/>
       <w:color w:val="000000" w:themeColor="text1" w:themeShade="BF"/>
     </w:rPr>
     <w:tblPr>
@@ -4738,6 +5283,7 @@
       <w:spacing w:after="0" w:line="240" w:lineRule="auto"/>
     </w:pPr>
     <w:rPr>
+      <w:rFonts w:eastAsia="Arial Unicode MS"/>
       <w:color w:val="365F91" w:themeColor="accent1" w:themeShade="BF"/>
     </w:rPr>
     <w:tblPr>
@@ -4841,6 +5387,7 @@
       <w:spacing w:after="0" w:line="240" w:lineRule="auto"/>
     </w:pPr>
     <w:rPr>
+      <w:rFonts w:eastAsia="Arial Unicode MS"/>
       <w:color w:val="943634" w:themeColor="accent2" w:themeShade="BF"/>
     </w:rPr>
     <w:tblPr>
@@ -4944,6 +5491,7 @@
       <w:spacing w:after="0" w:line="240" w:lineRule="auto"/>
     </w:pPr>
     <w:rPr>
+      <w:rFonts w:eastAsia="Arial Unicode MS"/>
       <w:color w:val="76923C" w:themeColor="accent3" w:themeShade="BF"/>
     </w:rPr>
     <w:tblPr>
@@ -5047,6 +5595,7 @@
       <w:spacing w:after="0" w:line="240" w:lineRule="auto"/>
     </w:pPr>
     <w:rPr>
+      <w:rFonts w:eastAsia="Arial Unicode MS"/>
       <w:color w:val="5F497A" w:themeColor="accent4" w:themeShade="BF"/>
     </w:rPr>
     <w:tblPr>
@@ -5150,6 +5699,7 @@
       <w:spacing w:after="0" w:line="240" w:lineRule="auto"/>
     </w:pPr>
     <w:rPr>
+      <w:rFonts w:eastAsia="Arial Unicode MS"/>
       <w:color w:val="31849B" w:themeColor="accent5" w:themeShade="BF"/>
     </w:rPr>
     <w:tblPr>
@@ -5253,6 +5803,7 @@
       <w:spacing w:after="0" w:line="240" w:lineRule="auto"/>
     </w:pPr>
     <w:rPr>
+      <w:rFonts w:eastAsia="Arial Unicode MS"/>
       <w:color w:val="E36C0A" w:themeColor="accent6" w:themeShade="BF"/>
     </w:rPr>
     <w:tblPr>
@@ -5355,6 +5906,9 @@
     <w:pPr>
       <w:spacing w:after="0" w:line="240" w:lineRule="auto"/>
     </w:pPr>
+    <w:rPr>
+      <w:rFonts w:eastAsia="Arial Unicode MS"/>
+    </w:rPr>
     <w:tblPr>
       <w:tblStyleRowBandSize w:val="1"/>
       <w:tblStyleColBandSize w:val="1"/>
@@ -5447,6 +6001,9 @@
     <w:pPr>
       <w:spacing w:after="0" w:line="240" w:lineRule="auto"/>
     </w:pPr>
+    <w:rPr>
+      <w:rFonts w:eastAsia="Arial Unicode MS"/>
+    </w:rPr>
     <w:tblPr>
       <w:tblStyleRowBandSize w:val="1"/>
       <w:tblStyleColBandSize w:val="1"/>
@@ -5539,6 +6096,9 @@
     <w:pPr>
       <w:spacing w:after="0" w:line="240" w:lineRule="auto"/>
     </w:pPr>
+    <w:rPr>
+      <w:rFonts w:eastAsia="Arial Unicode MS"/>
+    </w:rPr>
     <w:tblPr>
       <w:tblStyleRowBandSize w:val="1"/>
       <w:tblStyleColBandSize w:val="1"/>
@@ -5631,6 +6191,9 @@
     <w:pPr>
       <w:spacing w:after="0" w:line="240" w:lineRule="auto"/>
     </w:pPr>
+    <w:rPr>
+      <w:rFonts w:eastAsia="Arial Unicode MS"/>
+    </w:rPr>
     <w:tblPr>
       <w:tblStyleRowBandSize w:val="1"/>
       <w:tblStyleColBandSize w:val="1"/>
@@ -5723,6 +6286,9 @@
     <w:pPr>
       <w:spacing w:after="0" w:line="240" w:lineRule="auto"/>
     </w:pPr>
+    <w:rPr>
+      <w:rFonts w:eastAsia="Arial Unicode MS"/>
+    </w:rPr>
     <w:tblPr>
       <w:tblStyleRowBandSize w:val="1"/>
       <w:tblStyleColBandSize w:val="1"/>
@@ -5815,6 +6381,9 @@
     <w:pPr>
       <w:spacing w:after="0" w:line="240" w:lineRule="auto"/>
     </w:pPr>
+    <w:rPr>
+      <w:rFonts w:eastAsia="Arial Unicode MS"/>
+    </w:rPr>
     <w:tblPr>
       <w:tblStyleRowBandSize w:val="1"/>
       <w:tblStyleColBandSize w:val="1"/>
@@ -5907,6 +6476,9 @@
     <w:pPr>
       <w:spacing w:after="0" w:line="240" w:lineRule="auto"/>
     </w:pPr>
+    <w:rPr>
+      <w:rFonts w:eastAsia="Arial Unicode MS"/>
+    </w:rPr>
     <w:tblPr>
       <w:tblStyleRowBandSize w:val="1"/>
       <w:tblStyleColBandSize w:val="1"/>
@@ -5999,6 +6571,9 @@
     <w:pPr>
       <w:spacing w:after="0" w:line="240" w:lineRule="auto"/>
     </w:pPr>
+    <w:rPr>
+      <w:rFonts w:eastAsia="Arial Unicode MS"/>
+    </w:rPr>
     <w:tblPr>
       <w:tblStyleRowBandSize w:val="1"/>
       <w:tblStyleColBandSize w:val="1"/>
@@ -6129,6 +6704,9 @@
     <w:pPr>
       <w:spacing w:after="0" w:line="240" w:lineRule="auto"/>
     </w:pPr>
+    <w:rPr>
+      <w:rFonts w:eastAsia="Arial Unicode MS"/>
+    </w:rPr>
     <w:tblPr>
       <w:tblStyleRowBandSize w:val="1"/>
       <w:tblStyleColBandSize w:val="1"/>
@@ -6259,6 +6837,9 @@
     <w:pPr>
       <w:spacing w:after="0" w:line="240" w:lineRule="auto"/>
     </w:pPr>
+    <w:rPr>
+      <w:rFonts w:eastAsia="Arial Unicode MS"/>
+    </w:rPr>
     <w:tblPr>
       <w:tblStyleRowBandSize w:val="1"/>
       <w:tblStyleColBandSize w:val="1"/>
@@ -6389,6 +6970,9 @@
     <w:pPr>
       <w:spacing w:after="0" w:line="240" w:lineRule="auto"/>
     </w:pPr>
+    <w:rPr>
+      <w:rFonts w:eastAsia="Arial Unicode MS"/>
+    </w:rPr>
     <w:tblPr>
       <w:tblStyleRowBandSize w:val="1"/>
       <w:tblStyleColBandSize w:val="1"/>
@@ -6519,6 +7103,9 @@
     <w:pPr>
       <w:spacing w:after="0" w:line="240" w:lineRule="auto"/>
     </w:pPr>
+    <w:rPr>
+      <w:rFonts w:eastAsia="Arial Unicode MS"/>
+    </w:rPr>
     <w:tblPr>
       <w:tblStyleRowBandSize w:val="1"/>
       <w:tblStyleColBandSize w:val="1"/>
@@ -6649,6 +7236,9 @@
     <w:pPr>
       <w:spacing w:after="0" w:line="240" w:lineRule="auto"/>
     </w:pPr>
+    <w:rPr>
+      <w:rFonts w:eastAsia="Arial Unicode MS"/>
+    </w:rPr>
     <w:tblPr>
       <w:tblStyleRowBandSize w:val="1"/>
       <w:tblStyleColBandSize w:val="1"/>
@@ -6779,6 +7369,9 @@
     <w:pPr>
       <w:spacing w:after="0" w:line="240" w:lineRule="auto"/>
     </w:pPr>
+    <w:rPr>
+      <w:rFonts w:eastAsia="Arial Unicode MS"/>
+    </w:rPr>
     <w:tblPr>
       <w:tblStyleRowBandSize w:val="1"/>
       <w:tblStyleColBandSize w:val="1"/>
@@ -6909,6 +7502,9 @@
     <w:pPr>
       <w:spacing w:after="0" w:line="240" w:lineRule="auto"/>
     </w:pPr>
+    <w:rPr>
+      <w:rFonts w:eastAsia="Arial Unicode MS"/>
+    </w:rPr>
     <w:tblPr>
       <w:tblStyleRowBandSize w:val="1"/>
       <w:tblStyleColBandSize w:val="1"/>
@@ -7015,6 +7611,9 @@
     <w:pPr>
       <w:spacing w:after="0" w:line="240" w:lineRule="auto"/>
     </w:pPr>
+    <w:rPr>
+      <w:rFonts w:eastAsia="Arial Unicode MS"/>
+    </w:rPr>
     <w:tblPr>
       <w:tblStyleRowBandSize w:val="1"/>
       <w:tblStyleColBandSize w:val="1"/>
@@ -7121,6 +7720,9 @@
     <w:pPr>
       <w:spacing w:after="0" w:line="240" w:lineRule="auto"/>
     </w:pPr>
+    <w:rPr>
+      <w:rFonts w:eastAsia="Arial Unicode MS"/>
+    </w:rPr>
     <w:tblPr>
       <w:tblStyleRowBandSize w:val="1"/>
       <w:tblStyleColBandSize w:val="1"/>
@@ -7227,6 +7829,9 @@
     <w:pPr>
       <w:spacing w:after="0" w:line="240" w:lineRule="auto"/>
     </w:pPr>
+    <w:rPr>
+      <w:rFonts w:eastAsia="Arial Unicode MS"/>
+    </w:rPr>
     <w:tblPr>
       <w:tblStyleRowBandSize w:val="1"/>
       <w:tblStyleColBandSize w:val="1"/>
@@ -7333,6 +7938,9 @@
     <w:pPr>
       <w:spacing w:after="0" w:line="240" w:lineRule="auto"/>
     </w:pPr>
+    <w:rPr>
+      <w:rFonts w:eastAsia="Arial Unicode MS"/>
+    </w:rPr>
     <w:tblPr>
       <w:tblStyleRowBandSize w:val="1"/>
       <w:tblStyleColBandSize w:val="1"/>
@@ -7439,6 +8047,9 @@
     <w:pPr>
       <w:spacing w:after="0" w:line="240" w:lineRule="auto"/>
     </w:pPr>
+    <w:rPr>
+      <w:rFonts w:eastAsia="Arial Unicode MS"/>
+    </w:rPr>
     <w:tblPr>
       <w:tblStyleRowBandSize w:val="1"/>
       <w:tblStyleColBandSize w:val="1"/>
@@ -7545,6 +8156,9 @@
     <w:pPr>
       <w:spacing w:after="0" w:line="240" w:lineRule="auto"/>
     </w:pPr>
+    <w:rPr>
+      <w:rFonts w:eastAsia="Arial Unicode MS"/>
+    </w:rPr>
     <w:tblPr>
       <w:tblStyleRowBandSize w:val="1"/>
       <w:tblStyleColBandSize w:val="1"/>
@@ -7651,6 +8265,9 @@
     <w:pPr>
       <w:spacing w:after="0" w:line="240" w:lineRule="auto"/>
     </w:pPr>
+    <w:rPr>
+      <w:rFonts w:eastAsia="Arial Unicode MS"/>
+    </w:rPr>
     <w:tblPr>
       <w:tblStyleRowBandSize w:val="1"/>
       <w:tblStyleColBandSize w:val="1"/>
@@ -7800,6 +8417,9 @@
     <w:pPr>
       <w:spacing w:after="0" w:line="240" w:lineRule="auto"/>
     </w:pPr>
+    <w:rPr>
+      <w:rFonts w:eastAsia="Arial Unicode MS"/>
+    </w:rPr>
     <w:tblPr>
       <w:tblStyleRowBandSize w:val="1"/>
       <w:tblStyleColBandSize w:val="1"/>
@@ -7949,6 +8569,9 @@
     <w:pPr>
       <w:spacing w:after="0" w:line="240" w:lineRule="auto"/>
     </w:pPr>
+    <w:rPr>
+      <w:rFonts w:eastAsia="Arial Unicode MS"/>
+    </w:rPr>
     <w:tblPr>
       <w:tblStyleRowBandSize w:val="1"/>
       <w:tblStyleColBandSize w:val="1"/>
@@ -8098,6 +8721,9 @@
     <w:pPr>
       <w:spacing w:after="0" w:line="240" w:lineRule="auto"/>
     </w:pPr>
+    <w:rPr>
+      <w:rFonts w:eastAsia="Arial Unicode MS"/>
+    </w:rPr>
     <w:tblPr>
       <w:tblStyleRowBandSize w:val="1"/>
       <w:tblStyleColBandSize w:val="1"/>
@@ -8247,6 +8873,9 @@
     <w:pPr>
       <w:spacing w:after="0" w:line="240" w:lineRule="auto"/>
     </w:pPr>
+    <w:rPr>
+      <w:rFonts w:eastAsia="Arial Unicode MS"/>
+    </w:rPr>
     <w:tblPr>
       <w:tblStyleRowBandSize w:val="1"/>
       <w:tblStyleColBandSize w:val="1"/>
@@ -8396,6 +9025,9 @@
     <w:pPr>
       <w:spacing w:after="0" w:line="240" w:lineRule="auto"/>
     </w:pPr>
+    <w:rPr>
+      <w:rFonts w:eastAsia="Arial Unicode MS"/>
+    </w:rPr>
     <w:tblPr>
       <w:tblStyleRowBandSize w:val="1"/>
       <w:tblStyleColBandSize w:val="1"/>
@@ -8545,6 +9177,9 @@
     <w:pPr>
       <w:spacing w:after="0" w:line="240" w:lineRule="auto"/>
     </w:pPr>
+    <w:rPr>
+      <w:rFonts w:eastAsia="Arial Unicode MS"/>
+    </w:rPr>
     <w:tblPr>
       <w:tblStyleRowBandSize w:val="1"/>
       <w:tblStyleColBandSize w:val="1"/>
@@ -8695,6 +9330,7 @@
       <w:spacing w:after="0" w:line="240" w:lineRule="auto"/>
     </w:pPr>
     <w:rPr>
+      <w:rFonts w:eastAsia="Arial Unicode MS"/>
       <w:color w:val="000000" w:themeColor="text1"/>
     </w:rPr>
     <w:tblPr>
@@ -8779,6 +9415,7 @@
       <w:spacing w:after="0" w:line="240" w:lineRule="auto"/>
     </w:pPr>
     <w:rPr>
+      <w:rFonts w:eastAsia="Arial Unicode MS"/>
       <w:color w:val="000000" w:themeColor="text1"/>
     </w:rPr>
     <w:tblPr>
@@ -8863,6 +9500,7 @@
       <w:spacing w:after="0" w:line="240" w:lineRule="auto"/>
     </w:pPr>
     <w:rPr>
+      <w:rFonts w:eastAsia="Arial Unicode MS"/>
       <w:color w:val="000000" w:themeColor="text1"/>
     </w:rPr>
     <w:tblPr>
@@ -8947,6 +9585,7 @@
       <w:spacing w:after="0" w:line="240" w:lineRule="auto"/>
     </w:pPr>
     <w:rPr>
+      <w:rFonts w:eastAsia="Arial Unicode MS"/>
       <w:color w:val="000000" w:themeColor="text1"/>
     </w:rPr>
     <w:tblPr>
@@ -9031,6 +9670,7 @@
       <w:spacing w:after="0" w:line="240" w:lineRule="auto"/>
     </w:pPr>
     <w:rPr>
+      <w:rFonts w:eastAsia="Arial Unicode MS"/>
       <w:color w:val="000000" w:themeColor="text1"/>
     </w:rPr>
     <w:tblPr>
@@ -9115,6 +9755,7 @@
       <w:spacing w:after="0" w:line="240" w:lineRule="auto"/>
     </w:pPr>
     <w:rPr>
+      <w:rFonts w:eastAsia="Arial Unicode MS"/>
       <w:color w:val="000000" w:themeColor="text1"/>
     </w:rPr>
     <w:tblPr>
@@ -9199,6 +9840,7 @@
       <w:spacing w:after="0" w:line="240" w:lineRule="auto"/>
     </w:pPr>
     <w:rPr>
+      <w:rFonts w:eastAsia="Arial Unicode MS"/>
       <w:color w:val="000000" w:themeColor="text1"/>
     </w:rPr>
     <w:tblPr>
@@ -9283,7 +9925,7 @@
       <w:spacing w:after="0" w:line="240" w:lineRule="auto"/>
     </w:pPr>
     <w:rPr>
-      <w:rFonts w:asciiTheme="majorHAnsi" w:eastAsiaTheme="majorEastAsia" w:hAnsiTheme="majorHAnsi" w:cstheme="majorBidi"/>
+      <w:rFonts w:asciiTheme="majorHAnsi" w:eastAsiaTheme="majorEastAsia" w:hAnsiTheme="majorHAnsi" w:cstheme="majorBidi" w:eastAsia="Arial Unicode MS"/>
       <w:color w:val="000000" w:themeColor="text1"/>
     </w:rPr>
     <w:tblPr>
@@ -9411,7 +10053,7 @@
       <w:spacing w:after="0" w:line="240" w:lineRule="auto"/>
     </w:pPr>
     <w:rPr>
-      <w:rFonts w:asciiTheme="majorHAnsi" w:eastAsiaTheme="majorEastAsia" w:hAnsiTheme="majorHAnsi" w:cstheme="majorBidi"/>
+      <w:rFonts w:asciiTheme="majorHAnsi" w:eastAsiaTheme="majorEastAsia" w:hAnsiTheme="majorHAnsi" w:cstheme="majorBidi" w:eastAsia="Arial Unicode MS"/>
       <w:color w:val="000000" w:themeColor="text1"/>
     </w:rPr>
     <w:tblPr>
@@ -9539,7 +10181,7 @@
       <w:spacing w:after="0" w:line="240" w:lineRule="auto"/>
     </w:pPr>
     <w:rPr>
-      <w:rFonts w:asciiTheme="majorHAnsi" w:eastAsiaTheme="majorEastAsia" w:hAnsiTheme="majorHAnsi" w:cstheme="majorBidi"/>
+      <w:rFonts w:asciiTheme="majorHAnsi" w:eastAsiaTheme="majorEastAsia" w:hAnsiTheme="majorHAnsi" w:cstheme="majorBidi" w:eastAsia="Arial Unicode MS"/>
       <w:color w:val="000000" w:themeColor="text1"/>
     </w:rPr>
     <w:tblPr>
@@ -9667,7 +10309,7 @@
       <w:spacing w:after="0" w:line="240" w:lineRule="auto"/>
     </w:pPr>
     <w:rPr>
-      <w:rFonts w:asciiTheme="majorHAnsi" w:eastAsiaTheme="majorEastAsia" w:hAnsiTheme="majorHAnsi" w:cstheme="majorBidi"/>
+      <w:rFonts w:asciiTheme="majorHAnsi" w:eastAsiaTheme="majorEastAsia" w:hAnsiTheme="majorHAnsi" w:cstheme="majorBidi" w:eastAsia="Arial Unicode MS"/>
       <w:color w:val="000000" w:themeColor="text1"/>
     </w:rPr>
     <w:tblPr>
@@ -9795,7 +10437,7 @@
       <w:spacing w:after="0" w:line="240" w:lineRule="auto"/>
     </w:pPr>
     <w:rPr>
-      <w:rFonts w:asciiTheme="majorHAnsi" w:eastAsiaTheme="majorEastAsia" w:hAnsiTheme="majorHAnsi" w:cstheme="majorBidi"/>
+      <w:rFonts w:asciiTheme="majorHAnsi" w:eastAsiaTheme="majorEastAsia" w:hAnsiTheme="majorHAnsi" w:cstheme="majorBidi" w:eastAsia="Arial Unicode MS"/>
       <w:color w:val="000000" w:themeColor="text1"/>
     </w:rPr>
     <w:tblPr>
@@ -9923,7 +10565,7 @@
       <w:spacing w:after="0" w:line="240" w:lineRule="auto"/>
     </w:pPr>
     <w:rPr>
-      <w:rFonts w:asciiTheme="majorHAnsi" w:eastAsiaTheme="majorEastAsia" w:hAnsiTheme="majorHAnsi" w:cstheme="majorBidi"/>
+      <w:rFonts w:asciiTheme="majorHAnsi" w:eastAsiaTheme="majorEastAsia" w:hAnsiTheme="majorHAnsi" w:cstheme="majorBidi" w:eastAsia="Arial Unicode MS"/>
       <w:color w:val="000000" w:themeColor="text1"/>
     </w:rPr>
     <w:tblPr>
@@ -10051,7 +10693,7 @@
       <w:spacing w:after="0" w:line="240" w:lineRule="auto"/>
     </w:pPr>
     <w:rPr>
-      <w:rFonts w:asciiTheme="majorHAnsi" w:eastAsiaTheme="majorEastAsia" w:hAnsiTheme="majorHAnsi" w:cstheme="majorBidi"/>
+      <w:rFonts w:asciiTheme="majorHAnsi" w:eastAsiaTheme="majorEastAsia" w:hAnsiTheme="majorHAnsi" w:cstheme="majorBidi" w:eastAsia="Arial Unicode MS"/>
       <w:color w:val="000000" w:themeColor="text1"/>
     </w:rPr>
     <w:tblPr>
@@ -10178,6 +10820,9 @@
     <w:pPr>
       <w:spacing w:after="0" w:line="240" w:lineRule="auto"/>
     </w:pPr>
+    <w:rPr>
+      <w:rFonts w:eastAsia="Arial Unicode MS"/>
+    </w:rPr>
     <w:tblPr>
       <w:tblStyleRowBandSize w:val="1"/>
       <w:tblStyleColBandSize w:val="1"/>
@@ -10251,6 +10896,9 @@
     <w:pPr>
       <w:spacing w:after="0" w:line="240" w:lineRule="auto"/>
     </w:pPr>
+    <w:rPr>
+      <w:rFonts w:eastAsia="Arial Unicode MS"/>
+    </w:rPr>
     <w:tblPr>
       <w:tblStyleRowBandSize w:val="1"/>
       <w:tblStyleColBandSize w:val="1"/>
@@ -10324,6 +10972,9 @@
     <w:pPr>
       <w:spacing w:after="0" w:line="240" w:lineRule="auto"/>
     </w:pPr>
+    <w:rPr>
+      <w:rFonts w:eastAsia="Arial Unicode MS"/>
+    </w:rPr>
     <w:tblPr>
       <w:tblStyleRowBandSize w:val="1"/>
       <w:tblStyleColBandSize w:val="1"/>
@@ -10397,6 +11048,9 @@
     <w:pPr>
       <w:spacing w:after="0" w:line="240" w:lineRule="auto"/>
     </w:pPr>
+    <w:rPr>
+      <w:rFonts w:eastAsia="Arial Unicode MS"/>
+    </w:rPr>
     <w:tblPr>
       <w:tblStyleRowBandSize w:val="1"/>
       <w:tblStyleColBandSize w:val="1"/>
@@ -10470,6 +11124,9 @@
     <w:pPr>
       <w:spacing w:after="0" w:line="240" w:lineRule="auto"/>
     </w:pPr>
+    <w:rPr>
+      <w:rFonts w:eastAsia="Arial Unicode MS"/>
+    </w:rPr>
     <w:tblPr>
       <w:tblStyleRowBandSize w:val="1"/>
       <w:tblStyleColBandSize w:val="1"/>
@@ -10543,6 +11200,9 @@
     <w:pPr>
       <w:spacing w:after="0" w:line="240" w:lineRule="auto"/>
     </w:pPr>
+    <w:rPr>
+      <w:rFonts w:eastAsia="Arial Unicode MS"/>
+    </w:rPr>
     <w:tblPr>
       <w:tblStyleRowBandSize w:val="1"/>
       <w:tblStyleColBandSize w:val="1"/>
@@ -10616,6 +11276,9 @@
     <w:pPr>
       <w:spacing w:after="0" w:line="240" w:lineRule="auto"/>
     </w:pPr>
+    <w:rPr>
+      <w:rFonts w:eastAsia="Arial Unicode MS"/>
+    </w:rPr>
     <w:tblPr>
       <w:tblStyleRowBandSize w:val="1"/>
       <w:tblStyleColBandSize w:val="1"/>
@@ -10690,7 +11353,7 @@
       <w:spacing w:after="0" w:line="240" w:lineRule="auto"/>
     </w:pPr>
     <w:rPr>
-      <w:rFonts w:asciiTheme="majorHAnsi" w:eastAsiaTheme="majorEastAsia" w:hAnsiTheme="majorHAnsi" w:cstheme="majorBidi"/>
+      <w:rFonts w:asciiTheme="majorHAnsi" w:eastAsiaTheme="majorEastAsia" w:hAnsiTheme="majorHAnsi" w:cstheme="majorBidi" w:eastAsia="Arial Unicode MS"/>
       <w:color w:val="000000" w:themeColor="text1"/>
     </w:rPr>
     <w:tblPr>
@@ -10815,7 +11478,7 @@
       <w:spacing w:after="0" w:line="240" w:lineRule="auto"/>
     </w:pPr>
     <w:rPr>
-      <w:rFonts w:asciiTheme="majorHAnsi" w:eastAsiaTheme="majorEastAsia" w:hAnsiTheme="majorHAnsi" w:cstheme="majorBidi"/>
+      <w:rFonts w:asciiTheme="majorHAnsi" w:eastAsiaTheme="majorEastAsia" w:hAnsiTheme="majorHAnsi" w:cstheme="majorBidi" w:eastAsia="Arial Unicode MS"/>
       <w:color w:val="000000" w:themeColor="text1"/>
     </w:rPr>
     <w:tblPr>
@@ -10940,7 +11603,7 @@
       <w:spacing w:after="0" w:line="240" w:lineRule="auto"/>
     </w:pPr>
     <w:rPr>
-      <w:rFonts w:asciiTheme="majorHAnsi" w:eastAsiaTheme="majorEastAsia" w:hAnsiTheme="majorHAnsi" w:cstheme="majorBidi"/>
+      <w:rFonts w:asciiTheme="majorHAnsi" w:eastAsiaTheme="majorEastAsia" w:hAnsiTheme="majorHAnsi" w:cstheme="majorBidi" w:eastAsia="Arial Unicode MS"/>
       <w:color w:val="000000" w:themeColor="text1"/>
     </w:rPr>
     <w:tblPr>
@@ -11065,7 +11728,7 @@
       <w:spacing w:after="0" w:line="240" w:lineRule="auto"/>
     </w:pPr>
     <w:rPr>
-      <w:rFonts w:asciiTheme="majorHAnsi" w:eastAsiaTheme="majorEastAsia" w:hAnsiTheme="majorHAnsi" w:cstheme="majorBidi"/>
+      <w:rFonts w:asciiTheme="majorHAnsi" w:eastAsiaTheme="majorEastAsia" w:hAnsiTheme="majorHAnsi" w:cstheme="majorBidi" w:eastAsia="Arial Unicode MS"/>
       <w:color w:val="000000" w:themeColor="text1"/>
     </w:rPr>
     <w:tblPr>
@@ -11190,7 +11853,7 @@
       <w:spacing w:after="0" w:line="240" w:lineRule="auto"/>
     </w:pPr>
     <w:rPr>
-      <w:rFonts w:asciiTheme="majorHAnsi" w:eastAsiaTheme="majorEastAsia" w:hAnsiTheme="majorHAnsi" w:cstheme="majorBidi"/>
+      <w:rFonts w:asciiTheme="majorHAnsi" w:eastAsiaTheme="majorEastAsia" w:hAnsiTheme="majorHAnsi" w:cstheme="majorBidi" w:eastAsia="Arial Unicode MS"/>
       <w:color w:val="000000" w:themeColor="text1"/>
     </w:rPr>
     <w:tblPr>
@@ -11315,7 +11978,7 @@
       <w:spacing w:after="0" w:line="240" w:lineRule="auto"/>
     </w:pPr>
     <w:rPr>
-      <w:rFonts w:asciiTheme="majorHAnsi" w:eastAsiaTheme="majorEastAsia" w:hAnsiTheme="majorHAnsi" w:cstheme="majorBidi"/>
+      <w:rFonts w:asciiTheme="majorHAnsi" w:eastAsiaTheme="majorEastAsia" w:hAnsiTheme="majorHAnsi" w:cstheme="majorBidi" w:eastAsia="Arial Unicode MS"/>
       <w:color w:val="000000" w:themeColor="text1"/>
     </w:rPr>
     <w:tblPr>
@@ -11440,7 +12103,7 @@
       <w:spacing w:after="0" w:line="240" w:lineRule="auto"/>
     </w:pPr>
     <w:rPr>
-      <w:rFonts w:asciiTheme="majorHAnsi" w:eastAsiaTheme="majorEastAsia" w:hAnsiTheme="majorHAnsi" w:cstheme="majorBidi"/>
+      <w:rFonts w:asciiTheme="majorHAnsi" w:eastAsiaTheme="majorEastAsia" w:hAnsiTheme="majorHAnsi" w:cstheme="majorBidi" w:eastAsia="Arial Unicode MS"/>
       <w:color w:val="000000" w:themeColor="text1"/>
     </w:rPr>
     <w:tblPr>
@@ -11564,6 +12227,9 @@
     <w:pPr>
       <w:spacing w:after="0" w:line="240" w:lineRule="auto"/>
     </w:pPr>
+    <w:rPr>
+      <w:rFonts w:eastAsia="Arial Unicode MS"/>
+    </w:rPr>
     <w:tblPr>
       <w:tblStyleRowBandSize w:val="1"/>
       <w:tblStyleColBandSize w:val="1"/>
@@ -11705,6 +12371,9 @@
     <w:pPr>
       <w:spacing w:after="0" w:line="240" w:lineRule="auto"/>
     </w:pPr>
+    <w:rPr>
+      <w:rFonts w:eastAsia="Arial Unicode MS"/>
+    </w:rPr>
     <w:tblPr>
       <w:tblStyleRowBandSize w:val="1"/>
       <w:tblStyleColBandSize w:val="1"/>
@@ -11846,6 +12515,9 @@
     <w:pPr>
       <w:spacing w:after="0" w:line="240" w:lineRule="auto"/>
     </w:pPr>
+    <w:rPr>
+      <w:rFonts w:eastAsia="Arial Unicode MS"/>
+    </w:rPr>
     <w:tblPr>
       <w:tblStyleRowBandSize w:val="1"/>
       <w:tblStyleColBandSize w:val="1"/>
@@ -11987,6 +12659,9 @@
     <w:pPr>
       <w:spacing w:after="0" w:line="240" w:lineRule="auto"/>
     </w:pPr>
+    <w:rPr>
+      <w:rFonts w:eastAsia="Arial Unicode MS"/>
+    </w:rPr>
     <w:tblPr>
       <w:tblStyleRowBandSize w:val="1"/>
       <w:tblStyleColBandSize w:val="1"/>
@@ -12128,6 +12803,9 @@
     <w:pPr>
       <w:spacing w:after="0" w:line="240" w:lineRule="auto"/>
     </w:pPr>
+    <w:rPr>
+      <w:rFonts w:eastAsia="Arial Unicode MS"/>
+    </w:rPr>
     <w:tblPr>
       <w:tblStyleRowBandSize w:val="1"/>
       <w:tblStyleColBandSize w:val="1"/>
@@ -12269,6 +12947,9 @@
     <w:pPr>
       <w:spacing w:after="0" w:line="240" w:lineRule="auto"/>
     </w:pPr>
+    <w:rPr>
+      <w:rFonts w:eastAsia="Arial Unicode MS"/>
+    </w:rPr>
     <w:tblPr>
       <w:tblStyleRowBandSize w:val="1"/>
       <w:tblStyleColBandSize w:val="1"/>
@@ -12410,6 +13091,9 @@
     <w:pPr>
       <w:spacing w:after="0" w:line="240" w:lineRule="auto"/>
     </w:pPr>
+    <w:rPr>
+      <w:rFonts w:eastAsia="Arial Unicode MS"/>
+    </w:rPr>
     <w:tblPr>
       <w:tblStyleRowBandSize w:val="1"/>
       <w:tblStyleColBandSize w:val="1"/>
@@ -12552,6 +13236,7 @@
       <w:spacing w:after="0" w:line="240" w:lineRule="auto"/>
     </w:pPr>
     <w:rPr>
+      <w:rFonts w:eastAsia="Arial Unicode MS"/>
       <w:color w:val="FFFFFF" w:themeColor="background1"/>
     </w:rPr>
     <w:tblPr>
@@ -12666,6 +13351,7 @@
       <w:spacing w:after="0" w:line="240" w:lineRule="auto"/>
     </w:pPr>
     <w:rPr>
+      <w:rFonts w:eastAsia="Arial Unicode MS"/>
       <w:color w:val="FFFFFF" w:themeColor="background1"/>
     </w:rPr>
     <w:tblPr>
@@ -12780,6 +13466,7 @@
       <w:spacing w:after="0" w:line="240" w:lineRule="auto"/>
     </w:pPr>
     <w:rPr>
+      <w:rFonts w:eastAsia="Arial Unicode MS"/>
       <w:color w:val="FFFFFF" w:themeColor="background1"/>
     </w:rPr>
     <w:tblPr>
@@ -12894,6 +13581,7 @@
       <w:spacing w:after="0" w:line="240" w:lineRule="auto"/>
     </w:pPr>
     <w:rPr>
+      <w:rFonts w:eastAsia="Arial Unicode MS"/>
       <w:color w:val="FFFFFF" w:themeColor="background1"/>
     </w:rPr>
     <w:tblPr>
@@ -13008,6 +13696,7 @@
       <w:spacing w:after="0" w:line="240" w:lineRule="auto"/>
     </w:pPr>
     <w:rPr>
+      <w:rFonts w:eastAsia="Arial Unicode MS"/>
       <w:color w:val="FFFFFF" w:themeColor="background1"/>
     </w:rPr>
     <w:tblPr>
@@ -13122,6 +13811,7 @@
       <w:spacing w:after="0" w:line="240" w:lineRule="auto"/>
     </w:pPr>
     <w:rPr>
+      <w:rFonts w:eastAsia="Arial Unicode MS"/>
       <w:color w:val="FFFFFF" w:themeColor="background1"/>
     </w:rPr>
     <w:tblPr>
@@ -13236,6 +13926,7 @@
       <w:spacing w:after="0" w:line="240" w:lineRule="auto"/>
     </w:pPr>
     <w:rPr>
+      <w:rFonts w:eastAsia="Arial Unicode MS"/>
       <w:color w:val="FFFFFF" w:themeColor="background1"/>
     </w:rPr>
     <w:tblPr>
@@ -13350,6 +14041,7 @@
       <w:spacing w:after="0" w:line="240" w:lineRule="auto"/>
     </w:pPr>
     <w:rPr>
+      <w:rFonts w:eastAsia="Arial Unicode MS"/>
       <w:color w:val="000000" w:themeColor="text1"/>
     </w:rPr>
     <w:tblPr>
@@ -13472,6 +14164,7 @@
       <w:spacing w:after="0" w:line="240" w:lineRule="auto"/>
     </w:pPr>
     <w:rPr>
+      <w:rFonts w:eastAsia="Arial Unicode MS"/>
       <w:color w:val="000000" w:themeColor="text1"/>
     </w:rPr>
     <w:tblPr>
@@ -13594,6 +14287,7 @@
       <w:spacing w:after="0" w:line="240" w:lineRule="auto"/>
     </w:pPr>
     <w:rPr>
+      <w:rFonts w:eastAsia="Arial Unicode MS"/>
       <w:color w:val="000000" w:themeColor="text1"/>
     </w:rPr>
     <w:tblPr>
@@ -13716,6 +14410,7 @@
       <w:spacing w:after="0" w:line="240" w:lineRule="auto"/>
     </w:pPr>
     <w:rPr>
+      <w:rFonts w:eastAsia="Arial Unicode MS"/>
       <w:color w:val="000000" w:themeColor="text1"/>
     </w:rPr>
     <w:tblPr>
@@ -13828,6 +14523,7 @@
       <w:spacing w:after="0" w:line="240" w:lineRule="auto"/>
     </w:pPr>
     <w:rPr>
+      <w:rFonts w:eastAsia="Arial Unicode MS"/>
       <w:color w:val="000000" w:themeColor="text1"/>
     </w:rPr>
     <w:tblPr>
@@ -13950,6 +14646,7 @@
       <w:spacing w:after="0" w:line="240" w:lineRule="auto"/>
     </w:pPr>
     <w:rPr>
+      <w:rFonts w:eastAsia="Arial Unicode MS"/>
       <w:color w:val="000000" w:themeColor="text1"/>
     </w:rPr>
     <w:tblPr>
@@ -14072,6 +14769,7 @@
       <w:spacing w:after="0" w:line="240" w:lineRule="auto"/>
     </w:pPr>
     <w:rPr>
+      <w:rFonts w:eastAsia="Arial Unicode MS"/>
       <w:color w:val="000000" w:themeColor="text1"/>
     </w:rPr>
     <w:tblPr>
@@ -14194,6 +14892,7 @@
       <w:spacing w:after="0" w:line="240" w:lineRule="auto"/>
     </w:pPr>
     <w:rPr>
+      <w:rFonts w:eastAsia="Arial Unicode MS"/>
       <w:color w:val="000000" w:themeColor="text1"/>
     </w:rPr>
     <w:tblPr>
@@ -14280,6 +14979,7 @@
       <w:spacing w:after="0" w:line="240" w:lineRule="auto"/>
     </w:pPr>
     <w:rPr>
+      <w:rFonts w:eastAsia="Arial Unicode MS"/>
       <w:color w:val="000000" w:themeColor="text1"/>
     </w:rPr>
     <w:tblPr>
@@ -14366,6 +15066,7 @@
       <w:spacing w:after="0" w:line="240" w:lineRule="auto"/>
     </w:pPr>
     <w:rPr>
+      <w:rFonts w:eastAsia="Arial Unicode MS"/>
       <w:color w:val="000000" w:themeColor="text1"/>
     </w:rPr>
     <w:tblPr>
@@ -14452,6 +15153,7 @@
       <w:spacing w:after="0" w:line="240" w:lineRule="auto"/>
     </w:pPr>
     <w:rPr>
+      <w:rFonts w:eastAsia="Arial Unicode MS"/>
       <w:color w:val="000000" w:themeColor="text1"/>
     </w:rPr>
     <w:tblPr>
@@ -14538,6 +15240,7 @@
       <w:spacing w:after="0" w:line="240" w:lineRule="auto"/>
     </w:pPr>
     <w:rPr>
+      <w:rFonts w:eastAsia="Arial Unicode MS"/>
       <w:color w:val="000000" w:themeColor="text1"/>
     </w:rPr>
     <w:tblPr>
@@ -14624,6 +15327,7 @@
       <w:spacing w:after="0" w:line="240" w:lineRule="auto"/>
     </w:pPr>
     <w:rPr>
+      <w:rFonts w:eastAsia="Arial Unicode MS"/>
       <w:color w:val="000000" w:themeColor="text1"/>
     </w:rPr>
     <w:tblPr>
@@ -14710,6 +15414,7 @@
       <w:spacing w:after="0" w:line="240" w:lineRule="auto"/>
     </w:pPr>
     <w:rPr>
+      <w:rFonts w:eastAsia="Arial Unicode MS"/>
       <w:color w:val="000000" w:themeColor="text1"/>
     </w:rPr>
     <w:tblPr>
@@ -14796,6 +15501,7 @@
       <w:spacing w:after="0" w:line="240" w:lineRule="auto"/>
     </w:pPr>
     <w:rPr>
+      <w:rFonts w:eastAsia="Arial Unicode MS"/>
       <w:color w:val="000000" w:themeColor="text1"/>
     </w:rPr>
     <w:tblPr>
@@ -14876,6 +15582,7 @@
       <w:spacing w:after="0" w:line="240" w:lineRule="auto"/>
     </w:pPr>
     <w:rPr>
+      <w:rFonts w:eastAsia="Arial Unicode MS"/>
       <w:color w:val="000000" w:themeColor="text1"/>
     </w:rPr>
     <w:tblPr>
@@ -14956,6 +15663,7 @@
       <w:spacing w:after="0" w:line="240" w:lineRule="auto"/>
     </w:pPr>
     <w:rPr>
+      <w:rFonts w:eastAsia="Arial Unicode MS"/>
       <w:color w:val="000000" w:themeColor="text1"/>
     </w:rPr>
     <w:tblPr>
@@ -15036,6 +15744,7 @@
       <w:spacing w:after="0" w:line="240" w:lineRule="auto"/>
     </w:pPr>
     <w:rPr>
+      <w:rFonts w:eastAsia="Arial Unicode MS"/>
       <w:color w:val="000000" w:themeColor="text1"/>
     </w:rPr>
     <w:tblPr>
@@ -15116,6 +15825,7 @@
       <w:spacing w:after="0" w:line="240" w:lineRule="auto"/>
     </w:pPr>
     <w:rPr>
+      <w:rFonts w:eastAsia="Arial Unicode MS"/>
       <w:color w:val="000000" w:themeColor="text1"/>
     </w:rPr>
     <w:tblPr>
@@ -15196,6 +15906,7 @@
       <w:spacing w:after="0" w:line="240" w:lineRule="auto"/>
     </w:pPr>
     <w:rPr>
+      <w:rFonts w:eastAsia="Arial Unicode MS"/>
       <w:color w:val="000000" w:themeColor="text1"/>
     </w:rPr>
     <w:tblPr>
@@ -15276,6 +15987,7 @@
       <w:spacing w:after="0" w:line="240" w:lineRule="auto"/>
     </w:pPr>
     <w:rPr>
+      <w:rFonts w:eastAsia="Arial Unicode MS"/>
       <w:color w:val="000000" w:themeColor="text1"/>
     </w:rPr>
     <w:tblPr>

</xml_diff>

<commit_message>
fix: restore WorkBuddy MCP setup in V1.4.2
</commit_message>
<xml_diff>
--- a/docs/user-guide/企业全生命周期助手用户使用手册.docx
+++ b/docs/user-guide/企业全生命周期助手用户使用手册.docx
@@ -15,10 +15,11 @@
       </w:pPr>
       <w:r>
         <w:rPr>
-          <w:rFonts w:ascii="Arial Unicode MS" w:hAnsi="Arial Unicode MS" w:eastAsia="Arial Unicode MS" w:cs="Arial Unicode MS"/>
+          <w:rFonts w:ascii="Hiragino Sans GB" w:hAnsi="Hiragino Sans GB" w:eastAsia="Hiragino Sans GB" w:cs="Hiragino Sans GB"/>
           <w:b/>
           <w:color w:val="B98532"/>
           <w:sz w:val="20"/>
+          <w:lang w:eastAsia="zh-CN"/>
         </w:rPr>
         <w:t>FOCUS GUIDE  /  0.2.0</w:t>
       </w:r>
@@ -31,10 +32,11 @@
       </w:pPr>
       <w:r>
         <w:rPr>
-          <w:rFonts w:ascii="Arial Unicode MS" w:hAnsi="Arial Unicode MS" w:eastAsia="Arial Unicode MS" w:cs="Arial Unicode MS"/>
+          <w:rFonts w:ascii="Hiragino Sans GB" w:hAnsi="Hiragino Sans GB" w:eastAsia="Hiragino Sans GB" w:cs="Hiragino Sans GB"/>
           <w:b/>
           <w:color w:val="132B3A"/>
           <w:sz w:val="56"/>
+          <w:lang w:eastAsia="zh-CN"/>
         </w:rPr>
         <w:t>企业全生命周期助手</w:t>
       </w:r>
@@ -47,10 +49,11 @@
       </w:pPr>
       <w:r>
         <w:rPr>
-          <w:rFonts w:ascii="Arial Unicode MS" w:hAnsi="Arial Unicode MS" w:eastAsia="Arial Unicode MS" w:cs="Arial Unicode MS"/>
+          <w:rFonts w:ascii="Hiragino Sans GB" w:hAnsi="Hiragino Sans GB" w:eastAsia="Hiragino Sans GB" w:cs="Hiragino Sans GB"/>
           <w:b/>
           <w:color w:val="2E74B5"/>
           <w:sz w:val="36"/>
+          <w:lang w:eastAsia="zh-CN"/>
         </w:rPr>
         <w:t>Skills 管理器 0.2.0 用户手册</w:t>
       </w:r>
@@ -63,9 +66,10 @@
       </w:pPr>
       <w:r>
         <w:rPr>
-          <w:rFonts w:ascii="Arial Unicode MS" w:hAnsi="Arial Unicode MS" w:eastAsia="Arial Unicode MS" w:cs="Arial Unicode MS"/>
+          <w:rFonts w:ascii="Hiragino Sans GB" w:hAnsi="Hiragino Sans GB" w:eastAsia="Hiragino Sans GB" w:cs="Hiragino Sans GB"/>
           <w:color w:val="66717C"/>
           <w:sz w:val="22"/>
+          <w:lang w:eastAsia="zh-CN"/>
         </w:rPr>
         <w:t>macOS 与 Windows · Agent 扫描 · 一键导入 · 可恢复更新</w:t>
       </w:r>
@@ -113,10 +117,11 @@
             </w:pPr>
             <w:r>
               <w:rPr>
-                <w:rFonts w:ascii="Arial Unicode MS" w:hAnsi="Arial Unicode MS" w:eastAsia="Arial Unicode MS" w:cs="Arial Unicode MS"/>
+                <w:rFonts w:ascii="Hiragino Sans GB" w:hAnsi="Hiragino Sans GB" w:eastAsia="Hiragino Sans GB" w:cs="Hiragino Sans GB"/>
                 <w:b/>
                 <w:color w:val="B98532"/>
                 <w:sz w:val="21"/>
+                <w:lang w:eastAsia="zh-CN"/>
               </w:rPr>
               <w:t>先记住三件事</w:t>
             </w:r>
@@ -128,11 +133,12 @@
             </w:pPr>
             <w:r>
               <w:rPr>
-                <w:rFonts w:ascii="Arial Unicode MS" w:hAnsi="Arial Unicode MS" w:eastAsia="Arial Unicode MS" w:cs="Arial Unicode MS"/>
+                <w:rFonts w:ascii="Hiragino Sans GB" w:hAnsi="Hiragino Sans GB" w:eastAsia="Hiragino Sans GB" w:cs="Hiragino Sans GB"/>
                 <w:color w:val="17212B"/>
                 <w:sz w:val="20"/>
+                <w:lang w:eastAsia="zh-CN"/>
               </w:rPr>
-              <w:t>管理器版本与 Skills 内容版本相互独立。当前管理器为 0.2.0，正式 Skills 为 V1.4.0，共 49 项。桌面客户端采用未签名本机授权分发；应用身份与 Skills 内容验真是两条独立信任链。系统或企业策略不允许未签名应用时，继续使用 HTTPS PWA，不关闭系统防护。</w:t>
+              <w:t>管理器版本与 Skills 内容版本相互独立。当前管理器为 0.2.0，正式 Skills 为 V1.4.2，共 49 项。桌面客户端采用未签名本机授权分发；应用身份与 Skills 内容验真是两条独立信任链。系统或企业策略不允许未签名应用时，继续使用 HTTPS PWA，不关闭系统防护。</w:t>
             </w:r>
           </w:p>
         </w:tc>
@@ -145,10 +151,11 @@
       </w:pPr>
       <w:r>
         <w:rPr>
-          <w:rFonts w:ascii="Arial Unicode MS" w:hAnsi="Arial Unicode MS" w:eastAsia="Arial Unicode MS" w:cs="Arial Unicode MS"/>
+          <w:rFonts w:ascii="Hiragino Sans GB" w:hAnsi="Hiragino Sans GB" w:eastAsia="Hiragino Sans GB" w:cs="Hiragino Sans GB"/>
           <w:b/>
           <w:color w:val="132B3A"/>
           <w:sz w:val="23"/>
+          <w:lang w:eastAsia="zh-CN"/>
         </w:rPr>
         <w:t>下载  ·  校验  ·  本机授权  ·  扫描  ·  导入  ·  验收</w:t>
       </w:r>
@@ -161,9 +168,10 @@
       </w:pPr>
       <w:r>
         <w:rPr>
-          <w:rFonts w:ascii="Arial Unicode MS" w:hAnsi="Arial Unicode MS" w:eastAsia="Arial Unicode MS" w:cs="Arial Unicode MS"/>
+          <w:rFonts w:ascii="Hiragino Sans GB" w:hAnsi="Hiragino Sans GB" w:eastAsia="Hiragino Sans GB" w:cs="Hiragino Sans GB"/>
           <w:color w:val="66717C"/>
           <w:sz w:val="19"/>
+          <w:lang w:eastAsia="zh-CN"/>
         </w:rPr>
         <w:t>适用：macOS arm64 / x64，Windows x64  ·  更新日期：2026 年 7 月 30 日</w:t>
       </w:r>
@@ -176,6 +184,7 @@
           <w:headerReference w:type="first" r:id="rId11"/>
           <w:footerReference w:type="first" r:id="rId12"/>
           <w:headerReference w:type="even" r:id="rId21"/>
+          <w:footerReference w:type="even" r:id="rId22"/>
           <w:pgSz w:w="12240" w:h="15840"/>
           <w:pgMar w:top="1440" w:right="1440" w:bottom="1440" w:left="1440" w:header="708" w:footer="708" w:gutter="0"/>
           <w:cols w:space="720"/>
@@ -191,10 +200,11 @@
       </w:pPr>
       <w:r>
         <w:rPr>
-          <w:rFonts w:ascii="Arial Unicode MS" w:hAnsi="Arial Unicode MS" w:eastAsia="Arial Unicode MS" w:cs="Arial Unicode MS"/>
+          <w:rFonts w:ascii="Hiragino Sans GB" w:hAnsi="Hiragino Sans GB" w:eastAsia="Hiragino Sans GB" w:cs="Hiragino Sans GB"/>
           <w:b/>
           <w:color w:val="2E74B5"/>
           <w:sz w:val="32"/>
+          <w:lang w:eastAsia="zh-CN"/>
         </w:rPr>
         <w:t>1  安装桌面客户端</w:t>
       </w:r>
@@ -242,10 +252,11 @@
             </w:pPr>
             <w:r>
               <w:rPr>
-                <w:rFonts w:ascii="Arial Unicode MS" w:hAnsi="Arial Unicode MS" w:eastAsia="Arial Unicode MS" w:cs="Arial Unicode MS"/>
+                <w:rFonts w:ascii="Hiragino Sans GB" w:hAnsi="Hiragino Sans GB" w:eastAsia="Hiragino Sans GB" w:cs="Hiragino Sans GB"/>
                 <w:b/>
                 <w:color w:val="9B1C1C"/>
                 <w:sz w:val="21"/>
+                <w:lang w:eastAsia="zh-CN"/>
               </w:rPr>
               <w:t>本地授权版的含义</w:t>
             </w:r>
@@ -257,9 +268,10 @@
             </w:pPr>
             <w:r>
               <w:rPr>
-                <w:rFonts w:ascii="Arial Unicode MS" w:hAnsi="Arial Unicode MS" w:eastAsia="Arial Unicode MS" w:cs="Arial Unicode MS"/>
+                <w:rFonts w:ascii="Hiragino Sans GB" w:hAnsi="Hiragino Sans GB" w:eastAsia="Hiragino Sans GB" w:cs="Hiragino Sans GB"/>
                 <w:color w:val="17212B"/>
                 <w:sz w:val="20"/>
+                <w:lang w:eastAsia="zh-CN"/>
               </w:rPr>
               <w:t>安装包不含 Apple Developer ID、公证或 Windows Authenticode 签名。用户只能在确认下载来源、文件名、SHA-256 与发布审计后，按本机系统允许的入口继续。管理员权限只负责本机提权，不会把未知发布者变成可信发布者。</w:t>
             </w:r>
@@ -274,10 +286,11 @@
       </w:pPr>
       <w:r>
         <w:rPr>
-          <w:rFonts w:ascii="Arial Unicode MS" w:hAnsi="Arial Unicode MS" w:eastAsia="Arial Unicode MS" w:cs="Arial Unicode MS"/>
+          <w:rFonts w:ascii="Hiragino Sans GB" w:hAnsi="Hiragino Sans GB" w:eastAsia="Hiragino Sans GB" w:cs="Hiragino Sans GB"/>
           <w:b/>
           <w:color w:val="2E74B5"/>
           <w:sz w:val="26"/>
+          <w:lang w:eastAsia="zh-CN"/>
         </w:rPr>
         <w:t>下载前先核对</w:t>
       </w:r>
@@ -293,18 +306,20 @@
       </w:pPr>
       <w:r>
         <w:rPr>
-          <w:rFonts w:ascii="Arial Unicode MS" w:hAnsi="Arial Unicode MS" w:eastAsia="Arial Unicode MS" w:cs="Arial Unicode MS"/>
+          <w:rFonts w:ascii="Hiragino Sans GB" w:hAnsi="Hiragino Sans GB" w:eastAsia="Hiragino Sans GB" w:cs="Hiragino Sans GB"/>
           <w:b/>
           <w:color w:val="17212B"/>
           <w:sz w:val="22"/>
+          <w:lang w:eastAsia="zh-CN"/>
         </w:rPr>
         <w:t xml:space="preserve">选择本机架构。 </w:t>
       </w:r>
       <w:r>
         <w:rPr>
-          <w:rFonts w:ascii="Arial Unicode MS" w:hAnsi="Arial Unicode MS" w:eastAsia="Arial Unicode MS" w:cs="Arial Unicode MS"/>
+          <w:rFonts w:ascii="Hiragino Sans GB" w:hAnsi="Hiragino Sans GB" w:eastAsia="Hiragino Sans GB" w:cs="Hiragino Sans GB"/>
           <w:color w:val="17212B"/>
           <w:sz w:val="22"/>
+          <w:lang w:eastAsia="zh-CN"/>
         </w:rPr>
         <w:t>Apple Silicon 选择 macOS arm64；Intel Mac 选择 macOS x64；Windows 选择 x64。</w:t>
       </w:r>
@@ -320,18 +335,20 @@
       </w:pPr>
       <w:r>
         <w:rPr>
-          <w:rFonts w:ascii="Arial Unicode MS" w:hAnsi="Arial Unicode MS" w:eastAsia="Arial Unicode MS" w:cs="Arial Unicode MS"/>
+          <w:rFonts w:ascii="Hiragino Sans GB" w:hAnsi="Hiragino Sans GB" w:eastAsia="Hiragino Sans GB" w:cs="Hiragino Sans GB"/>
           <w:b/>
           <w:color w:val="17212B"/>
           <w:sz w:val="22"/>
+          <w:lang w:eastAsia="zh-CN"/>
         </w:rPr>
         <w:t xml:space="preserve">确认文件名。 </w:t>
       </w:r>
       <w:r>
         <w:rPr>
-          <w:rFonts w:ascii="Arial Unicode MS" w:hAnsi="Arial Unicode MS" w:eastAsia="Arial Unicode MS" w:cs="Arial Unicode MS"/>
+          <w:rFonts w:ascii="Hiragino Sans GB" w:hAnsi="Hiragino Sans GB" w:eastAsia="Hiragino Sans GB" w:cs="Hiragino Sans GB"/>
           <w:color w:val="17212B"/>
           <w:sz w:val="22"/>
+          <w:lang w:eastAsia="zh-CN"/>
         </w:rPr>
         <w:t>正式本地授权包名称必须包含 unsigned-local，版本必须为 0.2.0。</w:t>
       </w:r>
@@ -347,18 +364,20 @@
       </w:pPr>
       <w:r>
         <w:rPr>
-          <w:rFonts w:ascii="Arial Unicode MS" w:hAnsi="Arial Unicode MS" w:eastAsia="Arial Unicode MS" w:cs="Arial Unicode MS"/>
+          <w:rFonts w:ascii="Hiragino Sans GB" w:hAnsi="Hiragino Sans GB" w:eastAsia="Hiragino Sans GB" w:cs="Hiragino Sans GB"/>
           <w:b/>
           <w:color w:val="17212B"/>
           <w:sz w:val="22"/>
+          <w:lang w:eastAsia="zh-CN"/>
         </w:rPr>
         <w:t xml:space="preserve">核对完整性。 </w:t>
       </w:r>
       <w:r>
         <w:rPr>
-          <w:rFonts w:ascii="Arial Unicode MS" w:hAnsi="Arial Unicode MS" w:eastAsia="Arial Unicode MS" w:cs="Arial Unicode MS"/>
+          <w:rFonts w:ascii="Hiragino Sans GB" w:hAnsi="Hiragino Sans GB" w:eastAsia="Hiragino Sans GB" w:cs="Hiragino Sans GB"/>
           <w:color w:val="17212B"/>
           <w:sz w:val="22"/>
+          <w:lang w:eastAsia="zh-CN"/>
         </w:rPr>
         <w:t>按发布页说明比对 SHA256SUMS.txt 与 release-audit.json；任一不一致立即停止。</w:t>
       </w:r>
@@ -370,10 +389,11 @@
       </w:pPr>
       <w:r>
         <w:rPr>
-          <w:rFonts w:ascii="Arial Unicode MS" w:hAnsi="Arial Unicode MS" w:eastAsia="Arial Unicode MS" w:cs="Arial Unicode MS"/>
+          <w:rFonts w:ascii="Hiragino Sans GB" w:hAnsi="Hiragino Sans GB" w:eastAsia="Hiragino Sans GB" w:cs="Hiragino Sans GB"/>
           <w:b/>
           <w:color w:val="2E74B5"/>
           <w:sz w:val="26"/>
+          <w:lang w:eastAsia="zh-CN"/>
         </w:rPr>
         <w:t>macOS 与 Windows 操作差异</w:t>
       </w:r>
@@ -424,10 +444,11 @@
             </w:pPr>
             <w:r>
               <w:rPr>
-                <w:rFonts w:ascii="Arial Unicode MS" w:hAnsi="Arial Unicode MS" w:eastAsia="Arial Unicode MS" w:cs="Arial Unicode MS"/>
+                <w:rFonts w:ascii="Hiragino Sans GB" w:hAnsi="Hiragino Sans GB" w:eastAsia="Hiragino Sans GB" w:cs="Hiragino Sans GB"/>
                 <w:b/>
                 <w:color w:val="132B3A"/>
                 <w:sz w:val="18"/>
+                <w:lang w:eastAsia="zh-CN"/>
               </w:rPr>
               <w:t>环节</w:t>
             </w:r>
@@ -453,10 +474,11 @@
             </w:pPr>
             <w:r>
               <w:rPr>
-                <w:rFonts w:ascii="Arial Unicode MS" w:hAnsi="Arial Unicode MS" w:eastAsia="Arial Unicode MS" w:cs="Arial Unicode MS"/>
+                <w:rFonts w:ascii="Hiragino Sans GB" w:hAnsi="Hiragino Sans GB" w:eastAsia="Hiragino Sans GB" w:cs="Hiragino Sans GB"/>
                 <w:b/>
                 <w:color w:val="132B3A"/>
                 <w:sz w:val="18"/>
+                <w:lang w:eastAsia="zh-CN"/>
               </w:rPr>
               <w:t>macOS</w:t>
             </w:r>
@@ -482,10 +504,11 @@
             </w:pPr>
             <w:r>
               <w:rPr>
-                <w:rFonts w:ascii="Arial Unicode MS" w:hAnsi="Arial Unicode MS" w:eastAsia="Arial Unicode MS" w:cs="Arial Unicode MS"/>
+                <w:rFonts w:ascii="Hiragino Sans GB" w:hAnsi="Hiragino Sans GB" w:eastAsia="Hiragino Sans GB" w:cs="Hiragino Sans GB"/>
                 <w:b/>
                 <w:color w:val="132B3A"/>
                 <w:sz w:val="18"/>
+                <w:lang w:eastAsia="zh-CN"/>
               </w:rPr>
               <w:t>Windows</w:t>
             </w:r>
@@ -515,9 +538,10 @@
             </w:pPr>
             <w:r>
               <w:rPr>
-                <w:rFonts w:ascii="Arial Unicode MS" w:hAnsi="Arial Unicode MS" w:eastAsia="Arial Unicode MS" w:cs="Arial Unicode MS"/>
+                <w:rFonts w:ascii="Hiragino Sans GB" w:hAnsi="Hiragino Sans GB" w:eastAsia="Hiragino Sans GB" w:cs="Hiragino Sans GB"/>
                 <w:color w:val="17212B"/>
                 <w:sz w:val="18"/>
+                <w:lang w:eastAsia="zh-CN"/>
               </w:rPr>
               <w:t>首次打开</w:t>
             </w:r>
@@ -542,9 +566,10 @@
             </w:pPr>
             <w:r>
               <w:rPr>
-                <w:rFonts w:ascii="Arial Unicode MS" w:hAnsi="Arial Unicode MS" w:eastAsia="Arial Unicode MS" w:cs="Arial Unicode MS"/>
+                <w:rFonts w:ascii="Hiragino Sans GB" w:hAnsi="Hiragino Sans GB" w:eastAsia="Hiragino Sans GB" w:cs="Hiragino Sans GB"/>
                 <w:color w:val="17212B"/>
                 <w:sz w:val="18"/>
+                <w:lang w:eastAsia="zh-CN"/>
               </w:rPr>
               <w:t>双击 DMG，将应用放入“应用程序”。若被阻止，到“系统设置 → 隐私与安全性”选择“仍要打开”，再完成本机认证。</w:t>
             </w:r>
@@ -569,9 +594,10 @@
             </w:pPr>
             <w:r>
               <w:rPr>
-                <w:rFonts w:ascii="Arial Unicode MS" w:hAnsi="Arial Unicode MS" w:eastAsia="Arial Unicode MS" w:cs="Arial Unicode MS"/>
+                <w:rFonts w:ascii="Hiragino Sans GB" w:hAnsi="Hiragino Sans GB" w:eastAsia="Hiragino Sans GB" w:cs="Hiragino Sans GB"/>
                 <w:color w:val="17212B"/>
                 <w:sz w:val="18"/>
+                <w:lang w:eastAsia="zh-CN"/>
               </w:rPr>
               <w:t>运行 EXE。系统策略允许时，可在 SmartScreen 中选择“更多信息 → 仍要运行”。</w:t>
             </w:r>
@@ -601,9 +627,10 @@
             </w:pPr>
             <w:r>
               <w:rPr>
-                <w:rFonts w:ascii="Arial Unicode MS" w:hAnsi="Arial Unicode MS" w:eastAsia="Arial Unicode MS" w:cs="Arial Unicode MS"/>
+                <w:rFonts w:ascii="Hiragino Sans GB" w:hAnsi="Hiragino Sans GB" w:eastAsia="Hiragino Sans GB" w:cs="Hiragino Sans GB"/>
                 <w:color w:val="17212B"/>
                 <w:sz w:val="18"/>
+                <w:lang w:eastAsia="zh-CN"/>
               </w:rPr>
               <w:t>不要做</w:t>
             </w:r>
@@ -628,9 +655,10 @@
             </w:pPr>
             <w:r>
               <w:rPr>
-                <w:rFonts w:ascii="Arial Unicode MS" w:hAnsi="Arial Unicode MS" w:eastAsia="Arial Unicode MS" w:cs="Arial Unicode MS"/>
+                <w:rFonts w:ascii="Hiragino Sans GB" w:hAnsi="Hiragino Sans GB" w:eastAsia="Hiragino Sans GB" w:cs="Hiragino Sans GB"/>
                 <w:color w:val="17212B"/>
                 <w:sz w:val="18"/>
+                <w:lang w:eastAsia="zh-CN"/>
               </w:rPr>
               <w:t>不要删除隔离属性，不要关闭 Gatekeeper，不要运行来源不明的终端命令。</w:t>
             </w:r>
@@ -655,9 +683,10 @@
             </w:pPr>
             <w:r>
               <w:rPr>
-                <w:rFonts w:ascii="Arial Unicode MS" w:hAnsi="Arial Unicode MS" w:eastAsia="Arial Unicode MS" w:cs="Arial Unicode MS"/>
+                <w:rFonts w:ascii="Hiragino Sans GB" w:hAnsi="Hiragino Sans GB" w:eastAsia="Hiragino Sans GB" w:cs="Hiragino Sans GB"/>
                 <w:color w:val="17212B"/>
                 <w:sz w:val="18"/>
+                <w:lang w:eastAsia="zh-CN"/>
               </w:rPr>
               <w:t>不要关闭 Smart App Control、杀毒软件或组织策略，不要把 UAC 提示当成发布者证明。</w:t>
             </w:r>
@@ -687,9 +716,10 @@
             </w:pPr>
             <w:r>
               <w:rPr>
-                <w:rFonts w:ascii="Arial Unicode MS" w:hAnsi="Arial Unicode MS" w:eastAsia="Arial Unicode MS" w:cs="Arial Unicode MS"/>
+                <w:rFonts w:ascii="Hiragino Sans GB" w:hAnsi="Hiragino Sans GB" w:eastAsia="Hiragino Sans GB" w:cs="Hiragino Sans GB"/>
                 <w:color w:val="17212B"/>
                 <w:sz w:val="18"/>
+                <w:lang w:eastAsia="zh-CN"/>
               </w:rPr>
               <w:t>完全阻止时</w:t>
             </w:r>
@@ -714,9 +744,10 @@
             </w:pPr>
             <w:r>
               <w:rPr>
-                <w:rFonts w:ascii="Arial Unicode MS" w:hAnsi="Arial Unicode MS" w:eastAsia="Arial Unicode MS" w:cs="Arial Unicode MS"/>
+                <w:rFonts w:ascii="Hiragino Sans GB" w:hAnsi="Hiragino Sans GB" w:eastAsia="Hiragino Sans GB" w:cs="Hiragino Sans GB"/>
                 <w:color w:val="17212B"/>
                 <w:sz w:val="18"/>
+                <w:lang w:eastAsia="zh-CN"/>
               </w:rPr>
               <w:t>继续使用门户 HTTPS PWA，或等待取得 Developer ID 的签名版。</w:t>
             </w:r>
@@ -741,9 +772,10 @@
             </w:pPr>
             <w:r>
               <w:rPr>
-                <w:rFonts w:ascii="Arial Unicode MS" w:hAnsi="Arial Unicode MS" w:eastAsia="Arial Unicode MS" w:cs="Arial Unicode MS"/>
+                <w:rFonts w:ascii="Hiragino Sans GB" w:hAnsi="Hiragino Sans GB" w:eastAsia="Hiragino Sans GB" w:cs="Hiragino Sans GB"/>
                 <w:color w:val="17212B"/>
                 <w:sz w:val="18"/>
+                <w:lang w:eastAsia="zh-CN"/>
               </w:rPr>
               <w:t>继续使用门户 HTTPS PWA；企业设备应联系管理员确认策略，不尝试绕过。</w:t>
             </w:r>
@@ -794,10 +826,11 @@
             </w:pPr>
             <w:r>
               <w:rPr>
-                <w:rFonts w:ascii="Arial Unicode MS" w:hAnsi="Arial Unicode MS" w:eastAsia="Arial Unicode MS" w:cs="Arial Unicode MS"/>
+                <w:rFonts w:ascii="Hiragino Sans GB" w:hAnsi="Hiragino Sans GB" w:eastAsia="Hiragino Sans GB" w:cs="Hiragino Sans GB"/>
                 <w:b/>
                 <w:color w:val="1F4D78"/>
                 <w:sz w:val="21"/>
+                <w:lang w:eastAsia="zh-CN"/>
               </w:rPr>
               <w:t>现有用户不受影响</w:t>
             </w:r>
@@ -809,9 +842,10 @@
             </w:pPr>
             <w:r>
               <w:rPr>
-                <w:rFonts w:ascii="Arial Unicode MS" w:hAnsi="Arial Unicode MS" w:eastAsia="Arial Unicode MS" w:cs="Arial Unicode MS"/>
+                <w:rFonts w:ascii="Hiragino Sans GB" w:hAnsi="Hiragino Sans GB" w:eastAsia="Hiragino Sans GB" w:cs="Hiragino Sans GB"/>
                 <w:color w:val="17212B"/>
                 <w:sz w:val="20"/>
+                <w:lang w:eastAsia="zh-CN"/>
               </w:rPr>
               <w:t>安装管理器 0.2.0 不会强制升级 49 项 Skills，不会改变已有 WorkBuddy 插件、设备绑定、MCP 凭据或旧下载地址。同一台 Mac 或 Windows 已绑定团队知识库时，正常情况下继续复用现有设备凭据。</w:t>
             </w:r>
@@ -838,10 +872,11 @@
       </w:pPr>
       <w:r>
         <w:rPr>
-          <w:rFonts w:ascii="Arial Unicode MS" w:hAnsi="Arial Unicode MS" w:eastAsia="Arial Unicode MS" w:cs="Arial Unicode MS"/>
+          <w:rFonts w:ascii="Hiragino Sans GB" w:hAnsi="Hiragino Sans GB" w:eastAsia="Hiragino Sans GB" w:cs="Hiragino Sans GB"/>
           <w:b/>
           <w:color w:val="2E74B5"/>
           <w:sz w:val="32"/>
+          <w:lang w:eastAsia="zh-CN"/>
         </w:rPr>
         <w:t>2  扫描 Agent 与一键导入</w:t>
       </w:r>
@@ -889,10 +924,11 @@
             </w:pPr>
             <w:r>
               <w:rPr>
-                <w:rFonts w:ascii="Arial Unicode MS" w:hAnsi="Arial Unicode MS" w:eastAsia="Arial Unicode MS" w:cs="Arial Unicode MS"/>
+                <w:rFonts w:ascii="Hiragino Sans GB" w:hAnsi="Hiragino Sans GB" w:eastAsia="Hiragino Sans GB" w:cs="Hiragino Sans GB"/>
                 <w:b/>
                 <w:color w:val="1F4D78"/>
                 <w:sz w:val="21"/>
+                <w:lang w:eastAsia="zh-CN"/>
               </w:rPr>
               <w:t>扫描由用户主动触发</w:t>
             </w:r>
@@ -904,9 +940,10 @@
             </w:pPr>
             <w:r>
               <w:rPr>
-                <w:rFonts w:ascii="Arial Unicode MS" w:hAnsi="Arial Unicode MS" w:eastAsia="Arial Unicode MS" w:cs="Arial Unicode MS"/>
+                <w:rFonts w:ascii="Hiragino Sans GB" w:hAnsi="Hiragino Sans GB" w:eastAsia="Hiragino Sans GB" w:cs="Hiragino Sans GB"/>
                 <w:color w:val="17212B"/>
                 <w:sz w:val="20"/>
+                <w:lang w:eastAsia="zh-CN"/>
               </w:rPr>
               <w:t>只有点击“扫描本机 Agent”后才开始。扫描范围限于系统应用目录、常见用户安装目录和已配置命令位置；不读取项目正文、客户资料、聊天记录或用户文档。正式平台扫描只识别 WorkBuddy。</w:t>
             </w:r>
@@ -921,10 +958,11 @@
       </w:pPr>
       <w:r>
         <w:rPr>
-          <w:rFonts w:ascii="Arial Unicode MS" w:hAnsi="Arial Unicode MS" w:eastAsia="Arial Unicode MS" w:cs="Arial Unicode MS"/>
+          <w:rFonts w:ascii="Hiragino Sans GB" w:hAnsi="Hiragino Sans GB" w:eastAsia="Hiragino Sans GB" w:cs="Hiragino Sans GB"/>
           <w:b/>
           <w:color w:val="2E74B5"/>
           <w:sz w:val="26"/>
+          <w:lang w:eastAsia="zh-CN"/>
         </w:rPr>
         <w:t>标准操作</w:t>
       </w:r>
@@ -940,18 +978,20 @@
       </w:pPr>
       <w:r>
         <w:rPr>
-          <w:rFonts w:ascii="Arial Unicode MS" w:hAnsi="Arial Unicode MS" w:eastAsia="Arial Unicode MS" w:cs="Arial Unicode MS"/>
+          <w:rFonts w:ascii="Hiragino Sans GB" w:hAnsi="Hiragino Sans GB" w:eastAsia="Hiragino Sans GB" w:cs="Hiragino Sans GB"/>
           <w:b/>
           <w:color w:val="17212B"/>
           <w:sz w:val="22"/>
+          <w:lang w:eastAsia="zh-CN"/>
         </w:rPr>
         <w:t xml:space="preserve">连接发布门户。 </w:t>
       </w:r>
       <w:r>
         <w:rPr>
-          <w:rFonts w:ascii="Arial Unicode MS" w:hAnsi="Arial Unicode MS" w:eastAsia="Arial Unicode MS" w:cs="Arial Unicode MS"/>
+          <w:rFonts w:ascii="Hiragino Sans GB" w:hAnsi="Hiragino Sans GB" w:eastAsia="Hiragino Sans GB" w:cs="Hiragino Sans GB"/>
           <w:color w:val="17212B"/>
           <w:sz w:val="22"/>
+          <w:lang w:eastAsia="zh-CN"/>
         </w:rPr>
         <w:t>使用已有设备凭据连接；管理员调试时才使用管理员令牌。</w:t>
       </w:r>
@@ -967,18 +1007,20 @@
       </w:pPr>
       <w:r>
         <w:rPr>
-          <w:rFonts w:ascii="Arial Unicode MS" w:hAnsi="Arial Unicode MS" w:eastAsia="Arial Unicode MS" w:cs="Arial Unicode MS"/>
+          <w:rFonts w:ascii="Hiragino Sans GB" w:hAnsi="Hiragino Sans GB" w:eastAsia="Hiragino Sans GB" w:cs="Hiragino Sans GB"/>
           <w:b/>
           <w:color w:val="17212B"/>
           <w:sz w:val="22"/>
+          <w:lang w:eastAsia="zh-CN"/>
         </w:rPr>
         <w:t xml:space="preserve">点击扫描。 </w:t>
       </w:r>
       <w:r>
         <w:rPr>
-          <w:rFonts w:ascii="Arial Unicode MS" w:hAnsi="Arial Unicode MS" w:eastAsia="Arial Unicode MS" w:cs="Arial Unicode MS"/>
+          <w:rFonts w:ascii="Hiragino Sans GB" w:hAnsi="Hiragino Sans GB" w:eastAsia="Hiragino Sans GB" w:cs="Hiragino Sans GB"/>
           <w:color w:val="17212B"/>
           <w:sz w:val="22"/>
+          <w:lang w:eastAsia="zh-CN"/>
         </w:rPr>
         <w:t>总览或平台页均可重新扫描，结果会显示命中路径、耗时与适配器 revision。</w:t>
       </w:r>
@@ -994,18 +1036,20 @@
       </w:pPr>
       <w:r>
         <w:rPr>
-          <w:rFonts w:ascii="Arial Unicode MS" w:hAnsi="Arial Unicode MS" w:eastAsia="Arial Unicode MS" w:cs="Arial Unicode MS"/>
+          <w:rFonts w:ascii="Hiragino Sans GB" w:hAnsi="Hiragino Sans GB" w:eastAsia="Hiragino Sans GB" w:cs="Hiragino Sans GB"/>
           <w:b/>
           <w:color w:val="17212B"/>
           <w:sz w:val="22"/>
+          <w:lang w:eastAsia="zh-CN"/>
         </w:rPr>
         <w:t xml:space="preserve">选择产物。 </w:t>
       </w:r>
       <w:r>
         <w:rPr>
-          <w:rFonts w:ascii="Arial Unicode MS" w:hAnsi="Arial Unicode MS" w:eastAsia="Arial Unicode MS" w:cs="Arial Unicode MS"/>
+          <w:rFonts w:ascii="Hiragino Sans GB" w:hAnsi="Hiragino Sans GB" w:eastAsia="Hiragino Sans GB" w:cs="Hiragino Sans GB"/>
           <w:color w:val="17212B"/>
           <w:sz w:val="22"/>
+          <w:lang w:eastAsia="zh-CN"/>
         </w:rPr>
         <w:t>根据宿主能力选择通用版或 WorkBuddy 跨平台版。</w:t>
       </w:r>
@@ -1021,18 +1065,20 @@
       </w:pPr>
       <w:r>
         <w:rPr>
-          <w:rFonts w:ascii="Arial Unicode MS" w:hAnsi="Arial Unicode MS" w:eastAsia="Arial Unicode MS" w:cs="Arial Unicode MS"/>
+          <w:rFonts w:ascii="Hiragino Sans GB" w:hAnsi="Hiragino Sans GB" w:eastAsia="Hiragino Sans GB" w:cs="Hiragino Sans GB"/>
           <w:b/>
           <w:color w:val="17212B"/>
           <w:sz w:val="22"/>
+          <w:lang w:eastAsia="zh-CN"/>
         </w:rPr>
         <w:t xml:space="preserve">预览计划。 </w:t>
       </w:r>
       <w:r>
         <w:rPr>
-          <w:rFonts w:ascii="Arial Unicode MS" w:hAnsi="Arial Unicode MS" w:eastAsia="Arial Unicode MS" w:cs="Arial Unicode MS"/>
+          <w:rFonts w:ascii="Hiragino Sans GB" w:hAnsi="Hiragino Sans GB" w:eastAsia="Hiragino Sans GB" w:cs="Hiragino Sans GB"/>
           <w:color w:val="17212B"/>
           <w:sz w:val="22"/>
+          <w:lang w:eastAsia="zh-CN"/>
         </w:rPr>
         <w:t>管理器列出新增、替换和冲突。发现未登记的同名目录时自动阻断覆盖。</w:t>
       </w:r>
@@ -1048,18 +1094,20 @@
       </w:pPr>
       <w:r>
         <w:rPr>
-          <w:rFonts w:ascii="Arial Unicode MS" w:hAnsi="Arial Unicode MS" w:eastAsia="Arial Unicode MS" w:cs="Arial Unicode MS"/>
+          <w:rFonts w:ascii="Hiragino Sans GB" w:hAnsi="Hiragino Sans GB" w:eastAsia="Hiragino Sans GB" w:cs="Hiragino Sans GB"/>
           <w:b/>
           <w:color w:val="17212B"/>
           <w:sz w:val="22"/>
+          <w:lang w:eastAsia="zh-CN"/>
         </w:rPr>
         <w:t xml:space="preserve">确认导入。 </w:t>
       </w:r>
       <w:r>
         <w:rPr>
-          <w:rFonts w:ascii="Arial Unicode MS" w:hAnsi="Arial Unicode MS" w:eastAsia="Arial Unicode MS" w:cs="Arial Unicode MS"/>
+          <w:rFonts w:ascii="Hiragino Sans GB" w:hAnsi="Hiragino Sans GB" w:eastAsia="Hiragino Sans GB" w:cs="Hiragino Sans GB"/>
           <w:color w:val="17212B"/>
           <w:sz w:val="22"/>
+          <w:lang w:eastAsia="zh-CN"/>
         </w:rPr>
         <w:t>只向已确认的用户级 Skills 目录写入已验签内容，不请求修改未知平台数据库。</w:t>
       </w:r>
@@ -1075,18 +1123,20 @@
       </w:pPr>
       <w:r>
         <w:rPr>
-          <w:rFonts w:ascii="Arial Unicode MS" w:hAnsi="Arial Unicode MS" w:eastAsia="Arial Unicode MS" w:cs="Arial Unicode MS"/>
+          <w:rFonts w:ascii="Hiragino Sans GB" w:hAnsi="Hiragino Sans GB" w:eastAsia="Hiragino Sans GB" w:cs="Hiragino Sans GB"/>
           <w:b/>
           <w:color w:val="17212B"/>
           <w:sz w:val="22"/>
+          <w:lang w:eastAsia="zh-CN"/>
         </w:rPr>
         <w:t xml:space="preserve">回到 Agent 验收。 </w:t>
       </w:r>
       <w:r>
         <w:rPr>
-          <w:rFonts w:ascii="Arial Unicode MS" w:hAnsi="Arial Unicode MS" w:eastAsia="Arial Unicode MS" w:cs="Arial Unicode MS"/>
+          <w:rFonts w:ascii="Hiragino Sans GB" w:hAnsi="Hiragino Sans GB" w:eastAsia="Hiragino Sans GB" w:cs="Hiragino Sans GB"/>
           <w:color w:val="17212B"/>
           <w:sz w:val="22"/>
+          <w:lang w:eastAsia="zh-CN"/>
         </w:rPr>
         <w:t>新建会话，确认 49 项目录可见，并抽样调用一个文档或知识库能力。</w:t>
       </w:r>
@@ -1098,10 +1148,11 @@
       </w:pPr>
       <w:r>
         <w:rPr>
-          <w:rFonts w:ascii="Arial Unicode MS" w:hAnsi="Arial Unicode MS" w:eastAsia="Arial Unicode MS" w:cs="Arial Unicode MS"/>
+          <w:rFonts w:ascii="Hiragino Sans GB" w:hAnsi="Hiragino Sans GB" w:eastAsia="Hiragino Sans GB" w:cs="Hiragino Sans GB"/>
           <w:b/>
           <w:color w:val="2E74B5"/>
           <w:sz w:val="26"/>
+          <w:lang w:eastAsia="zh-CN"/>
         </w:rPr>
         <w:t>两个正式产物的当前动作</w:t>
       </w:r>
@@ -1153,10 +1204,11 @@
             </w:pPr>
             <w:r>
               <w:rPr>
-                <w:rFonts w:ascii="Arial Unicode MS" w:hAnsi="Arial Unicode MS" w:eastAsia="Arial Unicode MS" w:cs="Arial Unicode MS"/>
+                <w:rFonts w:ascii="Hiragino Sans GB" w:hAnsi="Hiragino Sans GB" w:eastAsia="Hiragino Sans GB" w:cs="Hiragino Sans GB"/>
                 <w:b/>
                 <w:color w:val="132B3A"/>
                 <w:sz w:val="17"/>
+                <w:lang w:eastAsia="zh-CN"/>
               </w:rPr>
               <w:t>平台</w:t>
             </w:r>
@@ -1182,10 +1234,11 @@
             </w:pPr>
             <w:r>
               <w:rPr>
-                <w:rFonts w:ascii="Arial Unicode MS" w:hAnsi="Arial Unicode MS" w:eastAsia="Arial Unicode MS" w:cs="Arial Unicode MS"/>
+                <w:rFonts w:ascii="Hiragino Sans GB" w:hAnsi="Hiragino Sans GB" w:eastAsia="Hiragino Sans GB" w:cs="Hiragino Sans GB"/>
                 <w:b/>
                 <w:color w:val="132B3A"/>
                 <w:sz w:val="17"/>
+                <w:lang w:eastAsia="zh-CN"/>
               </w:rPr>
               <w:t>识别入口</w:t>
             </w:r>
@@ -1211,10 +1264,11 @@
             </w:pPr>
             <w:r>
               <w:rPr>
-                <w:rFonts w:ascii="Arial Unicode MS" w:hAnsi="Arial Unicode MS" w:eastAsia="Arial Unicode MS" w:cs="Arial Unicode MS"/>
+                <w:rFonts w:ascii="Hiragino Sans GB" w:hAnsi="Hiragino Sans GB" w:eastAsia="Hiragino Sans GB" w:cs="Hiragino Sans GB"/>
                 <w:b/>
                 <w:color w:val="132B3A"/>
                 <w:sz w:val="17"/>
+                <w:lang w:eastAsia="zh-CN"/>
               </w:rPr>
               <w:t>管理器动作</w:t>
             </w:r>
@@ -1240,10 +1294,11 @@
             </w:pPr>
             <w:r>
               <w:rPr>
-                <w:rFonts w:ascii="Arial Unicode MS" w:hAnsi="Arial Unicode MS" w:eastAsia="Arial Unicode MS" w:cs="Arial Unicode MS"/>
+                <w:rFonts w:ascii="Hiragino Sans GB" w:hAnsi="Hiragino Sans GB" w:eastAsia="Hiragino Sans GB" w:cs="Hiragino Sans GB"/>
                 <w:b/>
                 <w:color w:val="132B3A"/>
                 <w:sz w:val="17"/>
+                <w:lang w:eastAsia="zh-CN"/>
               </w:rPr>
               <w:t>用户最终动作</w:t>
             </w:r>
@@ -1273,9 +1328,10 @@
             </w:pPr>
             <w:r>
               <w:rPr>
-                <w:rFonts w:ascii="Arial Unicode MS" w:hAnsi="Arial Unicode MS" w:eastAsia="Arial Unicode MS" w:cs="Arial Unicode MS"/>
+                <w:rFonts w:ascii="Hiragino Sans GB" w:hAnsi="Hiragino Sans GB" w:eastAsia="Hiragino Sans GB" w:cs="Hiragino Sans GB"/>
                 <w:color w:val="17212B"/>
                 <w:sz w:val="17"/>
+                <w:lang w:eastAsia="zh-CN"/>
               </w:rPr>
               <w:t>WorkBuddy</w:t>
             </w:r>
@@ -1300,9 +1356,10 @@
             </w:pPr>
             <w:r>
               <w:rPr>
-                <w:rFonts w:ascii="Arial Unicode MS" w:hAnsi="Arial Unicode MS" w:eastAsia="Arial Unicode MS" w:cs="Arial Unicode MS"/>
+                <w:rFonts w:ascii="Hiragino Sans GB" w:hAnsi="Hiragino Sans GB" w:eastAsia="Hiragino Sans GB" w:cs="Hiragino Sans GB"/>
                 <w:color w:val="17212B"/>
                 <w:sz w:val="17"/>
+                <w:lang w:eastAsia="zh-CN"/>
               </w:rPr>
               <w:t>应用安装位置</w:t>
             </w:r>
@@ -1327,9 +1384,10 @@
             </w:pPr>
             <w:r>
               <w:rPr>
-                <w:rFonts w:ascii="Arial Unicode MS" w:hAnsi="Arial Unicode MS" w:eastAsia="Arial Unicode MS" w:cs="Arial Unicode MS"/>
+                <w:rFonts w:ascii="Hiragino Sans GB" w:hAnsi="Hiragino Sans GB" w:eastAsia="Hiragino Sans GB" w:cs="Hiragino Sans GB"/>
                 <w:color w:val="17212B"/>
                 <w:sz w:val="17"/>
+                <w:lang w:eastAsia="zh-CN"/>
               </w:rPr>
               <w:t>准备并验签通用插件市场包</w:t>
             </w:r>
@@ -1354,9 +1412,10 @@
             </w:pPr>
             <w:r>
               <w:rPr>
-                <w:rFonts w:ascii="Arial Unicode MS" w:hAnsi="Arial Unicode MS" w:eastAsia="Arial Unicode MS" w:cs="Arial Unicode MS"/>
+                <w:rFonts w:ascii="Hiragino Sans GB" w:hAnsi="Hiragino Sans GB" w:eastAsia="Hiragino Sans GB" w:cs="Hiragino Sans GB"/>
                 <w:color w:val="17212B"/>
                 <w:sz w:val="17"/>
+                <w:lang w:eastAsia="zh-CN"/>
               </w:rPr>
               <w:t>在 WorkBuddy 应用内添加市场、安装并启用</w:t>
             </w:r>
@@ -1386,9 +1445,10 @@
             </w:pPr>
             <w:r>
               <w:rPr>
-                <w:rFonts w:ascii="Arial Unicode MS" w:hAnsi="Arial Unicode MS" w:eastAsia="Arial Unicode MS" w:cs="Arial Unicode MS"/>
+                <w:rFonts w:ascii="Hiragino Sans GB" w:hAnsi="Hiragino Sans GB" w:eastAsia="Hiragino Sans GB" w:cs="Hiragino Sans GB"/>
                 <w:color w:val="17212B"/>
                 <w:sz w:val="17"/>
+                <w:lang w:eastAsia="zh-CN"/>
               </w:rPr>
               <w:t>通用版</w:t>
             </w:r>
@@ -1413,9 +1473,10 @@
             </w:pPr>
             <w:r>
               <w:rPr>
-                <w:rFonts w:ascii="Arial Unicode MS" w:hAnsi="Arial Unicode MS" w:eastAsia="Arial Unicode MS" w:cs="Arial Unicode MS"/>
+                <w:rFonts w:ascii="Hiragino Sans GB" w:hAnsi="Hiragino Sans GB" w:eastAsia="Hiragino Sans GB" w:cs="Hiragino Sans GB"/>
                 <w:color w:val="17212B"/>
                 <w:sz w:val="17"/>
+                <w:lang w:eastAsia="zh-CN"/>
               </w:rPr>
               <w:t>标准 Skills 入口</w:t>
             </w:r>
@@ -1440,9 +1501,10 @@
             </w:pPr>
             <w:r>
               <w:rPr>
-                <w:rFonts w:ascii="Arial Unicode MS" w:hAnsi="Arial Unicode MS" w:eastAsia="Arial Unicode MS" w:cs="Arial Unicode MS"/>
+                <w:rFonts w:ascii="Hiragino Sans GB" w:hAnsi="Hiragino Sans GB" w:eastAsia="Hiragino Sans GB" w:cs="Hiragino Sans GB"/>
                 <w:color w:val="17212B"/>
                 <w:sz w:val="17"/>
+                <w:lang w:eastAsia="zh-CN"/>
               </w:rPr>
               <w:t>下载并验签通用 Skills 包</w:t>
             </w:r>
@@ -1467,9 +1529,10 @@
             </w:pPr>
             <w:r>
               <w:rPr>
-                <w:rFonts w:ascii="Arial Unicode MS" w:hAnsi="Arial Unicode MS" w:eastAsia="Arial Unicode MS" w:cs="Arial Unicode MS"/>
+                <w:rFonts w:ascii="Hiragino Sans GB" w:hAnsi="Hiragino Sans GB" w:eastAsia="Hiragino Sans GB" w:cs="Hiragino Sans GB"/>
                 <w:color w:val="17212B"/>
                 <w:sz w:val="17"/>
+                <w:lang w:eastAsia="zh-CN"/>
               </w:rPr>
               <w:t>按宿主标准入口导入并新建会话复验</w:t>
             </w:r>
@@ -1496,10 +1559,11 @@
       </w:pPr>
       <w:r>
         <w:rPr>
-          <w:rFonts w:ascii="Arial Unicode MS" w:hAnsi="Arial Unicode MS" w:eastAsia="Arial Unicode MS" w:cs="Arial Unicode MS"/>
+          <w:rFonts w:ascii="Hiragino Sans GB" w:hAnsi="Hiragino Sans GB" w:eastAsia="Hiragino Sans GB" w:cs="Hiragino Sans GB"/>
           <w:b/>
           <w:color w:val="2E74B5"/>
           <w:sz w:val="32"/>
+          <w:lang w:eastAsia="zh-CN"/>
         </w:rPr>
         <w:t>3  WorkBuddy 与远程签名适配器</w:t>
       </w:r>
@@ -1511,10 +1575,11 @@
       </w:pPr>
       <w:r>
         <w:rPr>
-          <w:rFonts w:ascii="Arial Unicode MS" w:hAnsi="Arial Unicode MS" w:eastAsia="Arial Unicode MS" w:cs="Arial Unicode MS"/>
+          <w:rFonts w:ascii="Hiragino Sans GB" w:hAnsi="Hiragino Sans GB" w:eastAsia="Hiragino Sans GB" w:cs="Hiragino Sans GB"/>
           <w:b/>
           <w:color w:val="2E74B5"/>
           <w:sz w:val="26"/>
+          <w:lang w:eastAsia="zh-CN"/>
         </w:rPr>
         <w:t>WorkBuddy 使用同一个跨平台包</w:t>
       </w:r>
@@ -1525,11 +1590,12 @@
       </w:pPr>
       <w:r>
         <w:rPr>
-          <w:rFonts w:ascii="Arial Unicode MS" w:hAnsi="Arial Unicode MS" w:eastAsia="Arial Unicode MS" w:cs="Arial Unicode MS"/>
+          <w:rFonts w:ascii="Hiragino Sans GB" w:hAnsi="Hiragino Sans GB" w:eastAsia="Hiragino Sans GB" w:cs="Hiragino Sans GB"/>
           <w:color w:val="17212B"/>
           <w:sz w:val="22"/>
+          <w:lang w:eastAsia="zh-CN"/>
         </w:rPr>
-        <w:t>macOS 与 Windows 不再分别发布 WorkBuddy 安装包，也不再运行固定 .command、.cmd、PowerShell 或外部 CLI。管理器只下载、验签并定位同一个跨平台插件市场 ZIP。V1.4.0 在签名 plugin.json 中内联声明 jiaotang-kb，不依赖插件根目录 .mcp.json，也不写用户级、项目级或全局 MCP 配置。</w:t>
+        <w:t>macOS 与 Windows 不再分别发布 WorkBuddy 安装包，也不再运行固定 .command、.cmd、PowerShell 或外部 CLI。管理器只下载、验签并定位同一个跨平台插件市场 ZIP。V1.4.2 从签名插件根目录 .mcp.json 加载 jiaotang-kb，plugin.json 保留相对路径声明；不写用户级、项目级或全局 MCP 配置。</w:t>
       </w:r>
     </w:p>
     <w:p>
@@ -1543,18 +1609,20 @@
       </w:pPr>
       <w:r>
         <w:rPr>
-          <w:rFonts w:ascii="Arial Unicode MS" w:hAnsi="Arial Unicode MS" w:eastAsia="Arial Unicode MS" w:cs="Arial Unicode MS"/>
+          <w:rFonts w:ascii="Hiragino Sans GB" w:hAnsi="Hiragino Sans GB" w:eastAsia="Hiragino Sans GB" w:cs="Hiragino Sans GB"/>
           <w:b/>
           <w:color w:val="17212B"/>
           <w:sz w:val="22"/>
+          <w:lang w:eastAsia="zh-CN"/>
         </w:rPr>
         <w:t xml:space="preserve">下载并验签。 </w:t>
       </w:r>
       <w:r>
         <w:rPr>
-          <w:rFonts w:ascii="Arial Unicode MS" w:hAnsi="Arial Unicode MS" w:eastAsia="Arial Unicode MS" w:cs="Arial Unicode MS"/>
+          <w:rFonts w:ascii="Hiragino Sans GB" w:hAnsi="Hiragino Sans GB" w:eastAsia="Hiragino Sans GB" w:cs="Hiragino Sans GB"/>
           <w:color w:val="17212B"/>
           <w:sz w:val="22"/>
+          <w:lang w:eastAsia="zh-CN"/>
         </w:rPr>
         <w:t>在平台页点击“准备安装”，等待签名与逐文件哈希通过。</w:t>
       </w:r>
@@ -1570,18 +1638,20 @@
       </w:pPr>
       <w:r>
         <w:rPr>
-          <w:rFonts w:ascii="Arial Unicode MS" w:hAnsi="Arial Unicode MS" w:eastAsia="Arial Unicode MS" w:cs="Arial Unicode MS"/>
+          <w:rFonts w:ascii="Hiragino Sans GB" w:hAnsi="Hiragino Sans GB" w:eastAsia="Hiragino Sans GB" w:cs="Hiragino Sans GB"/>
           <w:b/>
           <w:color w:val="17212B"/>
           <w:sz w:val="22"/>
+          <w:lang w:eastAsia="zh-CN"/>
         </w:rPr>
         <w:t xml:space="preserve">定位并解压。 </w:t>
       </w:r>
       <w:r>
         <w:rPr>
-          <w:rFonts w:ascii="Arial Unicode MS" w:hAnsi="Arial Unicode MS" w:eastAsia="Arial Unicode MS" w:cs="Arial Unicode MS"/>
+          <w:rFonts w:ascii="Hiragino Sans GB" w:hAnsi="Hiragino Sans GB" w:eastAsia="Hiragino Sans GB" w:cs="Hiragino Sans GB"/>
           <w:color w:val="17212B"/>
           <w:sz w:val="22"/>
+          <w:lang w:eastAsia="zh-CN"/>
         </w:rPr>
         <w:t>打开 ZIP 位置，安全解压完整 jiaotang 市场。</w:t>
       </w:r>
@@ -1597,18 +1667,20 @@
       </w:pPr>
       <w:r>
         <w:rPr>
-          <w:rFonts w:ascii="Arial Unicode MS" w:hAnsi="Arial Unicode MS" w:eastAsia="Arial Unicode MS" w:cs="Arial Unicode MS"/>
+          <w:rFonts w:ascii="Hiragino Sans GB" w:hAnsi="Hiragino Sans GB" w:eastAsia="Hiragino Sans GB" w:cs="Hiragino Sans GB"/>
           <w:b/>
           <w:color w:val="17212B"/>
           <w:sz w:val="22"/>
+          <w:lang w:eastAsia="zh-CN"/>
         </w:rPr>
         <w:t xml:space="preserve">持久保存。 </w:t>
       </w:r>
       <w:r>
         <w:rPr>
-          <w:rFonts w:ascii="Arial Unicode MS" w:hAnsi="Arial Unicode MS" w:eastAsia="Arial Unicode MS" w:cs="Arial Unicode MS"/>
+          <w:rFonts w:ascii="Hiragino Sans GB" w:hAnsi="Hiragino Sans GB" w:eastAsia="Hiragino Sans GB" w:cs="Hiragino Sans GB"/>
           <w:color w:val="17212B"/>
           <w:sz w:val="22"/>
+          <w:lang w:eastAsia="zh-CN"/>
         </w:rPr>
         <w:t>将完整市场保存到当前 WorkBuddy 实际用户目录的 plugins/marketplaces/jiaotang，不使用临时下载或临时解压目录。</w:t>
       </w:r>
@@ -1624,18 +1696,20 @@
       </w:pPr>
       <w:r>
         <w:rPr>
-          <w:rFonts w:ascii="Arial Unicode MS" w:hAnsi="Arial Unicode MS" w:eastAsia="Arial Unicode MS" w:cs="Arial Unicode MS"/>
+          <w:rFonts w:ascii="Hiragino Sans GB" w:hAnsi="Hiragino Sans GB" w:eastAsia="Hiragino Sans GB" w:cs="Hiragino Sans GB"/>
           <w:b/>
           <w:color w:val="17212B"/>
           <w:sz w:val="22"/>
+          <w:lang w:eastAsia="zh-CN"/>
         </w:rPr>
         <w:t xml:space="preserve">添加本地市场。 </w:t>
       </w:r>
       <w:r>
         <w:rPr>
-          <w:rFonts w:ascii="Arial Unicode MS" w:hAnsi="Arial Unicode MS" w:eastAsia="Arial Unicode MS" w:cs="Arial Unicode MS"/>
+          <w:rFonts w:ascii="Hiragino Sans GB" w:hAnsi="Hiragino Sans GB" w:eastAsia="Hiragino Sans GB" w:cs="Hiragino Sans GB"/>
           <w:color w:val="17212B"/>
           <w:sz w:val="22"/>
+          <w:lang w:eastAsia="zh-CN"/>
         </w:rPr>
         <w:t>在 WorkBuddy 插件市场添加上述持久 jiaotang 目录；安装后不得清理该目录。</w:t>
       </w:r>
@@ -1651,18 +1725,20 @@
       </w:pPr>
       <w:r>
         <w:rPr>
-          <w:rFonts w:ascii="Arial Unicode MS" w:hAnsi="Arial Unicode MS" w:eastAsia="Arial Unicode MS" w:cs="Arial Unicode MS"/>
+          <w:rFonts w:ascii="Hiragino Sans GB" w:hAnsi="Hiragino Sans GB" w:eastAsia="Hiragino Sans GB" w:cs="Hiragino Sans GB"/>
           <w:b/>
           <w:color w:val="17212B"/>
           <w:sz w:val="22"/>
+          <w:lang w:eastAsia="zh-CN"/>
         </w:rPr>
         <w:t xml:space="preserve">安装并启用。 </w:t>
       </w:r>
       <w:r>
         <w:rPr>
-          <w:rFonts w:ascii="Arial Unicode MS" w:hAnsi="Arial Unicode MS" w:eastAsia="Arial Unicode MS" w:cs="Arial Unicode MS"/>
+          <w:rFonts w:ascii="Hiragino Sans GB" w:hAnsi="Hiragino Sans GB" w:eastAsia="Hiragino Sans GB" w:cs="Hiragino Sans GB"/>
           <w:color w:val="17212B"/>
           <w:sz w:val="22"/>
+          <w:lang w:eastAsia="zh-CN"/>
         </w:rPr>
         <w:t>安装 jiaotang-workbuddy-skills@jiaotang；不关闭 WorkBuddy，不运行包外脚本。</w:t>
       </w:r>
@@ -1678,20 +1754,21 @@
       </w:pPr>
       <w:r>
         <w:rPr>
-          <w:rFonts w:ascii="Arial Unicode MS" w:hAnsi="Arial Unicode MS" w:eastAsia="Arial Unicode MS" w:cs="Arial Unicode MS"/>
+          <w:rFonts w:ascii="Hiragino Sans GB" w:hAnsi="Hiragino Sans GB" w:eastAsia="Hiragino Sans GB" w:cs="Hiragino Sans GB"/>
           <w:b/>
           <w:color w:val="17212B"/>
           <w:sz w:val="22"/>
+          <w:lang w:eastAsia="zh-CN"/>
         </w:rPr>
-        <w:t xml:space="preserve">填写 bootstrap。 </w:t>
+        <w:t>完成首次绑定。 新设备安装并启用插件后，让 Agent 将门户一次性 bootstrap_url 仅作为本地 jiaotang_kb_setup 工具参数调用一次；同机已绑定设备直接复用系统凭据。</w:t>
       </w:r>
       <w:r>
         <w:rPr>
-          <w:rFonts w:ascii="Arial Unicode MS" w:hAnsi="Arial Unicode MS" w:eastAsia="Arial Unicode MS" w:cs="Arial Unicode MS"/>
+          <w:rFonts w:ascii="Hiragino Sans GB" w:hAnsi="Hiragino Sans GB" w:eastAsia="Hiragino Sans GB" w:cs="Hiragino Sans GB"/>
           <w:color w:val="17212B"/>
           <w:sz w:val="22"/>
+          <w:lang w:eastAsia="zh-CN"/>
         </w:rPr>
-        <w:t>门户 API 页复制一次性地址并粘贴到敏感配置；同机已绑定时复用现有凭据。</w:t>
       </w:r>
     </w:p>
     <w:p>
@@ -1705,18 +1782,20 @@
       </w:pPr>
       <w:r>
         <w:rPr>
-          <w:rFonts w:ascii="Arial Unicode MS" w:hAnsi="Arial Unicode MS" w:eastAsia="Arial Unicode MS" w:cs="Arial Unicode MS"/>
+          <w:rFonts w:ascii="Hiragino Sans GB" w:hAnsi="Hiragino Sans GB" w:eastAsia="Hiragino Sans GB" w:cs="Hiragino Sans GB"/>
           <w:b/>
           <w:color w:val="17212B"/>
           <w:sz w:val="22"/>
+          <w:lang w:eastAsia="zh-CN"/>
         </w:rPr>
         <w:t xml:space="preserve">检查连接。 </w:t>
       </w:r>
       <w:r>
         <w:rPr>
-          <w:rFonts w:ascii="Arial Unicode MS" w:hAnsi="Arial Unicode MS" w:eastAsia="Arial Unicode MS" w:cs="Arial Unicode MS"/>
+          <w:rFonts w:ascii="Hiragino Sans GB" w:hAnsi="Hiragino Sans GB" w:eastAsia="Hiragino Sans GB" w:cs="Hiragino Sans GB"/>
           <w:color w:val="17212B"/>
           <w:sz w:val="22"/>
+          <w:lang w:eastAsia="zh-CN"/>
         </w:rPr>
         <w:t>让 Agent 检查知识库连接状态，确认 MCP 工具列表可见，并成功调用任一只读状态或检索工具。</w:t>
       </w:r>
@@ -1732,18 +1811,20 @@
       </w:pPr>
       <w:r>
         <w:rPr>
-          <w:rFonts w:ascii="Arial Unicode MS" w:hAnsi="Arial Unicode MS" w:eastAsia="Arial Unicode MS" w:cs="Arial Unicode MS"/>
+          <w:rFonts w:ascii="Hiragino Sans GB" w:hAnsi="Hiragino Sans GB" w:eastAsia="Hiragino Sans GB" w:cs="Hiragino Sans GB"/>
           <w:b/>
           <w:color w:val="17212B"/>
           <w:sz w:val="22"/>
+          <w:lang w:eastAsia="zh-CN"/>
         </w:rPr>
         <w:t xml:space="preserve">完成验收。 </w:t>
       </w:r>
       <w:r>
         <w:rPr>
-          <w:rFonts w:ascii="Arial Unicode MS" w:hAnsi="Arial Unicode MS" w:eastAsia="Arial Unicode MS" w:cs="Arial Unicode MS"/>
+          <w:rFonts w:ascii="Hiragino Sans GB" w:hAnsi="Hiragino Sans GB" w:eastAsia="Hiragino Sans GB" w:cs="Hiragino Sans GB"/>
           <w:color w:val="17212B"/>
           <w:sz w:val="22"/>
+          <w:lang w:eastAsia="zh-CN"/>
         </w:rPr>
         <w:t>连接成功后再安装 OCR、PDF、Word、PPT、Excel 和联网检索 Skills；确认插件启用且 49 项可见。</w:t>
       </w:r>
@@ -1756,9 +1837,10 @@
       </w:pPr>
       <w:r>
         <w:rPr>
-          <w:rFonts w:ascii="Arial Unicode MS" w:hAnsi="Arial Unicode MS" w:eastAsia="Arial Unicode MS" w:cs="Arial Unicode MS"/>
+          <w:rFonts w:ascii="Hiragino Sans GB" w:hAnsi="Hiragino Sans GB" w:eastAsia="Hiragino Sans GB" w:cs="Hiragino Sans GB"/>
           <w:color w:val="17212B"/>
           <w:sz w:val="18"/>
+          <w:lang w:eastAsia="zh-CN"/>
         </w:rPr>
         <w:t>/plugin marketplace add &lt;持久保存的 jiaotang 目录&gt;    →    安装 jiaotang-workbuddy-skills@jiaotang</w:t>
       </w:r>
@@ -1770,10 +1852,11 @@
       </w:pPr>
       <w:r>
         <w:rPr>
-          <w:rFonts w:ascii="Arial Unicode MS" w:hAnsi="Arial Unicode MS" w:eastAsia="Arial Unicode MS" w:cs="Arial Unicode MS"/>
+          <w:rFonts w:ascii="Hiragino Sans GB" w:hAnsi="Hiragino Sans GB" w:eastAsia="Hiragino Sans GB" w:cs="Hiragino Sans GB"/>
           <w:b/>
           <w:color w:val="2E74B5"/>
           <w:sz w:val="26"/>
+          <w:lang w:eastAsia="zh-CN"/>
         </w:rPr>
         <w:t>远程适配器只更新数据，不下发命令</w:t>
       </w:r>
@@ -1789,18 +1872,20 @@
       </w:pPr>
       <w:r>
         <w:rPr>
-          <w:rFonts w:ascii="Arial Unicode MS" w:hAnsi="Arial Unicode MS" w:eastAsia="Arial Unicode MS" w:cs="Arial Unicode MS"/>
+          <w:rFonts w:ascii="Hiragino Sans GB" w:hAnsi="Hiragino Sans GB" w:eastAsia="Hiragino Sans GB" w:cs="Hiragino Sans GB"/>
           <w:b/>
           <w:color w:val="17212B"/>
           <w:sz w:val="22"/>
+          <w:lang w:eastAsia="zh-CN"/>
         </w:rPr>
         <w:t xml:space="preserve">固定来源。 </w:t>
       </w:r>
       <w:r>
         <w:rPr>
-          <w:rFonts w:ascii="Arial Unicode MS" w:hAnsi="Arial Unicode MS" w:eastAsia="Arial Unicode MS" w:cs="Arial Unicode MS"/>
+          <w:rFonts w:ascii="Hiragino Sans GB" w:hAnsi="Hiragino Sans GB" w:eastAsia="Hiragino Sans GB" w:cs="Hiragino Sans GB"/>
           <w:color w:val="17212B"/>
           <w:sz w:val="22"/>
+          <w:lang w:eastAsia="zh-CN"/>
         </w:rPr>
         <w:t>只从焦糖门户读取平台清单、签名和签名元数据。</w:t>
       </w:r>
@@ -1816,18 +1901,20 @@
       </w:pPr>
       <w:r>
         <w:rPr>
-          <w:rFonts w:ascii="Arial Unicode MS" w:hAnsi="Arial Unicode MS" w:eastAsia="Arial Unicode MS" w:cs="Arial Unicode MS"/>
+          <w:rFonts w:ascii="Hiragino Sans GB" w:hAnsi="Hiragino Sans GB" w:eastAsia="Hiragino Sans GB" w:cs="Hiragino Sans GB"/>
           <w:b/>
           <w:color w:val="17212B"/>
           <w:sz w:val="22"/>
+          <w:lang w:eastAsia="zh-CN"/>
         </w:rPr>
         <w:t xml:space="preserve">固定发布者。 </w:t>
       </w:r>
       <w:r>
         <w:rPr>
-          <w:rFonts w:ascii="Arial Unicode MS" w:hAnsi="Arial Unicode MS" w:eastAsia="Arial Unicode MS" w:cs="Arial Unicode MS"/>
+          <w:rFonts w:ascii="Hiragino Sans GB" w:hAnsi="Hiragino Sans GB" w:eastAsia="Hiragino Sans GB" w:cs="Hiragino Sans GB"/>
           <w:color w:val="17212B"/>
           <w:sz w:val="22"/>
+          <w:lang w:eastAsia="zh-CN"/>
         </w:rPr>
         <w:t>内置 Ed25519 公钥和指纹验签，namespace 与 identity 必须匹配。</w:t>
       </w:r>
@@ -1843,18 +1930,20 @@
       </w:pPr>
       <w:r>
         <w:rPr>
-          <w:rFonts w:ascii="Arial Unicode MS" w:hAnsi="Arial Unicode MS" w:eastAsia="Arial Unicode MS" w:cs="Arial Unicode MS"/>
+          <w:rFonts w:ascii="Hiragino Sans GB" w:hAnsi="Hiragino Sans GB" w:eastAsia="Hiragino Sans GB" w:cs="Hiragino Sans GB"/>
           <w:b/>
           <w:color w:val="17212B"/>
           <w:sz w:val="22"/>
+          <w:lang w:eastAsia="zh-CN"/>
         </w:rPr>
         <w:t xml:space="preserve">严格 schema。 </w:t>
       </w:r>
       <w:r>
         <w:rPr>
-          <w:rFonts w:ascii="Arial Unicode MS" w:hAnsi="Arial Unicode MS" w:eastAsia="Arial Unicode MS" w:cs="Arial Unicode MS"/>
+          <w:rFonts w:ascii="Hiragino Sans GB" w:hAnsi="Hiragino Sans GB" w:eastAsia="Hiragino Sans GB" w:cs="Hiragino Sans GB"/>
           <w:color w:val="17212B"/>
           <w:sz w:val="22"/>
+          <w:lang w:eastAsia="zh-CN"/>
         </w:rPr>
         <w:t>只允许平台、能力、路径、说明和固定导入模式；命令、脚本、URL 与未知字段一律拒绝。</w:t>
       </w:r>
@@ -1870,18 +1959,20 @@
       </w:pPr>
       <w:r>
         <w:rPr>
-          <w:rFonts w:ascii="Arial Unicode MS" w:hAnsi="Arial Unicode MS" w:eastAsia="Arial Unicode MS" w:cs="Arial Unicode MS"/>
+          <w:rFonts w:ascii="Hiragino Sans GB" w:hAnsi="Hiragino Sans GB" w:eastAsia="Hiragino Sans GB" w:cs="Hiragino Sans GB"/>
           <w:b/>
           <w:color w:val="17212B"/>
           <w:sz w:val="22"/>
+          <w:lang w:eastAsia="zh-CN"/>
         </w:rPr>
         <w:t>版本保护。 新 revision 验证通过才缓存；失败时继续使用当前已验证版本或内置版本。只有新增可执行逻辑、私有 API 或扩大写入权限时，才升级管理器并重走双端发行门禁。</w:t>
       </w:r>
       <w:r>
         <w:rPr>
-          <w:rFonts w:ascii="Arial Unicode MS" w:hAnsi="Arial Unicode MS" w:eastAsia="Arial Unicode MS" w:cs="Arial Unicode MS"/>
+          <w:rFonts w:ascii="Hiragino Sans GB" w:hAnsi="Hiragino Sans GB" w:eastAsia="Hiragino Sans GB" w:cs="Hiragino Sans GB"/>
           <w:color w:val="17212B"/>
           <w:sz w:val="22"/>
+          <w:lang w:eastAsia="zh-CN"/>
         </w:rPr>
       </w:r>
     </w:p>
@@ -1905,10 +1996,11 @@
       </w:pPr>
       <w:r>
         <w:rPr>
-          <w:rFonts w:ascii="Arial Unicode MS" w:hAnsi="Arial Unicode MS" w:eastAsia="Arial Unicode MS" w:cs="Arial Unicode MS"/>
+          <w:rFonts w:ascii="Hiragino Sans GB" w:hAnsi="Hiragino Sans GB" w:eastAsia="Hiragino Sans GB" w:cs="Hiragino Sans GB"/>
           <w:b/>
           <w:color w:val="2E74B5"/>
           <w:sz w:val="32"/>
+          <w:lang w:eastAsia="zh-CN"/>
         </w:rPr>
         <w:t>4  安全、审计、回滚与验收</w:t>
       </w:r>
@@ -1920,10 +2012,11 @@
       </w:pPr>
       <w:r>
         <w:rPr>
-          <w:rFonts w:ascii="Arial Unicode MS" w:hAnsi="Arial Unicode MS" w:eastAsia="Arial Unicode MS" w:cs="Arial Unicode MS"/>
+          <w:rFonts w:ascii="Hiragino Sans GB" w:hAnsi="Hiragino Sans GB" w:eastAsia="Hiragino Sans GB" w:cs="Hiragino Sans GB"/>
           <w:b/>
           <w:color w:val="2E74B5"/>
           <w:sz w:val="26"/>
+          <w:lang w:eastAsia="zh-CN"/>
         </w:rPr>
         <w:t>两条信任链要分开看</w:t>
       </w:r>
@@ -1974,10 +2067,11 @@
             </w:pPr>
             <w:r>
               <w:rPr>
-                <w:rFonts w:ascii="Arial Unicode MS" w:hAnsi="Arial Unicode MS" w:eastAsia="Arial Unicode MS" w:cs="Arial Unicode MS"/>
+                <w:rFonts w:ascii="Hiragino Sans GB" w:hAnsi="Hiragino Sans GB" w:eastAsia="Hiragino Sans GB" w:cs="Hiragino Sans GB"/>
                 <w:b/>
                 <w:color w:val="132B3A"/>
                 <w:sz w:val="18"/>
+                <w:lang w:eastAsia="zh-CN"/>
               </w:rPr>
               <w:t>对象</w:t>
             </w:r>
@@ -2003,10 +2097,11 @@
             </w:pPr>
             <w:r>
               <w:rPr>
-                <w:rFonts w:ascii="Arial Unicode MS" w:hAnsi="Arial Unicode MS" w:eastAsia="Arial Unicode MS" w:cs="Arial Unicode MS"/>
+                <w:rFonts w:ascii="Hiragino Sans GB" w:hAnsi="Hiragino Sans GB" w:eastAsia="Hiragino Sans GB" w:cs="Hiragino Sans GB"/>
                 <w:b/>
                 <w:color w:val="132B3A"/>
                 <w:sz w:val="18"/>
+                <w:lang w:eastAsia="zh-CN"/>
               </w:rPr>
               <w:t>门禁</w:t>
             </w:r>
@@ -2032,10 +2127,11 @@
             </w:pPr>
             <w:r>
               <w:rPr>
-                <w:rFonts w:ascii="Arial Unicode MS" w:hAnsi="Arial Unicode MS" w:eastAsia="Arial Unicode MS" w:cs="Arial Unicode MS"/>
+                <w:rFonts w:ascii="Hiragino Sans GB" w:hAnsi="Hiragino Sans GB" w:eastAsia="Hiragino Sans GB" w:cs="Hiragino Sans GB"/>
                 <w:b/>
                 <w:color w:val="132B3A"/>
                 <w:sz w:val="18"/>
+                <w:lang w:eastAsia="zh-CN"/>
               </w:rPr>
               <w:t>结论</w:t>
             </w:r>
@@ -2065,9 +2161,10 @@
             </w:pPr>
             <w:r>
               <w:rPr>
-                <w:rFonts w:ascii="Arial Unicode MS" w:hAnsi="Arial Unicode MS" w:eastAsia="Arial Unicode MS" w:cs="Arial Unicode MS"/>
+                <w:rFonts w:ascii="Hiragino Sans GB" w:hAnsi="Hiragino Sans GB" w:eastAsia="Hiragino Sans GB" w:cs="Hiragino Sans GB"/>
                 <w:color w:val="17212B"/>
                 <w:sz w:val="18"/>
+                <w:lang w:eastAsia="zh-CN"/>
               </w:rPr>
               <w:t>桌面应用</w:t>
             </w:r>
@@ -2092,9 +2189,10 @@
             </w:pPr>
             <w:r>
               <w:rPr>
-                <w:rFonts w:ascii="Arial Unicode MS" w:hAnsi="Arial Unicode MS" w:eastAsia="Arial Unicode MS" w:cs="Arial Unicode MS"/>
+                <w:rFonts w:ascii="Hiragino Sans GB" w:hAnsi="Hiragino Sans GB" w:eastAsia="Hiragino Sans GB" w:cs="Hiragino Sans GB"/>
                 <w:color w:val="17212B"/>
                 <w:sz w:val="18"/>
+                <w:lang w:eastAsia="zh-CN"/>
               </w:rPr>
               <w:t>未签名本机授权；发布页提供版本、SHA-256 与发行审计</w:t>
             </w:r>
@@ -2119,9 +2217,10 @@
             </w:pPr>
             <w:r>
               <w:rPr>
-                <w:rFonts w:ascii="Arial Unicode MS" w:hAnsi="Arial Unicode MS" w:eastAsia="Arial Unicode MS" w:cs="Arial Unicode MS"/>
+                <w:rFonts w:ascii="Hiragino Sans GB" w:hAnsi="Hiragino Sans GB" w:eastAsia="Hiragino Sans GB" w:cs="Hiragino Sans GB"/>
                 <w:color w:val="17212B"/>
                 <w:sz w:val="18"/>
+                <w:lang w:eastAsia="zh-CN"/>
               </w:rPr>
               <w:t>确认下载来源后，由用户按本机策略决定是否运行</w:t>
             </w:r>
@@ -2151,9 +2250,10 @@
             </w:pPr>
             <w:r>
               <w:rPr>
-                <w:rFonts w:ascii="Arial Unicode MS" w:hAnsi="Arial Unicode MS" w:eastAsia="Arial Unicode MS" w:cs="Arial Unicode MS"/>
+                <w:rFonts w:ascii="Hiragino Sans GB" w:hAnsi="Hiragino Sans GB" w:eastAsia="Hiragino Sans GB" w:cs="Hiragino Sans GB"/>
                 <w:color w:val="17212B"/>
                 <w:sz w:val="18"/>
+                <w:lang w:eastAsia="zh-CN"/>
               </w:rPr>
               <w:t>Skills 下载</w:t>
             </w:r>
@@ -2178,9 +2278,10 @@
             </w:pPr>
             <w:r>
               <w:rPr>
-                <w:rFonts w:ascii="Arial Unicode MS" w:hAnsi="Arial Unicode MS" w:eastAsia="Arial Unicode MS" w:cs="Arial Unicode MS"/>
+                <w:rFonts w:ascii="Hiragino Sans GB" w:hAnsi="Hiragino Sans GB" w:eastAsia="Hiragino Sans GB" w:cs="Hiragino Sans GB"/>
                 <w:color w:val="17212B"/>
                 <w:sz w:val="18"/>
+                <w:lang w:eastAsia="zh-CN"/>
               </w:rPr>
               <w:t>HTTPS 同源、发布通道 SHA-256</w:t>
             </w:r>
@@ -2205,9 +2306,10 @@
             </w:pPr>
             <w:r>
               <w:rPr>
-                <w:rFonts w:ascii="Arial Unicode MS" w:hAnsi="Arial Unicode MS" w:eastAsia="Arial Unicode MS" w:cs="Arial Unicode MS"/>
+                <w:rFonts w:ascii="Hiragino Sans GB" w:hAnsi="Hiragino Sans GB" w:eastAsia="Hiragino Sans GB" w:cs="Hiragino Sans GB"/>
                 <w:color w:val="17212B"/>
                 <w:sz w:val="18"/>
+                <w:lang w:eastAsia="zh-CN"/>
               </w:rPr>
               <w:t>整体文件被替换时停止</w:t>
             </w:r>
@@ -2237,9 +2339,10 @@
             </w:pPr>
             <w:r>
               <w:rPr>
-                <w:rFonts w:ascii="Arial Unicode MS" w:hAnsi="Arial Unicode MS" w:eastAsia="Arial Unicode MS" w:cs="Arial Unicode MS"/>
+                <w:rFonts w:ascii="Hiragino Sans GB" w:hAnsi="Hiragino Sans GB" w:eastAsia="Hiragino Sans GB" w:cs="Hiragino Sans GB"/>
                 <w:color w:val="17212B"/>
                 <w:sz w:val="18"/>
+                <w:lang w:eastAsia="zh-CN"/>
               </w:rPr>
               <w:t>发布者</w:t>
             </w:r>
@@ -2264,9 +2367,10 @@
             </w:pPr>
             <w:r>
               <w:rPr>
-                <w:rFonts w:ascii="Arial Unicode MS" w:hAnsi="Arial Unicode MS" w:eastAsia="Arial Unicode MS" w:cs="Arial Unicode MS"/>
+                <w:rFonts w:ascii="Hiragino Sans GB" w:hAnsi="Hiragino Sans GB" w:eastAsia="Hiragino Sans GB" w:cs="Hiragino Sans GB"/>
                 <w:color w:val="17212B"/>
                 <w:sz w:val="18"/>
+                <w:lang w:eastAsia="zh-CN"/>
               </w:rPr>
               <w:t>固定 Ed25519 公钥、指纹、identity 与 namespace</w:t>
             </w:r>
@@ -2291,9 +2395,10 @@
             </w:pPr>
             <w:r>
               <w:rPr>
-                <w:rFonts w:ascii="Arial Unicode MS" w:hAnsi="Arial Unicode MS" w:eastAsia="Arial Unicode MS" w:cs="Arial Unicode MS"/>
+                <w:rFonts w:ascii="Hiragino Sans GB" w:hAnsi="Hiragino Sans GB" w:eastAsia="Hiragino Sans GB" w:cs="Hiragino Sans GB"/>
                 <w:color w:val="17212B"/>
                 <w:sz w:val="18"/>
+                <w:lang w:eastAsia="zh-CN"/>
               </w:rPr>
               <w:t>签名不匹配时停止</w:t>
             </w:r>
@@ -2323,9 +2428,10 @@
             </w:pPr>
             <w:r>
               <w:rPr>
-                <w:rFonts w:ascii="Arial Unicode MS" w:hAnsi="Arial Unicode MS" w:eastAsia="Arial Unicode MS" w:cs="Arial Unicode MS"/>
+                <w:rFonts w:ascii="Hiragino Sans GB" w:hAnsi="Hiragino Sans GB" w:eastAsia="Hiragino Sans GB" w:cs="Hiragino Sans GB"/>
                 <w:color w:val="17212B"/>
                 <w:sz w:val="18"/>
+                <w:lang w:eastAsia="zh-CN"/>
               </w:rPr>
               <w:t>包内内容</w:t>
             </w:r>
@@ -2350,9 +2456,10 @@
             </w:pPr>
             <w:r>
               <w:rPr>
-                <w:rFonts w:ascii="Arial Unicode MS" w:hAnsi="Arial Unicode MS" w:eastAsia="Arial Unicode MS" w:cs="Arial Unicode MS"/>
+                <w:rFonts w:ascii="Hiragino Sans GB" w:hAnsi="Hiragino Sans GB" w:eastAsia="Hiragino Sans GB" w:cs="Hiragino Sans GB"/>
                 <w:color w:val="17212B"/>
                 <w:sz w:val="18"/>
+                <w:lang w:eastAsia="zh-CN"/>
               </w:rPr>
               <w:t>安全路径、解压上限、签名清单与逐文件 SHA-256</w:t>
             </w:r>
@@ -2377,9 +2484,10 @@
             </w:pPr>
             <w:r>
               <w:rPr>
-                <w:rFonts w:ascii="Arial Unicode MS" w:hAnsi="Arial Unicode MS" w:eastAsia="Arial Unicode MS" w:cs="Arial Unicode MS"/>
+                <w:rFonts w:ascii="Hiragino Sans GB" w:hAnsi="Hiragino Sans GB" w:eastAsia="Hiragino Sans GB" w:cs="Hiragino Sans GB"/>
                 <w:color w:val="17212B"/>
                 <w:sz w:val="18"/>
+                <w:lang w:eastAsia="zh-CN"/>
               </w:rPr>
               <w:t>缺失、夹带或哈希不符时停止</w:t>
             </w:r>
@@ -2409,9 +2517,10 @@
             </w:pPr>
             <w:r>
               <w:rPr>
-                <w:rFonts w:ascii="Arial Unicode MS" w:hAnsi="Arial Unicode MS" w:eastAsia="Arial Unicode MS" w:cs="Arial Unicode MS"/>
+                <w:rFonts w:ascii="Hiragino Sans GB" w:hAnsi="Hiragino Sans GB" w:eastAsia="Hiragino Sans GB" w:cs="Hiragino Sans GB"/>
                 <w:color w:val="17212B"/>
                 <w:sz w:val="18"/>
+                <w:lang w:eastAsia="zh-CN"/>
               </w:rPr>
               <w:t>平台适配器</w:t>
             </w:r>
@@ -2436,9 +2545,10 @@
             </w:pPr>
             <w:r>
               <w:rPr>
-                <w:rFonts w:ascii="Arial Unicode MS" w:hAnsi="Arial Unicode MS" w:eastAsia="Arial Unicode MS" w:cs="Arial Unicode MS"/>
+                <w:rFonts w:ascii="Hiragino Sans GB" w:hAnsi="Hiragino Sans GB" w:eastAsia="Hiragino Sans GB" w:cs="Hiragino Sans GB"/>
                 <w:color w:val="17212B"/>
                 <w:sz w:val="18"/>
+                <w:lang w:eastAsia="zh-CN"/>
               </w:rPr>
               <w:t>签名、schema、兼容版本和 revision 保护</w:t>
             </w:r>
@@ -2463,9 +2573,10 @@
             </w:pPr>
             <w:r>
               <w:rPr>
-                <w:rFonts w:ascii="Arial Unicode MS" w:hAnsi="Arial Unicode MS" w:eastAsia="Arial Unicode MS" w:cs="Arial Unicode MS"/>
+                <w:rFonts w:ascii="Hiragino Sans GB" w:hAnsi="Hiragino Sans GB" w:eastAsia="Hiragino Sans GB" w:cs="Hiragino Sans GB"/>
                 <w:color w:val="17212B"/>
                 <w:sz w:val="18"/>
+                <w:lang w:eastAsia="zh-CN"/>
               </w:rPr>
               <w:t>失败时不执行远程内容</w:t>
             </w:r>
@@ -2480,10 +2591,11 @@
       </w:pPr>
       <w:r>
         <w:rPr>
-          <w:rFonts w:ascii="Arial Unicode MS" w:hAnsi="Arial Unicode MS" w:eastAsia="Arial Unicode MS" w:cs="Arial Unicode MS"/>
+          <w:rFonts w:ascii="Hiragino Sans GB" w:hAnsi="Hiragino Sans GB" w:eastAsia="Hiragino Sans GB" w:cs="Hiragino Sans GB"/>
           <w:b/>
           <w:color w:val="2E74B5"/>
           <w:sz w:val="26"/>
+          <w:lang w:eastAsia="zh-CN"/>
         </w:rPr>
         <w:t>查看审计与执行回滚</w:t>
       </w:r>
@@ -2499,9 +2611,10 @@
       </w:pPr>
       <w:r>
         <w:rPr>
-          <w:rFonts w:ascii="Arial Unicode MS" w:hAnsi="Arial Unicode MS" w:eastAsia="Arial Unicode MS" w:cs="Arial Unicode MS"/>
+          <w:rFonts w:ascii="Hiragino Sans GB" w:hAnsi="Hiragino Sans GB" w:eastAsia="Hiragino Sans GB" w:cs="Hiragino Sans GB"/>
           <w:color w:val="17212B"/>
           <w:sz w:val="22"/>
+          <w:lang w:eastAsia="zh-CN"/>
         </w:rPr>
         <w:t>在“安全中心”点击“打开审计日志”。日志记录扫描、适配器更新、包验签、导入与回滚的开始、结果和失败原因。</w:t>
       </w:r>
@@ -2517,9 +2630,10 @@
       </w:pPr>
       <w:r>
         <w:rPr>
-          <w:rFonts w:ascii="Arial Unicode MS" w:hAnsi="Arial Unicode MS" w:eastAsia="Arial Unicode MS" w:cs="Arial Unicode MS"/>
+          <w:rFonts w:ascii="Hiragino Sans GB" w:hAnsi="Hiragino Sans GB" w:eastAsia="Hiragino Sans GB" w:cs="Hiragino Sans GB"/>
           <w:color w:val="17212B"/>
           <w:sz w:val="22"/>
+          <w:lang w:eastAsia="zh-CN"/>
         </w:rPr>
         <w:t>访问令牌、bootstrap、密码、设备私钥和其他敏感字段只记录为脱敏占位，不写入普通日志。</w:t>
       </w:r>
@@ -2535,9 +2649,10 @@
       </w:pPr>
       <w:r>
         <w:rPr>
-          <w:rFonts w:ascii="Arial Unicode MS" w:hAnsi="Arial Unicode MS" w:eastAsia="Arial Unicode MS" w:cs="Arial Unicode MS"/>
+          <w:rFonts w:ascii="Hiragino Sans GB" w:hAnsi="Hiragino Sans GB" w:eastAsia="Hiragino Sans GB" w:cs="Hiragino Sans GB"/>
           <w:color w:val="17212B"/>
           <w:sz w:val="22"/>
+          <w:lang w:eastAsia="zh-CN"/>
         </w:rPr>
         <w:t>每次更新已托管目录前，旧内容进入同盘 backups；回滚前，当前版本先进入 displaced 恢复区。</w:t>
       </w:r>
@@ -2553,9 +2668,10 @@
       </w:pPr>
       <w:r>
         <w:rPr>
-          <w:rFonts w:ascii="Arial Unicode MS" w:hAnsi="Arial Unicode MS" w:eastAsia="Arial Unicode MS" w:cs="Arial Unicode MS"/>
+          <w:rFonts w:ascii="Hiragino Sans GB" w:hAnsi="Hiragino Sans GB" w:eastAsia="Hiragino Sans GB" w:cs="Hiragino Sans GB"/>
           <w:color w:val="17212B"/>
           <w:sz w:val="22"/>
+          <w:lang w:eastAsia="zh-CN"/>
         </w:rPr>
         <w:t>未知同名目录默认视为冲突并阻断，不自动覆盖个人项目、第三方 Skills 或平台私有配置。</w:t>
       </w:r>
@@ -2567,10 +2683,11 @@
       </w:pPr>
       <w:r>
         <w:rPr>
-          <w:rFonts w:ascii="Arial Unicode MS" w:hAnsi="Arial Unicode MS" w:eastAsia="Arial Unicode MS" w:cs="Arial Unicode MS"/>
+          <w:rFonts w:ascii="Hiragino Sans GB" w:hAnsi="Hiragino Sans GB" w:eastAsia="Hiragino Sans GB" w:cs="Hiragino Sans GB"/>
           <w:b/>
           <w:color w:val="2E74B5"/>
           <w:sz w:val="26"/>
+          <w:lang w:eastAsia="zh-CN"/>
         </w:rPr>
         <w:t>发布后验收清单</w:t>
       </w:r>
@@ -2586,11 +2703,12 @@
       </w:pPr>
       <w:r>
         <w:rPr>
-          <w:rFonts w:ascii="Arial Unicode MS" w:hAnsi="Arial Unicode MS" w:eastAsia="Arial Unicode MS" w:cs="Arial Unicode MS"/>
+          <w:rFonts w:ascii="Hiragino Sans GB" w:hAnsi="Hiragino Sans GB" w:eastAsia="Hiragino Sans GB" w:cs="Hiragino Sans GB"/>
           <w:color w:val="17212B"/>
           <w:sz w:val="21"/>
+          <w:lang w:eastAsia="zh-CN"/>
         </w:rPr>
-        <w:t>管理器“关于”或安全中心显示版本 0.2.0，Skills 清单显示 V1.4.0 与 49 项。</w:t>
+        <w:t>管理器“关于”或安全中心显示版本 0.2.0，Skills 清单显示 V1.4.2 与 49 项。</w:t>
       </w:r>
     </w:p>
     <w:p>
@@ -2604,9 +2722,10 @@
       </w:pPr>
       <w:r>
         <w:rPr>
-          <w:rFonts w:ascii="Arial Unicode MS" w:hAnsi="Arial Unicode MS" w:eastAsia="Arial Unicode MS" w:cs="Arial Unicode MS"/>
+          <w:rFonts w:ascii="Hiragino Sans GB" w:hAnsi="Hiragino Sans GB" w:eastAsia="Hiragino Sans GB" w:cs="Hiragino Sans GB"/>
           <w:color w:val="17212B"/>
           <w:sz w:val="21"/>
+          <w:lang w:eastAsia="zh-CN"/>
         </w:rPr>
         <w:t>点击扫描后，平台数量、命中路径、耗时与适配器 revision 均有结果。</w:t>
       </w:r>
@@ -2622,9 +2741,10 @@
       </w:pPr>
       <w:r>
         <w:rPr>
-          <w:rFonts w:ascii="Arial Unicode MS" w:hAnsi="Arial Unicode MS" w:eastAsia="Arial Unicode MS" w:cs="Arial Unicode MS"/>
+          <w:rFonts w:ascii="Hiragino Sans GB" w:hAnsi="Hiragino Sans GB" w:eastAsia="Hiragino Sans GB" w:cs="Hiragino Sans GB"/>
           <w:color w:val="17212B"/>
           <w:sz w:val="21"/>
+          <w:lang w:eastAsia="zh-CN"/>
         </w:rPr>
         <w:t>通用版下载、解压和导入计划没有未处理冲突；导入后新建会话能识别 Skills。</w:t>
       </w:r>
@@ -2640,11 +2760,12 @@
       </w:pPr>
       <w:r>
         <w:rPr>
-          <w:rFonts w:ascii="Arial Unicode MS" w:hAnsi="Arial Unicode MS" w:eastAsia="Arial Unicode MS" w:cs="Arial Unicode MS"/>
+          <w:rFonts w:ascii="Hiragino Sans GB" w:hAnsi="Hiragino Sans GB" w:eastAsia="Hiragino Sans GB" w:cs="Hiragino Sans GB"/>
           <w:color w:val="17212B"/>
           <w:sz w:val="21"/>
+          <w:lang w:eastAsia="zh-CN"/>
         </w:rPr>
-        <w:t>WorkBuddy 使用通用跨平台包，并在应用内完成市场添加、安装、启用与 bootstrap 配置。</w:t>
+        <w:t>WorkBuddy 使用通用跨平台包，并在应用内完成市场添加、安装与启用；首次绑定通过本地 jiaotang_kb_setup 工具完成。</w:t>
       </w:r>
     </w:p>
     <w:p>
@@ -2658,9 +2779,10 @@
       </w:pPr>
       <w:r>
         <w:rPr>
-          <w:rFonts w:ascii="Arial Unicode MS" w:hAnsi="Arial Unicode MS" w:eastAsia="Arial Unicode MS" w:cs="Arial Unicode MS"/>
+          <w:rFonts w:ascii="Hiragino Sans GB" w:hAnsi="Hiragino Sans GB" w:eastAsia="Hiragino Sans GB" w:cs="Hiragino Sans GB"/>
           <w:color w:val="17212B"/>
           <w:sz w:val="21"/>
+          <w:lang w:eastAsia="zh-CN"/>
         </w:rPr>
         <w:t>审计日志存在本轮扫描、验签和导入事件；托管目录存在可恢复的回滚点。</w:t>
       </w:r>
@@ -2676,9 +2798,10 @@
       </w:pPr>
       <w:r>
         <w:rPr>
-          <w:rFonts w:ascii="Arial Unicode MS" w:hAnsi="Arial Unicode MS" w:eastAsia="Arial Unicode MS" w:cs="Arial Unicode MS"/>
+          <w:rFonts w:ascii="Hiragino Sans GB" w:hAnsi="Hiragino Sans GB" w:eastAsia="Hiragino Sans GB" w:cs="Hiragino Sans GB"/>
           <w:color w:val="17212B"/>
           <w:sz w:val="21"/>
+          <w:lang w:eastAsia="zh-CN"/>
         </w:rPr>
         <w:t>系统或企业策略阻止未签名应用时，停止原生安装并改用 HTTPS PWA。</w:t>
       </w:r>
@@ -2726,10 +2849,11 @@
             </w:pPr>
             <w:r>
               <w:rPr>
-                <w:rFonts w:ascii="Arial Unicode MS" w:hAnsi="Arial Unicode MS" w:eastAsia="Arial Unicode MS" w:cs="Arial Unicode MS"/>
+                <w:rFonts w:ascii="Hiragino Sans GB" w:hAnsi="Hiragino Sans GB" w:eastAsia="Hiragino Sans GB" w:cs="Hiragino Sans GB"/>
                 <w:b/>
                 <w:color w:val="B98532"/>
                 <w:sz w:val="21"/>
+                <w:lang w:eastAsia="zh-CN"/>
               </w:rPr>
               <w:t>遇到问题先这样处理</w:t>
             </w:r>
@@ -2741,9 +2865,10 @@
             </w:pPr>
             <w:r>
               <w:rPr>
-                <w:rFonts w:ascii="Arial Unicode MS" w:hAnsi="Arial Unicode MS" w:eastAsia="Arial Unicode MS" w:cs="Arial Unicode MS"/>
+                <w:rFonts w:ascii="Hiragino Sans GB" w:hAnsi="Hiragino Sans GB" w:eastAsia="Hiragino Sans GB" w:cs="Hiragino Sans GB"/>
                 <w:color w:val="17212B"/>
                 <w:sz w:val="20"/>
+                <w:lang w:eastAsia="zh-CN"/>
               </w:rPr>
               <w:t>未发现平台：确认应用已安装后重新扫描，或改走平台官方导入界面。出现目录冲突：不要强制覆盖，先确认目录归属并备份。签名或 SHA-256 不一致：立即停止，不重新下载同名文件反复尝试。回滚记录缺失：不要手工删除当前目录，先从审计日志确认目标路径和上一次成功操作。</w:t>
             </w:r>
@@ -2770,7 +2895,8 @@
       </w:pPr>
       <w:r>
         <w:rPr>
-          <w:rFonts w:eastAsia="Arial Unicode MS"/>
+          <w:rFonts w:eastAsia="Hiragino Sans GB" w:ascii="Hiragino Sans GB" w:hAnsi="Hiragino Sans GB" w:cs="Hiragino Sans GB"/>
+          <w:lang w:eastAsia="zh-CN"/>
         </w:rPr>
         <w:t>5  项目算法、交付契约与专利案卷</w:t>
       </w:r>
@@ -2781,7 +2907,8 @@
       </w:pPr>
       <w:r>
         <w:rPr>
-          <w:rFonts w:eastAsia="Arial Unicode MS"/>
+          <w:rFonts w:eastAsia="Hiragino Sans GB" w:ascii="Hiragino Sans GB" w:hAnsi="Hiragino Sans GB" w:cs="Hiragino Sans GB"/>
+          <w:lang w:eastAsia="zh-CN"/>
         </w:rPr>
         <w:t>系统如何评估一家企业</w:t>
       </w:r>
@@ -2792,7 +2919,8 @@
       </w:pPr>
       <w:r>
         <w:rPr>
-          <w:rFonts w:eastAsia="Arial Unicode MS"/>
+          <w:rFonts w:eastAsia="Hiragino Sans GB" w:ascii="Hiragino Sans GB" w:hAnsi="Hiragino Sans GB" w:cs="Hiragino Sans GB"/>
+          <w:lang w:eastAsia="zh-CN"/>
         </w:rPr>
         <w:t>1. 锚定企业主体和目标属地，识别标准项目名称、项目族和历史别名。</w:t>
       </w:r>
@@ -2803,7 +2931,8 @@
       </w:pPr>
       <w:r>
         <w:rPr>
-          <w:rFonts w:eastAsia="Arial Unicode MS"/>
+          <w:rFonts w:eastAsia="Hiragino Sans GB" w:ascii="Hiragino Sans GB" w:hAnsi="Hiragino Sans GB" w:cs="Hiragino Sans GB"/>
+          <w:lang w:eastAsia="zh-CN"/>
         </w:rPr>
         <w:t>2. 选择正式判断、当年申报前准备、历史回放、预测或回测等政策时间类型。</w:t>
       </w:r>
@@ -2814,7 +2943,8 @@
       </w:pPr>
       <w:r>
         <w:rPr>
-          <w:rFonts w:eastAsia="Arial Unicode MS"/>
+          <w:rFonts w:eastAsia="Hiragino Sans GB" w:ascii="Hiragino Sans GB" w:hAnsi="Hiragino Sans GB" w:cs="Hiragino Sans GB"/>
+          <w:lang w:eastAsia="zh-CN"/>
         </w:rPr>
         <w:t>3. 读取稳定管理办法、当年度通知、属地规则和适用的征求意见前瞻层。</w:t>
       </w:r>
@@ -2825,7 +2955,8 @@
       </w:pPr>
       <w:r>
         <w:rPr>
-          <w:rFonts w:eastAsia="Arial Unicode MS"/>
+          <w:rFonts w:eastAsia="Hiragino Sans GB" w:ascii="Hiragino Sans GB" w:hAnsi="Hiragino Sans GB" w:cs="Hiragino Sans GB"/>
+          <w:lang w:eastAsia="zh-CN"/>
         </w:rPr>
         <w:t>4. 将企业事实送入项目规则树，执行叶节点阈值和 all/any 组合判断。</w:t>
       </w:r>
@@ -2836,7 +2967,8 @@
       </w:pPr>
       <w:r>
         <w:rPr>
-          <w:rFonts w:eastAsia="Arial Unicode MS"/>
+          <w:rFonts w:eastAsia="Hiragino Sans GB" w:ascii="Hiragino Sans GB" w:hAnsi="Hiragino Sans GB" w:cs="Hiragino Sans GB"/>
+          <w:lang w:eastAsia="zh-CN"/>
         </w:rPr>
         <w:t>5. 输出符合、不符合、待补材料或当前无法判断，并列明政策来源与事实缺口。</w:t>
       </w:r>
@@ -2847,7 +2979,8 @@
       </w:pPr>
       <w:r>
         <w:rPr>
-          <w:rFonts w:eastAsia="Arial Unicode MS"/>
+          <w:rFonts w:eastAsia="Hiragino Sans GB" w:ascii="Hiragino Sans GB" w:hAnsi="Hiragino Sans GB" w:cs="Hiragino Sans GB"/>
+          <w:lang w:eastAsia="zh-CN"/>
         </w:rPr>
         <w:t>系统不会因为政策库暂时未命中就断言项目不存在，也不会用省级政策替代必须由市、区县规则决定的结论。已核验且明确替代旧政策的征求意见稿，在申报尚未开放时作为准备与预测主基线，但始终标注为尚未正式生效。</w:t>
       </w:r>
@@ -2858,7 +2991,8 @@
       </w:pPr>
       <w:r>
         <w:rPr>
-          <w:rFonts w:eastAsia="Arial Unicode MS"/>
+          <w:rFonts w:eastAsia="Hiragino Sans GB" w:ascii="Hiragino Sans GB" w:hAnsi="Hiragino Sans GB" w:cs="Hiragino Sans GB"/>
+          <w:lang w:eastAsia="zh-CN"/>
         </w:rPr>
         <w:t>企业项目身份数字孪生</w:t>
       </w:r>
@@ -2869,7 +3003,8 @@
       </w:pPr>
       <w:r>
         <w:rPr>
-          <w:rFonts w:eastAsia="Arial Unicode MS"/>
+          <w:rFonts w:eastAsia="Hiragino Sans GB" w:ascii="Hiragino Sans GB" w:hAnsi="Hiragino Sans GB" w:cs="Hiragino Sans GB"/>
+          <w:lang w:eastAsia="zh-CN"/>
         </w:rPr>
         <w:t>系统把名单身份和规则判断分开保存。认定年度、认定时名称和认定时地区以名单原文为准；当前企业名称、统一社会信用代码、现注册地址和登记机关来自当前工商核验。更名、迁址、复评、复核、失效和重新认定形成独立生命周期事件，可以回放企业某一年为何具有某项身份。</w:t>
       </w:r>
@@ -2881,7 +3016,8 @@
       </w:pPr>
       <w:r>
         <w:rPr>
-          <w:rFonts w:eastAsia="Arial Unicode MS"/>
+          <w:rFonts w:eastAsia="Hiragino Sans GB" w:ascii="Hiragino Sans GB" w:hAnsi="Hiragino Sans GB" w:cs="Hiragino Sans GB"/>
+          <w:lang w:eastAsia="zh-CN"/>
         </w:rPr>
         <w:t>交付契约负责什么</w:t>
       </w:r>
@@ -2892,7 +3028,8 @@
       </w:pPr>
       <w:r>
         <w:rPr>
-          <w:rFonts w:eastAsia="Arial Unicode MS"/>
+          <w:rFonts w:eastAsia="Hiragino Sans GB" w:ascii="Hiragino Sans GB" w:hAnsi="Hiragino Sans GB" w:cs="Hiragino Sans GB"/>
+          <w:lang w:eastAsia="zh-CN"/>
         </w:rPr>
         <w:t>算法负责项目规则、政策版本和企业事实判断；交付契约负责最终文件是否完整。不同报告类型分别约束必填章节、结论顺序、政策原文、企业事实、同行对比、证据台账、内置表格、数据口径、文件格式、焦糖品牌、Logo、水印、四问复盘和产物 SHA-256。</w:t>
       </w:r>
@@ -2903,7 +3040,8 @@
       </w:pPr>
       <w:r>
         <w:rPr>
-          <w:rFonts w:eastAsia="Arial Unicode MS"/>
+          <w:rFonts w:eastAsia="Hiragino Sans GB" w:ascii="Hiragino Sans GB" w:hAnsi="Hiragino Sans GB" w:cs="Hiragino Sans GB"/>
+          <w:lang w:eastAsia="zh-CN"/>
         </w:rPr>
         <w:t>门禁失败时，自动修复器只生成缺失章节、表格、证据或重新渲染的精确任务，不会用一段“已完成”说明代替实际文件验收。</w:t>
       </w:r>
@@ -2914,7 +3052,8 @@
       </w:pPr>
       <w:r>
         <w:rPr>
-          <w:rFonts w:eastAsia="Arial Unicode MS"/>
+          <w:rFonts w:eastAsia="Hiragino Sans GB" w:ascii="Hiragino Sans GB" w:hAnsi="Hiragino Sans GB" w:cs="Hiragino Sans GB"/>
+          <w:lang w:eastAsia="zh-CN"/>
         </w:rPr>
         <w:t>专利入口说明</w:t>
       </w:r>
@@ -2925,7 +3064,8 @@
       </w:pPr>
       <w:r>
         <w:rPr>
-          <w:rFonts w:eastAsia="Arial Unicode MS"/>
+          <w:rFonts w:eastAsia="Hiragino Sans GB" w:ascii="Hiragino Sans GB" w:hAnsi="Hiragino Sans GB" w:cs="Hiragino Sans GB"/>
+          <w:lang w:eastAsia="zh-CN"/>
         </w:rPr>
         <w:t>专利任务先进入 jiaotang-patent-router，判断是查新、布局、挖掘、交底、预审、FTO、审查意见还是项目申报证据任务。需要检查中国专利申请 Word 文件时，再进入 checking-patdocx-cn-single-agent。授权、审中、失效和转让取得必须分别标注；FTO 和侵权预警仅作初筛。</w:t>
       </w:r>
@@ -2936,7 +3076,8 @@
       </w:pPr>
       <w:r>
         <w:rPr>
-          <w:rFonts w:eastAsia="Arial Unicode MS"/>
+          <w:rFonts w:eastAsia="Hiragino Sans GB" w:ascii="Hiragino Sans GB" w:hAnsi="Hiragino Sans GB" w:cs="Hiragino Sans GB"/>
+          <w:lang w:eastAsia="zh-CN"/>
         </w:rPr>
         <w:t>完整申请文件先创建每案唯一的 patent-case-manifest，再从确认后的事实锁 JSON 通过同一个生成器形成申请 Word 和附图规范。交底、检索证据、权利要求现有技术矩阵、核稿验证、预审建议和提交清单均回写同一清单。提交前契约检查文件哈希、案件版本和依赖关系；阶段错版或缺失会生成具体重建任务。匿名测试夹具只用于升级回归，不能作为真实申请案卷。</w:t>
       </w:r>
@@ -2962,17 +3103,19 @@
     </w:pPr>
     <w:r>
       <w:rPr>
-        <w:rFonts w:ascii="Arial Unicode MS" w:hAnsi="Arial Unicode MS" w:eastAsia="Arial Unicode MS" w:cs="Arial Unicode MS"/>
+        <w:rFonts w:ascii="Hiragino Sans GB" w:hAnsi="Hiragino Sans GB" w:eastAsia="Hiragino Sans GB" w:cs="Hiragino Sans GB"/>
         <w:color w:val="66717C"/>
         <w:sz w:val="17"/>
+        <w:lang w:eastAsia="zh-CN"/>
       </w:rPr>
       <w:t xml:space="preserve">第 </w:t>
     </w:r>
     <w:r>
       <w:rPr>
-        <w:rFonts w:ascii="Arial Unicode MS" w:hAnsi="Arial Unicode MS" w:eastAsia="Arial Unicode MS" w:cs="Arial Unicode MS"/>
+        <w:rFonts w:ascii="Hiragino Sans GB" w:hAnsi="Hiragino Sans GB" w:eastAsia="Hiragino Sans GB" w:cs="Hiragino Sans GB"/>
         <w:color w:val="66717C"/>
         <w:sz w:val="17"/>
+        <w:lang w:eastAsia="zh-CN"/>
       </w:rPr>
       <w:fldChar w:fldCharType="begin"/>
       <w:instrText xml:space="preserve"> PAGE </w:instrText>
@@ -2982,9 +3125,10 @@
     </w:r>
     <w:r>
       <w:rPr>
-        <w:rFonts w:ascii="Arial Unicode MS" w:hAnsi="Arial Unicode MS" w:eastAsia="Arial Unicode MS" w:cs="Arial Unicode MS"/>
+        <w:rFonts w:ascii="Hiragino Sans GB" w:hAnsi="Hiragino Sans GB" w:eastAsia="Hiragino Sans GB" w:cs="Hiragino Sans GB"/>
         <w:color w:val="66717C"/>
         <w:sz w:val="17"/>
+        <w:lang w:eastAsia="zh-CN"/>
       </w:rPr>
       <w:t xml:space="preserve"> 页</w:t>
     </w:r>
@@ -2998,7 +3142,12 @@
     <w:pPr>
       <w:pStyle w:val="Footer"/>
     </w:pPr>
-    <w:r/>
+    <w:r>
+      <w:rPr>
+        <w:rFonts w:ascii="Hiragino Sans GB" w:hAnsi="Hiragino Sans GB" w:eastAsia="Hiragino Sans GB" w:cs="Hiragino Sans GB"/>
+        <w:lang w:eastAsia="zh-CN"/>
+      </w:rPr>
+    </w:r>
   </w:p>
 </w:ftr>
 </file>
@@ -3014,17 +3163,19 @@
     </w:pPr>
     <w:r>
       <w:rPr>
-        <w:rFonts w:ascii="Arial Unicode MS" w:hAnsi="Arial Unicode MS" w:eastAsia="Arial Unicode MS" w:cs="Arial Unicode MS"/>
+        <w:rFonts w:ascii="Hiragino Sans GB" w:hAnsi="Hiragino Sans GB" w:eastAsia="Hiragino Sans GB" w:cs="Hiragino Sans GB"/>
         <w:color w:val="66717C"/>
         <w:sz w:val="17"/>
+        <w:lang w:eastAsia="zh-CN"/>
       </w:rPr>
       <w:t xml:space="preserve">第 </w:t>
     </w:r>
     <w:r>
       <w:rPr>
-        <w:rFonts w:ascii="Arial Unicode MS" w:hAnsi="Arial Unicode MS" w:eastAsia="Arial Unicode MS" w:cs="Arial Unicode MS"/>
+        <w:rFonts w:ascii="Hiragino Sans GB" w:hAnsi="Hiragino Sans GB" w:eastAsia="Hiragino Sans GB" w:cs="Hiragino Sans GB"/>
         <w:color w:val="66717C"/>
         <w:sz w:val="17"/>
+        <w:lang w:eastAsia="zh-CN"/>
       </w:rPr>
       <w:fldChar w:fldCharType="begin"/>
       <w:instrText xml:space="preserve"> PAGE </w:instrText>
@@ -3034,9 +3185,10 @@
     </w:r>
     <w:r>
       <w:rPr>
-        <w:rFonts w:ascii="Arial Unicode MS" w:hAnsi="Arial Unicode MS" w:eastAsia="Arial Unicode MS" w:cs="Arial Unicode MS"/>
+        <w:rFonts w:ascii="Hiragino Sans GB" w:hAnsi="Hiragino Sans GB" w:eastAsia="Hiragino Sans GB" w:cs="Hiragino Sans GB"/>
         <w:color w:val="66717C"/>
         <w:sz w:val="17"/>
+        <w:lang w:eastAsia="zh-CN"/>
       </w:rPr>
       <w:t xml:space="preserve"> 页</w:t>
     </w:r>
@@ -3055,17 +3207,19 @@
     </w:pPr>
     <w:r>
       <w:rPr>
-        <w:rFonts w:ascii="Arial Unicode MS" w:hAnsi="Arial Unicode MS" w:eastAsia="Arial Unicode MS" w:cs="Arial Unicode MS"/>
+        <w:rFonts w:ascii="Hiragino Sans GB" w:hAnsi="Hiragino Sans GB" w:eastAsia="Hiragino Sans GB" w:cs="Hiragino Sans GB"/>
         <w:color w:val="66717C"/>
         <w:sz w:val="17"/>
+        <w:lang w:eastAsia="zh-CN"/>
       </w:rPr>
       <w:t xml:space="preserve">第 </w:t>
     </w:r>
     <w:r>
       <w:rPr>
-        <w:rFonts w:ascii="Arial Unicode MS" w:hAnsi="Arial Unicode MS" w:eastAsia="Arial Unicode MS" w:cs="Arial Unicode MS"/>
+        <w:rFonts w:ascii="Hiragino Sans GB" w:hAnsi="Hiragino Sans GB" w:eastAsia="Hiragino Sans GB" w:cs="Hiragino Sans GB"/>
         <w:color w:val="66717C"/>
         <w:sz w:val="17"/>
+        <w:lang w:eastAsia="zh-CN"/>
       </w:rPr>
       <w:fldChar w:fldCharType="begin"/>
       <w:instrText xml:space="preserve"> PAGE </w:instrText>
@@ -3075,9 +3229,10 @@
     </w:r>
     <w:r>
       <w:rPr>
-        <w:rFonts w:ascii="Arial Unicode MS" w:hAnsi="Arial Unicode MS" w:eastAsia="Arial Unicode MS" w:cs="Arial Unicode MS"/>
+        <w:rFonts w:ascii="Hiragino Sans GB" w:hAnsi="Hiragino Sans GB" w:eastAsia="Hiragino Sans GB" w:cs="Hiragino Sans GB"/>
         <w:color w:val="66717C"/>
         <w:sz w:val="17"/>
+        <w:lang w:eastAsia="zh-CN"/>
       </w:rPr>
       <w:t xml:space="preserve"> 页</w:t>
     </w:r>
@@ -3096,17 +3251,19 @@
     </w:pPr>
     <w:r>
       <w:rPr>
-        <w:rFonts w:ascii="Arial Unicode MS" w:hAnsi="Arial Unicode MS" w:eastAsia="Arial Unicode MS" w:cs="Arial Unicode MS"/>
+        <w:rFonts w:ascii="Hiragino Sans GB" w:hAnsi="Hiragino Sans GB" w:eastAsia="Hiragino Sans GB" w:cs="Hiragino Sans GB"/>
         <w:color w:val="66717C"/>
         <w:sz w:val="17"/>
+        <w:lang w:eastAsia="zh-CN"/>
       </w:rPr>
       <w:t xml:space="preserve">第 </w:t>
     </w:r>
     <w:r>
       <w:rPr>
-        <w:rFonts w:ascii="Arial Unicode MS" w:hAnsi="Arial Unicode MS" w:eastAsia="Arial Unicode MS" w:cs="Arial Unicode MS"/>
+        <w:rFonts w:ascii="Hiragino Sans GB" w:hAnsi="Hiragino Sans GB" w:eastAsia="Hiragino Sans GB" w:cs="Hiragino Sans GB"/>
         <w:color w:val="66717C"/>
         <w:sz w:val="17"/>
+        <w:lang w:eastAsia="zh-CN"/>
       </w:rPr>
       <w:fldChar w:fldCharType="begin"/>
       <w:instrText xml:space="preserve"> PAGE </w:instrText>
@@ -3116,9 +3273,10 @@
     </w:r>
     <w:r>
       <w:rPr>
-        <w:rFonts w:ascii="Arial Unicode MS" w:hAnsi="Arial Unicode MS" w:eastAsia="Arial Unicode MS" w:cs="Arial Unicode MS"/>
+        <w:rFonts w:ascii="Hiragino Sans GB" w:hAnsi="Hiragino Sans GB" w:eastAsia="Hiragino Sans GB" w:cs="Hiragino Sans GB"/>
         <w:color w:val="66717C"/>
         <w:sz w:val="17"/>
+        <w:lang w:eastAsia="zh-CN"/>
       </w:rPr>
       <w:t xml:space="preserve"> 页</w:t>
     </w:r>
@@ -3137,17 +3295,19 @@
     </w:pPr>
     <w:r>
       <w:rPr>
-        <w:rFonts w:ascii="Arial Unicode MS" w:hAnsi="Arial Unicode MS" w:eastAsia="Arial Unicode MS" w:cs="Arial Unicode MS"/>
+        <w:rFonts w:ascii="Hiragino Sans GB" w:hAnsi="Hiragino Sans GB" w:eastAsia="Hiragino Sans GB" w:cs="Hiragino Sans GB"/>
         <w:color w:val="66717C"/>
         <w:sz w:val="17"/>
+        <w:lang w:eastAsia="zh-CN"/>
       </w:rPr>
       <w:t xml:space="preserve">第 </w:t>
     </w:r>
     <w:r>
       <w:rPr>
-        <w:rFonts w:ascii="Arial Unicode MS" w:hAnsi="Arial Unicode MS" w:eastAsia="Arial Unicode MS" w:cs="Arial Unicode MS"/>
+        <w:rFonts w:ascii="Hiragino Sans GB" w:hAnsi="Hiragino Sans GB" w:eastAsia="Hiragino Sans GB" w:cs="Hiragino Sans GB"/>
         <w:color w:val="66717C"/>
         <w:sz w:val="17"/>
+        <w:lang w:eastAsia="zh-CN"/>
       </w:rPr>
       <w:fldChar w:fldCharType="begin"/>
       <w:instrText xml:space="preserve"> PAGE </w:instrText>
@@ -3157,12 +3317,23 @@
     </w:r>
     <w:r>
       <w:rPr>
-        <w:rFonts w:ascii="Arial Unicode MS" w:hAnsi="Arial Unicode MS" w:eastAsia="Arial Unicode MS" w:cs="Arial Unicode MS"/>
+        <w:rFonts w:ascii="Hiragino Sans GB" w:hAnsi="Hiragino Sans GB" w:eastAsia="Hiragino Sans GB" w:cs="Hiragino Sans GB"/>
         <w:color w:val="66717C"/>
         <w:sz w:val="17"/>
+        <w:lang w:eastAsia="zh-CN"/>
       </w:rPr>
       <w:t xml:space="preserve"> 页</w:t>
     </w:r>
+  </w:p>
+</w:ftr>
+</file>
+
+<file path=word/footer7.xml><?xml version="1.0" encoding="utf-8"?>
+<w:ftr xmlns:m="http://schemas.openxmlformats.org/officeDocument/2006/math" xmlns:mc="http://schemas.openxmlformats.org/markup-compatibility/2006" xmlns:mo="http://schemas.microsoft.com/office/mac/office/2008/main" xmlns:mv="urn:schemas-microsoft-com:mac:vml" xmlns:o="urn:schemas-microsoft-com:office:office" xmlns:r="http://schemas.openxmlformats.org/officeDocument/2006/relationships" xmlns:v="urn:schemas-microsoft-com:vml" xmlns:w10="urn:schemas-microsoft-com:office:word" xmlns:w14="http://schemas.microsoft.com/office/word/2010/wordml" xmlns:w="http://schemas.openxmlformats.org/wordprocessingml/2006/main" xmlns:wne="http://schemas.microsoft.com/office/word/2006/wordml" xmlns:wp14="http://schemas.microsoft.com/office/word/2010/wordprocessingDrawing" xmlns:wp="http://schemas.openxmlformats.org/drawingml/2006/wordprocessingDrawing" xmlns:wpc="http://schemas.microsoft.com/office/word/2010/wordprocessingCanvas" xmlns:wpg="http://schemas.microsoft.com/office/word/2010/wordprocessingGroup" xmlns:wpi="http://schemas.microsoft.com/office/word/2010/wordprocessingInk" xmlns:wps="http://schemas.microsoft.com/office/word/2010/wordprocessingShape" mc:Ignorable="w14 wp14">
+  <w:p>
+    <w:pPr>
+      <w:pStyle w:val="Footer"/>
+    </w:pPr>
   </w:p>
 </w:ftr>
 </file>
@@ -3178,16 +3349,21 @@
     </w:pPr>
     <w:r>
       <w:rPr>
-        <w:rFonts w:ascii="Arial Unicode MS" w:hAnsi="Arial Unicode MS" w:eastAsia="Arial Unicode MS" w:cs="Arial Unicode MS"/>
+        <w:rFonts w:ascii="Hiragino Sans GB" w:hAnsi="Hiragino Sans GB" w:eastAsia="Hiragino Sans GB" w:cs="Hiragino Sans GB"/>
         <w:b/>
         <w:color w:val="66717C"/>
         <w:sz w:val="17"/>
+        <w:lang w:eastAsia="zh-CN"/>
       </w:rPr>
       <w:t>企业全生命周期助手  ·  Skills 管理器 0.2.0</w:t>
     </w:r>
   </w:p>
   <w:p>
     <w:r>
+      <w:rPr>
+        <w:rFonts w:ascii="Hiragino Sans GB" w:hAnsi="Hiragino Sans GB" w:eastAsia="Hiragino Sans GB" w:cs="Hiragino Sans GB"/>
+        <w:lang w:eastAsia="zh-CN"/>
+      </w:rPr>
       <w:drawing>
         <wp:anchor distT="0" distB="0" distL="0" distR="0" simplePos="0" relativeHeight="251658240" behindDoc="0" locked="0" layoutInCell="1" allowOverlap="1">
           <wp:simplePos x="0" y="0"/>
@@ -3240,10 +3416,19 @@
     <w:pPr>
       <w:pStyle w:val="Header"/>
     </w:pPr>
-    <w:r/>
+    <w:r>
+      <w:rPr>
+        <w:rFonts w:ascii="Hiragino Sans GB" w:hAnsi="Hiragino Sans GB" w:eastAsia="Hiragino Sans GB" w:cs="Hiragino Sans GB"/>
+        <w:lang w:eastAsia="zh-CN"/>
+      </w:rPr>
+    </w:r>
   </w:p>
   <w:p>
     <w:r>
+      <w:rPr>
+        <w:rFonts w:ascii="Hiragino Sans GB" w:hAnsi="Hiragino Sans GB" w:eastAsia="Hiragino Sans GB" w:cs="Hiragino Sans GB"/>
+        <w:lang w:eastAsia="zh-CN"/>
+      </w:rPr>
       <w:drawing>
         <wp:anchor distT="0" distB="0" distL="0" distR="0" simplePos="0" relativeHeight="251658240" behindDoc="0" locked="0" layoutInCell="1" allowOverlap="1">
           <wp:simplePos x="0" y="0"/>
@@ -3301,16 +3486,21 @@
     </w:pPr>
     <w:r>
       <w:rPr>
-        <w:rFonts w:ascii="Arial Unicode MS" w:hAnsi="Arial Unicode MS" w:eastAsia="Arial Unicode MS" w:cs="Arial Unicode MS"/>
+        <w:rFonts w:ascii="Hiragino Sans GB" w:hAnsi="Hiragino Sans GB" w:eastAsia="Hiragino Sans GB" w:cs="Hiragino Sans GB"/>
         <w:b/>
         <w:color w:val="66717C"/>
         <w:sz w:val="17"/>
+        <w:lang w:eastAsia="zh-CN"/>
       </w:rPr>
       <w:t>企业全生命周期助手  ·  Skills 管理器 0.2.0</w:t>
     </w:r>
   </w:p>
   <w:p>
     <w:r>
+      <w:rPr>
+        <w:rFonts w:ascii="Hiragino Sans GB" w:hAnsi="Hiragino Sans GB" w:eastAsia="Hiragino Sans GB" w:cs="Hiragino Sans GB"/>
+        <w:lang w:eastAsia="zh-CN"/>
+      </w:rPr>
       <w:drawing>
         <wp:anchor distT="0" distB="0" distL="0" distR="0" simplePos="0" relativeHeight="251658240" behindDoc="0" locked="0" layoutInCell="1" allowOverlap="1">
           <wp:simplePos x="0" y="0"/>
@@ -3368,16 +3558,21 @@
     </w:pPr>
     <w:r>
       <w:rPr>
-        <w:rFonts w:ascii="Arial Unicode MS" w:hAnsi="Arial Unicode MS" w:eastAsia="Arial Unicode MS" w:cs="Arial Unicode MS"/>
+        <w:rFonts w:ascii="Hiragino Sans GB" w:hAnsi="Hiragino Sans GB" w:eastAsia="Hiragino Sans GB" w:cs="Hiragino Sans GB"/>
         <w:b/>
         <w:color w:val="66717C"/>
         <w:sz w:val="17"/>
+        <w:lang w:eastAsia="zh-CN"/>
       </w:rPr>
       <w:t>企业全生命周期助手  ·  Skills 管理器 0.2.0</w:t>
     </w:r>
   </w:p>
   <w:p>
     <w:r>
+      <w:rPr>
+        <w:rFonts w:ascii="Hiragino Sans GB" w:hAnsi="Hiragino Sans GB" w:eastAsia="Hiragino Sans GB" w:cs="Hiragino Sans GB"/>
+        <w:lang w:eastAsia="zh-CN"/>
+      </w:rPr>
       <w:drawing>
         <wp:anchor distT="0" distB="0" distL="0" distR="0" simplePos="0" relativeHeight="251658240" behindDoc="0" locked="0" layoutInCell="1" allowOverlap="1">
           <wp:simplePos x="0" y="0"/>
@@ -3435,16 +3630,21 @@
     </w:pPr>
     <w:r>
       <w:rPr>
-        <w:rFonts w:ascii="Arial Unicode MS" w:hAnsi="Arial Unicode MS" w:eastAsia="Arial Unicode MS" w:cs="Arial Unicode MS"/>
+        <w:rFonts w:ascii="Hiragino Sans GB" w:hAnsi="Hiragino Sans GB" w:eastAsia="Hiragino Sans GB" w:cs="Hiragino Sans GB"/>
         <w:b/>
         <w:color w:val="66717C"/>
         <w:sz w:val="17"/>
+        <w:lang w:eastAsia="zh-CN"/>
       </w:rPr>
       <w:t>企业全生命周期助手  ·  Skills 管理器 0.2.0</w:t>
     </w:r>
   </w:p>
   <w:p>
     <w:r>
+      <w:rPr>
+        <w:rFonts w:ascii="Hiragino Sans GB" w:hAnsi="Hiragino Sans GB" w:eastAsia="Hiragino Sans GB" w:cs="Hiragino Sans GB"/>
+        <w:lang w:eastAsia="zh-CN"/>
+      </w:rPr>
       <w:drawing>
         <wp:anchor distT="0" distB="0" distL="0" distR="0" simplePos="0" relativeHeight="251658240" behindDoc="0" locked="0" layoutInCell="1" allowOverlap="1">
           <wp:simplePos x="0" y="0"/>
@@ -3502,16 +3702,21 @@
     </w:pPr>
     <w:r>
       <w:rPr>
-        <w:rFonts w:ascii="Arial Unicode MS" w:hAnsi="Arial Unicode MS" w:eastAsia="Arial Unicode MS" w:cs="Arial Unicode MS"/>
+        <w:rFonts w:ascii="Hiragino Sans GB" w:hAnsi="Hiragino Sans GB" w:eastAsia="Hiragino Sans GB" w:cs="Hiragino Sans GB"/>
         <w:b/>
         <w:color w:val="66717C"/>
         <w:sz w:val="17"/>
+        <w:lang w:eastAsia="zh-CN"/>
       </w:rPr>
       <w:t>企业全生命周期助手  ·  Skills 管理器 0.2.0</w:t>
     </w:r>
   </w:p>
   <w:p>
     <w:r>
+      <w:rPr>
+        <w:rFonts w:ascii="Hiragino Sans GB" w:hAnsi="Hiragino Sans GB" w:eastAsia="Hiragino Sans GB" w:cs="Hiragino Sans GB"/>
+        <w:lang w:eastAsia="zh-CN"/>
+      </w:rPr>
       <w:drawing>
         <wp:anchor distT="0" distB="0" distL="0" distR="0" simplePos="0" relativeHeight="251658240" behindDoc="0" locked="0" layoutInCell="1" allowOverlap="1">
           <wp:simplePos x="0" y="0"/>
@@ -3567,6 +3772,10 @@
   </w:p>
   <w:p>
     <w:r>
+      <w:rPr>
+        <w:rFonts w:ascii="Hiragino Sans GB" w:hAnsi="Hiragino Sans GB" w:eastAsia="Hiragino Sans GB" w:cs="Hiragino Sans GB"/>
+        <w:lang w:eastAsia="zh-CN"/>
+      </w:rPr>
       <w:drawing>
         <wp:anchor distT="0" distB="0" distL="0" distR="0" simplePos="0" relativeHeight="251658240" behindDoc="0" locked="0" layoutInCell="1" allowOverlap="1">
           <wp:simplePos x="0" y="0"/>
@@ -4107,10 +4316,11 @@
       <w:spacing w:before="0" w:after="120" w:line="300" w:lineRule="auto"/>
     </w:pPr>
     <w:rPr>
-      <w:rFonts w:ascii="Arial Unicode MS" w:hAnsi="Arial Unicode MS" w:eastAsia="Arial Unicode MS" w:cs="Arial Unicode MS"/>
+      <w:rFonts w:ascii="Hiragino Sans GB" w:hAnsi="Hiragino Sans GB" w:eastAsia="Hiragino Sans GB" w:cs="Hiragino Sans GB"/>
       <w:b w:val="0"/>
       <w:color w:val="17212B"/>
       <w:sz w:val="22"/>
+      <w:lang w:eastAsia="zh-CN"/>
     </w:rPr>
   </w:style>
   <w:style w:type="paragraph" w:styleId="Header">
@@ -4128,7 +4338,8 @@
       <w:spacing w:after="0" w:line="240" w:lineRule="auto"/>
     </w:pPr>
     <w:rPr>
-      <w:rFonts w:eastAsia="Arial Unicode MS"/>
+      <w:rFonts w:eastAsia="Hiragino Sans GB" w:ascii="Hiragino Sans GB" w:hAnsi="Hiragino Sans GB" w:cs="Hiragino Sans GB"/>
+      <w:lang w:eastAsia="zh-CN"/>
     </w:rPr>
   </w:style>
   <w:style w:type="character" w:customStyle="1" w:styleId="HeaderChar">
@@ -4138,7 +4349,8 @@
     <w:uiPriority w:val="99"/>
     <w:rsid w:val="00E618BF"/>
     <w:rPr>
-      <w:rFonts w:eastAsia="Arial Unicode MS"/>
+      <w:rFonts w:eastAsia="Hiragino Sans GB" w:ascii="Hiragino Sans GB" w:hAnsi="Hiragino Sans GB" w:cs="Hiragino Sans GB"/>
+      <w:lang w:eastAsia="zh-CN"/>
     </w:rPr>
   </w:style>
   <w:style w:type="paragraph" w:styleId="Footer">
@@ -4156,7 +4368,8 @@
       <w:spacing w:after="0" w:line="240" w:lineRule="auto"/>
     </w:pPr>
     <w:rPr>
-      <w:rFonts w:eastAsia="Arial Unicode MS"/>
+      <w:rFonts w:eastAsia="Hiragino Sans GB" w:ascii="Hiragino Sans GB" w:hAnsi="Hiragino Sans GB" w:cs="Hiragino Sans GB"/>
+      <w:lang w:eastAsia="zh-CN"/>
     </w:rPr>
   </w:style>
   <w:style w:type="character" w:customStyle="1" w:styleId="FooterChar">
@@ -4166,7 +4379,8 @@
     <w:uiPriority w:val="99"/>
     <w:rsid w:val="00E618BF"/>
     <w:rPr>
-      <w:rFonts w:eastAsia="Arial Unicode MS"/>
+      <w:rFonts w:eastAsia="Hiragino Sans GB" w:ascii="Hiragino Sans GB" w:hAnsi="Hiragino Sans GB" w:cs="Hiragino Sans GB"/>
+      <w:lang w:eastAsia="zh-CN"/>
     </w:rPr>
   </w:style>
   <w:style w:type="paragraph" w:styleId="Heading1">
@@ -4184,12 +4398,13 @@
       <w:outlineLvl w:val="0"/>
     </w:pPr>
     <w:rPr>
-      <w:rFonts w:asciiTheme="majorHAnsi" w:eastAsiaTheme="majorEastAsia" w:hAnsiTheme="majorHAnsi" w:cstheme="majorBidi" w:ascii="Arial Unicode MS" w:hAnsi="Arial Unicode MS" w:eastAsia="Arial Unicode MS" w:cs="Arial Unicode MS"/>
+      <w:rFonts w:ascii="Hiragino Sans GB" w:hAnsi="Hiragino Sans GB" w:eastAsia="Hiragino Sans GB" w:cs="Hiragino Sans GB"/>
       <w:b/>
       <w:bCs/>
       <w:color w:val="2E74B5"/>
       <w:sz w:val="32"/>
       <w:szCs w:val="28"/>
+      <w:lang w:eastAsia="zh-CN"/>
     </w:rPr>
   </w:style>
   <w:style w:type="paragraph" w:styleId="Heading2">
@@ -4208,12 +4423,13 @@
       <w:outlineLvl w:val="1"/>
     </w:pPr>
     <w:rPr>
-      <w:rFonts w:asciiTheme="majorHAnsi" w:eastAsiaTheme="majorEastAsia" w:hAnsiTheme="majorHAnsi" w:cstheme="majorBidi" w:ascii="Arial Unicode MS" w:hAnsi="Arial Unicode MS" w:eastAsia="Arial Unicode MS" w:cs="Arial Unicode MS"/>
+      <w:rFonts w:ascii="Hiragino Sans GB" w:hAnsi="Hiragino Sans GB" w:eastAsia="Hiragino Sans GB" w:cs="Hiragino Sans GB"/>
       <w:b/>
       <w:bCs/>
       <w:color w:val="2E74B5"/>
       <w:sz w:val="26"/>
       <w:szCs w:val="26"/>
+      <w:lang w:eastAsia="zh-CN"/>
     </w:rPr>
   </w:style>
   <w:style w:type="paragraph" w:styleId="Heading3">
@@ -4232,11 +4448,12 @@
       <w:outlineLvl w:val="2"/>
     </w:pPr>
     <w:rPr>
-      <w:rFonts w:asciiTheme="majorHAnsi" w:eastAsiaTheme="majorEastAsia" w:hAnsiTheme="majorHAnsi" w:cstheme="majorBidi" w:ascii="Arial Unicode MS" w:hAnsi="Arial Unicode MS" w:eastAsia="Arial Unicode MS" w:cs="Arial Unicode MS"/>
+      <w:rFonts w:ascii="Hiragino Sans GB" w:hAnsi="Hiragino Sans GB" w:eastAsia="Hiragino Sans GB" w:cs="Hiragino Sans GB"/>
       <w:b/>
       <w:bCs/>
       <w:color w:val="1F4D78"/>
       <w:sz w:val="24"/>
+      <w:lang w:eastAsia="zh-CN"/>
     </w:rPr>
   </w:style>
   <w:style w:type="paragraph" w:styleId="Heading4">
@@ -4256,12 +4473,13 @@
       <w:outlineLvl w:val="3"/>
     </w:pPr>
     <w:rPr>
-      <w:rFonts w:asciiTheme="majorHAnsi" w:eastAsiaTheme="majorEastAsia" w:hAnsiTheme="majorHAnsi" w:cstheme="majorBidi" w:eastAsia="Arial Unicode MS"/>
+      <w:rFonts w:eastAsia="Hiragino Sans GB" w:ascii="Hiragino Sans GB" w:hAnsi="Hiragino Sans GB" w:cs="Hiragino Sans GB"/>
       <w:b/>
       <w:bCs/>
       <w:i/>
       <w:iCs/>
       <w:color w:val="4F81BD" w:themeColor="accent1"/>
+      <w:lang w:eastAsia="zh-CN"/>
     </w:rPr>
   </w:style>
   <w:style w:type="paragraph" w:styleId="Heading5">
@@ -4281,8 +4499,9 @@
       <w:outlineLvl w:val="4"/>
     </w:pPr>
     <w:rPr>
-      <w:rFonts w:asciiTheme="majorHAnsi" w:eastAsiaTheme="majorEastAsia" w:hAnsiTheme="majorHAnsi" w:cstheme="majorBidi" w:eastAsia="Arial Unicode MS"/>
+      <w:rFonts w:eastAsia="Hiragino Sans GB" w:ascii="Hiragino Sans GB" w:hAnsi="Hiragino Sans GB" w:cs="Hiragino Sans GB"/>
       <w:color w:val="243F60" w:themeColor="accent1" w:themeShade="7F"/>
+      <w:lang w:eastAsia="zh-CN"/>
     </w:rPr>
   </w:style>
   <w:style w:type="paragraph" w:styleId="Heading6">
@@ -4302,10 +4521,11 @@
       <w:outlineLvl w:val="5"/>
     </w:pPr>
     <w:rPr>
-      <w:rFonts w:asciiTheme="majorHAnsi" w:eastAsiaTheme="majorEastAsia" w:hAnsiTheme="majorHAnsi" w:cstheme="majorBidi" w:eastAsia="Arial Unicode MS"/>
+      <w:rFonts w:eastAsia="Hiragino Sans GB" w:ascii="Hiragino Sans GB" w:hAnsi="Hiragino Sans GB" w:cs="Hiragino Sans GB"/>
       <w:i/>
       <w:iCs/>
       <w:color w:val="243F60" w:themeColor="accent1" w:themeShade="7F"/>
+      <w:lang w:eastAsia="zh-CN"/>
     </w:rPr>
   </w:style>
   <w:style w:type="paragraph" w:styleId="Heading7">
@@ -4325,10 +4545,11 @@
       <w:outlineLvl w:val="6"/>
     </w:pPr>
     <w:rPr>
-      <w:rFonts w:asciiTheme="majorHAnsi" w:eastAsiaTheme="majorEastAsia" w:hAnsiTheme="majorHAnsi" w:cstheme="majorBidi" w:eastAsia="Arial Unicode MS"/>
+      <w:rFonts w:eastAsia="Hiragino Sans GB" w:ascii="Hiragino Sans GB" w:hAnsi="Hiragino Sans GB" w:cs="Hiragino Sans GB"/>
       <w:i/>
       <w:iCs/>
       <w:color w:val="404040" w:themeColor="text1" w:themeTint="BF"/>
+      <w:lang w:eastAsia="zh-CN"/>
     </w:rPr>
   </w:style>
   <w:style w:type="paragraph" w:styleId="Heading8">
@@ -4348,10 +4569,11 @@
       <w:outlineLvl w:val="7"/>
     </w:pPr>
     <w:rPr>
-      <w:rFonts w:asciiTheme="majorHAnsi" w:eastAsiaTheme="majorEastAsia" w:hAnsiTheme="majorHAnsi" w:cstheme="majorBidi" w:eastAsia="Arial Unicode MS"/>
+      <w:rFonts w:eastAsia="Hiragino Sans GB" w:ascii="Hiragino Sans GB" w:hAnsi="Hiragino Sans GB" w:cs="Hiragino Sans GB"/>
       <w:color w:val="4F81BD" w:themeColor="accent1"/>
       <w:sz w:val="20"/>
       <w:szCs w:val="20"/>
+      <w:lang w:eastAsia="zh-CN"/>
     </w:rPr>
   </w:style>
   <w:style w:type="paragraph" w:styleId="Heading9">
@@ -4371,12 +4593,13 @@
       <w:outlineLvl w:val="8"/>
     </w:pPr>
     <w:rPr>
-      <w:rFonts w:asciiTheme="majorHAnsi" w:eastAsiaTheme="majorEastAsia" w:hAnsiTheme="majorHAnsi" w:cstheme="majorBidi" w:eastAsia="Arial Unicode MS"/>
+      <w:rFonts w:eastAsia="Hiragino Sans GB" w:ascii="Hiragino Sans GB" w:hAnsi="Hiragino Sans GB" w:cs="Hiragino Sans GB"/>
       <w:i/>
       <w:iCs/>
       <w:color w:val="404040" w:themeColor="text1" w:themeTint="BF"/>
       <w:sz w:val="20"/>
       <w:szCs w:val="20"/>
+      <w:lang w:eastAsia="zh-CN"/>
     </w:rPr>
   </w:style>
   <w:style w:type="character" w:default="1" w:styleId="DefaultParagraphFont">
@@ -4385,7 +4608,8 @@
     <w:semiHidden/>
     <w:unhideWhenUsed/>
     <w:rPr>
-      <w:rFonts w:eastAsia="Arial Unicode MS"/>
+      <w:rFonts w:eastAsia="Hiragino Sans GB" w:ascii="Hiragino Sans GB" w:hAnsi="Hiragino Sans GB" w:cs="Hiragino Sans GB"/>
+      <w:lang w:eastAsia="zh-CN"/>
     </w:rPr>
   </w:style>
   <w:style w:type="table" w:default="1" w:styleId="TableNormal">
@@ -4394,7 +4618,8 @@
     <w:semiHidden/>
     <w:unhideWhenUsed/>
     <w:rPr>
-      <w:rFonts w:eastAsia="Arial Unicode MS"/>
+      <w:rFonts w:eastAsia="Hiragino Sans GB" w:ascii="Hiragino Sans GB" w:hAnsi="Hiragino Sans GB" w:cs="Hiragino Sans GB"/>
+      <w:lang w:eastAsia="zh-CN"/>
     </w:rPr>
     <w:tblPr>
       <w:tblInd w:w="0" w:type="dxa"/>
@@ -4412,7 +4637,8 @@
     <w:semiHidden/>
     <w:unhideWhenUsed/>
     <w:rPr>
-      <w:rFonts w:eastAsia="Arial Unicode MS"/>
+      <w:rFonts w:eastAsia="Hiragino Sans GB" w:ascii="Hiragino Sans GB" w:hAnsi="Hiragino Sans GB" w:cs="Hiragino Sans GB"/>
+      <w:lang w:eastAsia="zh-CN"/>
     </w:rPr>
   </w:style>
   <w:style w:type="paragraph" w:styleId="NoSpacing">
@@ -4424,7 +4650,8 @@
       <w:spacing w:after="0" w:line="240" w:lineRule="auto"/>
     </w:pPr>
     <w:rPr>
-      <w:rFonts w:eastAsia="Arial Unicode MS"/>
+      <w:rFonts w:eastAsia="Hiragino Sans GB" w:ascii="Hiragino Sans GB" w:hAnsi="Hiragino Sans GB" w:cs="Hiragino Sans GB"/>
+      <w:lang w:eastAsia="zh-CN"/>
     </w:rPr>
   </w:style>
   <w:style w:type="character" w:customStyle="1" w:styleId="Heading1Char">
@@ -4434,12 +4661,13 @@
     <w:uiPriority w:val="9"/>
     <w:rsid w:val="00FC693F"/>
     <w:rPr>
-      <w:rFonts w:asciiTheme="majorHAnsi" w:eastAsiaTheme="majorEastAsia" w:hAnsiTheme="majorHAnsi" w:cstheme="majorBidi" w:eastAsia="Arial Unicode MS"/>
+      <w:rFonts w:eastAsia="Hiragino Sans GB" w:ascii="Hiragino Sans GB" w:hAnsi="Hiragino Sans GB" w:cs="Hiragino Sans GB"/>
       <w:b/>
       <w:bCs/>
       <w:color w:val="365F91" w:themeColor="accent1" w:themeShade="BF"/>
       <w:sz w:val="28"/>
       <w:szCs w:val="28"/>
+      <w:lang w:eastAsia="zh-CN"/>
     </w:rPr>
   </w:style>
   <w:style w:type="character" w:customStyle="1" w:styleId="Heading2Char">
@@ -4449,12 +4677,13 @@
     <w:uiPriority w:val="9"/>
     <w:rsid w:val="00FC693F"/>
     <w:rPr>
-      <w:rFonts w:asciiTheme="majorHAnsi" w:eastAsiaTheme="majorEastAsia" w:hAnsiTheme="majorHAnsi" w:cstheme="majorBidi" w:eastAsia="Arial Unicode MS"/>
+      <w:rFonts w:eastAsia="Hiragino Sans GB" w:ascii="Hiragino Sans GB" w:hAnsi="Hiragino Sans GB" w:cs="Hiragino Sans GB"/>
       <w:b/>
       <w:bCs/>
       <w:color w:val="4F81BD" w:themeColor="accent1"/>
       <w:sz w:val="26"/>
       <w:szCs w:val="26"/>
+      <w:lang w:eastAsia="zh-CN"/>
     </w:rPr>
   </w:style>
   <w:style w:type="character" w:customStyle="1" w:styleId="Heading3Char">
@@ -4464,10 +4693,11 @@
     <w:uiPriority w:val="9"/>
     <w:rsid w:val="00FC693F"/>
     <w:rPr>
-      <w:rFonts w:asciiTheme="majorHAnsi" w:eastAsiaTheme="majorEastAsia" w:hAnsiTheme="majorHAnsi" w:cstheme="majorBidi" w:eastAsia="Arial Unicode MS"/>
+      <w:rFonts w:eastAsia="Hiragino Sans GB" w:ascii="Hiragino Sans GB" w:hAnsi="Hiragino Sans GB" w:cs="Hiragino Sans GB"/>
       <w:b/>
       <w:bCs/>
       <w:color w:val="4F81BD" w:themeColor="accent1"/>
+      <w:lang w:eastAsia="zh-CN"/>
     </w:rPr>
   </w:style>
   <w:style w:type="paragraph" w:styleId="Title">
@@ -4486,12 +4716,13 @@
       <w:contextualSpacing/>
     </w:pPr>
     <w:rPr>
-      <w:rFonts w:asciiTheme="majorHAnsi" w:eastAsiaTheme="majorEastAsia" w:hAnsiTheme="majorHAnsi" w:cstheme="majorBidi" w:eastAsia="Arial Unicode MS"/>
+      <w:rFonts w:eastAsia="Hiragino Sans GB" w:ascii="Hiragino Sans GB" w:hAnsi="Hiragino Sans GB" w:cs="Hiragino Sans GB"/>
       <w:color w:val="17365D" w:themeColor="text2" w:themeShade="BF"/>
       <w:spacing w:val="5"/>
       <w:kern w:val="28"/>
       <w:sz w:val="52"/>
       <w:szCs w:val="52"/>
+      <w:lang w:eastAsia="zh-CN"/>
     </w:rPr>
   </w:style>
   <w:style w:type="character" w:customStyle="1" w:styleId="TitleChar">
@@ -4501,12 +4732,13 @@
     <w:uiPriority w:val="10"/>
     <w:rsid w:val="00FC693F"/>
     <w:rPr>
-      <w:rFonts w:asciiTheme="majorHAnsi" w:eastAsiaTheme="majorEastAsia" w:hAnsiTheme="majorHAnsi" w:cstheme="majorBidi" w:eastAsia="Arial Unicode MS"/>
+      <w:rFonts w:eastAsia="Hiragino Sans GB" w:ascii="Hiragino Sans GB" w:hAnsi="Hiragino Sans GB" w:cs="Hiragino Sans GB"/>
       <w:color w:val="17365D" w:themeColor="text2" w:themeShade="BF"/>
       <w:spacing w:val="5"/>
       <w:kern w:val="28"/>
       <w:sz w:val="52"/>
       <w:szCs w:val="52"/>
+      <w:lang w:eastAsia="zh-CN"/>
     </w:rPr>
   </w:style>
   <w:style w:type="paragraph" w:styleId="Subtitle">
@@ -4523,13 +4755,14 @@
       </w:numPr>
     </w:pPr>
     <w:rPr>
-      <w:rFonts w:asciiTheme="majorHAnsi" w:eastAsiaTheme="majorEastAsia" w:hAnsiTheme="majorHAnsi" w:cstheme="majorBidi" w:eastAsia="Arial Unicode MS"/>
+      <w:rFonts w:eastAsia="Hiragino Sans GB" w:ascii="Hiragino Sans GB" w:hAnsi="Hiragino Sans GB" w:cs="Hiragino Sans GB"/>
       <w:i/>
       <w:iCs/>
       <w:color w:val="4F81BD" w:themeColor="accent1"/>
       <w:spacing w:val="15"/>
       <w:sz w:val="24"/>
       <w:szCs w:val="24"/>
+      <w:lang w:eastAsia="zh-CN"/>
     </w:rPr>
   </w:style>
   <w:style w:type="character" w:customStyle="1" w:styleId="SubtitleChar">
@@ -4539,13 +4772,14 @@
     <w:uiPriority w:val="11"/>
     <w:rsid w:val="00FC693F"/>
     <w:rPr>
-      <w:rFonts w:asciiTheme="majorHAnsi" w:eastAsiaTheme="majorEastAsia" w:hAnsiTheme="majorHAnsi" w:cstheme="majorBidi" w:eastAsia="Arial Unicode MS"/>
+      <w:rFonts w:eastAsia="Hiragino Sans GB" w:ascii="Hiragino Sans GB" w:hAnsi="Hiragino Sans GB" w:cs="Hiragino Sans GB"/>
       <w:i/>
       <w:iCs/>
       <w:color w:val="4F81BD" w:themeColor="accent1"/>
       <w:spacing w:val="15"/>
       <w:sz w:val="24"/>
       <w:szCs w:val="24"/>
+      <w:lang w:eastAsia="zh-CN"/>
     </w:rPr>
   </w:style>
   <w:style w:type="paragraph" w:styleId="ListParagraph">
@@ -4559,7 +4793,8 @@
       <w:contextualSpacing/>
     </w:pPr>
     <w:rPr>
-      <w:rFonts w:eastAsia="Arial Unicode MS"/>
+      <w:rFonts w:eastAsia="Hiragino Sans GB" w:ascii="Hiragino Sans GB" w:hAnsi="Hiragino Sans GB" w:cs="Hiragino Sans GB"/>
+      <w:lang w:eastAsia="zh-CN"/>
     </w:rPr>
   </w:style>
   <w:style w:type="paragraph" w:styleId="BodyText">
@@ -4573,7 +4808,8 @@
       <w:spacing w:after="120"/>
     </w:pPr>
     <w:rPr>
-      <w:rFonts w:eastAsia="Arial Unicode MS"/>
+      <w:rFonts w:eastAsia="Hiragino Sans GB" w:ascii="Hiragino Sans GB" w:hAnsi="Hiragino Sans GB" w:cs="Hiragino Sans GB"/>
+      <w:lang w:eastAsia="zh-CN"/>
     </w:rPr>
   </w:style>
   <w:style w:type="character" w:customStyle="1" w:styleId="BodyTextChar">
@@ -4583,7 +4819,8 @@
     <w:uiPriority w:val="99"/>
     <w:rsid w:val="00AA1D8D"/>
     <w:rPr>
-      <w:rFonts w:eastAsia="Arial Unicode MS"/>
+      <w:rFonts w:eastAsia="Hiragino Sans GB" w:ascii="Hiragino Sans GB" w:hAnsi="Hiragino Sans GB" w:cs="Hiragino Sans GB"/>
+      <w:lang w:eastAsia="zh-CN"/>
     </w:rPr>
   </w:style>
   <w:style w:type="paragraph" w:styleId="BodyText2">
@@ -4597,7 +4834,8 @@
       <w:spacing w:after="120" w:line="480" w:lineRule="auto"/>
     </w:pPr>
     <w:rPr>
-      <w:rFonts w:eastAsia="Arial Unicode MS"/>
+      <w:rFonts w:eastAsia="Hiragino Sans GB" w:ascii="Hiragino Sans GB" w:hAnsi="Hiragino Sans GB" w:cs="Hiragino Sans GB"/>
+      <w:lang w:eastAsia="zh-CN"/>
     </w:rPr>
   </w:style>
   <w:style w:type="character" w:customStyle="1" w:styleId="BodyText2Char">
@@ -4607,7 +4845,8 @@
     <w:uiPriority w:val="99"/>
     <w:rsid w:val="00AA1D8D"/>
     <w:rPr>
-      <w:rFonts w:eastAsia="Arial Unicode MS"/>
+      <w:rFonts w:eastAsia="Hiragino Sans GB" w:ascii="Hiragino Sans GB" w:hAnsi="Hiragino Sans GB" w:cs="Hiragino Sans GB"/>
+      <w:lang w:eastAsia="zh-CN"/>
     </w:rPr>
   </w:style>
   <w:style w:type="paragraph" w:styleId="BodyText3">
@@ -4621,9 +4860,10 @@
       <w:spacing w:after="120"/>
     </w:pPr>
     <w:rPr>
-      <w:rFonts w:eastAsia="Arial Unicode MS"/>
+      <w:rFonts w:eastAsia="Hiragino Sans GB" w:ascii="Hiragino Sans GB" w:hAnsi="Hiragino Sans GB" w:cs="Hiragino Sans GB"/>
       <w:sz w:val="16"/>
       <w:szCs w:val="16"/>
+      <w:lang w:eastAsia="zh-CN"/>
     </w:rPr>
   </w:style>
   <w:style w:type="character" w:customStyle="1" w:styleId="BodyText3Char">
@@ -4633,9 +4873,10 @@
     <w:uiPriority w:val="99"/>
     <w:rsid w:val="00AA1D8D"/>
     <w:rPr>
-      <w:rFonts w:eastAsia="Arial Unicode MS"/>
+      <w:rFonts w:eastAsia="Hiragino Sans GB" w:ascii="Hiragino Sans GB" w:hAnsi="Hiragino Sans GB" w:cs="Hiragino Sans GB"/>
       <w:sz w:val="16"/>
       <w:szCs w:val="16"/>
+      <w:lang w:eastAsia="zh-CN"/>
     </w:rPr>
   </w:style>
   <w:style w:type="paragraph" w:styleId="List">
@@ -4649,7 +4890,8 @@
       <w:contextualSpacing/>
     </w:pPr>
     <w:rPr>
-      <w:rFonts w:eastAsia="Arial Unicode MS"/>
+      <w:rFonts w:eastAsia="Hiragino Sans GB" w:ascii="Hiragino Sans GB" w:hAnsi="Hiragino Sans GB" w:cs="Hiragino Sans GB"/>
+      <w:lang w:eastAsia="zh-CN"/>
     </w:rPr>
   </w:style>
   <w:style w:type="paragraph" w:styleId="List2">
@@ -4663,7 +4905,8 @@
       <w:contextualSpacing/>
     </w:pPr>
     <w:rPr>
-      <w:rFonts w:eastAsia="Arial Unicode MS"/>
+      <w:rFonts w:eastAsia="Hiragino Sans GB" w:ascii="Hiragino Sans GB" w:hAnsi="Hiragino Sans GB" w:cs="Hiragino Sans GB"/>
+      <w:lang w:eastAsia="zh-CN"/>
     </w:rPr>
   </w:style>
   <w:style w:type="paragraph" w:styleId="List3">
@@ -4677,7 +4920,8 @@
       <w:contextualSpacing/>
     </w:pPr>
     <w:rPr>
-      <w:rFonts w:eastAsia="Arial Unicode MS"/>
+      <w:rFonts w:eastAsia="Hiragino Sans GB" w:ascii="Hiragino Sans GB" w:hAnsi="Hiragino Sans GB" w:cs="Hiragino Sans GB"/>
+      <w:lang w:eastAsia="zh-CN"/>
     </w:rPr>
   </w:style>
   <w:style w:type="paragraph" w:styleId="ListBullet">
@@ -4693,7 +4937,8 @@
       <w:contextualSpacing/>
     </w:pPr>
     <w:rPr>
-      <w:rFonts w:eastAsia="Arial Unicode MS"/>
+      <w:rFonts w:eastAsia="Hiragino Sans GB" w:ascii="Hiragino Sans GB" w:hAnsi="Hiragino Sans GB" w:cs="Hiragino Sans GB"/>
+      <w:lang w:eastAsia="zh-CN"/>
     </w:rPr>
   </w:style>
   <w:style w:type="paragraph" w:styleId="ListBullet2">
@@ -4709,7 +4954,8 @@
       <w:contextualSpacing/>
     </w:pPr>
     <w:rPr>
-      <w:rFonts w:eastAsia="Arial Unicode MS"/>
+      <w:rFonts w:eastAsia="Hiragino Sans GB" w:ascii="Hiragino Sans GB" w:hAnsi="Hiragino Sans GB" w:cs="Hiragino Sans GB"/>
+      <w:lang w:eastAsia="zh-CN"/>
     </w:rPr>
   </w:style>
   <w:style w:type="paragraph" w:styleId="ListBullet3">
@@ -4725,7 +4971,8 @@
       <w:contextualSpacing/>
     </w:pPr>
     <w:rPr>
-      <w:rFonts w:eastAsia="Arial Unicode MS"/>
+      <w:rFonts w:eastAsia="Hiragino Sans GB" w:ascii="Hiragino Sans GB" w:hAnsi="Hiragino Sans GB" w:cs="Hiragino Sans GB"/>
+      <w:lang w:eastAsia="zh-CN"/>
     </w:rPr>
   </w:style>
   <w:style w:type="paragraph" w:styleId="ListNumber">
@@ -4741,7 +4988,8 @@
       <w:contextualSpacing/>
     </w:pPr>
     <w:rPr>
-      <w:rFonts w:eastAsia="Arial Unicode MS"/>
+      <w:rFonts w:eastAsia="Hiragino Sans GB" w:ascii="Hiragino Sans GB" w:hAnsi="Hiragino Sans GB" w:cs="Hiragino Sans GB"/>
+      <w:lang w:eastAsia="zh-CN"/>
     </w:rPr>
   </w:style>
   <w:style w:type="paragraph" w:styleId="ListNumber2">
@@ -4757,7 +5005,8 @@
       <w:contextualSpacing/>
     </w:pPr>
     <w:rPr>
-      <w:rFonts w:eastAsia="Arial Unicode MS"/>
+      <w:rFonts w:eastAsia="Hiragino Sans GB" w:ascii="Hiragino Sans GB" w:hAnsi="Hiragino Sans GB" w:cs="Hiragino Sans GB"/>
+      <w:lang w:eastAsia="zh-CN"/>
     </w:rPr>
   </w:style>
   <w:style w:type="paragraph" w:styleId="ListNumber3">
@@ -4773,7 +5022,8 @@
       <w:contextualSpacing/>
     </w:pPr>
     <w:rPr>
-      <w:rFonts w:eastAsia="Arial Unicode MS"/>
+      <w:rFonts w:eastAsia="Hiragino Sans GB" w:ascii="Hiragino Sans GB" w:hAnsi="Hiragino Sans GB" w:cs="Hiragino Sans GB"/>
+      <w:lang w:eastAsia="zh-CN"/>
     </w:rPr>
   </w:style>
   <w:style w:type="paragraph" w:styleId="ListContinue">
@@ -4788,7 +5038,8 @@
       <w:contextualSpacing/>
     </w:pPr>
     <w:rPr>
-      <w:rFonts w:eastAsia="Arial Unicode MS"/>
+      <w:rFonts w:eastAsia="Hiragino Sans GB" w:ascii="Hiragino Sans GB" w:hAnsi="Hiragino Sans GB" w:cs="Hiragino Sans GB"/>
+      <w:lang w:eastAsia="zh-CN"/>
     </w:rPr>
   </w:style>
   <w:style w:type="paragraph" w:styleId="ListContinue2">
@@ -4803,7 +5054,8 @@
       <w:contextualSpacing/>
     </w:pPr>
     <w:rPr>
-      <w:rFonts w:eastAsia="Arial Unicode MS"/>
+      <w:rFonts w:eastAsia="Hiragino Sans GB" w:ascii="Hiragino Sans GB" w:hAnsi="Hiragino Sans GB" w:cs="Hiragino Sans GB"/>
+      <w:lang w:eastAsia="zh-CN"/>
     </w:rPr>
   </w:style>
   <w:style w:type="paragraph" w:styleId="ListContinue3">
@@ -4818,7 +5070,8 @@
       <w:contextualSpacing/>
     </w:pPr>
     <w:rPr>
-      <w:rFonts w:eastAsia="Arial Unicode MS"/>
+      <w:rFonts w:eastAsia="Hiragino Sans GB" w:ascii="Hiragino Sans GB" w:hAnsi="Hiragino Sans GB" w:cs="Hiragino Sans GB"/>
+      <w:lang w:eastAsia="zh-CN"/>
     </w:rPr>
   </w:style>
   <w:style w:type="paragraph" w:styleId="MacroText">
@@ -4839,9 +5092,10 @@
       </w:tabs>
     </w:pPr>
     <w:rPr>
-      <w:rFonts w:ascii="Courier" w:hAnsi="Courier" w:eastAsia="Arial Unicode MS"/>
+      <w:rFonts w:ascii="Hiragino Sans GB" w:hAnsi="Hiragino Sans GB" w:eastAsia="Hiragino Sans GB" w:cs="Hiragino Sans GB"/>
       <w:sz w:val="20"/>
       <w:szCs w:val="20"/>
+      <w:lang w:eastAsia="zh-CN"/>
     </w:rPr>
   </w:style>
   <w:style w:type="character" w:customStyle="1" w:styleId="MacroTextChar">
@@ -4851,9 +5105,10 @@
     <w:uiPriority w:val="99"/>
     <w:rsid w:val="0029639D"/>
     <w:rPr>
-      <w:rFonts w:ascii="Courier" w:hAnsi="Courier" w:eastAsia="Arial Unicode MS"/>
+      <w:rFonts w:ascii="Hiragino Sans GB" w:hAnsi="Hiragino Sans GB" w:eastAsia="Hiragino Sans GB" w:cs="Hiragino Sans GB"/>
       <w:sz w:val="20"/>
       <w:szCs w:val="20"/>
+      <w:lang w:eastAsia="zh-CN"/>
     </w:rPr>
   </w:style>
   <w:style w:type="paragraph" w:styleId="Quote">
@@ -4865,10 +5120,11 @@
     <w:qFormat/>
     <w:rsid w:val="00FC693F"/>
     <w:rPr>
-      <w:rFonts w:eastAsia="Arial Unicode MS"/>
+      <w:rFonts w:eastAsia="Hiragino Sans GB" w:ascii="Hiragino Sans GB" w:hAnsi="Hiragino Sans GB" w:cs="Hiragino Sans GB"/>
       <w:i/>
       <w:iCs/>
       <w:color w:val="000000" w:themeColor="text1"/>
+      <w:lang w:eastAsia="zh-CN"/>
     </w:rPr>
   </w:style>
   <w:style w:type="character" w:customStyle="1" w:styleId="QuoteChar">
@@ -4878,10 +5134,11 @@
     <w:uiPriority w:val="29"/>
     <w:rsid w:val="00FC693F"/>
     <w:rPr>
-      <w:rFonts w:eastAsia="Arial Unicode MS"/>
+      <w:rFonts w:eastAsia="Hiragino Sans GB" w:ascii="Hiragino Sans GB" w:hAnsi="Hiragino Sans GB" w:cs="Hiragino Sans GB"/>
       <w:i/>
       <w:iCs/>
       <w:color w:val="000000" w:themeColor="text1"/>
+      <w:lang w:eastAsia="zh-CN"/>
     </w:rPr>
   </w:style>
   <w:style w:type="character" w:customStyle="1" w:styleId="Heading4Char">
@@ -4892,12 +5149,13 @@
     <w:semiHidden/>
     <w:rsid w:val="00FC693F"/>
     <w:rPr>
-      <w:rFonts w:asciiTheme="majorHAnsi" w:eastAsiaTheme="majorEastAsia" w:hAnsiTheme="majorHAnsi" w:cstheme="majorBidi" w:eastAsia="Arial Unicode MS"/>
+      <w:rFonts w:eastAsia="Hiragino Sans GB" w:ascii="Hiragino Sans GB" w:hAnsi="Hiragino Sans GB" w:cs="Hiragino Sans GB"/>
       <w:b/>
       <w:bCs/>
       <w:i/>
       <w:iCs/>
       <w:color w:val="4F81BD" w:themeColor="accent1"/>
+      <w:lang w:eastAsia="zh-CN"/>
     </w:rPr>
   </w:style>
   <w:style w:type="character" w:customStyle="1" w:styleId="Heading5Char">
@@ -4908,8 +5166,9 @@
     <w:semiHidden/>
     <w:rsid w:val="00FC693F"/>
     <w:rPr>
-      <w:rFonts w:asciiTheme="majorHAnsi" w:eastAsiaTheme="majorEastAsia" w:hAnsiTheme="majorHAnsi" w:cstheme="majorBidi" w:eastAsia="Arial Unicode MS"/>
+      <w:rFonts w:eastAsia="Hiragino Sans GB" w:ascii="Hiragino Sans GB" w:hAnsi="Hiragino Sans GB" w:cs="Hiragino Sans GB"/>
       <w:color w:val="243F60" w:themeColor="accent1" w:themeShade="7F"/>
+      <w:lang w:eastAsia="zh-CN"/>
     </w:rPr>
   </w:style>
   <w:style w:type="character" w:customStyle="1" w:styleId="Heading6Char">
@@ -4920,10 +5179,11 @@
     <w:semiHidden/>
     <w:rsid w:val="00FC693F"/>
     <w:rPr>
-      <w:rFonts w:asciiTheme="majorHAnsi" w:eastAsiaTheme="majorEastAsia" w:hAnsiTheme="majorHAnsi" w:cstheme="majorBidi" w:eastAsia="Arial Unicode MS"/>
+      <w:rFonts w:eastAsia="Hiragino Sans GB" w:ascii="Hiragino Sans GB" w:hAnsi="Hiragino Sans GB" w:cs="Hiragino Sans GB"/>
       <w:i/>
       <w:iCs/>
       <w:color w:val="243F60" w:themeColor="accent1" w:themeShade="7F"/>
+      <w:lang w:eastAsia="zh-CN"/>
     </w:rPr>
   </w:style>
   <w:style w:type="character" w:customStyle="1" w:styleId="Heading7Char">
@@ -4934,10 +5194,11 @@
     <w:semiHidden/>
     <w:rsid w:val="00FC693F"/>
     <w:rPr>
-      <w:rFonts w:asciiTheme="majorHAnsi" w:eastAsiaTheme="majorEastAsia" w:hAnsiTheme="majorHAnsi" w:cstheme="majorBidi" w:eastAsia="Arial Unicode MS"/>
+      <w:rFonts w:eastAsia="Hiragino Sans GB" w:ascii="Hiragino Sans GB" w:hAnsi="Hiragino Sans GB" w:cs="Hiragino Sans GB"/>
       <w:i/>
       <w:iCs/>
       <w:color w:val="404040" w:themeColor="text1" w:themeTint="BF"/>
+      <w:lang w:eastAsia="zh-CN"/>
     </w:rPr>
   </w:style>
   <w:style w:type="character" w:customStyle="1" w:styleId="Heading8Char">
@@ -4948,10 +5209,11 @@
     <w:semiHidden/>
     <w:rsid w:val="00FC693F"/>
     <w:rPr>
-      <w:rFonts w:asciiTheme="majorHAnsi" w:eastAsiaTheme="majorEastAsia" w:hAnsiTheme="majorHAnsi" w:cstheme="majorBidi" w:eastAsia="Arial Unicode MS"/>
+      <w:rFonts w:eastAsia="Hiragino Sans GB" w:ascii="Hiragino Sans GB" w:hAnsi="Hiragino Sans GB" w:cs="Hiragino Sans GB"/>
       <w:color w:val="4F81BD" w:themeColor="accent1"/>
       <w:sz w:val="20"/>
       <w:szCs w:val="20"/>
+      <w:lang w:eastAsia="zh-CN"/>
     </w:rPr>
   </w:style>
   <w:style w:type="character" w:customStyle="1" w:styleId="Heading9Char">
@@ -4962,12 +5224,13 @@
     <w:semiHidden/>
     <w:rsid w:val="00FC693F"/>
     <w:rPr>
-      <w:rFonts w:asciiTheme="majorHAnsi" w:eastAsiaTheme="majorEastAsia" w:hAnsiTheme="majorHAnsi" w:cstheme="majorBidi" w:eastAsia="Arial Unicode MS"/>
+      <w:rFonts w:eastAsia="Hiragino Sans GB" w:ascii="Hiragino Sans GB" w:hAnsi="Hiragino Sans GB" w:cs="Hiragino Sans GB"/>
       <w:i/>
       <w:iCs/>
       <w:color w:val="404040" w:themeColor="text1" w:themeTint="BF"/>
       <w:sz w:val="20"/>
       <w:szCs w:val="20"/>
+      <w:lang w:eastAsia="zh-CN"/>
     </w:rPr>
   </w:style>
   <w:style w:type="paragraph" w:styleId="Caption">
@@ -4983,12 +5246,13 @@
       <w:spacing w:line="240" w:lineRule="auto"/>
     </w:pPr>
     <w:rPr>
-      <w:rFonts w:eastAsia="Arial Unicode MS"/>
+      <w:rFonts w:eastAsia="Hiragino Sans GB" w:ascii="Hiragino Sans GB" w:hAnsi="Hiragino Sans GB" w:cs="Hiragino Sans GB"/>
       <w:b/>
       <w:bCs/>
       <w:color w:val="4F81BD" w:themeColor="accent1"/>
       <w:sz w:val="18"/>
       <w:szCs w:val="18"/>
+      <w:lang w:eastAsia="zh-CN"/>
     </w:rPr>
   </w:style>
   <w:style w:type="character" w:styleId="Strong">
@@ -4998,9 +5262,10 @@
     <w:qFormat/>
     <w:rsid w:val="00FC693F"/>
     <w:rPr>
-      <w:rFonts w:eastAsia="Arial Unicode MS"/>
+      <w:rFonts w:eastAsia="Hiragino Sans GB" w:ascii="Hiragino Sans GB" w:hAnsi="Hiragino Sans GB" w:cs="Hiragino Sans GB"/>
       <w:b/>
       <w:bCs/>
+      <w:lang w:eastAsia="zh-CN"/>
     </w:rPr>
   </w:style>
   <w:style w:type="character" w:styleId="Emphasis">
@@ -5010,9 +5275,10 @@
     <w:qFormat/>
     <w:rsid w:val="00FC693F"/>
     <w:rPr>
-      <w:rFonts w:eastAsia="Arial Unicode MS"/>
+      <w:rFonts w:eastAsia="Hiragino Sans GB" w:ascii="Hiragino Sans GB" w:hAnsi="Hiragino Sans GB" w:cs="Hiragino Sans GB"/>
       <w:i/>
       <w:iCs/>
+      <w:lang w:eastAsia="zh-CN"/>
     </w:rPr>
   </w:style>
   <w:style w:type="paragraph" w:styleId="IntenseQuote">
@@ -5031,12 +5297,13 @@
       <w:ind w:left="936" w:right="936"/>
     </w:pPr>
     <w:rPr>
-      <w:rFonts w:eastAsia="Arial Unicode MS"/>
+      <w:rFonts w:eastAsia="Hiragino Sans GB" w:ascii="Hiragino Sans GB" w:hAnsi="Hiragino Sans GB" w:cs="Hiragino Sans GB"/>
       <w:b/>
       <w:bCs/>
       <w:i/>
       <w:iCs/>
       <w:color w:val="4F81BD" w:themeColor="accent1"/>
+      <w:lang w:eastAsia="zh-CN"/>
     </w:rPr>
   </w:style>
   <w:style w:type="character" w:customStyle="1" w:styleId="IntenseQuoteChar">
@@ -5046,12 +5313,13 @@
     <w:uiPriority w:val="30"/>
     <w:rsid w:val="00FC693F"/>
     <w:rPr>
-      <w:rFonts w:eastAsia="Arial Unicode MS"/>
+      <w:rFonts w:eastAsia="Hiragino Sans GB" w:ascii="Hiragino Sans GB" w:hAnsi="Hiragino Sans GB" w:cs="Hiragino Sans GB"/>
       <w:b/>
       <w:bCs/>
       <w:i/>
       <w:iCs/>
       <w:color w:val="4F81BD" w:themeColor="accent1"/>
+      <w:lang w:eastAsia="zh-CN"/>
     </w:rPr>
   </w:style>
   <w:style w:type="character" w:styleId="SubtleEmphasis">
@@ -5061,10 +5329,11 @@
     <w:qFormat/>
     <w:rsid w:val="00FC693F"/>
     <w:rPr>
-      <w:rFonts w:eastAsia="Arial Unicode MS"/>
+      <w:rFonts w:eastAsia="Hiragino Sans GB" w:ascii="Hiragino Sans GB" w:hAnsi="Hiragino Sans GB" w:cs="Hiragino Sans GB"/>
       <w:i/>
       <w:iCs/>
       <w:color w:val="808080" w:themeColor="text1" w:themeTint="7F"/>
+      <w:lang w:eastAsia="zh-CN"/>
     </w:rPr>
   </w:style>
   <w:style w:type="character" w:styleId="IntenseEmphasis">
@@ -5074,12 +5343,13 @@
     <w:qFormat/>
     <w:rsid w:val="00FC693F"/>
     <w:rPr>
-      <w:rFonts w:eastAsia="Arial Unicode MS"/>
+      <w:rFonts w:eastAsia="Hiragino Sans GB" w:ascii="Hiragino Sans GB" w:hAnsi="Hiragino Sans GB" w:cs="Hiragino Sans GB"/>
       <w:b/>
       <w:bCs/>
       <w:i/>
       <w:iCs/>
       <w:color w:val="4F81BD" w:themeColor="accent1"/>
+      <w:lang w:eastAsia="zh-CN"/>
     </w:rPr>
   </w:style>
   <w:style w:type="character" w:styleId="SubtleReference">
@@ -5089,10 +5359,11 @@
     <w:qFormat/>
     <w:rsid w:val="00FC693F"/>
     <w:rPr>
-      <w:rFonts w:eastAsia="Arial Unicode MS"/>
+      <w:rFonts w:eastAsia="Hiragino Sans GB" w:ascii="Hiragino Sans GB" w:hAnsi="Hiragino Sans GB" w:cs="Hiragino Sans GB"/>
       <w:smallCaps/>
       <w:color w:val="C0504D" w:themeColor="accent2"/>
       <w:u w:val="single"/>
+      <w:lang w:eastAsia="zh-CN"/>
     </w:rPr>
   </w:style>
   <w:style w:type="character" w:styleId="IntenseReference">
@@ -5102,13 +5373,14 @@
     <w:qFormat/>
     <w:rsid w:val="00FC693F"/>
     <w:rPr>
-      <w:rFonts w:eastAsia="Arial Unicode MS"/>
+      <w:rFonts w:eastAsia="Hiragino Sans GB" w:ascii="Hiragino Sans GB" w:hAnsi="Hiragino Sans GB" w:cs="Hiragino Sans GB"/>
       <w:b/>
       <w:bCs/>
       <w:smallCaps/>
       <w:color w:val="C0504D" w:themeColor="accent2"/>
       <w:spacing w:val="5"/>
       <w:u w:val="single"/>
+      <w:lang w:eastAsia="zh-CN"/>
     </w:rPr>
   </w:style>
   <w:style w:type="character" w:styleId="BookTitle">
@@ -5118,11 +5390,12 @@
     <w:qFormat/>
     <w:rsid w:val="00FC693F"/>
     <w:rPr>
-      <w:rFonts w:eastAsia="Arial Unicode MS"/>
+      <w:rFonts w:eastAsia="Hiragino Sans GB" w:ascii="Hiragino Sans GB" w:hAnsi="Hiragino Sans GB" w:cs="Hiragino Sans GB"/>
       <w:b/>
       <w:bCs/>
       <w:smallCaps/>
       <w:spacing w:val="5"/>
+      <w:lang w:eastAsia="zh-CN"/>
     </w:rPr>
   </w:style>
   <w:style w:type="paragraph" w:styleId="TOCHeading">
@@ -5138,7 +5411,8 @@
       <w:outlineLvl w:val="9"/>
     </w:pPr>
     <w:rPr>
-      <w:rFonts w:eastAsia="Arial Unicode MS"/>
+      <w:rFonts w:eastAsia="Hiragino Sans GB" w:ascii="Hiragino Sans GB" w:hAnsi="Hiragino Sans GB" w:cs="Hiragino Sans GB"/>
+      <w:lang w:eastAsia="zh-CN"/>
     </w:rPr>
   </w:style>
   <w:style w:type="table" w:styleId="TableGrid">
@@ -5150,7 +5424,8 @@
       <w:spacing w:after="0" w:line="240" w:lineRule="auto"/>
     </w:pPr>
     <w:rPr>
-      <w:rFonts w:eastAsia="Arial Unicode MS"/>
+      <w:rFonts w:eastAsia="Hiragino Sans GB" w:ascii="Hiragino Sans GB" w:hAnsi="Hiragino Sans GB" w:cs="Hiragino Sans GB"/>
+      <w:lang w:eastAsia="zh-CN"/>
     </w:rPr>
     <w:tblPr>
       <w:tblInd w:w="0" w:type="dxa"/>
@@ -5179,8 +5454,9 @@
       <w:spacing w:after="0" w:line="240" w:lineRule="auto"/>
     </w:pPr>
     <w:rPr>
-      <w:rFonts w:eastAsia="Arial Unicode MS"/>
+      <w:rFonts w:eastAsia="Hiragino Sans GB" w:ascii="Hiragino Sans GB" w:hAnsi="Hiragino Sans GB" w:cs="Hiragino Sans GB"/>
       <w:color w:val="000000" w:themeColor="text1" w:themeShade="BF"/>
+      <w:lang w:eastAsia="zh-CN"/>
     </w:rPr>
     <w:tblPr>
       <w:tblStyleRowBandSize w:val="1"/>
@@ -5283,8 +5559,9 @@
       <w:spacing w:after="0" w:line="240" w:lineRule="auto"/>
     </w:pPr>
     <w:rPr>
-      <w:rFonts w:eastAsia="Arial Unicode MS"/>
+      <w:rFonts w:eastAsia="Hiragino Sans GB" w:ascii="Hiragino Sans GB" w:hAnsi="Hiragino Sans GB" w:cs="Hiragino Sans GB"/>
       <w:color w:val="365F91" w:themeColor="accent1" w:themeShade="BF"/>
+      <w:lang w:eastAsia="zh-CN"/>
     </w:rPr>
     <w:tblPr>
       <w:tblStyleRowBandSize w:val="1"/>
@@ -5387,8 +5664,9 @@
       <w:spacing w:after="0" w:line="240" w:lineRule="auto"/>
     </w:pPr>
     <w:rPr>
-      <w:rFonts w:eastAsia="Arial Unicode MS"/>
+      <w:rFonts w:eastAsia="Hiragino Sans GB" w:ascii="Hiragino Sans GB" w:hAnsi="Hiragino Sans GB" w:cs="Hiragino Sans GB"/>
       <w:color w:val="943634" w:themeColor="accent2" w:themeShade="BF"/>
+      <w:lang w:eastAsia="zh-CN"/>
     </w:rPr>
     <w:tblPr>
       <w:tblStyleRowBandSize w:val="1"/>
@@ -5491,8 +5769,9 @@
       <w:spacing w:after="0" w:line="240" w:lineRule="auto"/>
     </w:pPr>
     <w:rPr>
-      <w:rFonts w:eastAsia="Arial Unicode MS"/>
+      <w:rFonts w:eastAsia="Hiragino Sans GB" w:ascii="Hiragino Sans GB" w:hAnsi="Hiragino Sans GB" w:cs="Hiragino Sans GB"/>
       <w:color w:val="76923C" w:themeColor="accent3" w:themeShade="BF"/>
+      <w:lang w:eastAsia="zh-CN"/>
     </w:rPr>
     <w:tblPr>
       <w:tblStyleRowBandSize w:val="1"/>
@@ -5595,8 +5874,9 @@
       <w:spacing w:after="0" w:line="240" w:lineRule="auto"/>
     </w:pPr>
     <w:rPr>
-      <w:rFonts w:eastAsia="Arial Unicode MS"/>
+      <w:rFonts w:eastAsia="Hiragino Sans GB" w:ascii="Hiragino Sans GB" w:hAnsi="Hiragino Sans GB" w:cs="Hiragino Sans GB"/>
       <w:color w:val="5F497A" w:themeColor="accent4" w:themeShade="BF"/>
+      <w:lang w:eastAsia="zh-CN"/>
     </w:rPr>
     <w:tblPr>
       <w:tblStyleRowBandSize w:val="1"/>
@@ -5699,8 +5979,9 @@
       <w:spacing w:after="0" w:line="240" w:lineRule="auto"/>
     </w:pPr>
     <w:rPr>
-      <w:rFonts w:eastAsia="Arial Unicode MS"/>
+      <w:rFonts w:eastAsia="Hiragino Sans GB" w:ascii="Hiragino Sans GB" w:hAnsi="Hiragino Sans GB" w:cs="Hiragino Sans GB"/>
       <w:color w:val="31849B" w:themeColor="accent5" w:themeShade="BF"/>
+      <w:lang w:eastAsia="zh-CN"/>
     </w:rPr>
     <w:tblPr>
       <w:tblStyleRowBandSize w:val="1"/>
@@ -5803,8 +6084,9 @@
       <w:spacing w:after="0" w:line="240" w:lineRule="auto"/>
     </w:pPr>
     <w:rPr>
-      <w:rFonts w:eastAsia="Arial Unicode MS"/>
+      <w:rFonts w:eastAsia="Hiragino Sans GB" w:ascii="Hiragino Sans GB" w:hAnsi="Hiragino Sans GB" w:cs="Hiragino Sans GB"/>
       <w:color w:val="E36C0A" w:themeColor="accent6" w:themeShade="BF"/>
+      <w:lang w:eastAsia="zh-CN"/>
     </w:rPr>
     <w:tblPr>
       <w:tblStyleRowBandSize w:val="1"/>
@@ -5907,7 +6189,8 @@
       <w:spacing w:after="0" w:line="240" w:lineRule="auto"/>
     </w:pPr>
     <w:rPr>
-      <w:rFonts w:eastAsia="Arial Unicode MS"/>
+      <w:rFonts w:eastAsia="Hiragino Sans GB" w:ascii="Hiragino Sans GB" w:hAnsi="Hiragino Sans GB" w:cs="Hiragino Sans GB"/>
+      <w:lang w:eastAsia="zh-CN"/>
     </w:rPr>
     <w:tblPr>
       <w:tblStyleRowBandSize w:val="1"/>
@@ -6002,7 +6285,8 @@
       <w:spacing w:after="0" w:line="240" w:lineRule="auto"/>
     </w:pPr>
     <w:rPr>
-      <w:rFonts w:eastAsia="Arial Unicode MS"/>
+      <w:rFonts w:eastAsia="Hiragino Sans GB" w:ascii="Hiragino Sans GB" w:hAnsi="Hiragino Sans GB" w:cs="Hiragino Sans GB"/>
+      <w:lang w:eastAsia="zh-CN"/>
     </w:rPr>
     <w:tblPr>
       <w:tblStyleRowBandSize w:val="1"/>
@@ -6097,7 +6381,8 @@
       <w:spacing w:after="0" w:line="240" w:lineRule="auto"/>
     </w:pPr>
     <w:rPr>
-      <w:rFonts w:eastAsia="Arial Unicode MS"/>
+      <w:rFonts w:eastAsia="Hiragino Sans GB" w:ascii="Hiragino Sans GB" w:hAnsi="Hiragino Sans GB" w:cs="Hiragino Sans GB"/>
+      <w:lang w:eastAsia="zh-CN"/>
     </w:rPr>
     <w:tblPr>
       <w:tblStyleRowBandSize w:val="1"/>
@@ -6192,7 +6477,8 @@
       <w:spacing w:after="0" w:line="240" w:lineRule="auto"/>
     </w:pPr>
     <w:rPr>
-      <w:rFonts w:eastAsia="Arial Unicode MS"/>
+      <w:rFonts w:eastAsia="Hiragino Sans GB" w:ascii="Hiragino Sans GB" w:hAnsi="Hiragino Sans GB" w:cs="Hiragino Sans GB"/>
+      <w:lang w:eastAsia="zh-CN"/>
     </w:rPr>
     <w:tblPr>
       <w:tblStyleRowBandSize w:val="1"/>
@@ -6287,7 +6573,8 @@
       <w:spacing w:after="0" w:line="240" w:lineRule="auto"/>
     </w:pPr>
     <w:rPr>
-      <w:rFonts w:eastAsia="Arial Unicode MS"/>
+      <w:rFonts w:eastAsia="Hiragino Sans GB" w:ascii="Hiragino Sans GB" w:hAnsi="Hiragino Sans GB" w:cs="Hiragino Sans GB"/>
+      <w:lang w:eastAsia="zh-CN"/>
     </w:rPr>
     <w:tblPr>
       <w:tblStyleRowBandSize w:val="1"/>
@@ -6382,7 +6669,8 @@
       <w:spacing w:after="0" w:line="240" w:lineRule="auto"/>
     </w:pPr>
     <w:rPr>
-      <w:rFonts w:eastAsia="Arial Unicode MS"/>
+      <w:rFonts w:eastAsia="Hiragino Sans GB" w:ascii="Hiragino Sans GB" w:hAnsi="Hiragino Sans GB" w:cs="Hiragino Sans GB"/>
+      <w:lang w:eastAsia="zh-CN"/>
     </w:rPr>
     <w:tblPr>
       <w:tblStyleRowBandSize w:val="1"/>
@@ -6477,7 +6765,8 @@
       <w:spacing w:after="0" w:line="240" w:lineRule="auto"/>
     </w:pPr>
     <w:rPr>
-      <w:rFonts w:eastAsia="Arial Unicode MS"/>
+      <w:rFonts w:eastAsia="Hiragino Sans GB" w:ascii="Hiragino Sans GB" w:hAnsi="Hiragino Sans GB" w:cs="Hiragino Sans GB"/>
+      <w:lang w:eastAsia="zh-CN"/>
     </w:rPr>
     <w:tblPr>
       <w:tblStyleRowBandSize w:val="1"/>
@@ -6572,7 +6861,8 @@
       <w:spacing w:after="0" w:line="240" w:lineRule="auto"/>
     </w:pPr>
     <w:rPr>
-      <w:rFonts w:eastAsia="Arial Unicode MS"/>
+      <w:rFonts w:eastAsia="Hiragino Sans GB" w:ascii="Hiragino Sans GB" w:hAnsi="Hiragino Sans GB" w:cs="Hiragino Sans GB"/>
+      <w:lang w:eastAsia="zh-CN"/>
     </w:rPr>
     <w:tblPr>
       <w:tblStyleRowBandSize w:val="1"/>
@@ -6705,7 +6995,8 @@
       <w:spacing w:after="0" w:line="240" w:lineRule="auto"/>
     </w:pPr>
     <w:rPr>
-      <w:rFonts w:eastAsia="Arial Unicode MS"/>
+      <w:rFonts w:eastAsia="Hiragino Sans GB" w:ascii="Hiragino Sans GB" w:hAnsi="Hiragino Sans GB" w:cs="Hiragino Sans GB"/>
+      <w:lang w:eastAsia="zh-CN"/>
     </w:rPr>
     <w:tblPr>
       <w:tblStyleRowBandSize w:val="1"/>
@@ -6838,7 +7129,8 @@
       <w:spacing w:after="0" w:line="240" w:lineRule="auto"/>
     </w:pPr>
     <w:rPr>
-      <w:rFonts w:eastAsia="Arial Unicode MS"/>
+      <w:rFonts w:eastAsia="Hiragino Sans GB" w:ascii="Hiragino Sans GB" w:hAnsi="Hiragino Sans GB" w:cs="Hiragino Sans GB"/>
+      <w:lang w:eastAsia="zh-CN"/>
     </w:rPr>
     <w:tblPr>
       <w:tblStyleRowBandSize w:val="1"/>
@@ -6971,7 +7263,8 @@
       <w:spacing w:after="0" w:line="240" w:lineRule="auto"/>
     </w:pPr>
     <w:rPr>
-      <w:rFonts w:eastAsia="Arial Unicode MS"/>
+      <w:rFonts w:eastAsia="Hiragino Sans GB" w:ascii="Hiragino Sans GB" w:hAnsi="Hiragino Sans GB" w:cs="Hiragino Sans GB"/>
+      <w:lang w:eastAsia="zh-CN"/>
     </w:rPr>
     <w:tblPr>
       <w:tblStyleRowBandSize w:val="1"/>
@@ -7104,7 +7397,8 @@
       <w:spacing w:after="0" w:line="240" w:lineRule="auto"/>
     </w:pPr>
     <w:rPr>
-      <w:rFonts w:eastAsia="Arial Unicode MS"/>
+      <w:rFonts w:eastAsia="Hiragino Sans GB" w:ascii="Hiragino Sans GB" w:hAnsi="Hiragino Sans GB" w:cs="Hiragino Sans GB"/>
+      <w:lang w:eastAsia="zh-CN"/>
     </w:rPr>
     <w:tblPr>
       <w:tblStyleRowBandSize w:val="1"/>
@@ -7237,7 +7531,8 @@
       <w:spacing w:after="0" w:line="240" w:lineRule="auto"/>
     </w:pPr>
     <w:rPr>
-      <w:rFonts w:eastAsia="Arial Unicode MS"/>
+      <w:rFonts w:eastAsia="Hiragino Sans GB" w:ascii="Hiragino Sans GB" w:hAnsi="Hiragino Sans GB" w:cs="Hiragino Sans GB"/>
+      <w:lang w:eastAsia="zh-CN"/>
     </w:rPr>
     <w:tblPr>
       <w:tblStyleRowBandSize w:val="1"/>
@@ -7370,7 +7665,8 @@
       <w:spacing w:after="0" w:line="240" w:lineRule="auto"/>
     </w:pPr>
     <w:rPr>
-      <w:rFonts w:eastAsia="Arial Unicode MS"/>
+      <w:rFonts w:eastAsia="Hiragino Sans GB" w:ascii="Hiragino Sans GB" w:hAnsi="Hiragino Sans GB" w:cs="Hiragino Sans GB"/>
+      <w:lang w:eastAsia="zh-CN"/>
     </w:rPr>
     <w:tblPr>
       <w:tblStyleRowBandSize w:val="1"/>
@@ -7503,7 +7799,8 @@
       <w:spacing w:after="0" w:line="240" w:lineRule="auto"/>
     </w:pPr>
     <w:rPr>
-      <w:rFonts w:eastAsia="Arial Unicode MS"/>
+      <w:rFonts w:eastAsia="Hiragino Sans GB" w:ascii="Hiragino Sans GB" w:hAnsi="Hiragino Sans GB" w:cs="Hiragino Sans GB"/>
+      <w:lang w:eastAsia="zh-CN"/>
     </w:rPr>
     <w:tblPr>
       <w:tblStyleRowBandSize w:val="1"/>
@@ -7612,7 +7909,8 @@
       <w:spacing w:after="0" w:line="240" w:lineRule="auto"/>
     </w:pPr>
     <w:rPr>
-      <w:rFonts w:eastAsia="Arial Unicode MS"/>
+      <w:rFonts w:eastAsia="Hiragino Sans GB" w:ascii="Hiragino Sans GB" w:hAnsi="Hiragino Sans GB" w:cs="Hiragino Sans GB"/>
+      <w:lang w:eastAsia="zh-CN"/>
     </w:rPr>
     <w:tblPr>
       <w:tblStyleRowBandSize w:val="1"/>
@@ -7721,7 +8019,8 @@
       <w:spacing w:after="0" w:line="240" w:lineRule="auto"/>
     </w:pPr>
     <w:rPr>
-      <w:rFonts w:eastAsia="Arial Unicode MS"/>
+      <w:rFonts w:eastAsia="Hiragino Sans GB" w:ascii="Hiragino Sans GB" w:hAnsi="Hiragino Sans GB" w:cs="Hiragino Sans GB"/>
+      <w:lang w:eastAsia="zh-CN"/>
     </w:rPr>
     <w:tblPr>
       <w:tblStyleRowBandSize w:val="1"/>
@@ -7830,7 +8129,8 @@
       <w:spacing w:after="0" w:line="240" w:lineRule="auto"/>
     </w:pPr>
     <w:rPr>
-      <w:rFonts w:eastAsia="Arial Unicode MS"/>
+      <w:rFonts w:eastAsia="Hiragino Sans GB" w:ascii="Hiragino Sans GB" w:hAnsi="Hiragino Sans GB" w:cs="Hiragino Sans GB"/>
+      <w:lang w:eastAsia="zh-CN"/>
     </w:rPr>
     <w:tblPr>
       <w:tblStyleRowBandSize w:val="1"/>
@@ -7939,7 +8239,8 @@
       <w:spacing w:after="0" w:line="240" w:lineRule="auto"/>
     </w:pPr>
     <w:rPr>
-      <w:rFonts w:eastAsia="Arial Unicode MS"/>
+      <w:rFonts w:eastAsia="Hiragino Sans GB" w:ascii="Hiragino Sans GB" w:hAnsi="Hiragino Sans GB" w:cs="Hiragino Sans GB"/>
+      <w:lang w:eastAsia="zh-CN"/>
     </w:rPr>
     <w:tblPr>
       <w:tblStyleRowBandSize w:val="1"/>
@@ -8048,7 +8349,8 @@
       <w:spacing w:after="0" w:line="240" w:lineRule="auto"/>
     </w:pPr>
     <w:rPr>
-      <w:rFonts w:eastAsia="Arial Unicode MS"/>
+      <w:rFonts w:eastAsia="Hiragino Sans GB" w:ascii="Hiragino Sans GB" w:hAnsi="Hiragino Sans GB" w:cs="Hiragino Sans GB"/>
+      <w:lang w:eastAsia="zh-CN"/>
     </w:rPr>
     <w:tblPr>
       <w:tblStyleRowBandSize w:val="1"/>
@@ -8157,7 +8459,8 @@
       <w:spacing w:after="0" w:line="240" w:lineRule="auto"/>
     </w:pPr>
     <w:rPr>
-      <w:rFonts w:eastAsia="Arial Unicode MS"/>
+      <w:rFonts w:eastAsia="Hiragino Sans GB" w:ascii="Hiragino Sans GB" w:hAnsi="Hiragino Sans GB" w:cs="Hiragino Sans GB"/>
+      <w:lang w:eastAsia="zh-CN"/>
     </w:rPr>
     <w:tblPr>
       <w:tblStyleRowBandSize w:val="1"/>
@@ -8266,7 +8569,8 @@
       <w:spacing w:after="0" w:line="240" w:lineRule="auto"/>
     </w:pPr>
     <w:rPr>
-      <w:rFonts w:eastAsia="Arial Unicode MS"/>
+      <w:rFonts w:eastAsia="Hiragino Sans GB" w:ascii="Hiragino Sans GB" w:hAnsi="Hiragino Sans GB" w:cs="Hiragino Sans GB"/>
+      <w:lang w:eastAsia="zh-CN"/>
     </w:rPr>
     <w:tblPr>
       <w:tblStyleRowBandSize w:val="1"/>
@@ -8418,7 +8722,8 @@
       <w:spacing w:after="0" w:line="240" w:lineRule="auto"/>
     </w:pPr>
     <w:rPr>
-      <w:rFonts w:eastAsia="Arial Unicode MS"/>
+      <w:rFonts w:eastAsia="Hiragino Sans GB" w:ascii="Hiragino Sans GB" w:hAnsi="Hiragino Sans GB" w:cs="Hiragino Sans GB"/>
+      <w:lang w:eastAsia="zh-CN"/>
     </w:rPr>
     <w:tblPr>
       <w:tblStyleRowBandSize w:val="1"/>
@@ -8570,7 +8875,8 @@
       <w:spacing w:after="0" w:line="240" w:lineRule="auto"/>
     </w:pPr>
     <w:rPr>
-      <w:rFonts w:eastAsia="Arial Unicode MS"/>
+      <w:rFonts w:eastAsia="Hiragino Sans GB" w:ascii="Hiragino Sans GB" w:hAnsi="Hiragino Sans GB" w:cs="Hiragino Sans GB"/>
+      <w:lang w:eastAsia="zh-CN"/>
     </w:rPr>
     <w:tblPr>
       <w:tblStyleRowBandSize w:val="1"/>
@@ -8722,7 +9028,8 @@
       <w:spacing w:after="0" w:line="240" w:lineRule="auto"/>
     </w:pPr>
     <w:rPr>
-      <w:rFonts w:eastAsia="Arial Unicode MS"/>
+      <w:rFonts w:eastAsia="Hiragino Sans GB" w:ascii="Hiragino Sans GB" w:hAnsi="Hiragino Sans GB" w:cs="Hiragino Sans GB"/>
+      <w:lang w:eastAsia="zh-CN"/>
     </w:rPr>
     <w:tblPr>
       <w:tblStyleRowBandSize w:val="1"/>
@@ -8874,7 +9181,8 @@
       <w:spacing w:after="0" w:line="240" w:lineRule="auto"/>
     </w:pPr>
     <w:rPr>
-      <w:rFonts w:eastAsia="Arial Unicode MS"/>
+      <w:rFonts w:eastAsia="Hiragino Sans GB" w:ascii="Hiragino Sans GB" w:hAnsi="Hiragino Sans GB" w:cs="Hiragino Sans GB"/>
+      <w:lang w:eastAsia="zh-CN"/>
     </w:rPr>
     <w:tblPr>
       <w:tblStyleRowBandSize w:val="1"/>
@@ -9026,7 +9334,8 @@
       <w:spacing w:after="0" w:line="240" w:lineRule="auto"/>
     </w:pPr>
     <w:rPr>
-      <w:rFonts w:eastAsia="Arial Unicode MS"/>
+      <w:rFonts w:eastAsia="Hiragino Sans GB" w:ascii="Hiragino Sans GB" w:hAnsi="Hiragino Sans GB" w:cs="Hiragino Sans GB"/>
+      <w:lang w:eastAsia="zh-CN"/>
     </w:rPr>
     <w:tblPr>
       <w:tblStyleRowBandSize w:val="1"/>
@@ -9178,7 +9487,8 @@
       <w:spacing w:after="0" w:line="240" w:lineRule="auto"/>
     </w:pPr>
     <w:rPr>
-      <w:rFonts w:eastAsia="Arial Unicode MS"/>
+      <w:rFonts w:eastAsia="Hiragino Sans GB" w:ascii="Hiragino Sans GB" w:hAnsi="Hiragino Sans GB" w:cs="Hiragino Sans GB"/>
+      <w:lang w:eastAsia="zh-CN"/>
     </w:rPr>
     <w:tblPr>
       <w:tblStyleRowBandSize w:val="1"/>
@@ -9330,8 +9640,9 @@
       <w:spacing w:after="0" w:line="240" w:lineRule="auto"/>
     </w:pPr>
     <w:rPr>
-      <w:rFonts w:eastAsia="Arial Unicode MS"/>
+      <w:rFonts w:eastAsia="Hiragino Sans GB" w:ascii="Hiragino Sans GB" w:hAnsi="Hiragino Sans GB" w:cs="Hiragino Sans GB"/>
       <w:color w:val="000000" w:themeColor="text1"/>
+      <w:lang w:eastAsia="zh-CN"/>
     </w:rPr>
     <w:tblPr>
       <w:tblStyleRowBandSize w:val="1"/>
@@ -9415,8 +9726,9 @@
       <w:spacing w:after="0" w:line="240" w:lineRule="auto"/>
     </w:pPr>
     <w:rPr>
-      <w:rFonts w:eastAsia="Arial Unicode MS"/>
+      <w:rFonts w:eastAsia="Hiragino Sans GB" w:ascii="Hiragino Sans GB" w:hAnsi="Hiragino Sans GB" w:cs="Hiragino Sans GB"/>
       <w:color w:val="000000" w:themeColor="text1"/>
+      <w:lang w:eastAsia="zh-CN"/>
     </w:rPr>
     <w:tblPr>
       <w:tblStyleRowBandSize w:val="1"/>
@@ -9500,8 +9812,9 @@
       <w:spacing w:after="0" w:line="240" w:lineRule="auto"/>
     </w:pPr>
     <w:rPr>
-      <w:rFonts w:eastAsia="Arial Unicode MS"/>
+      <w:rFonts w:eastAsia="Hiragino Sans GB" w:ascii="Hiragino Sans GB" w:hAnsi="Hiragino Sans GB" w:cs="Hiragino Sans GB"/>
       <w:color w:val="000000" w:themeColor="text1"/>
+      <w:lang w:eastAsia="zh-CN"/>
     </w:rPr>
     <w:tblPr>
       <w:tblStyleRowBandSize w:val="1"/>
@@ -9585,8 +9898,9 @@
       <w:spacing w:after="0" w:line="240" w:lineRule="auto"/>
     </w:pPr>
     <w:rPr>
-      <w:rFonts w:eastAsia="Arial Unicode MS"/>
+      <w:rFonts w:eastAsia="Hiragino Sans GB" w:ascii="Hiragino Sans GB" w:hAnsi="Hiragino Sans GB" w:cs="Hiragino Sans GB"/>
       <w:color w:val="000000" w:themeColor="text1"/>
+      <w:lang w:eastAsia="zh-CN"/>
     </w:rPr>
     <w:tblPr>
       <w:tblStyleRowBandSize w:val="1"/>
@@ -9670,8 +9984,9 @@
       <w:spacing w:after="0" w:line="240" w:lineRule="auto"/>
     </w:pPr>
     <w:rPr>
-      <w:rFonts w:eastAsia="Arial Unicode MS"/>
+      <w:rFonts w:eastAsia="Hiragino Sans GB" w:ascii="Hiragino Sans GB" w:hAnsi="Hiragino Sans GB" w:cs="Hiragino Sans GB"/>
       <w:color w:val="000000" w:themeColor="text1"/>
+      <w:lang w:eastAsia="zh-CN"/>
     </w:rPr>
     <w:tblPr>
       <w:tblStyleRowBandSize w:val="1"/>
@@ -9755,8 +10070,9 @@
       <w:spacing w:after="0" w:line="240" w:lineRule="auto"/>
     </w:pPr>
     <w:rPr>
-      <w:rFonts w:eastAsia="Arial Unicode MS"/>
+      <w:rFonts w:eastAsia="Hiragino Sans GB" w:ascii="Hiragino Sans GB" w:hAnsi="Hiragino Sans GB" w:cs="Hiragino Sans GB"/>
       <w:color w:val="000000" w:themeColor="text1"/>
+      <w:lang w:eastAsia="zh-CN"/>
     </w:rPr>
     <w:tblPr>
       <w:tblStyleRowBandSize w:val="1"/>
@@ -9840,8 +10156,9 @@
       <w:spacing w:after="0" w:line="240" w:lineRule="auto"/>
     </w:pPr>
     <w:rPr>
-      <w:rFonts w:eastAsia="Arial Unicode MS"/>
+      <w:rFonts w:eastAsia="Hiragino Sans GB" w:ascii="Hiragino Sans GB" w:hAnsi="Hiragino Sans GB" w:cs="Hiragino Sans GB"/>
       <w:color w:val="000000" w:themeColor="text1"/>
+      <w:lang w:eastAsia="zh-CN"/>
     </w:rPr>
     <w:tblPr>
       <w:tblStyleRowBandSize w:val="1"/>
@@ -9925,8 +10242,9 @@
       <w:spacing w:after="0" w:line="240" w:lineRule="auto"/>
     </w:pPr>
     <w:rPr>
-      <w:rFonts w:asciiTheme="majorHAnsi" w:eastAsiaTheme="majorEastAsia" w:hAnsiTheme="majorHAnsi" w:cstheme="majorBidi" w:eastAsia="Arial Unicode MS"/>
+      <w:rFonts w:eastAsia="Hiragino Sans GB" w:ascii="Hiragino Sans GB" w:hAnsi="Hiragino Sans GB" w:cs="Hiragino Sans GB"/>
       <w:color w:val="000000" w:themeColor="text1"/>
+      <w:lang w:eastAsia="zh-CN"/>
     </w:rPr>
     <w:tblPr>
       <w:tblStyleRowBandSize w:val="1"/>
@@ -10053,8 +10371,9 @@
       <w:spacing w:after="0" w:line="240" w:lineRule="auto"/>
     </w:pPr>
     <w:rPr>
-      <w:rFonts w:asciiTheme="majorHAnsi" w:eastAsiaTheme="majorEastAsia" w:hAnsiTheme="majorHAnsi" w:cstheme="majorBidi" w:eastAsia="Arial Unicode MS"/>
+      <w:rFonts w:eastAsia="Hiragino Sans GB" w:ascii="Hiragino Sans GB" w:hAnsi="Hiragino Sans GB" w:cs="Hiragino Sans GB"/>
       <w:color w:val="000000" w:themeColor="text1"/>
+      <w:lang w:eastAsia="zh-CN"/>
     </w:rPr>
     <w:tblPr>
       <w:tblStyleRowBandSize w:val="1"/>
@@ -10181,8 +10500,9 @@
       <w:spacing w:after="0" w:line="240" w:lineRule="auto"/>
     </w:pPr>
     <w:rPr>
-      <w:rFonts w:asciiTheme="majorHAnsi" w:eastAsiaTheme="majorEastAsia" w:hAnsiTheme="majorHAnsi" w:cstheme="majorBidi" w:eastAsia="Arial Unicode MS"/>
+      <w:rFonts w:eastAsia="Hiragino Sans GB" w:ascii="Hiragino Sans GB" w:hAnsi="Hiragino Sans GB" w:cs="Hiragino Sans GB"/>
       <w:color w:val="000000" w:themeColor="text1"/>
+      <w:lang w:eastAsia="zh-CN"/>
     </w:rPr>
     <w:tblPr>
       <w:tblStyleRowBandSize w:val="1"/>
@@ -10309,8 +10629,9 @@
       <w:spacing w:after="0" w:line="240" w:lineRule="auto"/>
     </w:pPr>
     <w:rPr>
-      <w:rFonts w:asciiTheme="majorHAnsi" w:eastAsiaTheme="majorEastAsia" w:hAnsiTheme="majorHAnsi" w:cstheme="majorBidi" w:eastAsia="Arial Unicode MS"/>
+      <w:rFonts w:eastAsia="Hiragino Sans GB" w:ascii="Hiragino Sans GB" w:hAnsi="Hiragino Sans GB" w:cs="Hiragino Sans GB"/>
       <w:color w:val="000000" w:themeColor="text1"/>
+      <w:lang w:eastAsia="zh-CN"/>
     </w:rPr>
     <w:tblPr>
       <w:tblStyleRowBandSize w:val="1"/>
@@ -10437,8 +10758,9 @@
       <w:spacing w:after="0" w:line="240" w:lineRule="auto"/>
     </w:pPr>
     <w:rPr>
-      <w:rFonts w:asciiTheme="majorHAnsi" w:eastAsiaTheme="majorEastAsia" w:hAnsiTheme="majorHAnsi" w:cstheme="majorBidi" w:eastAsia="Arial Unicode MS"/>
+      <w:rFonts w:eastAsia="Hiragino Sans GB" w:ascii="Hiragino Sans GB" w:hAnsi="Hiragino Sans GB" w:cs="Hiragino Sans GB"/>
       <w:color w:val="000000" w:themeColor="text1"/>
+      <w:lang w:eastAsia="zh-CN"/>
     </w:rPr>
     <w:tblPr>
       <w:tblStyleRowBandSize w:val="1"/>
@@ -10565,8 +10887,9 @@
       <w:spacing w:after="0" w:line="240" w:lineRule="auto"/>
     </w:pPr>
     <w:rPr>
-      <w:rFonts w:asciiTheme="majorHAnsi" w:eastAsiaTheme="majorEastAsia" w:hAnsiTheme="majorHAnsi" w:cstheme="majorBidi" w:eastAsia="Arial Unicode MS"/>
+      <w:rFonts w:eastAsia="Hiragino Sans GB" w:ascii="Hiragino Sans GB" w:hAnsi="Hiragino Sans GB" w:cs="Hiragino Sans GB"/>
       <w:color w:val="000000" w:themeColor="text1"/>
+      <w:lang w:eastAsia="zh-CN"/>
     </w:rPr>
     <w:tblPr>
       <w:tblStyleRowBandSize w:val="1"/>
@@ -10693,8 +11016,9 @@
       <w:spacing w:after="0" w:line="240" w:lineRule="auto"/>
     </w:pPr>
     <w:rPr>
-      <w:rFonts w:asciiTheme="majorHAnsi" w:eastAsiaTheme="majorEastAsia" w:hAnsiTheme="majorHAnsi" w:cstheme="majorBidi" w:eastAsia="Arial Unicode MS"/>
+      <w:rFonts w:eastAsia="Hiragino Sans GB" w:ascii="Hiragino Sans GB" w:hAnsi="Hiragino Sans GB" w:cs="Hiragino Sans GB"/>
       <w:color w:val="000000" w:themeColor="text1"/>
+      <w:lang w:eastAsia="zh-CN"/>
     </w:rPr>
     <w:tblPr>
       <w:tblStyleRowBandSize w:val="1"/>
@@ -10821,7 +11145,8 @@
       <w:spacing w:after="0" w:line="240" w:lineRule="auto"/>
     </w:pPr>
     <w:rPr>
-      <w:rFonts w:eastAsia="Arial Unicode MS"/>
+      <w:rFonts w:eastAsia="Hiragino Sans GB" w:ascii="Hiragino Sans GB" w:hAnsi="Hiragino Sans GB" w:cs="Hiragino Sans GB"/>
+      <w:lang w:eastAsia="zh-CN"/>
     </w:rPr>
     <w:tblPr>
       <w:tblStyleRowBandSize w:val="1"/>
@@ -10897,7 +11222,8 @@
       <w:spacing w:after="0" w:line="240" w:lineRule="auto"/>
     </w:pPr>
     <w:rPr>
-      <w:rFonts w:eastAsia="Arial Unicode MS"/>
+      <w:rFonts w:eastAsia="Hiragino Sans GB" w:ascii="Hiragino Sans GB" w:hAnsi="Hiragino Sans GB" w:cs="Hiragino Sans GB"/>
+      <w:lang w:eastAsia="zh-CN"/>
     </w:rPr>
     <w:tblPr>
       <w:tblStyleRowBandSize w:val="1"/>
@@ -10973,7 +11299,8 @@
       <w:spacing w:after="0" w:line="240" w:lineRule="auto"/>
     </w:pPr>
     <w:rPr>
-      <w:rFonts w:eastAsia="Arial Unicode MS"/>
+      <w:rFonts w:eastAsia="Hiragino Sans GB" w:ascii="Hiragino Sans GB" w:hAnsi="Hiragino Sans GB" w:cs="Hiragino Sans GB"/>
+      <w:lang w:eastAsia="zh-CN"/>
     </w:rPr>
     <w:tblPr>
       <w:tblStyleRowBandSize w:val="1"/>
@@ -11049,7 +11376,8 @@
       <w:spacing w:after="0" w:line="240" w:lineRule="auto"/>
     </w:pPr>
     <w:rPr>
-      <w:rFonts w:eastAsia="Arial Unicode MS"/>
+      <w:rFonts w:eastAsia="Hiragino Sans GB" w:ascii="Hiragino Sans GB" w:hAnsi="Hiragino Sans GB" w:cs="Hiragino Sans GB"/>
+      <w:lang w:eastAsia="zh-CN"/>
     </w:rPr>
     <w:tblPr>
       <w:tblStyleRowBandSize w:val="1"/>
@@ -11125,7 +11453,8 @@
       <w:spacing w:after="0" w:line="240" w:lineRule="auto"/>
     </w:pPr>
     <w:rPr>
-      <w:rFonts w:eastAsia="Arial Unicode MS"/>
+      <w:rFonts w:eastAsia="Hiragino Sans GB" w:ascii="Hiragino Sans GB" w:hAnsi="Hiragino Sans GB" w:cs="Hiragino Sans GB"/>
+      <w:lang w:eastAsia="zh-CN"/>
     </w:rPr>
     <w:tblPr>
       <w:tblStyleRowBandSize w:val="1"/>
@@ -11201,7 +11530,8 @@
       <w:spacing w:after="0" w:line="240" w:lineRule="auto"/>
     </w:pPr>
     <w:rPr>
-      <w:rFonts w:eastAsia="Arial Unicode MS"/>
+      <w:rFonts w:eastAsia="Hiragino Sans GB" w:ascii="Hiragino Sans GB" w:hAnsi="Hiragino Sans GB" w:cs="Hiragino Sans GB"/>
+      <w:lang w:eastAsia="zh-CN"/>
     </w:rPr>
     <w:tblPr>
       <w:tblStyleRowBandSize w:val="1"/>
@@ -11277,7 +11607,8 @@
       <w:spacing w:after="0" w:line="240" w:lineRule="auto"/>
     </w:pPr>
     <w:rPr>
-      <w:rFonts w:eastAsia="Arial Unicode MS"/>
+      <w:rFonts w:eastAsia="Hiragino Sans GB" w:ascii="Hiragino Sans GB" w:hAnsi="Hiragino Sans GB" w:cs="Hiragino Sans GB"/>
+      <w:lang w:eastAsia="zh-CN"/>
     </w:rPr>
     <w:tblPr>
       <w:tblStyleRowBandSize w:val="1"/>
@@ -11353,8 +11684,9 @@
       <w:spacing w:after="0" w:line="240" w:lineRule="auto"/>
     </w:pPr>
     <w:rPr>
-      <w:rFonts w:asciiTheme="majorHAnsi" w:eastAsiaTheme="majorEastAsia" w:hAnsiTheme="majorHAnsi" w:cstheme="majorBidi" w:eastAsia="Arial Unicode MS"/>
+      <w:rFonts w:eastAsia="Hiragino Sans GB" w:ascii="Hiragino Sans GB" w:hAnsi="Hiragino Sans GB" w:cs="Hiragino Sans GB"/>
       <w:color w:val="000000" w:themeColor="text1"/>
+      <w:lang w:eastAsia="zh-CN"/>
     </w:rPr>
     <w:tblPr>
       <w:tblStyleRowBandSize w:val="1"/>
@@ -11478,8 +11810,9 @@
       <w:spacing w:after="0" w:line="240" w:lineRule="auto"/>
     </w:pPr>
     <w:rPr>
-      <w:rFonts w:asciiTheme="majorHAnsi" w:eastAsiaTheme="majorEastAsia" w:hAnsiTheme="majorHAnsi" w:cstheme="majorBidi" w:eastAsia="Arial Unicode MS"/>
+      <w:rFonts w:eastAsia="Hiragino Sans GB" w:ascii="Hiragino Sans GB" w:hAnsi="Hiragino Sans GB" w:cs="Hiragino Sans GB"/>
       <w:color w:val="000000" w:themeColor="text1"/>
+      <w:lang w:eastAsia="zh-CN"/>
     </w:rPr>
     <w:tblPr>
       <w:tblStyleRowBandSize w:val="1"/>
@@ -11603,8 +11936,9 @@
       <w:spacing w:after="0" w:line="240" w:lineRule="auto"/>
     </w:pPr>
     <w:rPr>
-      <w:rFonts w:asciiTheme="majorHAnsi" w:eastAsiaTheme="majorEastAsia" w:hAnsiTheme="majorHAnsi" w:cstheme="majorBidi" w:eastAsia="Arial Unicode MS"/>
+      <w:rFonts w:eastAsia="Hiragino Sans GB" w:ascii="Hiragino Sans GB" w:hAnsi="Hiragino Sans GB" w:cs="Hiragino Sans GB"/>
       <w:color w:val="000000" w:themeColor="text1"/>
+      <w:lang w:eastAsia="zh-CN"/>
     </w:rPr>
     <w:tblPr>
       <w:tblStyleRowBandSize w:val="1"/>
@@ -11728,8 +12062,9 @@
       <w:spacing w:after="0" w:line="240" w:lineRule="auto"/>
     </w:pPr>
     <w:rPr>
-      <w:rFonts w:asciiTheme="majorHAnsi" w:eastAsiaTheme="majorEastAsia" w:hAnsiTheme="majorHAnsi" w:cstheme="majorBidi" w:eastAsia="Arial Unicode MS"/>
+      <w:rFonts w:eastAsia="Hiragino Sans GB" w:ascii="Hiragino Sans GB" w:hAnsi="Hiragino Sans GB" w:cs="Hiragino Sans GB"/>
       <w:color w:val="000000" w:themeColor="text1"/>
+      <w:lang w:eastAsia="zh-CN"/>
     </w:rPr>
     <w:tblPr>
       <w:tblStyleRowBandSize w:val="1"/>
@@ -11853,8 +12188,9 @@
       <w:spacing w:after="0" w:line="240" w:lineRule="auto"/>
     </w:pPr>
     <w:rPr>
-      <w:rFonts w:asciiTheme="majorHAnsi" w:eastAsiaTheme="majorEastAsia" w:hAnsiTheme="majorHAnsi" w:cstheme="majorBidi" w:eastAsia="Arial Unicode MS"/>
+      <w:rFonts w:eastAsia="Hiragino Sans GB" w:ascii="Hiragino Sans GB" w:hAnsi="Hiragino Sans GB" w:cs="Hiragino Sans GB"/>
       <w:color w:val="000000" w:themeColor="text1"/>
+      <w:lang w:eastAsia="zh-CN"/>
     </w:rPr>
     <w:tblPr>
       <w:tblStyleRowBandSize w:val="1"/>
@@ -11978,8 +12314,9 @@
       <w:spacing w:after="0" w:line="240" w:lineRule="auto"/>
     </w:pPr>
     <w:rPr>
-      <w:rFonts w:asciiTheme="majorHAnsi" w:eastAsiaTheme="majorEastAsia" w:hAnsiTheme="majorHAnsi" w:cstheme="majorBidi" w:eastAsia="Arial Unicode MS"/>
+      <w:rFonts w:eastAsia="Hiragino Sans GB" w:ascii="Hiragino Sans GB" w:hAnsi="Hiragino Sans GB" w:cs="Hiragino Sans GB"/>
       <w:color w:val="000000" w:themeColor="text1"/>
+      <w:lang w:eastAsia="zh-CN"/>
     </w:rPr>
     <w:tblPr>
       <w:tblStyleRowBandSize w:val="1"/>
@@ -12103,8 +12440,9 @@
       <w:spacing w:after="0" w:line="240" w:lineRule="auto"/>
     </w:pPr>
     <w:rPr>
-      <w:rFonts w:asciiTheme="majorHAnsi" w:eastAsiaTheme="majorEastAsia" w:hAnsiTheme="majorHAnsi" w:cstheme="majorBidi" w:eastAsia="Arial Unicode MS"/>
+      <w:rFonts w:eastAsia="Hiragino Sans GB" w:ascii="Hiragino Sans GB" w:hAnsi="Hiragino Sans GB" w:cs="Hiragino Sans GB"/>
       <w:color w:val="000000" w:themeColor="text1"/>
+      <w:lang w:eastAsia="zh-CN"/>
     </w:rPr>
     <w:tblPr>
       <w:tblStyleRowBandSize w:val="1"/>
@@ -12228,7 +12566,8 @@
       <w:spacing w:after="0" w:line="240" w:lineRule="auto"/>
     </w:pPr>
     <w:rPr>
-      <w:rFonts w:eastAsia="Arial Unicode MS"/>
+      <w:rFonts w:eastAsia="Hiragino Sans GB" w:ascii="Hiragino Sans GB" w:hAnsi="Hiragino Sans GB" w:cs="Hiragino Sans GB"/>
+      <w:lang w:eastAsia="zh-CN"/>
     </w:rPr>
     <w:tblPr>
       <w:tblStyleRowBandSize w:val="1"/>
@@ -12372,7 +12711,8 @@
       <w:spacing w:after="0" w:line="240" w:lineRule="auto"/>
     </w:pPr>
     <w:rPr>
-      <w:rFonts w:eastAsia="Arial Unicode MS"/>
+      <w:rFonts w:eastAsia="Hiragino Sans GB" w:ascii="Hiragino Sans GB" w:hAnsi="Hiragino Sans GB" w:cs="Hiragino Sans GB"/>
+      <w:lang w:eastAsia="zh-CN"/>
     </w:rPr>
     <w:tblPr>
       <w:tblStyleRowBandSize w:val="1"/>
@@ -12516,7 +12856,8 @@
       <w:spacing w:after="0" w:line="240" w:lineRule="auto"/>
     </w:pPr>
     <w:rPr>
-      <w:rFonts w:eastAsia="Arial Unicode MS"/>
+      <w:rFonts w:eastAsia="Hiragino Sans GB" w:ascii="Hiragino Sans GB" w:hAnsi="Hiragino Sans GB" w:cs="Hiragino Sans GB"/>
+      <w:lang w:eastAsia="zh-CN"/>
     </w:rPr>
     <w:tblPr>
       <w:tblStyleRowBandSize w:val="1"/>
@@ -12660,7 +13001,8 @@
       <w:spacing w:after="0" w:line="240" w:lineRule="auto"/>
     </w:pPr>
     <w:rPr>
-      <w:rFonts w:eastAsia="Arial Unicode MS"/>
+      <w:rFonts w:eastAsia="Hiragino Sans GB" w:ascii="Hiragino Sans GB" w:hAnsi="Hiragino Sans GB" w:cs="Hiragino Sans GB"/>
+      <w:lang w:eastAsia="zh-CN"/>
     </w:rPr>
     <w:tblPr>
       <w:tblStyleRowBandSize w:val="1"/>
@@ -12804,7 +13146,8 @@
       <w:spacing w:after="0" w:line="240" w:lineRule="auto"/>
     </w:pPr>
     <w:rPr>
-      <w:rFonts w:eastAsia="Arial Unicode MS"/>
+      <w:rFonts w:eastAsia="Hiragino Sans GB" w:ascii="Hiragino Sans GB" w:hAnsi="Hiragino Sans GB" w:cs="Hiragino Sans GB"/>
+      <w:lang w:eastAsia="zh-CN"/>
     </w:rPr>
     <w:tblPr>
       <w:tblStyleRowBandSize w:val="1"/>
@@ -12948,7 +13291,8 @@
       <w:spacing w:after="0" w:line="240" w:lineRule="auto"/>
     </w:pPr>
     <w:rPr>
-      <w:rFonts w:eastAsia="Arial Unicode MS"/>
+      <w:rFonts w:eastAsia="Hiragino Sans GB" w:ascii="Hiragino Sans GB" w:hAnsi="Hiragino Sans GB" w:cs="Hiragino Sans GB"/>
+      <w:lang w:eastAsia="zh-CN"/>
     </w:rPr>
     <w:tblPr>
       <w:tblStyleRowBandSize w:val="1"/>
@@ -13092,7 +13436,8 @@
       <w:spacing w:after="0" w:line="240" w:lineRule="auto"/>
     </w:pPr>
     <w:rPr>
-      <w:rFonts w:eastAsia="Arial Unicode MS"/>
+      <w:rFonts w:eastAsia="Hiragino Sans GB" w:ascii="Hiragino Sans GB" w:hAnsi="Hiragino Sans GB" w:cs="Hiragino Sans GB"/>
+      <w:lang w:eastAsia="zh-CN"/>
     </w:rPr>
     <w:tblPr>
       <w:tblStyleRowBandSize w:val="1"/>
@@ -13236,8 +13581,9 @@
       <w:spacing w:after="0" w:line="240" w:lineRule="auto"/>
     </w:pPr>
     <w:rPr>
-      <w:rFonts w:eastAsia="Arial Unicode MS"/>
+      <w:rFonts w:eastAsia="Hiragino Sans GB" w:ascii="Hiragino Sans GB" w:hAnsi="Hiragino Sans GB" w:cs="Hiragino Sans GB"/>
       <w:color w:val="FFFFFF" w:themeColor="background1"/>
+      <w:lang w:eastAsia="zh-CN"/>
     </w:rPr>
     <w:tblPr>
       <w:tblStyleRowBandSize w:val="1"/>
@@ -13351,8 +13697,9 @@
       <w:spacing w:after="0" w:line="240" w:lineRule="auto"/>
     </w:pPr>
     <w:rPr>
-      <w:rFonts w:eastAsia="Arial Unicode MS"/>
+      <w:rFonts w:eastAsia="Hiragino Sans GB" w:ascii="Hiragino Sans GB" w:hAnsi="Hiragino Sans GB" w:cs="Hiragino Sans GB"/>
       <w:color w:val="FFFFFF" w:themeColor="background1"/>
+      <w:lang w:eastAsia="zh-CN"/>
     </w:rPr>
     <w:tblPr>
       <w:tblStyleRowBandSize w:val="1"/>
@@ -13466,8 +13813,9 @@
       <w:spacing w:after="0" w:line="240" w:lineRule="auto"/>
     </w:pPr>
     <w:rPr>
-      <w:rFonts w:eastAsia="Arial Unicode MS"/>
+      <w:rFonts w:eastAsia="Hiragino Sans GB" w:ascii="Hiragino Sans GB" w:hAnsi="Hiragino Sans GB" w:cs="Hiragino Sans GB"/>
       <w:color w:val="FFFFFF" w:themeColor="background1"/>
+      <w:lang w:eastAsia="zh-CN"/>
     </w:rPr>
     <w:tblPr>
       <w:tblStyleRowBandSize w:val="1"/>
@@ -13581,8 +13929,9 @@
       <w:spacing w:after="0" w:line="240" w:lineRule="auto"/>
     </w:pPr>
     <w:rPr>
-      <w:rFonts w:eastAsia="Arial Unicode MS"/>
+      <w:rFonts w:eastAsia="Hiragino Sans GB" w:ascii="Hiragino Sans GB" w:hAnsi="Hiragino Sans GB" w:cs="Hiragino Sans GB"/>
       <w:color w:val="FFFFFF" w:themeColor="background1"/>
+      <w:lang w:eastAsia="zh-CN"/>
     </w:rPr>
     <w:tblPr>
       <w:tblStyleRowBandSize w:val="1"/>
@@ -13696,8 +14045,9 @@
       <w:spacing w:after="0" w:line="240" w:lineRule="auto"/>
     </w:pPr>
     <w:rPr>
-      <w:rFonts w:eastAsia="Arial Unicode MS"/>
+      <w:rFonts w:eastAsia="Hiragino Sans GB" w:ascii="Hiragino Sans GB" w:hAnsi="Hiragino Sans GB" w:cs="Hiragino Sans GB"/>
       <w:color w:val="FFFFFF" w:themeColor="background1"/>
+      <w:lang w:eastAsia="zh-CN"/>
     </w:rPr>
     <w:tblPr>
       <w:tblStyleRowBandSize w:val="1"/>
@@ -13811,8 +14161,9 @@
       <w:spacing w:after="0" w:line="240" w:lineRule="auto"/>
     </w:pPr>
     <w:rPr>
-      <w:rFonts w:eastAsia="Arial Unicode MS"/>
+      <w:rFonts w:eastAsia="Hiragino Sans GB" w:ascii="Hiragino Sans GB" w:hAnsi="Hiragino Sans GB" w:cs="Hiragino Sans GB"/>
       <w:color w:val="FFFFFF" w:themeColor="background1"/>
+      <w:lang w:eastAsia="zh-CN"/>
     </w:rPr>
     <w:tblPr>
       <w:tblStyleRowBandSize w:val="1"/>
@@ -13926,8 +14277,9 @@
       <w:spacing w:after="0" w:line="240" w:lineRule="auto"/>
     </w:pPr>
     <w:rPr>
-      <w:rFonts w:eastAsia="Arial Unicode MS"/>
+      <w:rFonts w:eastAsia="Hiragino Sans GB" w:ascii="Hiragino Sans GB" w:hAnsi="Hiragino Sans GB" w:cs="Hiragino Sans GB"/>
       <w:color w:val="FFFFFF" w:themeColor="background1"/>
+      <w:lang w:eastAsia="zh-CN"/>
     </w:rPr>
     <w:tblPr>
       <w:tblStyleRowBandSize w:val="1"/>
@@ -14041,8 +14393,9 @@
       <w:spacing w:after="0" w:line="240" w:lineRule="auto"/>
     </w:pPr>
     <w:rPr>
-      <w:rFonts w:eastAsia="Arial Unicode MS"/>
+      <w:rFonts w:eastAsia="Hiragino Sans GB" w:ascii="Hiragino Sans GB" w:hAnsi="Hiragino Sans GB" w:cs="Hiragino Sans GB"/>
       <w:color w:val="000000" w:themeColor="text1"/>
+      <w:lang w:eastAsia="zh-CN"/>
     </w:rPr>
     <w:tblPr>
       <w:tblStyleRowBandSize w:val="1"/>
@@ -14164,8 +14517,9 @@
       <w:spacing w:after="0" w:line="240" w:lineRule="auto"/>
     </w:pPr>
     <w:rPr>
-      <w:rFonts w:eastAsia="Arial Unicode MS"/>
+      <w:rFonts w:eastAsia="Hiragino Sans GB" w:ascii="Hiragino Sans GB" w:hAnsi="Hiragino Sans GB" w:cs="Hiragino Sans GB"/>
       <w:color w:val="000000" w:themeColor="text1"/>
+      <w:lang w:eastAsia="zh-CN"/>
     </w:rPr>
     <w:tblPr>
       <w:tblStyleRowBandSize w:val="1"/>
@@ -14287,8 +14641,9 @@
       <w:spacing w:after="0" w:line="240" w:lineRule="auto"/>
     </w:pPr>
     <w:rPr>
-      <w:rFonts w:eastAsia="Arial Unicode MS"/>
+      <w:rFonts w:eastAsia="Hiragino Sans GB" w:ascii="Hiragino Sans GB" w:hAnsi="Hiragino Sans GB" w:cs="Hiragino Sans GB"/>
       <w:color w:val="000000" w:themeColor="text1"/>
+      <w:lang w:eastAsia="zh-CN"/>
     </w:rPr>
     <w:tblPr>
       <w:tblStyleRowBandSize w:val="1"/>
@@ -14410,8 +14765,9 @@
       <w:spacing w:after="0" w:line="240" w:lineRule="auto"/>
     </w:pPr>
     <w:rPr>
-      <w:rFonts w:eastAsia="Arial Unicode MS"/>
+      <w:rFonts w:eastAsia="Hiragino Sans GB" w:ascii="Hiragino Sans GB" w:hAnsi="Hiragino Sans GB" w:cs="Hiragino Sans GB"/>
       <w:color w:val="000000" w:themeColor="text1"/>
+      <w:lang w:eastAsia="zh-CN"/>
     </w:rPr>
     <w:tblPr>
       <w:tblStyleRowBandSize w:val="1"/>
@@ -14523,8 +14879,9 @@
       <w:spacing w:after="0" w:line="240" w:lineRule="auto"/>
     </w:pPr>
     <w:rPr>
-      <w:rFonts w:eastAsia="Arial Unicode MS"/>
+      <w:rFonts w:eastAsia="Hiragino Sans GB" w:ascii="Hiragino Sans GB" w:hAnsi="Hiragino Sans GB" w:cs="Hiragino Sans GB"/>
       <w:color w:val="000000" w:themeColor="text1"/>
+      <w:lang w:eastAsia="zh-CN"/>
     </w:rPr>
     <w:tblPr>
       <w:tblStyleRowBandSize w:val="1"/>
@@ -14646,8 +15003,9 @@
       <w:spacing w:after="0" w:line="240" w:lineRule="auto"/>
     </w:pPr>
     <w:rPr>
-      <w:rFonts w:eastAsia="Arial Unicode MS"/>
+      <w:rFonts w:eastAsia="Hiragino Sans GB" w:ascii="Hiragino Sans GB" w:hAnsi="Hiragino Sans GB" w:cs="Hiragino Sans GB"/>
       <w:color w:val="000000" w:themeColor="text1"/>
+      <w:lang w:eastAsia="zh-CN"/>
     </w:rPr>
     <w:tblPr>
       <w:tblStyleRowBandSize w:val="1"/>
@@ -14769,8 +15127,9 @@
       <w:spacing w:after="0" w:line="240" w:lineRule="auto"/>
     </w:pPr>
     <w:rPr>
-      <w:rFonts w:eastAsia="Arial Unicode MS"/>
+      <w:rFonts w:eastAsia="Hiragino Sans GB" w:ascii="Hiragino Sans GB" w:hAnsi="Hiragino Sans GB" w:cs="Hiragino Sans GB"/>
       <w:color w:val="000000" w:themeColor="text1"/>
+      <w:lang w:eastAsia="zh-CN"/>
     </w:rPr>
     <w:tblPr>
       <w:tblStyleRowBandSize w:val="1"/>
@@ -14892,8 +15251,9 @@
       <w:spacing w:after="0" w:line="240" w:lineRule="auto"/>
     </w:pPr>
     <w:rPr>
-      <w:rFonts w:eastAsia="Arial Unicode MS"/>
+      <w:rFonts w:eastAsia="Hiragino Sans GB" w:ascii="Hiragino Sans GB" w:hAnsi="Hiragino Sans GB" w:cs="Hiragino Sans GB"/>
       <w:color w:val="000000" w:themeColor="text1"/>
+      <w:lang w:eastAsia="zh-CN"/>
     </w:rPr>
     <w:tblPr>
       <w:tblStyleRowBandSize w:val="1"/>
@@ -14979,8 +15339,9 @@
       <w:spacing w:after="0" w:line="240" w:lineRule="auto"/>
     </w:pPr>
     <w:rPr>
-      <w:rFonts w:eastAsia="Arial Unicode MS"/>
+      <w:rFonts w:eastAsia="Hiragino Sans GB" w:ascii="Hiragino Sans GB" w:hAnsi="Hiragino Sans GB" w:cs="Hiragino Sans GB"/>
       <w:color w:val="000000" w:themeColor="text1"/>
+      <w:lang w:eastAsia="zh-CN"/>
     </w:rPr>
     <w:tblPr>
       <w:tblStyleRowBandSize w:val="1"/>
@@ -15066,8 +15427,9 @@
       <w:spacing w:after="0" w:line="240" w:lineRule="auto"/>
     </w:pPr>
     <w:rPr>
-      <w:rFonts w:eastAsia="Arial Unicode MS"/>
+      <w:rFonts w:eastAsia="Hiragino Sans GB" w:ascii="Hiragino Sans GB" w:hAnsi="Hiragino Sans GB" w:cs="Hiragino Sans GB"/>
       <w:color w:val="000000" w:themeColor="text1"/>
+      <w:lang w:eastAsia="zh-CN"/>
     </w:rPr>
     <w:tblPr>
       <w:tblStyleRowBandSize w:val="1"/>
@@ -15153,8 +15515,9 @@
       <w:spacing w:after="0" w:line="240" w:lineRule="auto"/>
     </w:pPr>
     <w:rPr>
-      <w:rFonts w:eastAsia="Arial Unicode MS"/>
+      <w:rFonts w:eastAsia="Hiragino Sans GB" w:ascii="Hiragino Sans GB" w:hAnsi="Hiragino Sans GB" w:cs="Hiragino Sans GB"/>
       <w:color w:val="000000" w:themeColor="text1"/>
+      <w:lang w:eastAsia="zh-CN"/>
     </w:rPr>
     <w:tblPr>
       <w:tblStyleRowBandSize w:val="1"/>
@@ -15240,8 +15603,9 @@
       <w:spacing w:after="0" w:line="240" w:lineRule="auto"/>
     </w:pPr>
     <w:rPr>
-      <w:rFonts w:eastAsia="Arial Unicode MS"/>
+      <w:rFonts w:eastAsia="Hiragino Sans GB" w:ascii="Hiragino Sans GB" w:hAnsi="Hiragino Sans GB" w:cs="Hiragino Sans GB"/>
       <w:color w:val="000000" w:themeColor="text1"/>
+      <w:lang w:eastAsia="zh-CN"/>
     </w:rPr>
     <w:tblPr>
       <w:tblStyleRowBandSize w:val="1"/>
@@ -15327,8 +15691,9 @@
       <w:spacing w:after="0" w:line="240" w:lineRule="auto"/>
     </w:pPr>
     <w:rPr>
-      <w:rFonts w:eastAsia="Arial Unicode MS"/>
+      <w:rFonts w:eastAsia="Hiragino Sans GB" w:ascii="Hiragino Sans GB" w:hAnsi="Hiragino Sans GB" w:cs="Hiragino Sans GB"/>
       <w:color w:val="000000" w:themeColor="text1"/>
+      <w:lang w:eastAsia="zh-CN"/>
     </w:rPr>
     <w:tblPr>
       <w:tblStyleRowBandSize w:val="1"/>
@@ -15414,8 +15779,9 @@
       <w:spacing w:after="0" w:line="240" w:lineRule="auto"/>
     </w:pPr>
     <w:rPr>
-      <w:rFonts w:eastAsia="Arial Unicode MS"/>
+      <w:rFonts w:eastAsia="Hiragino Sans GB" w:ascii="Hiragino Sans GB" w:hAnsi="Hiragino Sans GB" w:cs="Hiragino Sans GB"/>
       <w:color w:val="000000" w:themeColor="text1"/>
+      <w:lang w:eastAsia="zh-CN"/>
     </w:rPr>
     <w:tblPr>
       <w:tblStyleRowBandSize w:val="1"/>
@@ -15501,8 +15867,9 @@
       <w:spacing w:after="0" w:line="240" w:lineRule="auto"/>
     </w:pPr>
     <w:rPr>
-      <w:rFonts w:eastAsia="Arial Unicode MS"/>
+      <w:rFonts w:eastAsia="Hiragino Sans GB" w:ascii="Hiragino Sans GB" w:hAnsi="Hiragino Sans GB" w:cs="Hiragino Sans GB"/>
       <w:color w:val="000000" w:themeColor="text1"/>
+      <w:lang w:eastAsia="zh-CN"/>
     </w:rPr>
     <w:tblPr>
       <w:tblStyleRowBandSize w:val="1"/>
@@ -15582,8 +15949,9 @@
       <w:spacing w:after="0" w:line="240" w:lineRule="auto"/>
     </w:pPr>
     <w:rPr>
-      <w:rFonts w:eastAsia="Arial Unicode MS"/>
+      <w:rFonts w:eastAsia="Hiragino Sans GB" w:ascii="Hiragino Sans GB" w:hAnsi="Hiragino Sans GB" w:cs="Hiragino Sans GB"/>
       <w:color w:val="000000" w:themeColor="text1"/>
+      <w:lang w:eastAsia="zh-CN"/>
     </w:rPr>
     <w:tblPr>
       <w:tblStyleRowBandSize w:val="1"/>
@@ -15663,8 +16031,9 @@
       <w:spacing w:after="0" w:line="240" w:lineRule="auto"/>
     </w:pPr>
     <w:rPr>
-      <w:rFonts w:eastAsia="Arial Unicode MS"/>
+      <w:rFonts w:eastAsia="Hiragino Sans GB" w:ascii="Hiragino Sans GB" w:hAnsi="Hiragino Sans GB" w:cs="Hiragino Sans GB"/>
       <w:color w:val="000000" w:themeColor="text1"/>
+      <w:lang w:eastAsia="zh-CN"/>
     </w:rPr>
     <w:tblPr>
       <w:tblStyleRowBandSize w:val="1"/>
@@ -15744,8 +16113,9 @@
       <w:spacing w:after="0" w:line="240" w:lineRule="auto"/>
     </w:pPr>
     <w:rPr>
-      <w:rFonts w:eastAsia="Arial Unicode MS"/>
+      <w:rFonts w:eastAsia="Hiragino Sans GB" w:ascii="Hiragino Sans GB" w:hAnsi="Hiragino Sans GB" w:cs="Hiragino Sans GB"/>
       <w:color w:val="000000" w:themeColor="text1"/>
+      <w:lang w:eastAsia="zh-CN"/>
     </w:rPr>
     <w:tblPr>
       <w:tblStyleRowBandSize w:val="1"/>
@@ -15825,8 +16195,9 @@
       <w:spacing w:after="0" w:line="240" w:lineRule="auto"/>
     </w:pPr>
     <w:rPr>
-      <w:rFonts w:eastAsia="Arial Unicode MS"/>
+      <w:rFonts w:eastAsia="Hiragino Sans GB" w:ascii="Hiragino Sans GB" w:hAnsi="Hiragino Sans GB" w:cs="Hiragino Sans GB"/>
       <w:color w:val="000000" w:themeColor="text1"/>
+      <w:lang w:eastAsia="zh-CN"/>
     </w:rPr>
     <w:tblPr>
       <w:tblStyleRowBandSize w:val="1"/>
@@ -15906,8 +16277,9 @@
       <w:spacing w:after="0" w:line="240" w:lineRule="auto"/>
     </w:pPr>
     <w:rPr>
-      <w:rFonts w:eastAsia="Arial Unicode MS"/>
+      <w:rFonts w:eastAsia="Hiragino Sans GB" w:ascii="Hiragino Sans GB" w:hAnsi="Hiragino Sans GB" w:cs="Hiragino Sans GB"/>
       <w:color w:val="000000" w:themeColor="text1"/>
+      <w:lang w:eastAsia="zh-CN"/>
     </w:rPr>
     <w:tblPr>
       <w:tblStyleRowBandSize w:val="1"/>
@@ -15987,8 +16359,9 @@
       <w:spacing w:after="0" w:line="240" w:lineRule="auto"/>
     </w:pPr>
     <w:rPr>
-      <w:rFonts w:eastAsia="Arial Unicode MS"/>
+      <w:rFonts w:eastAsia="Hiragino Sans GB" w:ascii="Hiragino Sans GB" w:hAnsi="Hiragino Sans GB" w:cs="Hiragino Sans GB"/>
       <w:color w:val="000000" w:themeColor="text1"/>
+      <w:lang w:eastAsia="zh-CN"/>
     </w:rPr>
     <w:tblPr>
       <w:tblStyleRowBandSize w:val="1"/>

</xml_diff>

<commit_message>
release: integrate V1.4.4 capabilities
</commit_message>
<xml_diff>
--- a/docs/user-guide/企业全生命周期助手用户使用手册.docx
+++ b/docs/user-guide/企业全生命周期助手用户使用手册.docx
@@ -138,7 +138,7 @@
                 <w:sz w:val="20"/>
                 <w:lang w:eastAsia="zh-CN"/>
               </w:rPr>
-              <w:t>管理器版本与 Skills 内容版本相互独立。当前管理器为 0.2.0，正式 Skills 为 V1.4.2，共 49 项。桌面客户端采用未签名本机授权分发；应用身份与 Skills 内容验真是两条独立信任链。系统或企业策略不允许未签名应用时，继续使用 HTTPS PWA，不关闭系统防护。</w:t>
+              <w:t>管理器版本与 Skills 内容版本相互独立。当前管理器为 0.2.0，正式 Skills 为 V1.4.4，共 49 项。桌面客户端采用未签名本机授权分发；应用身份与 Skills 内容验真是两条独立信任链。系统或企业策略不允许未签名应用时，继续使用 HTTPS PWA，不关闭系统防护。</w:t>
             </w:r>
           </w:p>
         </w:tc>
@@ -173,7 +173,7 @@
           <w:sz w:val="19"/>
           <w:lang w:eastAsia="zh-CN"/>
         </w:rPr>
-        <w:t>适用：macOS arm64 / x64，Windows x64  ·  更新日期：2026 年 7 月 30 日</w:t>
+        <w:t>适用：macOS arm64 / x64，Windows x64  ·  更新日期：2026 年 8 月 1 日</w:t>
       </w:r>
     </w:p>
     <w:p>
@@ -1595,7 +1595,7 @@
           <w:sz w:val="22"/>
           <w:lang w:eastAsia="zh-CN"/>
         </w:rPr>
-        <w:t>macOS 与 Windows 不再分别发布 WorkBuddy 安装包，也不再运行固定 .command、.cmd、PowerShell 或外部 CLI。管理器只下载、验签并定位同一个跨平台插件市场 ZIP。V1.4.2 从签名插件根目录 .mcp.json 加载 jiaotang-kb，plugin.json 保留相对路径声明；不写用户级、项目级或全局 MCP 配置。</w:t>
+        <w:t>macOS 与 Windows 不再分别发布 WorkBuddy 安装包，也不再运行固定 .command、.cmd、PowerShell 或外部 CLI。管理器只下载、验签并定位同一个跨平台插件市场 ZIP。V1.4.4 从签名插件根目录 .mcp.json 加载 jiaotang-kb，plugin.json 保留相对路径声明；不写用户级、项目级或全局 MCP 配置。</w:t>
       </w:r>
     </w:p>
     <w:p>
@@ -2708,7 +2708,7 @@
           <w:sz w:val="21"/>
           <w:lang w:eastAsia="zh-CN"/>
         </w:rPr>
-        <w:t>管理器“关于”或安全中心显示版本 0.2.0，Skills 清单显示 V1.4.2 与 49 项。</w:t>
+        <w:t>管理器“关于”或安全中心显示版本 0.2.0，Skills 清单显示 V1.4.4 与 49 项。</w:t>
       </w:r>
     </w:p>
     <w:p>
@@ -3082,6 +3082,79 @@
         <w:t>完整申请文件先创建每案唯一的 patent-case-manifest，再从确认后的事实锁 JSON 通过同一个生成器形成申请 Word 和附图规范。交底、检索证据、权利要求现有技术矩阵、核稿验证、预审建议和提交清单均回写同一清单。提交前契约检查文件哈希、案件版本和依赖关系；阶段错版或缺失会生成具体重建任务。匿名测试夹具只用于升级回归，不能作为真实申请案卷。</w:t>
       </w:r>
     </w:p>
+    <w:p>
+      <w:pPr>
+        <w:pStyle w:val="Heading1"/>
+      </w:pPr>
+      <w:r>
+        <w:t>V1.4.4 新增能力</w:t>
+      </w:r>
+    </w:p>
+    <w:p>
+      <w:pPr>
+        <w:pStyle w:val="Heading2"/>
+      </w:pPr>
+      <w:r>
+        <w:t>三步安装与发布后双端验收</w:t>
+      </w:r>
+    </w:p>
+    <w:p>
+      <w:r>
+        <w:t>WorkBuddy 新设备依次完成审查、安装、bootstrap 绑定。插件包与 jiaotang-kb MCP 均由三步流程统一配置，不再提供手工 WorkBuddy 配置。只有第三步获得授权后，系统才生成一次性引导地址；Agent 完成设备登记、凭据保存、首次验签和 MCP 连接四阶段。自动夹具通过后即可正式发布，macOS 与 Windows 实机验收由管理员在发布后分别完成；验收前状态统一为“已发布，待双端实机验收”。</w:t>
+      </w:r>
+    </w:p>
+    <w:p>
+      <w:pPr>
+        <w:pStyle w:val="Heading2"/>
+      </w:pPr>
+      <w:r>
+        <w:t>权威名单事实查询</w:t>
+      </w:r>
+    </w:p>
+    <w:p>
+      <w:r>
+        <w:t>国家专精特新小巨人、省级专精特新中小企业和三首名单优先调用 authoritative_list_search。结果显示完整命中总数、官方匹配数、来源等级和分页状态。权威专表缺失时系统会明确报错，不会使用通用文档实体补成确定结论。</w:t>
+      </w:r>
+    </w:p>
+    <w:p>
+      <w:pPr>
+        <w:pStyle w:val="Heading2"/>
+      </w:pPr>
+      <w:r>
+        <w:t>案例包分层调用</w:t>
+      </w:r>
+    </w:p>
+    <w:p>
+      <w:r>
+        <w:t>需要历史申报书、建设方案或附件结构时，使用 knowledge_case_pack 按项目、年度、行业、企业规模和章节筛选。先查看三至五套案例骨架，再按当前章节展开对应佐证。自动归组案例标记为待复核；案例只能借鉴结构、指标组织和证据类型，严禁复制案例企业的名称、财务、客户、技术、专利或人员事实。</w:t>
+      </w:r>
+    </w:p>
+    <w:p>
+      <w:pPr>
+        <w:pStyle w:val="Heading2"/>
+      </w:pPr>
+      <w:r>
+        <w:t>AI 专利工作流</w:t>
+      </w:r>
+    </w:p>
+    <w:p>
+      <w:r>
+        <w:t>专利总路由新增技术特征证据图、分层检索、自然人发明人门禁和 AI 专利充分公开检查。系统先把技术问题、技术手段、实施细节和可验证效果建立映射，再进入检索、交底或申请文件流程。该能力为独立实现，不包含第三方私有代码、模型、数据库或界面。</w:t>
+      </w:r>
+    </w:p>
+    <w:p>
+      <w:pPr>
+        <w:pStyle w:val="Heading2"/>
+      </w:pPr>
+      <w:r>
+        <w:t>非 WorkBuddy 手工连接 MCP</w:t>
+      </w:r>
+    </w:p>
+    <w:p>
+      <w:r>
+        <w:t>非 WorkBuddy 用户如所用 Agent 支持远程 Streamable HTTP MCP，可在门户生成个人 Token，手工填写 MCP 地址和 Authorization Bearer 请求头。该路径不下载 WorkBuddy 插件包，不使用 bootstrap_url，也不调用 jiaotang_kb_setup；配置后先调用 knowledge_service_status 验证连接。</w:t>
+      </w:r>
+    </w:p>
     <w:sectPr>
       <w:pgSz w:w="12240" w:h="15840"/>
       <w:pgMar w:top="1440" w:right="1440" w:bottom="1440" w:left="1440" w:header="708" w:footer="708" w:gutter="0"/>

</xml_diff>

<commit_message>
release: integrate V1.4.8 code and index gates
</commit_message>
<xml_diff>
--- a/docs/user-guide/企业全生命周期助手用户使用手册.docx
+++ b/docs/user-guide/企业全生命周期助手用户使用手册.docx
@@ -563,14 +563,7 @@
     </w:p>
     <w:p>
       <w:r>
-        <w:rPr>
-          <w:rFonts w:ascii="Arial Unicode MS" w:hAnsi="Arial Unicode MS" w:eastAsia="Arial Unicode MS" w:cs="Arial Unicode MS"/>
-          <w:b w:val="0"/>
-          <w:i w:val="0"/>
-          <w:color w:val="202B38"/>
-          <w:sz w:val="22"/>
-        </w:rPr>
-        <w:t>可安装的 WorkBuddy 正式包必须在签名文件集合中包含插件根目录 .mcp.json，并由 plugin.json 使用相对路径声明 MCP。安装后必须通过真实 tools/list 枚举和至少一次只读工具调用；只有页面状态和这两项运行时检查全部通过才算完成。不得自行删除 .mcp.json，不得把候选包当作正式包，也不得从临时解压目录长期注册市场。</w:t>
+        <w:t>可安装的 WorkBuddy 正式包只包含插件清单、49 项 Skills、最小行为 Hook、必要参考资料和业务脚本，不包含本地 MCP 服务、启动器、个人 Token 或插件根目录 .mcp.json。安装后必须通过真实 tools/list 枚举和 knowledge_service_status 调用；只有 49 项 Skills 可识别、三个核心知识工具齐全、状态返回 connected: true 且其他 MCP 未被覆盖，才算完成。</w:t>
       </w:r>
     </w:p>
     <w:p>
@@ -582,111 +575,21 @@
       </w:r>
     </w:p>
     <w:p>
-      <w:pPr>
-        <w:pStyle w:val="ListNumber"/>
-        <w:numPr>
-          <w:ilvl w:val="0"/>
-          <w:numId w:val="13"/>
-        </w:numPr>
-      </w:pPr>
+      <w:pPr/>
       <w:r>
-        <w:t>登录网站，进入“连接我的 Agent”。</w:t>
+        <w:t>WorkBuddy 使用上述一键安装指令同时完成 Skills 安装和远程 MCP 连接，不需要分开执行安装与绑定。</w:t>
       </w:r>
     </w:p>
     <w:p>
-      <w:pPr>
-        <w:pStyle w:val="ListNumber"/>
-        <w:numPr>
-          <w:ilvl w:val="0"/>
-          <w:numId w:val="13"/>
-        </w:numPr>
-      </w:pPr>
+      <w:pPr/>
       <w:r>
-        <w:t>点击第一步“复制给 Agent”，将审查说明粘贴给当前本地 Agent；这一步不会下载安装。</w:t>
+        <w:t>其他支持 Streamable HTTP MCP 的 Agent 可进入“手工配置 MCP”页面。网站会自动复用当前账号的有效个人 Token；没有有效 Token 时才生成新值，并直接填入完整 MCP JSON。用户点击“复制完整配置”即可，不再到其他页面查找 Token。</w:t>
       </w:r>
     </w:p>
     <w:p>
-      <w:pPr>
-        <w:pStyle w:val="ListNumber"/>
-        <w:numPr>
-          <w:ilvl w:val="0"/>
-          <w:numId w:val="13"/>
-        </w:numPr>
-      </w:pPr>
+      <w:pPr/>
       <w:r>
-        <w:t>核对审查结论后回到网站，点击第二步“我已审查，复制安装指令”，再粘贴给同一个 Agent。</w:t>
-      </w:r>
-    </w:p>
-    <w:p>
-      <w:pPr>
-        <w:pStyle w:val="ListNumber"/>
-        <w:numPr>
-          <w:ilvl w:val="0"/>
-          <w:numId w:val="13"/>
-        </w:numPr>
-      </w:pPr>
-      <w:r>
-        <w:t>Agent 使用一次性受限地址自动下载、校验并安装插件包，主人不需要提前手工下载。若 WorkBuddy 5.3.x 把 ${CODEBUDDY_PLUGIN_ROOT} 当成字面量导致 MCP -32000，安装指令只修复用户级 jiaotang-kb 条目的绝对路径，不改签名插件副本。</w:t>
-      </w:r>
-    </w:p>
-    <w:p>
-      <w:pPr>
-        <w:pStyle w:val="ListNumber"/>
-        <w:numPr>
-          <w:ilvl w:val="0"/>
-          <w:numId w:val="13"/>
-        </w:numPr>
-      </w:pPr>
-      <w:r>
-        <w:t>插件加载并枚举 jiaotang_kb_setup 后，回到网站点击第三步“复制知识库绑定指令”，再粘贴给同一个 Agent。门户在这一步生成并刷新一次性 bootstrap_url。</w:t>
-      </w:r>
-    </w:p>
-    <w:p>
-      <w:pPr>
-        <w:pStyle w:val="ListNumber"/>
-        <w:numPr>
-          <w:ilvl w:val="0"/>
-          <w:numId w:val="13"/>
-        </w:numPr>
-      </w:pPr>
-      <w:r>
-        <w:t>Agent 仅将 bootstrap_url 作为本地 jiaotang_kb_setup 工具参数调用一次，不在回复中复述，不写入普通配置。</w:t>
-      </w:r>
-    </w:p>
-    <w:p>
-      <w:pPr>
-        <w:pStyle w:val="ListNumber"/>
-        <w:numPr>
-          <w:ilvl w:val="0"/>
-          <w:numId w:val="13"/>
-        </w:numPr>
-      </w:pPr>
-      <w:r>
-        <w:t>绑定后让 Agent 检查知识库连接状态；实际调用任一只读状态或检索工具成功后，首次配置才结束。</w:t>
-      </w:r>
-    </w:p>
-    <w:p>
-      <w:r>
-        <w:rPr>
-          <w:rFonts w:ascii="Arial Unicode MS" w:hAnsi="Arial Unicode MS" w:eastAsia="Arial Unicode MS" w:cs="Arial Unicode MS"/>
-          <w:b w:val="0"/>
-          <w:i w:val="0"/>
-          <w:color w:val="202B38"/>
-          <w:sz w:val="22"/>
-        </w:rPr>
-        <w:t>只有选择“手工配置”时才需要自行前往 Skills 中心下载插件包。自动三步流程和手工下载是二选一，不需要重复执行。</w:t>
-      </w:r>
-    </w:p>
-    <w:p>
-      <w:r>
-        <w:rPr>
-          <w:rFonts w:ascii="Arial Unicode MS" w:hAnsi="Arial Unicode MS" w:eastAsia="Arial Unicode MS" w:cs="Arial Unicode MS"/>
-          <w:b w:val="0"/>
-          <w:i w:val="0"/>
-          <w:color w:val="202B38"/>
-          <w:sz w:val="22"/>
-        </w:rPr>
-        <w:t>普通成员无需查看或保存个人 API Key、设备私钥和 MCP 请求头。同一账号同时只能绑定一台设备；换机时先在门户点击“更换绑定设备”，再把新的配置发送给新设备 Agent。管理员账号不执行该设备限制。</w:t>
+        <w:t>Token 只在当前登录用户的手工配置页和一键安装指令中出现，不写入公共插件包或公共代码。页面使用 Cache-Control: private, no-store；服务端普通日志和 Agent 最终回复不得记录或复述完整 Token。Token 会明文保存在当前用户的 WorkBuddy MCP 配置中；怀疑泄露时撤销旧 Token，下次打开配置页自动生成新值。</w:t>
       </w:r>
     </w:p>
     <w:p>
@@ -698,87 +601,27 @@
       </w:r>
     </w:p>
     <w:p>
-      <w:pPr>
-        <w:pStyle w:val="ListNumber"/>
-        <w:numPr>
-          <w:ilvl w:val="0"/>
-          <w:numId w:val="14"/>
-        </w:numPr>
-      </w:pPr>
+      <w:pPr/>
       <w:r>
-        <w:t>登录网站，进入“Skills → 安装与设备”。门户只有在已验收设备版本低于最新可安装的 WorkBuddy 正式包时才显示升级按钮；页面显示的目标版本是本次升级唯一依据。</w:t>
+        <w:t>1. 已安装旧版的用户不要手工删除插件目录。</w:t>
       </w:r>
     </w:p>
     <w:p>
-      <w:pPr>
-        <w:pStyle w:val="ListNumber"/>
-        <w:numPr>
-          <w:ilvl w:val="0"/>
-          <w:numId w:val="14"/>
-        </w:numPr>
-      </w:pPr>
+      <w:pPr/>
       <w:r>
-        <w:t>点击第一步生成升级审查计划，并粘贴给当前设备的同一个 Agent。核对源版本、源包哈希、目标版本、目标包哈希、发布者指纹、身份复用范围和回滚方法。</w:t>
+        <w:t>2. 仍使用门户的同一段一键安装指令。WorkBuddy 会更新或替换旧插件，移除旧本地 jiaotang-kb 连接方式，并且不再读取旧的系统凭据。</w:t>
       </w:r>
     </w:p>
     <w:p>
-      <w:pPr>
-        <w:pStyle w:val="ListNumber"/>
-        <w:numPr>
-          <w:ilvl w:val="0"/>
-          <w:numId w:val="14"/>
-        </w:numPr>
-      </w:pPr>
+      <w:pPr/>
       <w:r>
-        <w:t>回到门户点击第二步明确授权，再把升级确认粘贴给同一个 Agent。</w:t>
+        <w:t>3. 升级只替换 mcpServers.jiaotang-kb，保留其他 MCP 配置，并只重载一次。</w:t>
       </w:r>
     </w:p>
     <w:p>
-      <w:pPr>
-        <w:pStyle w:val="ListNumber"/>
-        <w:numPr>
-          <w:ilvl w:val="0"/>
-          <w:numId w:val="14"/>
-        </w:numPr>
-      </w:pPr>
+      <w:pPr/>
       <w:r>
-        <w:t>Agent 使用 WorkBuddy 内置插件管理器升级已签名插件，复用原设备标识、Ed25519 设备密钥、API Token、bootstrap_url 和 jiaotang-kb MCP，不重新登记设备。</w:t>
-      </w:r>
-    </w:p>
-    <w:p>
-      <w:pPr>
-        <w:pStyle w:val="ListNumber"/>
-        <w:numPr>
-          <w:ilvl w:val="0"/>
-          <w:numId w:val="14"/>
-        </w:numPr>
-      </w:pPr>
-      <w:r>
-        <w:t>目标包验签、插件启用和任一只读 jiaotang-kb 调用全部通过后，Agent 回传目标版本和目标包哈希；门户只在二者与固定升级计划完全一致时更新设备版本。</w:t>
-      </w:r>
-    </w:p>
-    <w:p>
-      <w:pPr>
-        <w:pStyle w:val="ListNumber"/>
-        <w:numPr>
-          <w:ilvl w:val="0"/>
-          <w:numId w:val="14"/>
-        </w:numPr>
-      </w:pPr>
-      <w:r>
-        <w:t>任一步失败时恢复升级前插件目录，保留原设备身份和系统凭据，并在门户显示失败阶段和下一步。</w:t>
-      </w:r>
-    </w:p>
-    <w:p>
-      <w:r>
-        <w:rPr>
-          <w:rFonts w:ascii="Arial Unicode MS" w:hAnsi="Arial Unicode MS" w:eastAsia="Arial Unicode MS" w:cs="Arial Unicode MS"/>
-          <w:b w:val="0"/>
-          <w:i w:val="0"/>
-          <w:color w:val="202B38"/>
-          <w:sz w:val="22"/>
-        </w:rPr>
-        <w:t>跨版本升级不要求用户删除旧插件、移除整个 jiaotang 持久市场或重新绑定设备。升级计划生成后固定目标包，不会在执行过程中自动切换到其他版本。</w:t>
+        <w:t>4. 升级前备份插件目录和用户 MCP 配置。任一步失败时先保全现场，再恢复升级前备份，不覆盖个人项目资料、其他 MCP 条目或个人偏好。</w:t>
       </w:r>
     </w:p>
     <w:p>
@@ -2020,7 +1863,7 @@
         <w:pStyle w:val="ListBullet"/>
       </w:pPr>
       <w:r>
-        <w:t>WorkBuddy 已绑定设备通过门户升级事务复用原设备身份和系统凭据；验签或只读工具调用失败时恢复升级前插件目录。</w:t>
+        <w:t>WorkBuddy 旧版用户仍使用同一段一键安装指令覆盖升级；升级前保留插件目录和用户 MCP 配置备份，失败时恢复。</w:t>
       </w:r>
     </w:p>
     <w:p>
@@ -2028,7 +1871,7 @@
         <w:pStyle w:val="ListBullet"/>
       </w:pPr>
       <w:r>
-        <w:t>网站保存不可变发布记录和升级结果；访问令牌、设备私钥及一次性引导地址不进入普通日志。</w:t>
+        <w:t>网站保存不可变发布记录；个人 Token 不进入公共包、公共代码或普通日志，怀疑泄露时在门户撤销并重新生成。</w:t>
       </w:r>
     </w:p>
     <w:p>

</xml_diff>